<commit_message>
Addressed US 5 and US 6
Signed-off-by: David Loffredo <loffredo@steptools.com>
</commit_message>
<xml_diff>
--- a/comments/ISO_DIS_10303-238e4_comment_log.docx
+++ b/comments/ISO_DIS_10303-238e4_comment_log.docx
@@ -708,6 +708,9 @@
             <w:pPr>
               <w:pStyle w:val="ISOSecretObservations"/>
             </w:pPr>
+            <w:r>
+              <w:t>Adopted proposed solution</w:t>
+            </w:r>
           </w:p>
         </w:tc>
       </w:tr>
@@ -843,6 +846,27 @@
             <w:pPr>
               <w:pStyle w:val="ISOSecretObservations"/>
             </w:pPr>
+            <w:r>
+              <w:t>Added "</w:t>
+            </w:r>
+            <w:r>
+              <w:t>Clause 2</w:t>
+            </w:r>
+            <w:r>
+              <w:t xml:space="preserve"> </w:t>
+            </w:r>
+            <w:r>
+              <w:t>lists documents that</w:t>
+            </w:r>
+            <w:r>
+              <w:t xml:space="preserve"> </w:t>
+            </w:r>
+            <w:r>
+              <w:t>define additional requirements incorporated by reference into the AP.</w:t>
+            </w:r>
+            <w:r>
+              <w:t>"</w:t>
+            </w:r>
           </w:p>
         </w:tc>
       </w:tr>
@@ -998,6 +1022,7 @@
               <w:pStyle w:val="ISOMB"/>
             </w:pPr>
             <w:r>
+              <w:lastRenderedPageBreak/>
               <w:t>US-8</w:t>
             </w:r>
           </w:p>
@@ -1133,7 +1158,6 @@
               <w:pStyle w:val="ISOMB"/>
             </w:pPr>
             <w:r>
-              <w:lastRenderedPageBreak/>
               <w:t>US-9</w:t>
             </w:r>
           </w:p>
@@ -2167,7 +2191,11 @@
               <w:pStyle w:val="ISOComments"/>
             </w:pPr>
             <w:r>
-              <w:t>Multiple HREF attributes contain trailing spaces in ID references (e.g., '#ao-am_application_feature '). These trailing spaces could cause broken cross-reference links. (djo)</w:t>
+              <w:t xml:space="preserve">Multiple HREF attributes contain trailing spaces in ID references (e.g., '#ao-am_application_feature </w:t>
+            </w:r>
+            <w:r>
+              <w:lastRenderedPageBreak/>
+              <w:t>'). These trailing spaces could cause broken cross-reference links. (djo)</w:t>
             </w:r>
           </w:p>
         </w:tc>
@@ -2184,6 +2212,7 @@
               <w:pStyle w:val="ISOChange"/>
             </w:pPr>
             <w:r>
+              <w:lastRenderedPageBreak/>
               <w:t>Remove trailing spaces from all HREF attribute values in section 4.2.14. ( DJO can identify specific ones)</w:t>
             </w:r>
           </w:p>
@@ -2247,7 +2276,6 @@
               <w:rPr>
                 <w:highlight w:val="yellow"/>
               </w:rPr>
-              <w:lastRenderedPageBreak/>
               <w:t>US-17</w:t>
             </w:r>
           </w:p>
@@ -3338,6 +3366,7 @@
               <w:pStyle w:val="ISOMB"/>
             </w:pPr>
             <w:r>
+              <w:lastRenderedPageBreak/>
               <w:t>US-24</w:t>
             </w:r>
           </w:p>
@@ -3420,11 +3449,7 @@
               <w:pStyle w:val="ISOComments"/>
             </w:pPr>
             <w:r>
-              <w:t xml:space="preserve">One key use of a manufacturing stage, is that it can be used to reference alternative fastener assemblies  (grip length +1 for example) .. But it’s </w:t>
-            </w:r>
-            <w:r>
-              <w:lastRenderedPageBreak/>
-              <w:t>not clear what it is useful for.  Maybe there should be a note in this section on this application or elsewhere</w:t>
+              <w:t>One key use of a manufacturing stage, is that it can be used to reference alternative fastener assemblies  (grip length +1 for example) .. But it’s not clear what it is useful for.  Maybe there should be a note in this section on this application or elsewhere</w:t>
             </w:r>
           </w:p>
           <w:p>
@@ -3449,7 +3474,6 @@
               <w:pStyle w:val="ISOChange"/>
             </w:pPr>
             <w:r>
-              <w:lastRenderedPageBreak/>
               <w:t>Add note on how multiple fastener groups could be handled using this Application Object</w:t>
             </w:r>
           </w:p>
@@ -4494,6 +4518,7 @@
               <w:pStyle w:val="ISOMB"/>
             </w:pPr>
             <w:r>
+              <w:lastRenderedPageBreak/>
               <w:t>US-31</w:t>
             </w:r>
           </w:p>
@@ -4610,11 +4635,7 @@
               <w:pStyle w:val="ISOSecretObservations"/>
             </w:pPr>
             <w:r>
-              <w:t xml:space="preserve">RESOLVED (ed): changed 'mapping specification' to </w:t>
-            </w:r>
-            <w:r>
-              <w:lastRenderedPageBreak/>
-              <w:t>'mapping specifications' in 5.1.1 NOTE.</w:t>
+              <w:t>RESOLVED (ed): changed 'mapping specification' to 'mapping specifications' in 5.1.1 NOTE.</w:t>
             </w:r>
           </w:p>
         </w:tc>
@@ -4636,7 +4657,6 @@
               <w:pStyle w:val="ISOMB"/>
             </w:pPr>
             <w:r>
-              <w:lastRenderedPageBreak/>
               <w:t>US-32</w:t>
             </w:r>
           </w:p>
@@ -5720,6 +5740,7 @@
               <w:pStyle w:val="ISOMB"/>
             </w:pPr>
             <w:r>
+              <w:lastRenderedPageBreak/>
               <w:t>US-40</w:t>
             </w:r>
           </w:p>
@@ -5858,7 +5879,6 @@
               <w:pStyle w:val="ISOMB"/>
             </w:pPr>
             <w:r>
-              <w:lastRenderedPageBreak/>
               <w:t>US-41</w:t>
             </w:r>
           </w:p>
@@ -6771,7 +6791,11 @@
               <w:pStyle w:val="ISOComments"/>
             </w:pPr>
             <w:r>
-              <w:t>Heading says 'Protocol Implementation Conformance Statement (PICS)' but body text says 'Protocol Information and Conformance Statement (PICS)'. These must match. (djo)</w:t>
+              <w:t xml:space="preserve">Heading says 'Protocol Implementation Conformance Statement (PICS)' but body text </w:t>
+            </w:r>
+            <w:r>
+              <w:lastRenderedPageBreak/>
+              <w:t>says 'Protocol Information and Conformance Statement (PICS)'. These must match. (djo)</w:t>
             </w:r>
           </w:p>
         </w:tc>
@@ -6788,6 +6812,7 @@
               <w:pStyle w:val="ISOChange"/>
             </w:pPr>
             <w:r>
+              <w:lastRenderedPageBreak/>
               <w:t>Change body text to 'Protocol Implementation Conformance Statement' to match heading.</w:t>
             </w:r>
           </w:p>
@@ -6805,7 +6830,11 @@
               <w:pStyle w:val="ISOSecretObservations"/>
             </w:pPr>
             <w:r>
-              <w:t>RESOLVED (ed): body changed to 'Protocol Implementation Conformance Statement' to match heading (Annex D).</w:t>
+              <w:t xml:space="preserve">RESOLVED (ed): body changed to 'Protocol Implementation </w:t>
+            </w:r>
+            <w:r>
+              <w:lastRenderedPageBreak/>
+              <w:t>Conformance Statement' to match heading (Annex D).</w:t>
             </w:r>
           </w:p>
         </w:tc>
@@ -7771,6 +7800,7 @@
               <w:pStyle w:val="ISOMB"/>
             </w:pPr>
             <w:r>
+              <w:lastRenderedPageBreak/>
               <w:t>US-55</w:t>
             </w:r>
           </w:p>
@@ -7902,7 +7932,6 @@
               <w:pStyle w:val="ISOMB"/>
             </w:pPr>
             <w:r>
-              <w:lastRenderedPageBreak/>
               <w:t>US-56</w:t>
             </w:r>
           </w:p>
@@ -9739,7 +9768,14 @@
               <w:rPr>
                 <w:highlight w:val="yellow"/>
               </w:rPr>
-              <w:t>Add Interval OPTIONAL INTEGER to describe frequency of processing with 1 being the default and 2 meaning the process is executed on every other layer</w:t>
+              <w:t xml:space="preserve">Add Interval OPTIONAL INTEGER to describe frequency of processing with 1 being the default </w:t>
+            </w:r>
+            <w:r>
+              <w:rPr>
+                <w:highlight w:val="yellow"/>
+              </w:rPr>
+              <w:lastRenderedPageBreak/>
+              <w:t>and 2 meaning the process is executed on every other layer</w:t>
             </w:r>
           </w:p>
           <w:p>
@@ -9771,6 +9807,7 @@
               <w:rPr>
                 <w:highlight w:val="yellow"/>
               </w:rPr>
+              <w:lastRenderedPageBreak/>
               <w:t>What is an interval?</w:t>
             </w:r>
           </w:p>
@@ -9813,7 +9850,6 @@
               <w:rPr>
                 <w:highlight w:val="yellow"/>
               </w:rPr>
-              <w:lastRenderedPageBreak/>
               <w:t>US-66</w:t>
             </w:r>
           </w:p>
@@ -11093,6 +11129,7 @@
                 <w:highlight w:val="yellow"/>
                 <w:lang w:val="en-US"/>
               </w:rPr>
+              <w:lastRenderedPageBreak/>
               <w:t>SE</w:t>
             </w:r>
             <w:r>
@@ -11294,7 +11331,6 @@
               </w:rPr>
             </w:pPr>
             <w:r>
-              <w:lastRenderedPageBreak/>
               <w:t>ISO-1</w:t>
             </w:r>
           </w:p>
@@ -12222,6 +12258,7 @@
               <w:pStyle w:val="ISOMB"/>
             </w:pPr>
             <w:r>
+              <w:lastRenderedPageBreak/>
               <w:t>ISO-7</w:t>
             </w:r>
           </w:p>
@@ -12347,7 +12384,6 @@
               <w:rPr>
                 <w:lang w:val="en-US"/>
               </w:rPr>
-              <w:lastRenderedPageBreak/>
               <w:t>dimension;</w:t>
             </w:r>
           </w:p>
@@ -12456,7 +12492,6 @@
               <w:pStyle w:val="ISOChange"/>
             </w:pPr>
             <w:r>
-              <w:lastRenderedPageBreak/>
               <w:t>Please refer to ISO/IEC Directives Part 2, Clause 16 for instructions and formatting guidance.</w:t>
             </w:r>
           </w:p>
@@ -12473,7 +12508,6 @@
               <w:pStyle w:val="ISOChange"/>
             </w:pPr>
             <w:r>
-              <w:lastRenderedPageBreak/>
               <w:t>If you choose to refer to the terms from other documents, you should delete the current content and add this introductory sentence:</w:t>
             </w:r>
           </w:p>
@@ -12835,7 +12869,6 @@
               <w:rPr>
                 <w:lang w:val="en-US"/>
               </w:rPr>
-              <w:lastRenderedPageBreak/>
               <w:t>The mapping specification for the application objects in this UoF shall be as defined by ISO 10303-1006, ISO 10303-1026, ISO 10303-1030, ISO 10303-1110, ISO 10303-1118, ISO 10303-1681, and the specification below.</w:t>
             </w:r>
           </w:p>
@@ -13473,6 +13506,7 @@
               <w:rPr>
                 <w:lang w:val="en-US"/>
               </w:rPr>
+              <w:lastRenderedPageBreak/>
               <w:t>Ensure that all tables are cited in the text.</w:t>
             </w:r>
           </w:p>
@@ -13523,7 +13557,6 @@
               <w:pStyle w:val="ISOMB"/>
             </w:pPr>
             <w:r>
-              <w:lastRenderedPageBreak/>
               <w:t>SC4QC-1</w:t>
             </w:r>
           </w:p>
@@ -13986,6 +14019,7 @@
               <w:rPr>
                 <w:lang w:val="en-US"/>
               </w:rPr>
+              <w:lastRenderedPageBreak/>
               <w:t xml:space="preserve">ISO 10303-1797 </w:t>
             </w:r>
           </w:p>
@@ -14014,7 +14048,6 @@
               <w:rPr>
                 <w:lang w:val="en-US"/>
               </w:rPr>
-              <w:lastRenderedPageBreak/>
               <w:t>ISO 1101</w:t>
             </w:r>
           </w:p>
@@ -14319,6 +14352,7 @@
               <w:rPr>
                 <w:lang w:val="en-US"/>
               </w:rPr>
+              <w:lastRenderedPageBreak/>
               <w:t>clause4</w:t>
             </w:r>
             <w:r>
@@ -14347,14 +14381,7 @@
                 <w:lang w:val="en-US"/>
               </w:rPr>
               <w:tab/>
-              <w:t xml:space="preserve">EXAMPLEA Feature_complete_probing could adjust the </w:t>
-            </w:r>
-            <w:r>
-              <w:rPr>
-                <w:lang w:val="en-US"/>
-              </w:rPr>
-              <w:lastRenderedPageBreak/>
-              <w:t>position of a product such as a fastener, or a process such as a drilling operation.</w:t>
+              <w:t>EXAMPLEA Feature_complete_probing could adjust the position of a product such as a fastener, or a process such as a drilling operation.</w:t>
             </w:r>
           </w:p>
           <w:p>
@@ -14515,6 +14542,7 @@
               <w:rPr>
                 <w:lang w:val="en-US"/>
               </w:rPr>
+              <w:lastRenderedPageBreak/>
               <w:t>clause4</w:t>
             </w:r>
             <w:r>
@@ -14536,7 +14564,6 @@
               <w:rPr>
                 <w:lang w:val="en-US"/>
               </w:rPr>
-              <w:lastRenderedPageBreak/>
               <w:t>clause5</w:t>
             </w:r>
             <w:r>
@@ -14705,6 +14732,7 @@
               <w:rPr>
                 <w:lang w:val="en-US"/>
               </w:rPr>
+              <w:lastRenderedPageBreak/>
               <w:t>clause4</w:t>
             </w:r>
             <w:r>
@@ -14747,6 +14775,195 @@
               <w:rPr>
                 <w:lang w:val="en-US"/>
               </w:rPr>
+              <w:t>clause4</w:t>
+            </w:r>
+            <w:r>
+              <w:rPr>
+                <w:lang w:val="en-US"/>
+              </w:rPr>
+              <w:tab/>
+              <w:t>If compute_thin_wall is false or unspecified, they may not.</w:t>
+            </w:r>
+          </w:p>
+          <w:p>
+            <w:pPr>
+              <w:pStyle w:val="ISOComments"/>
+              <w:rPr>
+                <w:lang w:val="en-US"/>
+              </w:rPr>
+            </w:pPr>
+            <w:r>
+              <w:rPr>
+                <w:lang w:val="en-US"/>
+              </w:rPr>
+              <w:t>clause4</w:t>
+            </w:r>
+            <w:r>
+              <w:rPr>
+                <w:lang w:val="en-US"/>
+              </w:rPr>
+              <w:tab/>
+              <w:t>The its_support_geometry may not be specified for a particular Executable.</w:t>
+            </w:r>
+          </w:p>
+          <w:p>
+            <w:pPr>
+              <w:pStyle w:val="ISOComments"/>
+              <w:rPr>
+                <w:lang w:val="en-US"/>
+              </w:rPr>
+            </w:pPr>
+            <w:r>
+              <w:rPr>
+                <w:lang w:val="en-US"/>
+              </w:rPr>
+              <w:t>clause4</w:t>
+            </w:r>
+            <w:r>
+              <w:rPr>
+                <w:lang w:val="en-US"/>
+              </w:rPr>
+              <w:tab/>
+              <w:t>PLC measurements may not be portable between machines.</w:t>
+            </w:r>
+          </w:p>
+          <w:p>
+            <w:pPr>
+              <w:pStyle w:val="ISOComments"/>
+              <w:rPr>
+                <w:lang w:val="en-US"/>
+              </w:rPr>
+            </w:pPr>
+            <w:r>
+              <w:rPr>
+                <w:lang w:val="en-US"/>
+              </w:rPr>
+              <w:t>clause4</w:t>
+            </w:r>
+            <w:r>
+              <w:rPr>
+                <w:lang w:val="en-US"/>
+              </w:rPr>
+              <w:tab/>
+              <w:t>The clamping shall be performed at high speed if high_speed is true, and may not if high_speed is false or not specified.</w:t>
+            </w:r>
+          </w:p>
+          <w:p>
+            <w:pPr>
+              <w:pStyle w:val="ISOComments"/>
+              <w:rPr>
+                <w:lang w:val="en-US"/>
+              </w:rPr>
+            </w:pPr>
+            <w:r>
+              <w:rPr>
+                <w:lang w:val="en-US"/>
+              </w:rPr>
+              <w:t>clause4</w:t>
+            </w:r>
+            <w:r>
+              <w:rPr>
+                <w:lang w:val="en-US"/>
+              </w:rPr>
+              <w:tab/>
+              <w:t>The its_toolref_direction may not be specified for a particular Cutter_contact_trajectory.</w:t>
+            </w:r>
+          </w:p>
+          <w:p>
+            <w:pPr>
+              <w:pStyle w:val="ISOComments"/>
+              <w:rPr>
+                <w:lang w:val="en-US"/>
+              </w:rPr>
+            </w:pPr>
+            <w:r>
+              <w:rPr>
+                <w:lang w:val="en-US"/>
+              </w:rPr>
+              <w:t>clause4</w:t>
+            </w:r>
+            <w:r>
+              <w:rPr>
+                <w:lang w:val="en-US"/>
+              </w:rPr>
+              <w:tab/>
+              <w:t>The path_maximum_deviation may not be specified for a particular Cutter_contact_trajectory.</w:t>
+            </w:r>
+          </w:p>
+          <w:p>
+            <w:pPr>
+              <w:pStyle w:val="ISOComments"/>
+              <w:rPr>
+                <w:lang w:val="en-US"/>
+              </w:rPr>
+            </w:pPr>
+            <w:r>
+              <w:rPr>
+                <w:lang w:val="en-US"/>
+              </w:rPr>
+              <w:t>clause4</w:t>
+            </w:r>
+            <w:r>
+              <w:rPr>
+                <w:lang w:val="en-US"/>
+              </w:rPr>
+              <w:tab/>
+              <w:t>The tool_axis_maximum_deviation may not be specified for a particular Cutter_contact_trajectory.</w:t>
+            </w:r>
+          </w:p>
+          <w:p>
+            <w:pPr>
+              <w:pStyle w:val="ISOComments"/>
+              <w:rPr>
+                <w:lang w:val="en-US"/>
+              </w:rPr>
+            </w:pPr>
+            <w:r>
+              <w:rPr>
+                <w:lang w:val="en-US"/>
+              </w:rPr>
+              <w:t>clause4</w:t>
+            </w:r>
+            <w:r>
+              <w:rPr>
+                <w:lang w:val="en-US"/>
+              </w:rPr>
+              <w:tab/>
+              <w:t>The its_toolref_direction may not be specified for a particular Cutter_location_trajectory.</w:t>
+            </w:r>
+          </w:p>
+          <w:p>
+            <w:pPr>
+              <w:pStyle w:val="ISOComments"/>
+              <w:rPr>
+                <w:lang w:val="en-US"/>
+              </w:rPr>
+            </w:pPr>
+            <w:r>
+              <w:rPr>
+                <w:lang w:val="en-US"/>
+              </w:rPr>
+              <w:t>clause4</w:t>
+            </w:r>
+            <w:r>
+              <w:rPr>
+                <w:lang w:val="en-US"/>
+              </w:rPr>
+              <w:tab/>
+              <w:t>The path_maximum_deviation may not be specified for a particular Cutter_location_trajectory.</w:t>
+            </w:r>
+          </w:p>
+          <w:p>
+            <w:pPr>
+              <w:pStyle w:val="ISOComments"/>
+              <w:rPr>
+                <w:lang w:val="en-US"/>
+              </w:rPr>
+            </w:pPr>
+            <w:r>
+              <w:rPr>
+                <w:lang w:val="en-US"/>
+              </w:rPr>
               <w:lastRenderedPageBreak/>
               <w:t>clause4</w:t>
             </w:r>
@@ -14755,7 +14972,7 @@
                 <w:lang w:val="en-US"/>
               </w:rPr>
               <w:tab/>
-              <w:t>If compute_thin_wall is false or unspecified, they may not.</w:t>
+              <w:t>The tool_axis_maximum_deviation may not be specified for a particular Cutter_location_trajectory.</w:t>
             </w:r>
           </w:p>
           <w:p>
@@ -14776,7 +14993,7 @@
                 <w:lang w:val="en-US"/>
               </w:rPr>
               <w:tab/>
-              <w:t>The its_support_geometry may not be specified for a particular Executable.</w:t>
+              <w:t>The as_is may not be specified for a particular Executable.</w:t>
             </w:r>
           </w:p>
           <w:p>
@@ -14797,7 +15014,7 @@
                 <w:lang w:val="en-US"/>
               </w:rPr>
               <w:tab/>
-              <w:t>PLC measurements may not be portable between machines.</w:t>
+              <w:t>The enabled may not be specified for a particular Executable.</w:t>
             </w:r>
           </w:p>
           <w:p>
@@ -14818,7 +15035,7 @@
                 <w:lang w:val="en-US"/>
               </w:rPr>
               <w:tab/>
-              <w:t>The clamping shall be performed at high speed if high_speed is true, and may not if high_speed is false or not specified.</w:t>
+              <w:t>The machine_used may not be specified for a particular Executable.</w:t>
             </w:r>
           </w:p>
           <w:p>
@@ -14839,7 +15056,7 @@
                 <w:lang w:val="en-US"/>
               </w:rPr>
               <w:tab/>
-              <w:t>The its_toolref_direction may not be specified for a particular Cutter_contact_trajectory.</w:t>
+              <w:t>The process_properties describe characteristics of an Executable that may not be conveyed using other capabilities of this document.</w:t>
             </w:r>
           </w:p>
           <w:p>
@@ -14860,7 +15077,7 @@
                 <w:lang w:val="en-US"/>
               </w:rPr>
               <w:tab/>
-              <w:t>The path_maximum_deviation may not be specified for a particular Cutter_contact_trajectory.</w:t>
+              <w:t>The removal may not be specified for a particular Executable.</w:t>
             </w:r>
           </w:p>
           <w:p>
@@ -14881,7 +15098,7 @@
                 <w:lang w:val="en-US"/>
               </w:rPr>
               <w:tab/>
-              <w:t>The tool_axis_maximum_deviation may not be specified for a particular Cutter_contact_trajectory.</w:t>
+              <w:t>The to_be may not be specified for a particular Executable.</w:t>
             </w:r>
           </w:p>
           <w:p>
@@ -14902,7 +15119,7 @@
                 <w:lang w:val="en-US"/>
               </w:rPr>
               <w:tab/>
-              <w:t>The its_toolref_direction may not be specified for a particular Cutter_location_trajectory.</w:t>
+              <w:t>The twin_end may not be specified for a particular Executable.</w:t>
             </w:r>
           </w:p>
           <w:p>
@@ -14923,7 +15140,7 @@
                 <w:lang w:val="en-US"/>
               </w:rPr>
               <w:tab/>
-              <w:t>The path_maximum_deviation may not be specified for a particular Cutter_location_trajectory.</w:t>
+              <w:t>The twin_exception may not be specified for a particular Executable.</w:t>
             </w:r>
           </w:p>
           <w:p>
@@ -14944,7 +15161,49 @@
                 <w:lang w:val="en-US"/>
               </w:rPr>
               <w:tab/>
-              <w:t>The tool_axis_maximum_deviation may not be specified for a particular Cutter_location_trajectory.</w:t>
+              <w:t>The twin_plan may not be specified for a particular Executable.</w:t>
+            </w:r>
+          </w:p>
+          <w:p>
+            <w:pPr>
+              <w:pStyle w:val="ISOComments"/>
+              <w:rPr>
+                <w:lang w:val="en-US"/>
+              </w:rPr>
+            </w:pPr>
+            <w:r>
+              <w:rPr>
+                <w:lang w:val="en-US"/>
+              </w:rPr>
+              <w:t>clause4</w:t>
+            </w:r>
+            <w:r>
+              <w:rPr>
+                <w:lang w:val="en-US"/>
+              </w:rPr>
+              <w:tab/>
+              <w:t>The twin_source may not be specified for a particular Executable.</w:t>
+            </w:r>
+          </w:p>
+          <w:p>
+            <w:pPr>
+              <w:pStyle w:val="ISOComments"/>
+              <w:rPr>
+                <w:lang w:val="en-US"/>
+              </w:rPr>
+            </w:pPr>
+            <w:r>
+              <w:rPr>
+                <w:lang w:val="en-US"/>
+              </w:rPr>
+              <w:t>clause4</w:t>
+            </w:r>
+            <w:r>
+              <w:rPr>
+                <w:lang w:val="en-US"/>
+              </w:rPr>
+              <w:tab/>
+              <w:t>The twin_start may not be specified for a particular Executable.</w:t>
             </w:r>
           </w:p>
           <w:p>
@@ -14966,7 +15225,7 @@
                 <w:lang w:val="en-US"/>
               </w:rPr>
               <w:tab/>
-              <w:t>The as_is may not be specified for a particular Executable.</w:t>
+              <w:t>The twin_worktime may not be specified for a particular Executable.</w:t>
             </w:r>
           </w:p>
           <w:p>
@@ -14987,7 +15246,7 @@
                 <w:lang w:val="en-US"/>
               </w:rPr>
               <w:tab/>
-              <w:t>The enabled may not be specified for a particular Executable.</w:t>
+              <w:t>The its_machine_functions may not be specified for a particular Extended_operation.</w:t>
             </w:r>
           </w:p>
           <w:p>
@@ -15008,7 +15267,7 @@
                 <w:lang w:val="en-US"/>
               </w:rPr>
               <w:tab/>
-              <w:t>The machine_used may not be specified for a particular Executable.</w:t>
+              <w:t>The its_technology may not be specified for a particular Extended_operation.</w:t>
             </w:r>
           </w:p>
           <w:p>
@@ -15029,7 +15288,7 @@
                 <w:lang w:val="en-US"/>
               </w:rPr>
               <w:tab/>
-              <w:t>The process_properties describe characteristics of an Executable that may not be conveyed using other capabilities of this document.</w:t>
+              <w:t>The its_tool may not be specified for a particular Extended_operation.</w:t>
             </w:r>
           </w:p>
           <w:p>
@@ -15050,7 +15309,7 @@
                 <w:lang w:val="en-US"/>
               </w:rPr>
               <w:tab/>
-              <w:t>The removal may not be specified for a particular Executable.</w:t>
+              <w:t>The expected_value may not be specified for a particular Feature_complete_probing.</w:t>
             </w:r>
           </w:p>
           <w:p>
@@ -15071,7 +15330,7 @@
                 <w:lang w:val="en-US"/>
               </w:rPr>
               <w:tab/>
-              <w:t>The to_be may not be specified for a particular Executable.</w:t>
+              <w:t>The description may not be specified for a particular Fixture_usage.</w:t>
             </w:r>
           </w:p>
           <w:p>
@@ -15092,7 +15351,7 @@
                 <w:lang w:val="en-US"/>
               </w:rPr>
               <w:tab/>
-              <w:t>The twin_end may not be specified for a particular Executable.</w:t>
+              <w:t>The its_product may not be specified for a particular Fixture_usage.</w:t>
             </w:r>
           </w:p>
           <w:p>
@@ -15113,7 +15372,7 @@
                 <w:lang w:val="en-US"/>
               </w:rPr>
               <w:tab/>
-              <w:t>The twin_exception may not be specified for a particular Executable.</w:t>
+              <w:t>The mount_reference may not be specified for a particular Fixture_usage.</w:t>
             </w:r>
           </w:p>
           <w:p>
@@ -15134,7 +15393,7 @@
                 <w:lang w:val="en-US"/>
               </w:rPr>
               <w:tab/>
-              <w:t>The twin_plan may not be specified for a particular Executable.</w:t>
+              <w:t>The workpiece_reference may not be specified for a particular Fixture_usage.</w:t>
             </w:r>
           </w:p>
           <w:p>
@@ -15155,7 +15414,7 @@
                 <w:lang w:val="en-US"/>
               </w:rPr>
               <w:tab/>
-              <w:t>The twin_source may not be specified for a particular Executable.</w:t>
+              <w:t>The axis_travel may not be specified for a particular Machine_parameters and the axis_travel shall not be specified if work_volume_length, work_volume_width, or work_volume_height is specified.</w:t>
             </w:r>
           </w:p>
           <w:p>
@@ -15176,28 +15435,7 @@
                 <w:lang w:val="en-US"/>
               </w:rPr>
               <w:tab/>
-              <w:t>The twin_start may not be specified for a particular Executable.</w:t>
-            </w:r>
-          </w:p>
-          <w:p>
-            <w:pPr>
-              <w:pStyle w:val="ISOComments"/>
-              <w:rPr>
-                <w:lang w:val="en-US"/>
-              </w:rPr>
-            </w:pPr>
-            <w:r>
-              <w:rPr>
-                <w:lang w:val="en-US"/>
-              </w:rPr>
-              <w:t>clause4</w:t>
-            </w:r>
-            <w:r>
-              <w:rPr>
-                <w:lang w:val="en-US"/>
-              </w:rPr>
-              <w:tab/>
-              <w:t>The twin_worktime may not be specified for a particular Executable.</w:t>
+              <w:t>The feedrate may not be specified for a particular Machine_parameters.</w:t>
             </w:r>
           </w:p>
           <w:p>
@@ -15219,7 +15457,7 @@
                 <w:lang w:val="en-US"/>
               </w:rPr>
               <w:tab/>
-              <w:t>The its_machine_functions may not be specified for a particular Extended_operation.</w:t>
+              <w:t>The number_of_control_axis may not be specified for a particular Machine_parameters.</w:t>
             </w:r>
           </w:p>
           <w:p>
@@ -15240,7 +15478,7 @@
                 <w:lang w:val="en-US"/>
               </w:rPr>
               <w:tab/>
-              <w:t>The its_technology may not be specified for a particular Extended_operation.</w:t>
+              <w:t>The number_of_simultaneous_axis may not be specified for a particular Machine_parameters.</w:t>
             </w:r>
           </w:p>
           <w:p>
@@ -15261,7 +15499,7 @@
                 <w:lang w:val="en-US"/>
               </w:rPr>
               <w:tab/>
-              <w:t>The its_tool may not be specified for a particular Extended_operation.</w:t>
+              <w:t>The positioning_accuracy may not be specified for a particular Machine_parameters.</w:t>
             </w:r>
           </w:p>
           <w:p>
@@ -15282,7 +15520,7 @@
                 <w:lang w:val="en-US"/>
               </w:rPr>
               <w:tab/>
-              <w:t>The expected_value may not be specified for a particular Feature_complete_probing.</w:t>
+              <w:t>The spindle_power may not be specified for a particular Machine_parameters.</w:t>
             </w:r>
           </w:p>
           <w:p>
@@ -15303,7 +15541,7 @@
                 <w:lang w:val="en-US"/>
               </w:rPr>
               <w:tab/>
-              <w:t>The description may not be specified for a particular Fixture_usage.</w:t>
+              <w:t>The spindle_torque may not be specified for a particular Machine_parameters.</w:t>
             </w:r>
           </w:p>
           <w:p>
@@ -15324,7 +15562,7 @@
                 <w:lang w:val="en-US"/>
               </w:rPr>
               <w:tab/>
-              <w:t>The its_product may not be specified for a particular Fixture_usage.</w:t>
+              <w:t>The spindle_speed may not be specified for a particular Machine_parameters.</w:t>
             </w:r>
           </w:p>
           <w:p>
@@ -15345,7 +15583,7 @@
                 <w:lang w:val="en-US"/>
               </w:rPr>
               <w:tab/>
-              <w:t>The mount_reference may not be specified for a particular Fixture_usage.</w:t>
+              <w:t>The table_indexing may not be specified for a particular Machine_parameters.</w:t>
             </w:r>
           </w:p>
           <w:p>
@@ -15366,7 +15604,7 @@
                 <w:lang w:val="en-US"/>
               </w:rPr>
               <w:tab/>
-              <w:t>The workpiece_reference may not be specified for a particular Fixture_usage.</w:t>
+              <w:t>The table_length may not be specified for a particular Machine_parameters.</w:t>
             </w:r>
           </w:p>
           <w:p>
@@ -15387,7 +15625,7 @@
                 <w:lang w:val="en-US"/>
               </w:rPr>
               <w:tab/>
-              <w:t>The axis_travel may not be specified for a particular Machine_parameters and the axis_travel shall not be specified if work_volume_length, work_volume_width, or work_volume_height is specified.</w:t>
+              <w:t>The table_width may not be specified for a particular Machine_parameters.</w:t>
             </w:r>
           </w:p>
           <w:p>
@@ -15408,7 +15646,7 @@
                 <w:lang w:val="en-US"/>
               </w:rPr>
               <w:tab/>
-              <w:t>The feedrate may not be specified for a particular Machine_parameters.</w:t>
+              <w:t>The work_volume_height may not be specified for a particular Machine_parameters and the work_volume_height shall not be specified if axis_travel is specified.</w:t>
             </w:r>
           </w:p>
           <w:p>
@@ -15429,7 +15667,7 @@
                 <w:lang w:val="en-US"/>
               </w:rPr>
               <w:tab/>
-              <w:t>The number_of_control_axis may not be specified for a particular Machine_parameters.</w:t>
+              <w:t>The work_volume_length may not be specified for a particular Machine_parameters and the work_volume_length shall not be specified if axis_travel is specified.</w:t>
             </w:r>
           </w:p>
           <w:p>
@@ -15451,224 +15689,7 @@
                 <w:lang w:val="en-US"/>
               </w:rPr>
               <w:tab/>
-              <w:t>The number_of_simultaneous_axis may not be specified for a particular Machine_parameters.</w:t>
-            </w:r>
-          </w:p>
-          <w:p>
-            <w:pPr>
-              <w:pStyle w:val="ISOComments"/>
-              <w:rPr>
-                <w:lang w:val="en-US"/>
-              </w:rPr>
-            </w:pPr>
-            <w:r>
-              <w:rPr>
-                <w:lang w:val="en-US"/>
-              </w:rPr>
-              <w:t>clause4</w:t>
-            </w:r>
-            <w:r>
-              <w:rPr>
-                <w:lang w:val="en-US"/>
-              </w:rPr>
-              <w:tab/>
-              <w:t>The positioning_accuracy may not be specified for a particular Machine_parameters.</w:t>
-            </w:r>
-          </w:p>
-          <w:p>
-            <w:pPr>
-              <w:pStyle w:val="ISOComments"/>
-              <w:rPr>
-                <w:lang w:val="en-US"/>
-              </w:rPr>
-            </w:pPr>
-            <w:r>
-              <w:rPr>
-                <w:lang w:val="en-US"/>
-              </w:rPr>
-              <w:t>clause4</w:t>
-            </w:r>
-            <w:r>
-              <w:rPr>
-                <w:lang w:val="en-US"/>
-              </w:rPr>
-              <w:tab/>
-              <w:t>The spindle_power may not be specified for a particular Machine_parameters.</w:t>
-            </w:r>
-          </w:p>
-          <w:p>
-            <w:pPr>
-              <w:pStyle w:val="ISOComments"/>
-              <w:rPr>
-                <w:lang w:val="en-US"/>
-              </w:rPr>
-            </w:pPr>
-            <w:r>
-              <w:rPr>
-                <w:lang w:val="en-US"/>
-              </w:rPr>
-              <w:t>clause4</w:t>
-            </w:r>
-            <w:r>
-              <w:rPr>
-                <w:lang w:val="en-US"/>
-              </w:rPr>
-              <w:tab/>
-              <w:t>The spindle_torque may not be specified for a particular Machine_parameters.</w:t>
-            </w:r>
-          </w:p>
-          <w:p>
-            <w:pPr>
-              <w:pStyle w:val="ISOComments"/>
-              <w:rPr>
-                <w:lang w:val="en-US"/>
-              </w:rPr>
-            </w:pPr>
-            <w:r>
-              <w:rPr>
-                <w:lang w:val="en-US"/>
-              </w:rPr>
-              <w:t>clause4</w:t>
-            </w:r>
-            <w:r>
-              <w:rPr>
-                <w:lang w:val="en-US"/>
-              </w:rPr>
-              <w:tab/>
-              <w:t>The spindle_speed may not be specified for a particular Machine_parameters.</w:t>
-            </w:r>
-          </w:p>
-          <w:p>
-            <w:pPr>
-              <w:pStyle w:val="ISOComments"/>
-              <w:rPr>
-                <w:lang w:val="en-US"/>
-              </w:rPr>
-            </w:pPr>
-            <w:r>
-              <w:rPr>
-                <w:lang w:val="en-US"/>
-              </w:rPr>
-              <w:t>clause4</w:t>
-            </w:r>
-            <w:r>
-              <w:rPr>
-                <w:lang w:val="en-US"/>
-              </w:rPr>
-              <w:tab/>
-              <w:t>The table_indexing may not be specified for a particular Machine_parameters.</w:t>
-            </w:r>
-          </w:p>
-          <w:p>
-            <w:pPr>
-              <w:pStyle w:val="ISOComments"/>
-              <w:rPr>
-                <w:lang w:val="en-US"/>
-              </w:rPr>
-            </w:pPr>
-            <w:r>
-              <w:rPr>
-                <w:lang w:val="en-US"/>
-              </w:rPr>
-              <w:t>clause4</w:t>
-            </w:r>
-            <w:r>
-              <w:rPr>
-                <w:lang w:val="en-US"/>
-              </w:rPr>
-              <w:tab/>
-              <w:t>The table_length may not be specified for a particular Machine_parameters.</w:t>
-            </w:r>
-          </w:p>
-          <w:p>
-            <w:pPr>
-              <w:pStyle w:val="ISOComments"/>
-              <w:rPr>
-                <w:lang w:val="en-US"/>
-              </w:rPr>
-            </w:pPr>
-            <w:r>
-              <w:rPr>
-                <w:lang w:val="en-US"/>
-              </w:rPr>
-              <w:t>clause4</w:t>
-            </w:r>
-            <w:r>
-              <w:rPr>
-                <w:lang w:val="en-US"/>
-              </w:rPr>
-              <w:tab/>
-              <w:t>The table_width may not be specified for a particular Machine_parameters.</w:t>
-            </w:r>
-          </w:p>
-          <w:p>
-            <w:pPr>
-              <w:pStyle w:val="ISOComments"/>
-              <w:rPr>
-                <w:lang w:val="en-US"/>
-              </w:rPr>
-            </w:pPr>
-            <w:r>
-              <w:rPr>
-                <w:lang w:val="en-US"/>
-              </w:rPr>
-              <w:t>clause4</w:t>
-            </w:r>
-            <w:r>
-              <w:rPr>
-                <w:lang w:val="en-US"/>
-              </w:rPr>
-              <w:tab/>
-              <w:t>The work_volume_height may not be specified for a particular Machine_parameters and the work_volume_height shall not be specified if axis_travel is specified.</w:t>
-            </w:r>
-          </w:p>
-          <w:p>
-            <w:pPr>
-              <w:pStyle w:val="ISOComments"/>
-              <w:rPr>
-                <w:lang w:val="en-US"/>
-              </w:rPr>
-            </w:pPr>
-            <w:r>
-              <w:rPr>
-                <w:lang w:val="en-US"/>
-              </w:rPr>
-              <w:t>clause4</w:t>
-            </w:r>
-            <w:r>
-              <w:rPr>
-                <w:lang w:val="en-US"/>
-              </w:rPr>
-              <w:tab/>
-              <w:t>The work_volume_length may not be specified for a particular Machine_parameters and the work_volume_length shall not be specified if axis_travel is specified.</w:t>
-            </w:r>
-          </w:p>
-          <w:p>
-            <w:pPr>
-              <w:pStyle w:val="ISOComments"/>
-              <w:rPr>
-                <w:lang w:val="en-US"/>
-              </w:rPr>
-            </w:pPr>
-            <w:r>
-              <w:rPr>
-                <w:lang w:val="en-US"/>
-              </w:rPr>
-              <w:t>clause4</w:t>
-            </w:r>
-            <w:r>
-              <w:rPr>
-                <w:lang w:val="en-US"/>
-              </w:rPr>
-              <w:tab/>
-              <w:t xml:space="preserve">The work_volume_width may not be specified for a particular Machine_parameters </w:t>
-            </w:r>
-            <w:r>
-              <w:rPr>
-                <w:lang w:val="en-US"/>
-              </w:rPr>
-              <w:lastRenderedPageBreak/>
-              <w:t>and the work_volume_width shall not be specified if axis_travel is specified.</w:t>
+              <w:t>The work_volume_width may not be specified for a particular Machine_parameters and the work_volume_width shall not be specified if axis_travel is specified.</w:t>
             </w:r>
           </w:p>
           <w:p>
@@ -15913,6 +15934,7 @@
               <w:rPr>
                 <w:lang w:val="en-US"/>
               </w:rPr>
+              <w:lastRenderedPageBreak/>
               <w:t>clause4</w:t>
             </w:r>
             <w:r>
@@ -15934,6 +15956,237 @@
               <w:rPr>
                 <w:lang w:val="en-US"/>
               </w:rPr>
+              <w:t>clause4</w:t>
+            </w:r>
+            <w:r>
+              <w:rPr>
+                <w:lang w:val="en-US"/>
+              </w:rPr>
+              <w:tab/>
+              <w:t>The its_product may not be specified for a particular Tool_usage.</w:t>
+            </w:r>
+          </w:p>
+          <w:p>
+            <w:pPr>
+              <w:pStyle w:val="ISOComments"/>
+              <w:rPr>
+                <w:lang w:val="en-US"/>
+              </w:rPr>
+            </w:pPr>
+            <w:r>
+              <w:rPr>
+                <w:lang w:val="en-US"/>
+              </w:rPr>
+              <w:t>clause4</w:t>
+            </w:r>
+            <w:r>
+              <w:rPr>
+                <w:lang w:val="en-US"/>
+              </w:rPr>
+              <w:tab/>
+              <w:t>The tool_end_placement may not be specified for a particular Tool_usage.</w:t>
+            </w:r>
+          </w:p>
+          <w:p>
+            <w:pPr>
+              <w:pStyle w:val="ISOComments"/>
+              <w:rPr>
+                <w:lang w:val="en-US"/>
+              </w:rPr>
+            </w:pPr>
+            <w:r>
+              <w:rPr>
+                <w:lang w:val="en-US"/>
+              </w:rPr>
+              <w:t>clause4</w:t>
+            </w:r>
+            <w:r>
+              <w:rPr>
+                <w:lang w:val="en-US"/>
+              </w:rPr>
+              <w:tab/>
+              <w:t>The its_id may not be specified for a particular Toolpath.</w:t>
+            </w:r>
+          </w:p>
+          <w:p>
+            <w:pPr>
+              <w:pStyle w:val="ISOComments"/>
+              <w:rPr>
+                <w:lang w:val="en-US"/>
+              </w:rPr>
+            </w:pPr>
+            <w:r>
+              <w:rPr>
+                <w:lang w:val="en-US"/>
+              </w:rPr>
+              <w:t>clause4</w:t>
+            </w:r>
+            <w:r>
+              <w:rPr>
+                <w:lang w:val="en-US"/>
+              </w:rPr>
+              <w:tab/>
+              <w:t>The ball_radius may not be specified for a particular Touch_probe.</w:t>
+            </w:r>
+          </w:p>
+          <w:p>
+            <w:pPr>
+              <w:pStyle w:val="ISOComments"/>
+              <w:rPr>
+                <w:lang w:val="en-US"/>
+              </w:rPr>
+            </w:pPr>
+            <w:r>
+              <w:rPr>
+                <w:lang w:val="en-US"/>
+              </w:rPr>
+              <w:t>clause4</w:t>
+            </w:r>
+            <w:r>
+              <w:rPr>
+                <w:lang w:val="en-US"/>
+              </w:rPr>
+              <w:tab/>
+              <w:t>The stylus_diameter may not be specified for a particular Touch_probe.</w:t>
+            </w:r>
+          </w:p>
+          <w:p>
+            <w:pPr>
+              <w:pStyle w:val="ISOComments"/>
+              <w:rPr>
+                <w:lang w:val="en-US"/>
+              </w:rPr>
+            </w:pPr>
+            <w:r>
+              <w:rPr>
+                <w:lang w:val="en-US"/>
+              </w:rPr>
+              <w:t>clause4</w:t>
+            </w:r>
+            <w:r>
+              <w:rPr>
+                <w:lang w:val="en-US"/>
+              </w:rPr>
+              <w:tab/>
+              <w:t>The its_material_removal_depth may not be specified for a particular Trajectory.</w:t>
+            </w:r>
+          </w:p>
+          <w:p>
+            <w:pPr>
+              <w:pStyle w:val="ISOComments"/>
+              <w:rPr>
+                <w:lang w:val="en-US"/>
+              </w:rPr>
+            </w:pPr>
+            <w:r>
+              <w:rPr>
+                <w:lang w:val="en-US"/>
+              </w:rPr>
+              <w:t>clause4</w:t>
+            </w:r>
+            <w:r>
+              <w:rPr>
+                <w:lang w:val="en-US"/>
+              </w:rPr>
+              <w:tab/>
+              <w:t>The its_material_removal_overcut may not be specified for a particular Trajectory.</w:t>
+            </w:r>
+          </w:p>
+          <w:p>
+            <w:pPr>
+              <w:pStyle w:val="ISOComments"/>
+              <w:rPr>
+                <w:lang w:val="en-US"/>
+              </w:rPr>
+            </w:pPr>
+            <w:r>
+              <w:rPr>
+                <w:lang w:val="en-US"/>
+              </w:rPr>
+              <w:t>clause4</w:t>
+            </w:r>
+            <w:r>
+              <w:rPr>
+                <w:lang w:val="en-US"/>
+              </w:rPr>
+              <w:tab/>
+              <w:t>The its_material_removal_total_volume may not be specified for a particular Trajectory.</w:t>
+            </w:r>
+          </w:p>
+          <w:p>
+            <w:pPr>
+              <w:pStyle w:val="ISOComments"/>
+              <w:rPr>
+                <w:lang w:val="en-US"/>
+              </w:rPr>
+            </w:pPr>
+            <w:r>
+              <w:rPr>
+                <w:lang w:val="en-US"/>
+              </w:rPr>
+              <w:t>clause4</w:t>
+            </w:r>
+            <w:r>
+              <w:rPr>
+                <w:lang w:val="en-US"/>
+              </w:rPr>
+              <w:tab/>
+              <w:t>The cross_section_area_parameters may not be specified for a particular Trajectory.</w:t>
+            </w:r>
+          </w:p>
+          <w:p>
+            <w:pPr>
+              <w:pStyle w:val="ISOComments"/>
+              <w:rPr>
+                <w:lang w:val="en-US"/>
+              </w:rPr>
+            </w:pPr>
+            <w:r>
+              <w:rPr>
+                <w:lang w:val="en-US"/>
+              </w:rPr>
+              <w:t>clause4</w:t>
+            </w:r>
+            <w:r>
+              <w:rPr>
+                <w:lang w:val="en-US"/>
+              </w:rPr>
+              <w:tab/>
+              <w:t>The toolpath_orientation may not be specified for a particular Workingstep.</w:t>
+            </w:r>
+          </w:p>
+          <w:p>
+            <w:pPr>
+              <w:pStyle w:val="ISOComments"/>
+              <w:rPr>
+                <w:lang w:val="en-US"/>
+              </w:rPr>
+            </w:pPr>
+            <w:r>
+              <w:rPr>
+                <w:lang w:val="en-US"/>
+              </w:rPr>
+              <w:t>clause4</w:t>
+            </w:r>
+            <w:r>
+              <w:rPr>
+                <w:lang w:val="en-US"/>
+              </w:rPr>
+              <w:tab/>
+              <w:t>The its_approvals may not be specified for a particular Workpiece.</w:t>
+            </w:r>
+          </w:p>
+          <w:p>
+            <w:pPr>
+              <w:pStyle w:val="ISOComments"/>
+              <w:rPr>
+                <w:lang w:val="en-US"/>
+              </w:rPr>
+            </w:pPr>
+            <w:r>
+              <w:rPr>
+                <w:lang w:val="en-US"/>
+              </w:rPr>
               <w:lastRenderedPageBreak/>
               <w:t>clause4</w:t>
             </w:r>
@@ -15942,7 +16195,7 @@
                 <w:lang w:val="en-US"/>
               </w:rPr>
               <w:tab/>
-              <w:t>The its_product may not be specified for a particular Tool_usage.</w:t>
+              <w:t>The its_categories may not be specified for a particular Workpiece.</w:t>
             </w:r>
           </w:p>
           <w:p>
@@ -15963,7 +16216,7 @@
                 <w:lang w:val="en-US"/>
               </w:rPr>
               <w:tab/>
-              <w:t>The tool_end_placement may not be specified for a particular Tool_usage.</w:t>
+              <w:t>The its_datestamps may not be specified for a particular Workpiece.</w:t>
             </w:r>
           </w:p>
           <w:p>
@@ -15984,7 +16237,7 @@
                 <w:lang w:val="en-US"/>
               </w:rPr>
               <w:tab/>
-              <w:t>The its_id may not be specified for a particular Toolpath.</w:t>
+              <w:t>The its_orgs may not be specified for a particular Workpiece.</w:t>
             </w:r>
           </w:p>
           <w:p>
@@ -16005,7 +16258,7 @@
                 <w:lang w:val="en-US"/>
               </w:rPr>
               <w:tab/>
-              <w:t>The ball_radius may not be specified for a particular Touch_probe.</w:t>
+              <w:t>The its_people may not be specified for a particular Workpiece.</w:t>
             </w:r>
           </w:p>
           <w:p>
@@ -16026,7 +16279,7 @@
                 <w:lang w:val="en-US"/>
               </w:rPr>
               <w:tab/>
-              <w:t>The stylus_diameter may not be specified for a particular Touch_probe.</w:t>
+              <w:t>The its_timestamps may not be specified for a particular Workpiece.</w:t>
             </w:r>
           </w:p>
           <w:p>
@@ -16047,7 +16300,7 @@
                 <w:lang w:val="en-US"/>
               </w:rPr>
               <w:tab/>
-              <w:t>The its_material_removal_depth may not be specified for a particular Trajectory.</w:t>
+              <w:t>The product_approvals may not be specified for a particular Workpiece.</w:t>
             </w:r>
           </w:p>
           <w:p>
@@ -16068,7 +16321,7 @@
                 <w:lang w:val="en-US"/>
               </w:rPr>
               <w:tab/>
-              <w:t>The its_material_removal_overcut may not be specified for a particular Trajectory.</w:t>
+              <w:t>The product_datestamps may not be specified for a particular Workpiece.</w:t>
             </w:r>
           </w:p>
           <w:p>
@@ -16089,7 +16342,7 @@
                 <w:lang w:val="en-US"/>
               </w:rPr>
               <w:tab/>
-              <w:t>The its_material_removal_total_volume may not be specified for a particular Trajectory.</w:t>
+              <w:t>The product_orgs may not be specified for a particular Workpiece.</w:t>
             </w:r>
           </w:p>
           <w:p>
@@ -16110,7 +16363,7 @@
                 <w:lang w:val="en-US"/>
               </w:rPr>
               <w:tab/>
-              <w:t>The cross_section_area_parameters may not be specified for a particular Trajectory.</w:t>
+              <w:t>The product_people may not be specified for a particular Workpiece.</w:t>
             </w:r>
           </w:p>
           <w:p>
@@ -16131,7 +16384,7 @@
                 <w:lang w:val="en-US"/>
               </w:rPr>
               <w:tab/>
-              <w:t>The toolpath_orientation may not be specified for a particular Workingstep.</w:t>
+              <w:t>The product_timestamps may not be specified for a particular Workpiece.</w:t>
             </w:r>
           </w:p>
           <w:p>
@@ -16152,7 +16405,7 @@
                 <w:lang w:val="en-US"/>
               </w:rPr>
               <w:tab/>
-              <w:t>The its_approvals may not be specified for a particular Workpiece.</w:t>
+              <w:t>The revision_approvals may not be specified for a particular Workpiece.</w:t>
             </w:r>
           </w:p>
           <w:p>
@@ -16173,7 +16426,28 @@
                 <w:lang w:val="en-US"/>
               </w:rPr>
               <w:tab/>
-              <w:t>The its_categories may not be specified for a particular Workpiece.</w:t>
+              <w:t>The revision_datestamps may not be specified for a particular Workpiece.</w:t>
+            </w:r>
+          </w:p>
+          <w:p>
+            <w:pPr>
+              <w:pStyle w:val="ISOComments"/>
+              <w:rPr>
+                <w:lang w:val="en-US"/>
+              </w:rPr>
+            </w:pPr>
+            <w:r>
+              <w:rPr>
+                <w:lang w:val="en-US"/>
+              </w:rPr>
+              <w:t>clause4</w:t>
+            </w:r>
+            <w:r>
+              <w:rPr>
+                <w:lang w:val="en-US"/>
+              </w:rPr>
+              <w:tab/>
+              <w:t>The revision_id may not be specified for a particular Workpiece.</w:t>
             </w:r>
           </w:p>
           <w:p>
@@ -16195,258 +16469,6 @@
                 <w:lang w:val="en-US"/>
               </w:rPr>
               <w:tab/>
-              <w:t>The its_datestamps may not be specified for a particular Workpiece.</w:t>
-            </w:r>
-          </w:p>
-          <w:p>
-            <w:pPr>
-              <w:pStyle w:val="ISOComments"/>
-              <w:rPr>
-                <w:lang w:val="en-US"/>
-              </w:rPr>
-            </w:pPr>
-            <w:r>
-              <w:rPr>
-                <w:lang w:val="en-US"/>
-              </w:rPr>
-              <w:t>clause4</w:t>
-            </w:r>
-            <w:r>
-              <w:rPr>
-                <w:lang w:val="en-US"/>
-              </w:rPr>
-              <w:tab/>
-              <w:t>The its_orgs may not be specified for a particular Workpiece.</w:t>
-            </w:r>
-          </w:p>
-          <w:p>
-            <w:pPr>
-              <w:pStyle w:val="ISOComments"/>
-              <w:rPr>
-                <w:lang w:val="en-US"/>
-              </w:rPr>
-            </w:pPr>
-            <w:r>
-              <w:rPr>
-                <w:lang w:val="en-US"/>
-              </w:rPr>
-              <w:t>clause4</w:t>
-            </w:r>
-            <w:r>
-              <w:rPr>
-                <w:lang w:val="en-US"/>
-              </w:rPr>
-              <w:tab/>
-              <w:t>The its_people may not be specified for a particular Workpiece.</w:t>
-            </w:r>
-          </w:p>
-          <w:p>
-            <w:pPr>
-              <w:pStyle w:val="ISOComments"/>
-              <w:rPr>
-                <w:lang w:val="en-US"/>
-              </w:rPr>
-            </w:pPr>
-            <w:r>
-              <w:rPr>
-                <w:lang w:val="en-US"/>
-              </w:rPr>
-              <w:t>clause4</w:t>
-            </w:r>
-            <w:r>
-              <w:rPr>
-                <w:lang w:val="en-US"/>
-              </w:rPr>
-              <w:tab/>
-              <w:t>The its_timestamps may not be specified for a particular Workpiece.</w:t>
-            </w:r>
-          </w:p>
-          <w:p>
-            <w:pPr>
-              <w:pStyle w:val="ISOComments"/>
-              <w:rPr>
-                <w:lang w:val="en-US"/>
-              </w:rPr>
-            </w:pPr>
-            <w:r>
-              <w:rPr>
-                <w:lang w:val="en-US"/>
-              </w:rPr>
-              <w:t>clause4</w:t>
-            </w:r>
-            <w:r>
-              <w:rPr>
-                <w:lang w:val="en-US"/>
-              </w:rPr>
-              <w:tab/>
-              <w:t>The product_approvals may not be specified for a particular Workpiece.</w:t>
-            </w:r>
-          </w:p>
-          <w:p>
-            <w:pPr>
-              <w:pStyle w:val="ISOComments"/>
-              <w:rPr>
-                <w:lang w:val="en-US"/>
-              </w:rPr>
-            </w:pPr>
-            <w:r>
-              <w:rPr>
-                <w:lang w:val="en-US"/>
-              </w:rPr>
-              <w:t>clause4</w:t>
-            </w:r>
-            <w:r>
-              <w:rPr>
-                <w:lang w:val="en-US"/>
-              </w:rPr>
-              <w:tab/>
-              <w:t>The product_datestamps may not be specified for a particular Workpiece.</w:t>
-            </w:r>
-          </w:p>
-          <w:p>
-            <w:pPr>
-              <w:pStyle w:val="ISOComments"/>
-              <w:rPr>
-                <w:lang w:val="en-US"/>
-              </w:rPr>
-            </w:pPr>
-            <w:r>
-              <w:rPr>
-                <w:lang w:val="en-US"/>
-              </w:rPr>
-              <w:t>clause4</w:t>
-            </w:r>
-            <w:r>
-              <w:rPr>
-                <w:lang w:val="en-US"/>
-              </w:rPr>
-              <w:tab/>
-              <w:t>The product_orgs may not be specified for a particular Workpiece.</w:t>
-            </w:r>
-          </w:p>
-          <w:p>
-            <w:pPr>
-              <w:pStyle w:val="ISOComments"/>
-              <w:rPr>
-                <w:lang w:val="en-US"/>
-              </w:rPr>
-            </w:pPr>
-            <w:r>
-              <w:rPr>
-                <w:lang w:val="en-US"/>
-              </w:rPr>
-              <w:t>clause4</w:t>
-            </w:r>
-            <w:r>
-              <w:rPr>
-                <w:lang w:val="en-US"/>
-              </w:rPr>
-              <w:tab/>
-              <w:t>The product_people may not be specified for a particular Workpiece.</w:t>
-            </w:r>
-          </w:p>
-          <w:p>
-            <w:pPr>
-              <w:pStyle w:val="ISOComments"/>
-              <w:rPr>
-                <w:lang w:val="en-US"/>
-              </w:rPr>
-            </w:pPr>
-            <w:r>
-              <w:rPr>
-                <w:lang w:val="en-US"/>
-              </w:rPr>
-              <w:t>clause4</w:t>
-            </w:r>
-            <w:r>
-              <w:rPr>
-                <w:lang w:val="en-US"/>
-              </w:rPr>
-              <w:tab/>
-              <w:t>The product_timestamps may not be specified for a particular Workpiece.</w:t>
-            </w:r>
-          </w:p>
-          <w:p>
-            <w:pPr>
-              <w:pStyle w:val="ISOComments"/>
-              <w:rPr>
-                <w:lang w:val="en-US"/>
-              </w:rPr>
-            </w:pPr>
-            <w:r>
-              <w:rPr>
-                <w:lang w:val="en-US"/>
-              </w:rPr>
-              <w:t>clause4</w:t>
-            </w:r>
-            <w:r>
-              <w:rPr>
-                <w:lang w:val="en-US"/>
-              </w:rPr>
-              <w:tab/>
-              <w:t>The revision_approvals may not be specified for a particular Workpiece.</w:t>
-            </w:r>
-          </w:p>
-          <w:p>
-            <w:pPr>
-              <w:pStyle w:val="ISOComments"/>
-              <w:rPr>
-                <w:lang w:val="en-US"/>
-              </w:rPr>
-            </w:pPr>
-            <w:r>
-              <w:rPr>
-                <w:lang w:val="en-US"/>
-              </w:rPr>
-              <w:t>clause4</w:t>
-            </w:r>
-            <w:r>
-              <w:rPr>
-                <w:lang w:val="en-US"/>
-              </w:rPr>
-              <w:tab/>
-              <w:t>The revision_datestamps may not be specified for a particular Workpiece.</w:t>
-            </w:r>
-          </w:p>
-          <w:p>
-            <w:pPr>
-              <w:pStyle w:val="ISOComments"/>
-              <w:rPr>
-                <w:lang w:val="en-US"/>
-              </w:rPr>
-            </w:pPr>
-            <w:r>
-              <w:rPr>
-                <w:lang w:val="en-US"/>
-              </w:rPr>
-              <w:t>clause4</w:t>
-            </w:r>
-            <w:r>
-              <w:rPr>
-                <w:lang w:val="en-US"/>
-              </w:rPr>
-              <w:tab/>
-              <w:t>The revision_id may not be specified for a particular Workpiece.</w:t>
-            </w:r>
-          </w:p>
-          <w:p>
-            <w:pPr>
-              <w:pStyle w:val="ISOComments"/>
-              <w:rPr>
-                <w:lang w:val="en-US"/>
-              </w:rPr>
-            </w:pPr>
-            <w:r>
-              <w:rPr>
-                <w:lang w:val="en-US"/>
-              </w:rPr>
-              <w:t>clause4</w:t>
-            </w:r>
-            <w:r>
-              <w:rPr>
-                <w:lang w:val="en-US"/>
-              </w:rPr>
-              <w:tab/>
               <w:t>The revision_orgs may not be specified for a particular Workpiece.</w:t>
             </w:r>
           </w:p>
@@ -16461,7 +16483,6 @@
               <w:rPr>
                 <w:lang w:val="en-US"/>
               </w:rPr>
-              <w:lastRenderedPageBreak/>
               <w:t>clause4</w:t>
             </w:r>
             <w:r>
@@ -16815,7 +16836,6 @@
               <w:rPr>
                 <w:lang w:val="en-US"/>
               </w:rPr>
-              <w:lastRenderedPageBreak/>
               <w:t>annexJ</w:t>
             </w:r>
             <w:r>
@@ -17026,6 +17046,7 @@
               <w:rPr>
                 <w:lang w:val="en-US"/>
               </w:rPr>
+              <w:lastRenderedPageBreak/>
               <w:t>clause4</w:t>
             </w:r>
             <w:r>
@@ -17033,14 +17054,7 @@
                 <w:lang w:val="en-US"/>
               </w:rPr>
               <w:tab/>
-              <w:t xml:space="preserve">In the most complex case an Executable in the set may be a Workplan that </w:t>
-            </w:r>
-            <w:r>
-              <w:rPr>
-                <w:lang w:val="en-US"/>
-              </w:rPr>
-              <w:lastRenderedPageBreak/>
-              <w:t>describes multiple things that must be completed before beginning the oneup assembly group.</w:t>
+              <w:t>In the most complex case an Executable in the set may be a Workplan that describes multiple things that must be completed before beginning the oneup assembly group.</w:t>
             </w:r>
           </w:p>
           <w:p>
@@ -17195,7 +17209,140 @@
                 <w:lang w:val="en-US"/>
               </w:rPr>
               <w:tab/>
-              <w:t>To determine the depth of the Profile_feature, one must geometrically evaluate the distance in the negative Z direction between this placement and the depth surface.</w:t>
+              <w:t xml:space="preserve">To determine the depth of the Profile_feature, one must geometrically evaluate </w:t>
+            </w:r>
+            <w:r>
+              <w:rPr>
+                <w:lang w:val="en-US"/>
+              </w:rPr>
+              <w:lastRenderedPageBreak/>
+              <w:t>the distance in the negative Z direction between this placement and the depth surface.</w:t>
+            </w:r>
+          </w:p>
+          <w:p>
+            <w:pPr>
+              <w:pStyle w:val="ISOComments"/>
+              <w:rPr>
+                <w:lang w:val="en-US"/>
+              </w:rPr>
+            </w:pPr>
+            <w:r>
+              <w:rPr>
+                <w:lang w:val="en-US"/>
+              </w:rPr>
+              <w:t>clause5</w:t>
+            </w:r>
+            <w:r>
+              <w:rPr>
+                <w:lang w:val="en-US"/>
+              </w:rPr>
+              <w:tab/>
+              <w:t>To determine the depth of the slot, one must geometrically evaluate the distance in the negative Z direction between this placement and the depth surface.</w:t>
+            </w:r>
+          </w:p>
+          <w:p>
+            <w:pPr>
+              <w:pStyle w:val="ISOComments"/>
+              <w:rPr>
+                <w:lang w:val="en-US"/>
+              </w:rPr>
+            </w:pPr>
+            <w:r>
+              <w:rPr>
+                <w:lang w:val="en-US"/>
+              </w:rPr>
+              <w:t>clause5</w:t>
+            </w:r>
+            <w:r>
+              <w:rPr>
+                <w:lang w:val="en-US"/>
+              </w:rPr>
+              <w:tab/>
+              <w:t>To determine the depth of the step, one must geometrically evaluate the distance in the negative Z direction between this placement and the depth surface.</w:t>
+            </w:r>
+          </w:p>
+          <w:p>
+            <w:pPr>
+              <w:pStyle w:val="ISOComments"/>
+              <w:rPr>
+                <w:lang w:val="en-US"/>
+              </w:rPr>
+            </w:pPr>
+            <w:r>
+              <w:rPr>
+                <w:lang w:val="en-US"/>
+              </w:rPr>
+              <w:t>clause5</w:t>
+            </w:r>
+            <w:r>
+              <w:rPr>
+                <w:lang w:val="en-US"/>
+              </w:rPr>
+              <w:tab/>
+              <w:t>The items set must refer to representation_item instances, so measurements are encoded as a measure_representation_item, which is a subtype of measure_with_unit and representation_item.</w:t>
+            </w:r>
+          </w:p>
+          <w:p>
+            <w:pPr>
+              <w:pStyle w:val="ISOComments"/>
+              <w:rPr>
+                <w:lang w:val="en-US"/>
+              </w:rPr>
+            </w:pPr>
+            <w:r>
+              <w:rPr>
+                <w:lang w:val="en-US"/>
+              </w:rPr>
+              <w:t>clause5</w:t>
+            </w:r>
+            <w:r>
+              <w:rPr>
+                <w:lang w:val="en-US"/>
+              </w:rPr>
+              <w:tab/>
+              <w:t>Local rules on the ISO 10303 geometry definitions require that any enclosing representation must refer to a geometric_representation_context to identify the dimensionality (2D, 3D, etc.) of the geometry.</w:t>
+            </w:r>
+          </w:p>
+          <w:p>
+            <w:pPr>
+              <w:pStyle w:val="ISOComments"/>
+              <w:rPr>
+                <w:lang w:val="en-US"/>
+              </w:rPr>
+            </w:pPr>
+            <w:r>
+              <w:rPr>
+                <w:lang w:val="en-US"/>
+              </w:rPr>
+              <w:t>clause5</w:t>
+            </w:r>
+            <w:r>
+              <w:rPr>
+                <w:lang w:val="en-US"/>
+              </w:rPr>
+              <w:tab/>
+              <w:t>The definitions of Cutter_contact_trajectory, Cutter_location_trajectory, Axis_trajectory, and Toolpath_speed, require that the curves that describe location (basiccurve), tool axis, surface normal, and feed speed must have the same parameterization.</w:t>
+            </w:r>
+          </w:p>
+          <w:p>
+            <w:pPr>
+              <w:pStyle w:val="ISOComments"/>
+              <w:rPr>
+                <w:lang w:val="en-US"/>
+              </w:rPr>
+            </w:pPr>
+            <w:r>
+              <w:rPr>
+                <w:lang w:val="en-US"/>
+              </w:rPr>
+              <w:t>clause5</w:t>
+            </w:r>
+            <w:r>
+              <w:rPr>
+                <w:lang w:val="en-US"/>
+              </w:rPr>
+              <w:tab/>
+              <w:t>Where a planned process would produce results, such as touch_probing, the operations identify an external variable name, but the value must be collected from a machine tool by some unspecified method.</w:t>
             </w:r>
           </w:p>
           <w:p>
@@ -17217,132 +17364,6 @@
                 <w:lang w:val="en-US"/>
               </w:rPr>
               <w:tab/>
-              <w:t>To determine the depth of the slot, one must geometrically evaluate the distance in the negative Z direction between this placement and the depth surface.</w:t>
-            </w:r>
-          </w:p>
-          <w:p>
-            <w:pPr>
-              <w:pStyle w:val="ISOComments"/>
-              <w:rPr>
-                <w:lang w:val="en-US"/>
-              </w:rPr>
-            </w:pPr>
-            <w:r>
-              <w:rPr>
-                <w:lang w:val="en-US"/>
-              </w:rPr>
-              <w:t>clause5</w:t>
-            </w:r>
-            <w:r>
-              <w:rPr>
-                <w:lang w:val="en-US"/>
-              </w:rPr>
-              <w:tab/>
-              <w:t>To determine the depth of the step, one must geometrically evaluate the distance in the negative Z direction between this placement and the depth surface.</w:t>
-            </w:r>
-          </w:p>
-          <w:p>
-            <w:pPr>
-              <w:pStyle w:val="ISOComments"/>
-              <w:rPr>
-                <w:lang w:val="en-US"/>
-              </w:rPr>
-            </w:pPr>
-            <w:r>
-              <w:rPr>
-                <w:lang w:val="en-US"/>
-              </w:rPr>
-              <w:t>clause5</w:t>
-            </w:r>
-            <w:r>
-              <w:rPr>
-                <w:lang w:val="en-US"/>
-              </w:rPr>
-              <w:tab/>
-              <w:t>The items set must refer to representation_item instances, so measurements are encoded as a measure_representation_item, which is a subtype of measure_with_unit and representation_item.</w:t>
-            </w:r>
-          </w:p>
-          <w:p>
-            <w:pPr>
-              <w:pStyle w:val="ISOComments"/>
-              <w:rPr>
-                <w:lang w:val="en-US"/>
-              </w:rPr>
-            </w:pPr>
-            <w:r>
-              <w:rPr>
-                <w:lang w:val="en-US"/>
-              </w:rPr>
-              <w:t>clause5</w:t>
-            </w:r>
-            <w:r>
-              <w:rPr>
-                <w:lang w:val="en-US"/>
-              </w:rPr>
-              <w:tab/>
-              <w:t>Local rules on the ISO 10303 geometry definitions require that any enclosing representation must refer to a geometric_representation_context to identify the dimensionality (2D, 3D, etc.) of the geometry.</w:t>
-            </w:r>
-          </w:p>
-          <w:p>
-            <w:pPr>
-              <w:pStyle w:val="ISOComments"/>
-              <w:rPr>
-                <w:lang w:val="en-US"/>
-              </w:rPr>
-            </w:pPr>
-            <w:r>
-              <w:rPr>
-                <w:lang w:val="en-US"/>
-              </w:rPr>
-              <w:t>clause5</w:t>
-            </w:r>
-            <w:r>
-              <w:rPr>
-                <w:lang w:val="en-US"/>
-              </w:rPr>
-              <w:tab/>
-              <w:t>The definitions of Cutter_contact_trajectory, Cutter_location_trajectory, Axis_trajectory, and Toolpath_speed, require that the curves that describe location (basiccurve), tool axis, surface normal, and feed speed must have the same parameterization.</w:t>
-            </w:r>
-          </w:p>
-          <w:p>
-            <w:pPr>
-              <w:pStyle w:val="ISOComments"/>
-              <w:rPr>
-                <w:lang w:val="en-US"/>
-              </w:rPr>
-            </w:pPr>
-            <w:r>
-              <w:rPr>
-                <w:lang w:val="en-US"/>
-              </w:rPr>
-              <w:t>clause5</w:t>
-            </w:r>
-            <w:r>
-              <w:rPr>
-                <w:lang w:val="en-US"/>
-              </w:rPr>
-              <w:tab/>
-              <w:t>Where a planned process would produce results, such as touch_probing, the operations identify an external variable name, but the value must be collected from a machine tool by some unspecified method.</w:t>
-            </w:r>
-          </w:p>
-          <w:p>
-            <w:pPr>
-              <w:pStyle w:val="ISOComments"/>
-              <w:rPr>
-                <w:lang w:val="en-US"/>
-              </w:rPr>
-            </w:pPr>
-            <w:r>
-              <w:rPr>
-                <w:lang w:val="en-US"/>
-              </w:rPr>
-              <w:t>clause5</w:t>
-            </w:r>
-            <w:r>
-              <w:rPr>
-                <w:lang w:val="en-US"/>
-              </w:rPr>
-              <w:tab/>
               <w:t>Extra via points between two non via points must define arcs of the same radius.</w:t>
             </w:r>
           </w:p>
@@ -17357,7 +17378,6 @@
               <w:rPr>
                 <w:lang w:val="en-US"/>
               </w:rPr>
-              <w:lastRenderedPageBreak/>
               <w:t>clause5</w:t>
             </w:r>
             <w:r>
@@ -17725,14 +17745,8 @@
               <w:rPr>
                 <w:lang w:val="en-US"/>
               </w:rPr>
-              <w:t>In annexK, please verify 'Change the measure UoF to reference application object definitions and mappings from ISO 10303-1054, 10303-</w:t>
-            </w:r>
-            <w:r>
-              <w:rPr>
-                <w:lang w:val="en-US"/>
-              </w:rPr>
               <w:lastRenderedPageBreak/>
-              <w:t xml:space="preserve">1106, 10303-1753, and 10303-1782 rather than define them in clause 4 and 5.' </w:t>
+              <w:t xml:space="preserve">In annexK, please verify 'Change the measure UoF to reference application object definitions and mappings from ISO 10303-1054, 10303-1106, 10303-1753, and 10303-1782 rather than define them in clause 4 and 5.' </w:t>
             </w:r>
           </w:p>
           <w:p>
@@ -17816,6 +17830,7 @@
               <w:rPr>
                 <w:lang w:val="en-US"/>
               </w:rPr>
+              <w:lastRenderedPageBreak/>
               <w:t xml:space="preserve">In annexK, please verify 'Added machining_fixture_usage to clause 5 for use in the mapping.' </w:t>
             </w:r>
           </w:p>
@@ -17830,233 +17845,244 @@
               <w:rPr>
                 <w:lang w:val="en-US"/>
               </w:rPr>
+              <w:t xml:space="preserve">In annexK, please verify 'Add extended_type_operation to clause 5 to support mapping of Extended_operation.' </w:t>
+            </w:r>
+          </w:p>
+          <w:p>
+            <w:pPr>
+              <w:pStyle w:val="ISOComments"/>
+              <w:rPr>
+                <w:lang w:val="en-US"/>
+              </w:rPr>
+            </w:pPr>
+            <w:r>
+              <w:rPr>
+                <w:lang w:val="en-US"/>
+              </w:rPr>
+              <w:t xml:space="preserve">In annexK, please verify 'Add via_arc_point and via_helix_point to clause 5 to support high-speed milling operations.' </w:t>
+            </w:r>
+          </w:p>
+          <w:p>
+            <w:pPr>
+              <w:pStyle w:val="ISOComments"/>
+              <w:rPr>
+                <w:lang w:val="en-US"/>
+              </w:rPr>
+            </w:pPr>
+            <w:r>
+              <w:rPr>
+                <w:lang w:val="en-US"/>
+              </w:rPr>
+              <w:t xml:space="preserve">In annexK, please verify 'Add additive_type_operation to clause 5 to support mapping of Am_operation and subtypes.' </w:t>
+            </w:r>
+          </w:p>
+          <w:p>
+            <w:pPr>
+              <w:pStyle w:val="ISOComments"/>
+              <w:rPr>
+                <w:lang w:val="en-US"/>
+              </w:rPr>
+            </w:pPr>
+            <w:r>
+              <w:rPr>
+                <w:lang w:val="en-US"/>
+              </w:rPr>
+              <w:t xml:space="preserve">In annexK, please verify 'Change the geometric dimensioning and tolerancing UoF to reference the following feature application object definitions and mappings from ISO 10303-1050 and ISO 10303-1051 rather than define them in clause 4 and 5.' </w:t>
+            </w:r>
+          </w:p>
+          <w:p>
+            <w:pPr>
+              <w:pStyle w:val="ISOComments"/>
+              <w:rPr>
+                <w:lang w:val="en-US"/>
+              </w:rPr>
+            </w:pPr>
+            <w:r>
+              <w:rPr>
+                <w:lang w:val="en-US"/>
+              </w:rPr>
+              <w:t xml:space="preserve">In annexK, please verify 'Remove definitions in clause 5 for directed_dimensional_location, externally_defined_dimension_definition, and placed_datum_target_feature.' </w:t>
+            </w:r>
+          </w:p>
+          <w:p>
+            <w:pPr>
+              <w:pStyle w:val="ISOComments"/>
+              <w:rPr>
+                <w:lang w:val="en-US"/>
+              </w:rPr>
+            </w:pPr>
+            <w:r>
+              <w:rPr>
+                <w:lang w:val="en-US"/>
+              </w:rPr>
+              <w:t xml:space="preserve">In annexK, please verify 'The information requirements described in clause 4 have not changed.' </w:t>
+            </w:r>
+          </w:p>
+          <w:p>
+            <w:pPr>
+              <w:pStyle w:val="ISOComments"/>
+              <w:rPr>
+                <w:lang w:val="en-US"/>
+              </w:rPr>
+            </w:pPr>
+            <w:r>
+              <w:rPr>
+                <w:lang w:val="en-US"/>
+              </w:rPr>
+              <w:t xml:space="preserve">In annexK, please verify 'The application interpreted model described in clause 5 has not changed.' </w:t>
+            </w:r>
+          </w:p>
+          <w:p>
+            <w:pPr>
+              <w:pStyle w:val="ISOComments"/>
+              <w:rPr>
+                <w:lang w:val="en-US"/>
+              </w:rPr>
+            </w:pPr>
+            <w:r>
+              <w:rPr>
+                <w:lang w:val="en-US"/>
+              </w:rPr>
+              <w:t xml:space="preserve">In clause5, please verify 'This clause specifies how each UoF and application object in clause 4 </w:t>
+            </w:r>
+            <w:r>
+              <w:rPr>
+                <w:lang w:val="en-US"/>
+              </w:rPr>
               <w:lastRenderedPageBreak/>
-              <w:t xml:space="preserve">In annexK, please verify 'Add extended_type_operation to clause 5 to support mapping of Extended_operation.' </w:t>
-            </w:r>
-          </w:p>
-          <w:p>
-            <w:pPr>
-              <w:pStyle w:val="ISOComments"/>
-              <w:rPr>
-                <w:lang w:val="en-US"/>
-              </w:rPr>
-            </w:pPr>
-            <w:r>
-              <w:rPr>
-                <w:lang w:val="en-US"/>
-              </w:rPr>
-              <w:t xml:space="preserve">In annexK, please verify 'Add via_arc_point and via_helix_point to clause 5 to support high-speed milling operations.' </w:t>
-            </w:r>
-          </w:p>
-          <w:p>
-            <w:pPr>
-              <w:pStyle w:val="ISOComments"/>
-              <w:rPr>
-                <w:lang w:val="en-US"/>
-              </w:rPr>
-            </w:pPr>
-            <w:r>
-              <w:rPr>
-                <w:lang w:val="en-US"/>
-              </w:rPr>
-              <w:t xml:space="preserve">In annexK, please verify 'Add additive_type_operation to clause 5 to support mapping of Am_operation and subtypes.' </w:t>
-            </w:r>
-          </w:p>
-          <w:p>
-            <w:pPr>
-              <w:pStyle w:val="ISOComments"/>
-              <w:rPr>
-                <w:lang w:val="en-US"/>
-              </w:rPr>
-            </w:pPr>
-            <w:r>
-              <w:rPr>
-                <w:lang w:val="en-US"/>
-              </w:rPr>
-              <w:t xml:space="preserve">In annexK, please verify 'Change the geometric dimensioning and tolerancing UoF to reference the following feature application object definitions and mappings from ISO 10303-1050 and ISO 10303-1051 rather than define them in clause 4 and 5.' </w:t>
-            </w:r>
-          </w:p>
-          <w:p>
-            <w:pPr>
-              <w:pStyle w:val="ISOComments"/>
-              <w:rPr>
-                <w:lang w:val="en-US"/>
-              </w:rPr>
-            </w:pPr>
-            <w:r>
-              <w:rPr>
-                <w:lang w:val="en-US"/>
-              </w:rPr>
-              <w:t xml:space="preserve">In annexK, please verify 'Remove definitions in clause 5 for directed_dimensional_location, externally_defined_dimension_definition, and placed_datum_target_feature.' </w:t>
-            </w:r>
-          </w:p>
-          <w:p>
-            <w:pPr>
-              <w:pStyle w:val="ISOComments"/>
-              <w:rPr>
-                <w:lang w:val="en-US"/>
-              </w:rPr>
-            </w:pPr>
-            <w:r>
-              <w:rPr>
-                <w:lang w:val="en-US"/>
-              </w:rPr>
-              <w:t xml:space="preserve">In annexK, please verify 'The information requirements described in clause 4 have not changed.' </w:t>
-            </w:r>
-          </w:p>
-          <w:p>
-            <w:pPr>
-              <w:pStyle w:val="ISOComments"/>
-              <w:rPr>
-                <w:lang w:val="en-US"/>
-              </w:rPr>
-            </w:pPr>
-            <w:r>
-              <w:rPr>
-                <w:lang w:val="en-US"/>
-              </w:rPr>
-              <w:t xml:space="preserve">In annexK, please verify 'The application interpreted model described in clause 5 has not changed.' </w:t>
-            </w:r>
-          </w:p>
-          <w:p>
-            <w:pPr>
-              <w:pStyle w:val="ISOComments"/>
-              <w:rPr>
-                <w:lang w:val="en-US"/>
-              </w:rPr>
-            </w:pPr>
-            <w:r>
-              <w:rPr>
-                <w:lang w:val="en-US"/>
-              </w:rPr>
-              <w:t xml:space="preserve">In clause5, please verify 'This clause specifies how each UoF and application object in clause 4 shall be represented by one or more AIM EXPRESS constructs given by Annex A.' </w:t>
-            </w:r>
-          </w:p>
-          <w:p>
-            <w:pPr>
-              <w:pStyle w:val="ISOComments"/>
-              <w:rPr>
-                <w:lang w:val="en-US"/>
-              </w:rPr>
-            </w:pPr>
+              <w:t xml:space="preserve">shall be represented by one or more AIM EXPRESS constructs given by Annex A.' </w:t>
+            </w:r>
+          </w:p>
+          <w:p>
+            <w:pPr>
+              <w:pStyle w:val="ISOComments"/>
+              <w:rPr>
+                <w:lang w:val="en-US"/>
+              </w:rPr>
+            </w:pPr>
+            <w:r>
+              <w:rPr>
+                <w:lang w:val="en-US"/>
+              </w:rPr>
+              <w:t xml:space="preserve">In introduction, please verify 'The information requirements of the application are specified in clause 4 using terminology appropriate to the application.' </w:t>
+            </w:r>
+          </w:p>
+          <w:p>
+            <w:pPr>
+              <w:pStyle w:val="ISOComments"/>
+              <w:rPr>
+                <w:lang w:val="en-US"/>
+              </w:rPr>
+            </w:pPr>
+            <w:r>
+              <w:rPr>
+                <w:lang w:val="en-US"/>
+              </w:rPr>
+              <w:t xml:space="preserve">In annexK, please verify 'The Process_property name has been reused for an application object defined by the Executable UoF that extends an Executable with additional information.' </w:t>
+            </w:r>
+          </w:p>
+          <w:p>
+            <w:pPr>
+              <w:pStyle w:val="ISOComments"/>
+              <w:rPr>
+                <w:lang w:val="en-US"/>
+              </w:rPr>
+            </w:pPr>
+            <w:r>
+              <w:rPr>
+                <w:lang w:val="en-US"/>
+              </w:rPr>
+              <w:t xml:space="preserve">In clause4, please verify 'The executable UoF specifies the information necessary to describe control flow of a machining program as well as the non-machining actions that may be performed by a numerical control.' </w:t>
+            </w:r>
+          </w:p>
+          <w:p>
+            <w:pPr>
+              <w:pStyle w:val="ISOComments"/>
+              <w:rPr>
+                <w:lang w:val="en-US"/>
+              </w:rPr>
+            </w:pPr>
+            <w:r>
+              <w:rPr>
+                <w:lang w:val="en-US"/>
+              </w:rPr>
+              <w:t xml:space="preserve">In clause4, please verify 'The following application objects are used by the executable UoF, and shall be as defined by ISO 14649-10.' </w:t>
+            </w:r>
+          </w:p>
+          <w:p>
+            <w:pPr>
+              <w:pStyle w:val="ISOComments"/>
+              <w:rPr>
+                <w:lang w:val="en-US"/>
+              </w:rPr>
+            </w:pPr>
+            <w:r>
+              <w:rPr>
+                <w:lang w:val="en-US"/>
+              </w:rPr>
+              <w:t xml:space="preserve">In clause4, please verify 'In addition, the following application objects are used by the executable UoF, and shall be as defined by this document' </w:t>
+            </w:r>
+          </w:p>
+          <w:p>
+            <w:pPr>
+              <w:pStyle w:val="ISOComments"/>
+              <w:rPr>
+                <w:lang w:val="en-US"/>
+              </w:rPr>
+            </w:pPr>
+            <w:r>
+              <w:rPr>
+                <w:lang w:val="en-US"/>
+              </w:rPr>
+              <w:t xml:space="preserve">In clause4, please verify 'The following application objects are used by the executable UoF, and shall be as defined by ISO 10303-1526.' </w:t>
+            </w:r>
+          </w:p>
+          <w:p>
+            <w:pPr>
+              <w:pStyle w:val="ISOComments"/>
+              <w:rPr>
+                <w:lang w:val="en-US"/>
+              </w:rPr>
+            </w:pPr>
+            <w:r>
+              <w:rPr>
+                <w:lang w:val="en-US"/>
+              </w:rPr>
+              <w:t xml:space="preserve">In clause6, please verify 'This conformance class includes the following application objects and their supertypes from the executable UoF' </w:t>
+            </w:r>
+          </w:p>
+          <w:p>
+            <w:pPr>
+              <w:pStyle w:val="ISOComments"/>
+              <w:rPr>
+                <w:lang w:val="en-US"/>
+              </w:rPr>
+            </w:pPr>
+            <w:r>
+              <w:rPr>
+                <w:lang w:val="en-US"/>
+              </w:rPr>
+              <w:t xml:space="preserve">In clause6, please verify 'This conformance class includes everything specified by CC1, plus all remaining application objects from the toolpath </w:t>
+            </w:r>
             <w:r>
               <w:rPr>
                 <w:lang w:val="en-US"/>
               </w:rPr>
               <w:lastRenderedPageBreak/>
-              <w:t xml:space="preserve">In introduction, please verify 'The information requirements of the application are specified in clause 4 using terminology appropriate to the application.' </w:t>
-            </w:r>
-          </w:p>
-          <w:p>
-            <w:pPr>
-              <w:pStyle w:val="ISOComments"/>
-              <w:rPr>
-                <w:lang w:val="en-US"/>
-              </w:rPr>
-            </w:pPr>
-            <w:r>
-              <w:rPr>
-                <w:lang w:val="en-US"/>
-              </w:rPr>
-              <w:t xml:space="preserve">In annexK, please verify 'The Process_property name has been reused for an application object defined by the Executable UoF that extends an Executable with additional information.' </w:t>
-            </w:r>
-          </w:p>
-          <w:p>
-            <w:pPr>
-              <w:pStyle w:val="ISOComments"/>
-              <w:rPr>
-                <w:lang w:val="en-US"/>
-              </w:rPr>
-            </w:pPr>
-            <w:r>
-              <w:rPr>
-                <w:lang w:val="en-US"/>
-              </w:rPr>
-              <w:t xml:space="preserve">In clause4, please verify 'The executable UoF specifies the information necessary to describe control flow of a machining program as well as the non-machining actions that may be performed by a numerical control.' </w:t>
-            </w:r>
-          </w:p>
-          <w:p>
-            <w:pPr>
-              <w:pStyle w:val="ISOComments"/>
-              <w:rPr>
-                <w:lang w:val="en-US"/>
-              </w:rPr>
-            </w:pPr>
-            <w:r>
-              <w:rPr>
-                <w:lang w:val="en-US"/>
-              </w:rPr>
-              <w:t xml:space="preserve">In clause4, please verify 'The following application objects are used by the executable UoF, and shall be as defined by ISO 14649-10.' </w:t>
-            </w:r>
-          </w:p>
-          <w:p>
-            <w:pPr>
-              <w:pStyle w:val="ISOComments"/>
-              <w:rPr>
-                <w:lang w:val="en-US"/>
-              </w:rPr>
-            </w:pPr>
-            <w:r>
-              <w:rPr>
-                <w:lang w:val="en-US"/>
-              </w:rPr>
-              <w:t xml:space="preserve">In clause4, please verify 'In addition, the following application objects are used by the executable UoF, and shall be as defined by this document' </w:t>
-            </w:r>
-          </w:p>
-          <w:p>
-            <w:pPr>
-              <w:pStyle w:val="ISOComments"/>
-              <w:rPr>
-                <w:lang w:val="en-US"/>
-              </w:rPr>
-            </w:pPr>
-            <w:r>
-              <w:rPr>
-                <w:lang w:val="en-US"/>
-              </w:rPr>
-              <w:t xml:space="preserve">In clause4, please verify 'The following application objects are used by the executable UoF, and shall be as defined by ISO 10303-1526.' </w:t>
-            </w:r>
-          </w:p>
-          <w:p>
-            <w:pPr>
-              <w:pStyle w:val="ISOComments"/>
-              <w:rPr>
-                <w:lang w:val="en-US"/>
-              </w:rPr>
-            </w:pPr>
-            <w:r>
-              <w:rPr>
-                <w:lang w:val="en-US"/>
-              </w:rPr>
-              <w:t xml:space="preserve">In clause6, please verify 'This conformance class includes the following application objects and their supertypes from the executable UoF' </w:t>
-            </w:r>
-          </w:p>
-          <w:p>
-            <w:pPr>
-              <w:pStyle w:val="ISOComments"/>
-              <w:rPr>
-                <w:lang w:val="en-US"/>
-              </w:rPr>
-            </w:pPr>
-            <w:r>
-              <w:rPr>
-                <w:lang w:val="en-US"/>
-              </w:rPr>
-              <w:t xml:space="preserve">In clause6, please verify 'This conformance class includes everything specified by CC1, plus all remaining application objects from the toolpath UoF and the Parallel application object from the executable UOF.' </w:t>
-            </w:r>
-          </w:p>
-          <w:p>
-            <w:pPr>
-              <w:pStyle w:val="ISOComments"/>
-              <w:rPr>
-                <w:lang w:val="en-US"/>
-              </w:rPr>
-            </w:pPr>
-            <w:r>
-              <w:rPr>
-                <w:lang w:val="en-US"/>
-              </w:rPr>
-              <w:lastRenderedPageBreak/>
+              <w:t xml:space="preserve">UoF and the Parallel application object from the executable UOF.' </w:t>
+            </w:r>
+          </w:p>
+          <w:p>
+            <w:pPr>
+              <w:pStyle w:val="ISOComments"/>
+              <w:rPr>
+                <w:lang w:val="en-US"/>
+              </w:rPr>
+            </w:pPr>
+            <w:r>
+              <w:rPr>
+                <w:lang w:val="en-US"/>
+              </w:rPr>
               <w:t xml:space="preserve">In clause6, please verify 'This conformance class includes everything specified by CC2, plus all application objects from the manufacturing feature and manufacturing feature for turning UOFs and all remaining application objects from the executable UoF.' </w:t>
             </w:r>
           </w:p>
@@ -18773,6 +18799,7 @@
                     <w:rPr>
                       <w:lang w:val="en-US"/>
                     </w:rPr>
+                    <w:lastRenderedPageBreak/>
                     <w:t>clause5</w:t>
                   </w:r>
                 </w:p>
@@ -18820,7 +18847,6 @@
                     <w:rPr>
                       <w:lang w:val="en-US"/>
                     </w:rPr>
-                    <w:lastRenderedPageBreak/>
                     <w:t>clause5</w:t>
                   </w:r>
                 </w:p>
@@ -19424,7 +19450,14 @@
               <w:rPr>
                 <w:lang w:val="en-US"/>
               </w:rPr>
-              <w:t>Please verify if the reference ISO 10303-21:2016, ISO 10303-21 should be added dated or undated in the reference list Please verify if the reference ISO 14649-11:2004, ISO 14649-11 should be added dated or undated in the reference list Please verify if the reference ISO 14649-12:2005, ISO 14649-12 should be added dated or undated in the reference list Please verify if the reference ISO 14649-1:2003, ISO 14649-1 should be added dated or undated in the reference list</w:t>
+              <w:t xml:space="preserve">Please verify if the reference ISO 10303-21:2016, ISO 10303-21 should be added dated or undated in the reference list Please verify if the reference ISO 14649-11:2004, ISO 14649-11 should be added dated or undated in the reference list Please verify if the reference ISO 14649-12:2005, ISO 14649-12 should be added dated or undated in the reference list Please verify if the reference </w:t>
+            </w:r>
+            <w:r>
+              <w:rPr>
+                <w:lang w:val="en-US"/>
+              </w:rPr>
+              <w:lastRenderedPageBreak/>
+              <w:t>ISO 14649-1:2003, ISO 14649-1 should be added dated or undated in the reference list</w:t>
             </w:r>
           </w:p>
         </w:tc>

</xml_diff>

<commit_message>
Address US 7, 20-21, 32, 34-39, 42, 45, 48, 52-55
Signed-off-by: David Loffredo <loffredo@steptools.com>
</commit_message>
<xml_diff>
--- a/comments/ISO_DIS_10303-238e4_comment_log.docx
+++ b/comments/ISO_DIS_10303-238e4_comment_log.docx
@@ -1002,6 +1002,9 @@
             <w:pPr>
               <w:pStyle w:val="ISOSecretObservations"/>
             </w:pPr>
+            <w:r>
+              <w:t>Added Part 17 to abstract</w:t>
+            </w:r>
           </w:p>
         </w:tc>
       </w:tr>
@@ -1138,6 +1141,9 @@
             <w:pPr>
               <w:pStyle w:val="ISOSecretObservations"/>
             </w:pPr>
+            <w:r>
+              <w:t>Defer – Adjusting wording of scope statement needs to be coordinated with ISO,   Do at project launch of Ed5.</w:t>
+            </w:r>
           </w:p>
         </w:tc>
       </w:tr>
@@ -2109,6 +2115,7 @@
               <w:pStyle w:val="ISOMB"/>
             </w:pPr>
             <w:r>
+              <w:lastRenderedPageBreak/>
               <w:t>US-16</w:t>
             </w:r>
           </w:p>
@@ -2191,11 +2198,7 @@
               <w:pStyle w:val="ISOComments"/>
             </w:pPr>
             <w:r>
-              <w:t xml:space="preserve">Multiple HREF attributes contain trailing spaces in ID references (e.g., '#ao-am_application_feature </w:t>
-            </w:r>
-            <w:r>
-              <w:lastRenderedPageBreak/>
-              <w:t>'). These trailing spaces could cause broken cross-reference links. (djo)</w:t>
+              <w:t>Multiple HREF attributes contain trailing spaces in ID references (e.g., '#ao-am_application_feature '). These trailing spaces could cause broken cross-reference links. (djo)</w:t>
             </w:r>
           </w:p>
         </w:tc>
@@ -2212,7 +2215,6 @@
               <w:pStyle w:val="ISOChange"/>
             </w:pPr>
             <w:r>
-              <w:lastRenderedPageBreak/>
               <w:t>Remove trailing spaces from all HREF attribute values in section 4.2.14. ( DJO can identify specific ones)</w:t>
             </w:r>
           </w:p>
@@ -2889,6 +2891,9 @@
             <w:pPr>
               <w:pStyle w:val="ISOSecretObservations"/>
             </w:pPr>
+            <w:r>
+              <w:t>Adopted proposed solution</w:t>
+            </w:r>
           </w:p>
         </w:tc>
       </w:tr>
@@ -3024,6 +3029,9 @@
             <w:pPr>
               <w:pStyle w:val="ISOSecretObservations"/>
             </w:pPr>
+            <w:r>
+              <w:t>Adopted proposed solution</w:t>
+            </w:r>
           </w:p>
         </w:tc>
       </w:tr>
@@ -3298,7 +3306,14 @@
               <w:rPr>
                 <w:highlight w:val="yellow"/>
               </w:rPr>
-              <w:t>Description seems incomplete… What is response to check_dimensions_operation?  What dimensions are in force?  Should there be a flag to check and adjust?  Should measurements be recorded? (djo)</w:t>
+              <w:t xml:space="preserve">Description seems incomplete… What is response to check_dimensions_operation?  What dimensions are in force?  Should there be a flag </w:t>
+            </w:r>
+            <w:r>
+              <w:rPr>
+                <w:highlight w:val="yellow"/>
+              </w:rPr>
+              <w:lastRenderedPageBreak/>
+              <w:t>to check and adjust?  Should measurements be recorded? (djo)</w:t>
             </w:r>
           </w:p>
         </w:tc>
@@ -3321,6 +3336,7 @@
               <w:rPr>
                 <w:highlight w:val="yellow"/>
               </w:rPr>
+              <w:lastRenderedPageBreak/>
               <w:t>Add descriptions/capabilities</w:t>
             </w:r>
           </w:p>
@@ -3364,9 +3380,14 @@
           <w:p>
             <w:pPr>
               <w:pStyle w:val="ISOMB"/>
-            </w:pPr>
-            <w:r>
-              <w:lastRenderedPageBreak/>
+              <w:rPr>
+                <w:highlight w:val="yellow"/>
+              </w:rPr>
+            </w:pPr>
+            <w:r>
+              <w:rPr>
+                <w:highlight w:val="yellow"/>
+              </w:rPr>
               <w:t>US-24</w:t>
             </w:r>
           </w:p>
@@ -3382,6 +3403,9 @@
           <w:p>
             <w:pPr>
               <w:pStyle w:val="ISOClause"/>
+              <w:rPr>
+                <w:highlight w:val="yellow"/>
+              </w:rPr>
             </w:pPr>
           </w:p>
         </w:tc>
@@ -3396,8 +3420,14 @@
           <w:p>
             <w:pPr>
               <w:pStyle w:val="ISOClause"/>
-            </w:pPr>
-            <w:r>
+              <w:rPr>
+                <w:highlight w:val="yellow"/>
+              </w:rPr>
+            </w:pPr>
+            <w:r>
+              <w:rPr>
+                <w:highlight w:val="yellow"/>
+              </w:rPr>
               <w:t>4.3.211</w:t>
             </w:r>
           </w:p>
@@ -3413,8 +3443,14 @@
           <w:p>
             <w:pPr>
               <w:pStyle w:val="ISOParagraph"/>
-            </w:pPr>
-            <w:r>
+              <w:rPr>
+                <w:highlight w:val="yellow"/>
+              </w:rPr>
+            </w:pPr>
+            <w:r>
+              <w:rPr>
+                <w:highlight w:val="yellow"/>
+              </w:rPr>
               <w:t>Manufacturing_stage</w:t>
             </w:r>
           </w:p>
@@ -3430,8 +3466,14 @@
           <w:p>
             <w:pPr>
               <w:pStyle w:val="ISOCommType"/>
-            </w:pPr>
-            <w:r>
+              <w:rPr>
+                <w:highlight w:val="yellow"/>
+              </w:rPr>
+            </w:pPr>
+            <w:r>
+              <w:rPr>
+                <w:highlight w:val="yellow"/>
+              </w:rPr>
               <w:t>ed</w:t>
             </w:r>
           </w:p>
@@ -3447,16 +3489,28 @@
           <w:p>
             <w:pPr>
               <w:pStyle w:val="ISOComments"/>
-            </w:pPr>
-            <w:r>
+              <w:rPr>
+                <w:highlight w:val="yellow"/>
+              </w:rPr>
+            </w:pPr>
+            <w:r>
+              <w:rPr>
+                <w:highlight w:val="yellow"/>
+              </w:rPr>
               <w:t>One key use of a manufacturing stage, is that it can be used to reference alternative fastener assemblies  (grip length +1 for example) .. But it’s not clear what it is useful for.  Maybe there should be a note in this section on this application or elsewhere</w:t>
             </w:r>
           </w:p>
           <w:p>
             <w:pPr>
               <w:pStyle w:val="ISOComments"/>
-            </w:pPr>
-            <w:r>
+              <w:rPr>
+                <w:highlight w:val="yellow"/>
+              </w:rPr>
+            </w:pPr>
+            <w:r>
+              <w:rPr>
+                <w:highlight w:val="yellow"/>
+              </w:rPr>
               <w:t xml:space="preserve"> (djo)</w:t>
             </w:r>
           </w:p>
@@ -3472,8 +3526,14 @@
           <w:p>
             <w:pPr>
               <w:pStyle w:val="ISOChange"/>
-            </w:pPr>
-            <w:r>
+              <w:rPr>
+                <w:highlight w:val="yellow"/>
+              </w:rPr>
+            </w:pPr>
+            <w:r>
+              <w:rPr>
+                <w:highlight w:val="yellow"/>
+              </w:rPr>
               <w:t>Add note on how multiple fastener groups could be handled using this Application Object</w:t>
             </w:r>
           </w:p>
@@ -3489,6 +3549,9 @@
           <w:p>
             <w:pPr>
               <w:pStyle w:val="ISOSecretObservations"/>
+              <w:rPr>
+                <w:highlight w:val="yellow"/>
+              </w:rPr>
             </w:pPr>
           </w:p>
         </w:tc>
@@ -3706,8 +3769,14 @@
           <w:p>
             <w:pPr>
               <w:pStyle w:val="ISOMB"/>
-            </w:pPr>
-            <w:r>
+              <w:rPr>
+                <w:highlight w:val="yellow"/>
+              </w:rPr>
+            </w:pPr>
+            <w:r>
+              <w:rPr>
+                <w:highlight w:val="yellow"/>
+              </w:rPr>
               <w:t>US-26</w:t>
             </w:r>
           </w:p>
@@ -3723,6 +3792,9 @@
           <w:p>
             <w:pPr>
               <w:pStyle w:val="ISOClause"/>
+              <w:rPr>
+                <w:highlight w:val="yellow"/>
+              </w:rPr>
             </w:pPr>
           </w:p>
         </w:tc>
@@ -3737,8 +3809,14 @@
           <w:p>
             <w:pPr>
               <w:pStyle w:val="ISOClause"/>
-            </w:pPr>
-            <w:r>
+              <w:rPr>
+                <w:highlight w:val="yellow"/>
+              </w:rPr>
+            </w:pPr>
+            <w:r>
+              <w:rPr>
+                <w:highlight w:val="yellow"/>
+              </w:rPr>
               <w:t>4.3.229</w:t>
             </w:r>
           </w:p>
@@ -3754,8 +3832,14 @@
           <w:p>
             <w:pPr>
               <w:pStyle w:val="ISOParagraph"/>
-            </w:pPr>
-            <w:r>
+              <w:rPr>
+                <w:highlight w:val="yellow"/>
+              </w:rPr>
+            </w:pPr>
+            <w:r>
+              <w:rPr>
+                <w:highlight w:val="yellow"/>
+              </w:rPr>
               <w:t>Oneup_assembly_group</w:t>
             </w:r>
           </w:p>
@@ -3771,8 +3855,14 @@
           <w:p>
             <w:pPr>
               <w:pStyle w:val="ISOCommType"/>
-            </w:pPr>
-            <w:r>
+              <w:rPr>
+                <w:highlight w:val="yellow"/>
+              </w:rPr>
+            </w:pPr>
+            <w:r>
+              <w:rPr>
+                <w:highlight w:val="yellow"/>
+              </w:rPr>
               <w:t>ed</w:t>
             </w:r>
           </w:p>
@@ -3788,8 +3878,14 @@
           <w:p>
             <w:pPr>
               <w:pStyle w:val="ISOComments"/>
-            </w:pPr>
-            <w:r>
+              <w:rPr>
+                <w:highlight w:val="yellow"/>
+              </w:rPr>
+            </w:pPr>
+            <w:r>
+              <w:rPr>
+                <w:highlight w:val="yellow"/>
+              </w:rPr>
               <w:t>Not clear if this is an “and” or an “or” (djo)</w:t>
             </w:r>
           </w:p>
@@ -3805,8 +3901,14 @@
           <w:p>
             <w:pPr>
               <w:pStyle w:val="ISOChange"/>
-            </w:pPr>
-            <w:r>
+              <w:rPr>
+                <w:highlight w:val="yellow"/>
+              </w:rPr>
+            </w:pPr>
+            <w:r>
+              <w:rPr>
+                <w:highlight w:val="yellow"/>
+              </w:rPr>
               <w:t xml:space="preserve">Clarify that it is an “or” in either the description or add a note.  Perhaps change “shall be completed” to “one of which shall be completed” </w:t>
             </w:r>
           </w:p>
@@ -3822,6 +3924,9 @@
           <w:p>
             <w:pPr>
               <w:pStyle w:val="ISOSecretObservations"/>
+              <w:rPr>
+                <w:highlight w:val="yellow"/>
+              </w:rPr>
             </w:pPr>
           </w:p>
         </w:tc>
@@ -4380,6 +4485,7 @@
               <w:pStyle w:val="ISOMB"/>
             </w:pPr>
             <w:r>
+              <w:lastRenderedPageBreak/>
               <w:t>US-30</w:t>
             </w:r>
           </w:p>
@@ -4518,7 +4624,6 @@
               <w:pStyle w:val="ISOMB"/>
             </w:pPr>
             <w:r>
-              <w:lastRenderedPageBreak/>
               <w:t>US-31</w:t>
             </w:r>
           </w:p>
@@ -4772,6 +4877,9 @@
             <w:pPr>
               <w:pStyle w:val="ISOSecretObservations"/>
             </w:pPr>
+            <w:r>
+              <w:t>Adopted proposed solution</w:t>
+            </w:r>
           </w:p>
         </w:tc>
       </w:tr>
@@ -5045,6 +5153,9 @@
             <w:pPr>
               <w:pStyle w:val="ISOSecretObservations"/>
             </w:pPr>
+            <w:r>
+              <w:t>Adopted proposed solution</w:t>
+            </w:r>
           </w:p>
         </w:tc>
       </w:tr>
@@ -5180,6 +5291,9 @@
             <w:pPr>
               <w:pStyle w:val="ISOSecretObservations"/>
             </w:pPr>
+            <w:r>
+              <w:t>Adopted proposed solution</w:t>
+            </w:r>
           </w:p>
         </w:tc>
       </w:tr>
@@ -5315,6 +5429,9 @@
             <w:pPr>
               <w:pStyle w:val="ISOSecretObservations"/>
             </w:pPr>
+            <w:r>
+              <w:t>Adopted proposed solution</w:t>
+            </w:r>
           </w:p>
         </w:tc>
       </w:tr>
@@ -5450,6 +5567,9 @@
             <w:pPr>
               <w:pStyle w:val="ISOSecretObservations"/>
             </w:pPr>
+            <w:r>
+              <w:t>Adopted proposed solution</w:t>
+            </w:r>
           </w:p>
         </w:tc>
       </w:tr>
@@ -5585,6 +5705,9 @@
             <w:pPr>
               <w:pStyle w:val="ISOSecretObservations"/>
             </w:pPr>
+            <w:r>
+              <w:t>Adopted proposed solution</w:t>
+            </w:r>
           </w:p>
         </w:tc>
       </w:tr>
@@ -5605,6 +5728,7 @@
               <w:pStyle w:val="ISOMB"/>
             </w:pPr>
             <w:r>
+              <w:lastRenderedPageBreak/>
               <w:t>US-39</w:t>
             </w:r>
           </w:p>
@@ -5720,6 +5844,9 @@
             <w:pPr>
               <w:pStyle w:val="ISOSecretObservations"/>
             </w:pPr>
+            <w:r>
+              <w:t>Adopted proposed solution</w:t>
+            </w:r>
           </w:p>
         </w:tc>
       </w:tr>
@@ -5740,7 +5867,6 @@
               <w:pStyle w:val="ISOMB"/>
             </w:pPr>
             <w:r>
-              <w:lastRenderedPageBreak/>
               <w:t>US-40</w:t>
             </w:r>
           </w:p>
@@ -6132,6 +6258,9 @@
             <w:pPr>
               <w:pStyle w:val="ISOSecretObservations"/>
             </w:pPr>
+            <w:r>
+              <w:t>Added hot link to all table references so that renum.pl will update them like the figure refs.</w:t>
+            </w:r>
           </w:p>
         </w:tc>
       </w:tr>
@@ -6551,6 +6680,12 @@
             <w:pPr>
               <w:pStyle w:val="ISOSecretObservations"/>
             </w:pPr>
+            <w:r>
+              <w:t xml:space="preserve">Done,. </w:t>
+            </w:r>
+            <w:r>
+              <w:t>WG15N349</w:t>
+            </w:r>
           </w:p>
         </w:tc>
       </w:tr>
@@ -6709,6 +6844,7 @@
               <w:pStyle w:val="ISOMB"/>
             </w:pPr>
             <w:r>
+              <w:lastRenderedPageBreak/>
               <w:t>US-47</w:t>
             </w:r>
           </w:p>
@@ -6791,11 +6927,7 @@
               <w:pStyle w:val="ISOComments"/>
             </w:pPr>
             <w:r>
-              <w:t xml:space="preserve">Heading says 'Protocol Implementation Conformance Statement (PICS)' but body text </w:t>
-            </w:r>
-            <w:r>
-              <w:lastRenderedPageBreak/>
-              <w:t>says 'Protocol Information and Conformance Statement (PICS)'. These must match. (djo)</w:t>
+              <w:t>Heading says 'Protocol Implementation Conformance Statement (PICS)' but body text says 'Protocol Information and Conformance Statement (PICS)'. These must match. (djo)</w:t>
             </w:r>
           </w:p>
         </w:tc>
@@ -6812,7 +6944,6 @@
               <w:pStyle w:val="ISOChange"/>
             </w:pPr>
             <w:r>
-              <w:lastRenderedPageBreak/>
               <w:t>Change body text to 'Protocol Implementation Conformance Statement' to match heading.</w:t>
             </w:r>
           </w:p>
@@ -6830,11 +6961,7 @@
               <w:pStyle w:val="ISOSecretObservations"/>
             </w:pPr>
             <w:r>
-              <w:t xml:space="preserve">RESOLVED (ed): body changed to 'Protocol Implementation </w:t>
-            </w:r>
-            <w:r>
-              <w:lastRenderedPageBreak/>
-              <w:t>Conformance Statement' to match heading (Annex D).</w:t>
+              <w:t>RESOLVED (ed): body changed to 'Protocol Implementation Conformance Statement' to match heading (Annex D).</w:t>
             </w:r>
           </w:p>
         </w:tc>
@@ -6856,7 +6983,6 @@
               <w:pStyle w:val="ISOMB"/>
             </w:pPr>
             <w:r>
-              <w:lastRenderedPageBreak/>
               <w:t>US-48</w:t>
             </w:r>
           </w:p>
@@ -6972,6 +7098,9 @@
             <w:pPr>
               <w:pStyle w:val="ISOSecretObservations"/>
             </w:pPr>
+            <w:r>
+              <w:t>Removed redundant</w:t>
+            </w:r>
           </w:p>
         </w:tc>
       </w:tr>
@@ -7518,6 +7647,9 @@
             <w:pPr>
               <w:pStyle w:val="ISOSecretObservations"/>
             </w:pPr>
+            <w:r>
+              <w:t>Adopted proposed solution</w:t>
+            </w:r>
           </w:p>
         </w:tc>
       </w:tr>
@@ -7649,7 +7781,11 @@
               <w:bottom w:val="single" w:sz="6" w:space="0" w:color="auto"/>
             </w:tcBorders>
           </w:tcPr>
-          <w:p/>
+          <w:p>
+            <w:r>
+              <w:t>Removed entire line.  Cut and paste error.</w:t>
+            </w:r>
+          </w:p>
         </w:tc>
       </w:tr>
       <w:tr>
@@ -7669,6 +7805,7 @@
               <w:pStyle w:val="ISOMB"/>
             </w:pPr>
             <w:r>
+              <w:lastRenderedPageBreak/>
               <w:t>US-54</w:t>
             </w:r>
           </w:p>
@@ -7780,7 +7917,11 @@
               <w:bottom w:val="single" w:sz="6" w:space="0" w:color="auto"/>
             </w:tcBorders>
           </w:tcPr>
-          <w:p/>
+          <w:p>
+            <w:r>
+              <w:t>Adopted proposed solution</w:t>
+            </w:r>
+          </w:p>
         </w:tc>
       </w:tr>
       <w:tr>
@@ -7800,7 +7941,6 @@
               <w:pStyle w:val="ISOMB"/>
             </w:pPr>
             <w:r>
-              <w:lastRenderedPageBreak/>
               <w:t>US-55</w:t>
             </w:r>
           </w:p>
@@ -7912,7 +8052,17 @@
               <w:bottom w:val="single" w:sz="6" w:space="0" w:color="auto"/>
             </w:tcBorders>
           </w:tcPr>
-          <w:p/>
+          <w:p>
+            <w:r>
+              <w:t xml:space="preserve">Undated reference is correct.  Dated version was not called out in </w:t>
+            </w:r>
+            <w:r>
+              <w:t>4.3.59.2</w:t>
+            </w:r>
+            <w:r>
+              <w:t xml:space="preserve"> and most of the other references in the bibliography are undated.</w:t>
+            </w:r>
+          </w:p>
         </w:tc>
       </w:tr>
       <w:tr>
@@ -9630,6 +9780,7 @@
               <w:rPr>
                 <w:highlight w:val="yellow"/>
               </w:rPr>
+              <w:lastRenderedPageBreak/>
               <w:t>US-65</w:t>
             </w:r>
           </w:p>
@@ -9768,14 +9919,7 @@
               <w:rPr>
                 <w:highlight w:val="yellow"/>
               </w:rPr>
-              <w:t xml:space="preserve">Add Interval OPTIONAL INTEGER to describe frequency of processing with 1 being the default </w:t>
-            </w:r>
-            <w:r>
-              <w:rPr>
-                <w:highlight w:val="yellow"/>
-              </w:rPr>
-              <w:lastRenderedPageBreak/>
-              <w:t>and 2 meaning the process is executed on every other layer</w:t>
+              <w:t>Add Interval OPTIONAL INTEGER to describe frequency of processing with 1 being the default and 2 meaning the process is executed on every other layer</w:t>
             </w:r>
           </w:p>
           <w:p>
@@ -9807,7 +9951,6 @@
               <w:rPr>
                 <w:highlight w:val="yellow"/>
               </w:rPr>
-              <w:lastRenderedPageBreak/>
               <w:t>What is an interval?</w:t>
             </w:r>
           </w:p>
@@ -10863,6 +11006,7 @@
                 <w:highlight w:val="yellow"/>
                 <w:lang w:val="en-US"/>
               </w:rPr>
+              <w:lastRenderedPageBreak/>
               <w:t>SE-</w:t>
             </w:r>
             <w:r>
@@ -11129,7 +11273,6 @@
                 <w:highlight w:val="yellow"/>
                 <w:lang w:val="en-US"/>
               </w:rPr>
-              <w:lastRenderedPageBreak/>
               <w:t>SE</w:t>
             </w:r>
             <w:r>
@@ -12126,6 +12269,7 @@
               <w:pStyle w:val="ISOMB"/>
             </w:pPr>
             <w:r>
+              <w:lastRenderedPageBreak/>
               <w:t>ISO-6</w:t>
             </w:r>
           </w:p>
@@ -12258,7 +12402,6 @@
               <w:pStyle w:val="ISOMB"/>
             </w:pPr>
             <w:r>
-              <w:lastRenderedPageBreak/>
               <w:t>ISO-7</w:t>
             </w:r>
           </w:p>
@@ -12754,6 +12897,7 @@
               <w:pStyle w:val="ISOMB"/>
             </w:pPr>
             <w:r>
+              <w:lastRenderedPageBreak/>
               <w:t>ISO-9</w:t>
             </w:r>
           </w:p>
@@ -13048,7 +13192,6 @@
               <w:pStyle w:val="ISOChange"/>
             </w:pPr>
             <w:r>
-              <w:lastRenderedPageBreak/>
               <w:t>Review throughout and replace hanging paragraphs with subclause headings.</w:t>
             </w:r>
           </w:p>
@@ -13404,6 +13547,7 @@
               <w:pStyle w:val="ISOMB"/>
             </w:pPr>
             <w:r>
+              <w:lastRenderedPageBreak/>
               <w:t>ISO-12</w:t>
             </w:r>
           </w:p>
@@ -13506,7 +13650,6 @@
               <w:rPr>
                 <w:lang w:val="en-US"/>
               </w:rPr>
-              <w:lastRenderedPageBreak/>
               <w:t>Ensure that all tables are cited in the text.</w:t>
             </w:r>
           </w:p>
@@ -13786,16 +13929,7 @@
               <w:pStyle w:val="ISOSecretObservations"/>
             </w:pPr>
             <w:r>
-              <w:t>Adopted proposed solution</w:t>
-            </w:r>
-            <w:r>
-              <w:t xml:space="preserve"> </w:t>
-            </w:r>
-            <w:r>
-              <w:t>where appropriate</w:t>
-            </w:r>
-            <w:r>
-              <w:t>.</w:t>
+              <w:t>Adopted proposed solution where appropriate.</w:t>
             </w:r>
           </w:p>
           <w:p>
@@ -13991,6 +14125,7 @@
               <w:rPr>
                 <w:lang w:val="en-US"/>
               </w:rPr>
+              <w:lastRenderedPageBreak/>
               <w:t xml:space="preserve">ISO 10303-1131 </w:t>
             </w:r>
           </w:p>
@@ -14019,7 +14154,6 @@
               <w:rPr>
                 <w:lang w:val="en-US"/>
               </w:rPr>
-              <w:lastRenderedPageBreak/>
               <w:t xml:space="preserve">ISO 10303-1797 </w:t>
             </w:r>
           </w:p>
@@ -14147,6 +14281,7 @@
               <w:pStyle w:val="ISOSecretObservations"/>
             </w:pPr>
             <w:r>
+              <w:lastRenderedPageBreak/>
               <w:t>ISO 1101, ISO 23247-1, ISO 2806, ISO 5459 are referenced in clause 3</w:t>
             </w:r>
           </w:p>
@@ -14169,6 +14304,7 @@
               <w:pStyle w:val="ISOMB"/>
             </w:pPr>
             <w:r>
+              <w:lastRenderedPageBreak/>
               <w:t>SC4QC-3</w:t>
             </w:r>
           </w:p>
@@ -14338,7 +14474,378 @@
                 <w:lang w:val="en-US"/>
               </w:rPr>
               <w:tab/>
-              <w:t>A planning_operation has been added to Program_structure to describe information that could be used to generate workingsteps just before or during manufacturing.</w:t>
+              <w:t xml:space="preserve">A planning_operation has been added to Program_structure to describe information that </w:t>
+            </w:r>
+            <w:r>
+              <w:rPr>
+                <w:lang w:val="en-US"/>
+              </w:rPr>
+              <w:lastRenderedPageBreak/>
+              <w:t>could be used to generate workingsteps just before or during manufacturing.</w:t>
+            </w:r>
+          </w:p>
+          <w:p>
+            <w:pPr>
+              <w:pStyle w:val="ISOComments"/>
+              <w:rPr>
+                <w:lang w:val="en-US"/>
+              </w:rPr>
+            </w:pPr>
+            <w:r>
+              <w:rPr>
+                <w:lang w:val="en-US"/>
+              </w:rPr>
+              <w:t>clause4</w:t>
+            </w:r>
+            <w:r>
+              <w:rPr>
+                <w:lang w:val="en-US"/>
+              </w:rPr>
+              <w:tab/>
+              <w:t>In addition, only length parameters could be qualified with a tolerance.</w:t>
+            </w:r>
+          </w:p>
+          <w:p>
+            <w:pPr>
+              <w:pStyle w:val="ISOComments"/>
+              <w:rPr>
+                <w:lang w:val="en-US"/>
+              </w:rPr>
+            </w:pPr>
+            <w:r>
+              <w:rPr>
+                <w:lang w:val="en-US"/>
+              </w:rPr>
+              <w:t>clause4</w:t>
+            </w:r>
+            <w:r>
+              <w:rPr>
+                <w:lang w:val="en-US"/>
+              </w:rPr>
+              <w:tab/>
+              <w:t>EXAMPLEA Feature_complete_probing could adjust the position of a product such as a fastener, or a process such as a drilling operation.</w:t>
+            </w:r>
+          </w:p>
+          <w:p>
+            <w:pPr>
+              <w:pStyle w:val="ISOComments"/>
+              <w:rPr>
+                <w:lang w:val="en-US"/>
+              </w:rPr>
+            </w:pPr>
+            <w:r>
+              <w:rPr>
+                <w:lang w:val="en-US"/>
+              </w:rPr>
+              <w:t>clause4</w:t>
+            </w:r>
+            <w:r>
+              <w:rPr>
+                <w:lang w:val="en-US"/>
+              </w:rPr>
+              <w:tab/>
+              <w:t>The message could be put into a PPRINT command to show that the broadcast has been processed.</w:t>
+            </w:r>
+          </w:p>
+          <w:p>
+            <w:pPr>
+              <w:pStyle w:val="ISOComments"/>
+              <w:rPr>
+                <w:lang w:val="en-US"/>
+              </w:rPr>
+            </w:pPr>
+            <w:r>
+              <w:rPr>
+                <w:lang w:val="en-US"/>
+              </w:rPr>
+              <w:t>clause4</w:t>
+            </w:r>
+            <w:r>
+              <w:rPr>
+                <w:lang w:val="en-US"/>
+              </w:rPr>
+              <w:tab/>
+              <w:t>The measured properties could be used for values that are described by an external standard.</w:t>
+            </w:r>
+          </w:p>
+          <w:p>
+            <w:pPr>
+              <w:pStyle w:val="ISOComments"/>
+              <w:rPr>
+                <w:lang w:val="en-US"/>
+              </w:rPr>
+            </w:pPr>
+            <w:r>
+              <w:rPr>
+                <w:lang w:val="en-US"/>
+              </w:rPr>
+              <w:t>clause4</w:t>
+            </w:r>
+            <w:r>
+              <w:rPr>
+                <w:lang w:val="en-US"/>
+              </w:rPr>
+              <w:tab/>
+              <w:t>The current operator id could be held in the location such as "OPERATOR_BUFFER[68]".</w:t>
+            </w:r>
+          </w:p>
+          <w:p>
+            <w:pPr>
+              <w:pStyle w:val="ISOComments"/>
+              <w:rPr>
+                <w:lang w:val="en-US"/>
+              </w:rPr>
+            </w:pPr>
+            <w:r>
+              <w:rPr>
+                <w:lang w:val="en-US"/>
+              </w:rPr>
+              <w:t>clause4</w:t>
+            </w:r>
+            <w:r>
+              <w:rPr>
+                <w:lang w:val="en-US"/>
+              </w:rPr>
+              <w:tab/>
+              <w:t>A drill and fill executable could add a fastener, collar or washer.</w:t>
+            </w:r>
+          </w:p>
+          <w:p>
+            <w:pPr>
+              <w:pStyle w:val="ISOComments"/>
+              <w:rPr>
+                <w:lang w:val="en-US"/>
+              </w:rPr>
+            </w:pPr>
+            <w:r>
+              <w:rPr>
+                <w:lang w:val="en-US"/>
+              </w:rPr>
+              <w:t>clause4</w:t>
+            </w:r>
+            <w:r>
+              <w:rPr>
+                <w:lang w:val="en-US"/>
+              </w:rPr>
+              <w:tab/>
+              <w:t>Also, when drilling on a machine with redundant (not necessarily parallel) linear axes, such as a machine with a movable quill (W axis), either the W or other axes could be used to advance the drill.</w:t>
+            </w:r>
+          </w:p>
+          <w:p>
+            <w:pPr>
+              <w:pStyle w:val="ISOComments"/>
+              <w:rPr>
+                <w:lang w:val="en-US"/>
+              </w:rPr>
+            </w:pPr>
+            <w:r>
+              <w:rPr>
+                <w:lang w:val="en-US"/>
+              </w:rPr>
+              <w:t>clause4</w:t>
+            </w:r>
+            <w:r>
+              <w:rPr>
+                <w:lang w:val="en-US"/>
+              </w:rPr>
+              <w:tab/>
+              <w:t>A material workpiece could also be a Product_view_twin if it includes measured properties specific to an instance of the material.</w:t>
+            </w:r>
+          </w:p>
+          <w:p>
+            <w:pPr>
+              <w:pStyle w:val="ISOComments"/>
+              <w:rPr>
+                <w:lang w:val="en-US"/>
+              </w:rPr>
+            </w:pPr>
+            <w:r>
+              <w:rPr>
+                <w:lang w:val="en-US"/>
+              </w:rPr>
+              <w:t>clause4</w:t>
+            </w:r>
+            <w:r>
+              <w:rPr>
+                <w:lang w:val="en-US"/>
+              </w:rPr>
+              <w:tab/>
+              <w:t xml:space="preserve">NOTE The planning operation describes information that could be used to </w:t>
+            </w:r>
+            <w:r>
+              <w:rPr>
+                <w:lang w:val="en-US"/>
+              </w:rPr>
+              <w:lastRenderedPageBreak/>
+              <w:t>generate workingsteps just before or during manufacturing.</w:t>
+            </w:r>
+          </w:p>
+          <w:p>
+            <w:pPr>
+              <w:pStyle w:val="ISOComments"/>
+              <w:rPr>
+                <w:lang w:val="en-US"/>
+              </w:rPr>
+            </w:pPr>
+            <w:r>
+              <w:rPr>
+                <w:lang w:val="en-US"/>
+              </w:rPr>
+              <w:t>clause4</w:t>
+            </w:r>
+            <w:r>
+              <w:rPr>
+                <w:lang w:val="en-US"/>
+              </w:rPr>
+              <w:tab/>
+              <w:t>This will be of benefit to related downstream tasks, such as inspection, which could use the tracability to pinpoint critical areas of interest in the micro and macro process-plans.</w:t>
+            </w:r>
+          </w:p>
+          <w:p>
+            <w:pPr>
+              <w:pStyle w:val="ISOComments"/>
+              <w:rPr>
+                <w:lang w:val="en-US"/>
+              </w:rPr>
+            </w:pPr>
+            <w:r>
+              <w:rPr>
+                <w:lang w:val="en-US"/>
+              </w:rPr>
+              <w:t>clause5</w:t>
+            </w:r>
+            <w:r>
+              <w:rPr>
+                <w:lang w:val="en-US"/>
+              </w:rPr>
+              <w:tab/>
+              <w:t>Before it is machined, the top of a feature often corresponds to a tangible location on the stock where a machinist could measure or make a mark.</w:t>
+            </w:r>
+          </w:p>
+          <w:p>
+            <w:pPr>
+              <w:pStyle w:val="ISOComments"/>
+              <w:rPr>
+                <w:lang w:val="en-US"/>
+              </w:rPr>
+            </w:pPr>
+            <w:r>
+              <w:rPr>
+                <w:lang w:val="en-US"/>
+              </w:rPr>
+              <w:t>clause5</w:t>
+            </w:r>
+            <w:r>
+              <w:rPr>
+                <w:lang w:val="en-US"/>
+              </w:rPr>
+              <w:tab/>
+              <w:t>This associativity through the entire design to manufacturing path is useful for related downstream tasks, such as inspection, which could use the tracability to pinpoint critical areas of interest in the micro and macro process-plans.</w:t>
+            </w:r>
+          </w:p>
+          <w:p>
+            <w:pPr>
+              <w:pStyle w:val="ISOComments"/>
+              <w:rPr>
+                <w:lang w:val="en-US"/>
+              </w:rPr>
+            </w:pPr>
+            <w:r>
+              <w:rPr>
+                <w:lang w:val="en-US"/>
+              </w:rPr>
+              <w:t>clause5</w:t>
+            </w:r>
+            <w:r>
+              <w:rPr>
+                <w:lang w:val="en-US"/>
+              </w:rPr>
+              <w:tab/>
+              <w:t>A feedrate could be described either as a linear speed (length per unit of time), or as a length per tooth of the tool being used.</w:t>
+            </w:r>
+          </w:p>
+          <w:p>
+            <w:pPr>
+              <w:pStyle w:val="ISOComments"/>
+              <w:rPr>
+                <w:lang w:val="en-US"/>
+              </w:rPr>
+            </w:pPr>
+            <w:r>
+              <w:rPr>
+                <w:lang w:val="en-US"/>
+              </w:rPr>
+              <w:t>clause5</w:t>
+            </w:r>
+            <w:r>
+              <w:rPr>
+                <w:lang w:val="en-US"/>
+              </w:rPr>
+              <w:tab/>
+              <w:t>The model could represent the values, but could not distinguish between as-planned and as-executed data sources.</w:t>
+            </w:r>
+          </w:p>
+          <w:p>
+            <w:pPr>
+              <w:pStyle w:val="ISOComments"/>
+              <w:rPr>
+                <w:lang w:val="en-US"/>
+              </w:rPr>
+            </w:pPr>
+            <w:r>
+              <w:rPr>
+                <w:lang w:val="en-US"/>
+              </w:rPr>
+              <w:t>clause5</w:t>
+            </w:r>
+            <w:r>
+              <w:rPr>
+                <w:lang w:val="en-US"/>
+              </w:rPr>
+              <w:tab/>
+              <w:t>Furthermore, the model could only represent as-executed values for a single execution run.</w:t>
+            </w:r>
+          </w:p>
+          <w:p>
+            <w:pPr>
+              <w:pStyle w:val="ISOComments"/>
+              <w:rPr>
+                <w:lang w:val="en-US"/>
+              </w:rPr>
+            </w:pPr>
+            <w:r>
+              <w:rPr>
+                <w:lang w:val="en-US"/>
+              </w:rPr>
+              <w:t>scope</w:t>
+            </w:r>
+            <w:r>
+              <w:rPr>
+                <w:lang w:val="en-US"/>
+              </w:rPr>
+              <w:tab/>
+              <w:t>Future editions of this document might include additional processes if additional ISO 14649 descriptions become available.</w:t>
+            </w:r>
+          </w:p>
+          <w:p>
+            <w:pPr>
+              <w:pStyle w:val="ISOComments"/>
+              <w:rPr>
+                <w:lang w:val="en-US"/>
+              </w:rPr>
+            </w:pPr>
+            <w:r>
+              <w:rPr>
+                <w:lang w:val="en-US"/>
+              </w:rPr>
+              <w:t>clause4</w:t>
+            </w:r>
+            <w:r>
+              <w:rPr>
+                <w:lang w:val="en-US"/>
+              </w:rPr>
+              <w:tab/>
+              <w:t>The its_technology may not be specified for a particular Am_operation.</w:t>
             </w:r>
           </w:p>
           <w:p>
@@ -14360,7 +14867,7 @@
                 <w:lang w:val="en-US"/>
               </w:rPr>
               <w:tab/>
-              <w:t>In addition, only length parameters could be qualified with a tolerance.</w:t>
+              <w:t>If compute_downskin is false or unspecified, they may not.</w:t>
             </w:r>
           </w:p>
           <w:p>
@@ -14381,7 +14888,7 @@
                 <w:lang w:val="en-US"/>
               </w:rPr>
               <w:tab/>
-              <w:t>EXAMPLEA Feature_complete_probing could adjust the position of a product such as a fastener, or a process such as a drilling operation.</w:t>
+              <w:t>If compute_upskin is false or unspecified, they may not.</w:t>
             </w:r>
           </w:p>
           <w:p>
@@ -14402,7 +14909,7 @@
                 <w:lang w:val="en-US"/>
               </w:rPr>
               <w:tab/>
-              <w:t>The message could be put into a PPRINT command to show that the broadcast has been processed.</w:t>
+              <w:t>If compute_spike is false or unspecified, they may not.</w:t>
             </w:r>
           </w:p>
           <w:p>
@@ -14423,7 +14930,7 @@
                 <w:lang w:val="en-US"/>
               </w:rPr>
               <w:tab/>
-              <w:t>The measured properties could be used for values that are described by an external standard.</w:t>
+              <w:t>If compute_thin_wall is false or unspecified, they may not.</w:t>
             </w:r>
           </w:p>
           <w:p>
@@ -14444,7 +14951,7 @@
                 <w:lang w:val="en-US"/>
               </w:rPr>
               <w:tab/>
-              <w:t>The current operator id could be held in the location such as "OPERATOR_BUFFER[68]".</w:t>
+              <w:t>The its_support_geometry may not be specified for a particular Executable.</w:t>
             </w:r>
           </w:p>
           <w:p>
@@ -14465,7 +14972,7 @@
                 <w:lang w:val="en-US"/>
               </w:rPr>
               <w:tab/>
-              <w:t>A drill and fill executable could add a fastener, collar or washer.</w:t>
+              <w:t>PLC measurements may not be portable between machines.</w:t>
             </w:r>
           </w:p>
           <w:p>
@@ -14486,7 +14993,7 @@
                 <w:lang w:val="en-US"/>
               </w:rPr>
               <w:tab/>
-              <w:t>Also, when drilling on a machine with redundant (not necessarily parallel) linear axes, such as a machine with a movable quill (W axis), either the W or other axes could be used to advance the drill.</w:t>
+              <w:t>The clamping shall be performed at high speed if high_speed is true, and may not if high_speed is false or not specified.</w:t>
             </w:r>
           </w:p>
           <w:p>
@@ -14507,7 +15014,7 @@
                 <w:lang w:val="en-US"/>
               </w:rPr>
               <w:tab/>
-              <w:t>A material workpiece could also be a Product_view_twin if it includes measured properties specific to an instance of the material.</w:t>
+              <w:t>The its_toolref_direction may not be specified for a particular Cutter_contact_trajectory.</w:t>
             </w:r>
           </w:p>
           <w:p>
@@ -14528,7 +15035,49 @@
                 <w:lang w:val="en-US"/>
               </w:rPr>
               <w:tab/>
-              <w:t>NOTE The planning operation describes information that could be used to generate workingsteps just before or during manufacturing.</w:t>
+              <w:t>The path_maximum_deviation may not be specified for a particular Cutter_contact_trajectory.</w:t>
+            </w:r>
+          </w:p>
+          <w:p>
+            <w:pPr>
+              <w:pStyle w:val="ISOComments"/>
+              <w:rPr>
+                <w:lang w:val="en-US"/>
+              </w:rPr>
+            </w:pPr>
+            <w:r>
+              <w:rPr>
+                <w:lang w:val="en-US"/>
+              </w:rPr>
+              <w:t>clause4</w:t>
+            </w:r>
+            <w:r>
+              <w:rPr>
+                <w:lang w:val="en-US"/>
+              </w:rPr>
+              <w:tab/>
+              <w:t>The tool_axis_maximum_deviation may not be specified for a particular Cutter_contact_trajectory.</w:t>
+            </w:r>
+          </w:p>
+          <w:p>
+            <w:pPr>
+              <w:pStyle w:val="ISOComments"/>
+              <w:rPr>
+                <w:lang w:val="en-US"/>
+              </w:rPr>
+            </w:pPr>
+            <w:r>
+              <w:rPr>
+                <w:lang w:val="en-US"/>
+              </w:rPr>
+              <w:t>clause4</w:t>
+            </w:r>
+            <w:r>
+              <w:rPr>
+                <w:lang w:val="en-US"/>
+              </w:rPr>
+              <w:tab/>
+              <w:t>The its_toolref_direction may not be specified for a particular Cutter_location_trajectory.</w:t>
             </w:r>
           </w:p>
           <w:p>
@@ -14550,133 +15099,133 @@
                 <w:lang w:val="en-US"/>
               </w:rPr>
               <w:tab/>
-              <w:t>This will be of benefit to related downstream tasks, such as inspection, which could use the tracability to pinpoint critical areas of interest in the micro and macro process-plans.</w:t>
-            </w:r>
-          </w:p>
-          <w:p>
-            <w:pPr>
-              <w:pStyle w:val="ISOComments"/>
-              <w:rPr>
-                <w:lang w:val="en-US"/>
-              </w:rPr>
-            </w:pPr>
-            <w:r>
-              <w:rPr>
-                <w:lang w:val="en-US"/>
-              </w:rPr>
-              <w:t>clause5</w:t>
+              <w:t>The path_maximum_deviation may not be specified for a particular Cutter_location_trajectory.</w:t>
+            </w:r>
+          </w:p>
+          <w:p>
+            <w:pPr>
+              <w:pStyle w:val="ISOComments"/>
+              <w:rPr>
+                <w:lang w:val="en-US"/>
+              </w:rPr>
+            </w:pPr>
+            <w:r>
+              <w:rPr>
+                <w:lang w:val="en-US"/>
+              </w:rPr>
+              <w:t>clause4</w:t>
             </w:r>
             <w:r>
               <w:rPr>
                 <w:lang w:val="en-US"/>
               </w:rPr>
               <w:tab/>
-              <w:t>Before it is machined, the top of a feature often corresponds to a tangible location on the stock where a machinist could measure or make a mark.</w:t>
-            </w:r>
-          </w:p>
-          <w:p>
-            <w:pPr>
-              <w:pStyle w:val="ISOComments"/>
-              <w:rPr>
-                <w:lang w:val="en-US"/>
-              </w:rPr>
-            </w:pPr>
-            <w:r>
-              <w:rPr>
-                <w:lang w:val="en-US"/>
-              </w:rPr>
-              <w:t>clause5</w:t>
+              <w:t>The tool_axis_maximum_deviation may not be specified for a particular Cutter_location_trajectory.</w:t>
+            </w:r>
+          </w:p>
+          <w:p>
+            <w:pPr>
+              <w:pStyle w:val="ISOComments"/>
+              <w:rPr>
+                <w:lang w:val="en-US"/>
+              </w:rPr>
+            </w:pPr>
+            <w:r>
+              <w:rPr>
+                <w:lang w:val="en-US"/>
+              </w:rPr>
+              <w:t>clause4</w:t>
             </w:r>
             <w:r>
               <w:rPr>
                 <w:lang w:val="en-US"/>
               </w:rPr>
               <w:tab/>
-              <w:t>This associativity through the entire design to manufacturing path is useful for related downstream tasks, such as inspection, which could use the tracability to pinpoint critical areas of interest in the micro and macro process-plans.</w:t>
-            </w:r>
-          </w:p>
-          <w:p>
-            <w:pPr>
-              <w:pStyle w:val="ISOComments"/>
-              <w:rPr>
-                <w:lang w:val="en-US"/>
-              </w:rPr>
-            </w:pPr>
-            <w:r>
-              <w:rPr>
-                <w:lang w:val="en-US"/>
-              </w:rPr>
-              <w:t>clause5</w:t>
+              <w:t>The as_is may not be specified for a particular Executable.</w:t>
+            </w:r>
+          </w:p>
+          <w:p>
+            <w:pPr>
+              <w:pStyle w:val="ISOComments"/>
+              <w:rPr>
+                <w:lang w:val="en-US"/>
+              </w:rPr>
+            </w:pPr>
+            <w:r>
+              <w:rPr>
+                <w:lang w:val="en-US"/>
+              </w:rPr>
+              <w:t>clause4</w:t>
             </w:r>
             <w:r>
               <w:rPr>
                 <w:lang w:val="en-US"/>
               </w:rPr>
               <w:tab/>
-              <w:t>A feedrate could be described either as a linear speed (length per unit of time), or as a length per tooth of the tool being used.</w:t>
-            </w:r>
-          </w:p>
-          <w:p>
-            <w:pPr>
-              <w:pStyle w:val="ISOComments"/>
-              <w:rPr>
-                <w:lang w:val="en-US"/>
-              </w:rPr>
-            </w:pPr>
-            <w:r>
-              <w:rPr>
-                <w:lang w:val="en-US"/>
-              </w:rPr>
-              <w:t>clause5</w:t>
+              <w:t>The enabled may not be specified for a particular Executable.</w:t>
+            </w:r>
+          </w:p>
+          <w:p>
+            <w:pPr>
+              <w:pStyle w:val="ISOComments"/>
+              <w:rPr>
+                <w:lang w:val="en-US"/>
+              </w:rPr>
+            </w:pPr>
+            <w:r>
+              <w:rPr>
+                <w:lang w:val="en-US"/>
+              </w:rPr>
+              <w:t>clause4</w:t>
             </w:r>
             <w:r>
               <w:rPr>
                 <w:lang w:val="en-US"/>
               </w:rPr>
               <w:tab/>
-              <w:t>The model could represent the values, but could not distinguish between as-planned and as-executed data sources.</w:t>
-            </w:r>
-          </w:p>
-          <w:p>
-            <w:pPr>
-              <w:pStyle w:val="ISOComments"/>
-              <w:rPr>
-                <w:lang w:val="en-US"/>
-              </w:rPr>
-            </w:pPr>
-            <w:r>
-              <w:rPr>
-                <w:lang w:val="en-US"/>
-              </w:rPr>
-              <w:t>clause5</w:t>
+              <w:t>The machine_used may not be specified for a particular Executable.</w:t>
+            </w:r>
+          </w:p>
+          <w:p>
+            <w:pPr>
+              <w:pStyle w:val="ISOComments"/>
+              <w:rPr>
+                <w:lang w:val="en-US"/>
+              </w:rPr>
+            </w:pPr>
+            <w:r>
+              <w:rPr>
+                <w:lang w:val="en-US"/>
+              </w:rPr>
+              <w:t>clause4</w:t>
             </w:r>
             <w:r>
               <w:rPr>
                 <w:lang w:val="en-US"/>
               </w:rPr>
               <w:tab/>
-              <w:t>Furthermore, the model could only represent as-executed values for a single execution run.</w:t>
-            </w:r>
-          </w:p>
-          <w:p>
-            <w:pPr>
-              <w:pStyle w:val="ISOComments"/>
-              <w:rPr>
-                <w:lang w:val="en-US"/>
-              </w:rPr>
-            </w:pPr>
-            <w:r>
-              <w:rPr>
-                <w:lang w:val="en-US"/>
-              </w:rPr>
-              <w:t>scope</w:t>
+              <w:t>The process_properties describe characteristics of an Executable that may not be conveyed using other capabilities of this document.</w:t>
+            </w:r>
+          </w:p>
+          <w:p>
+            <w:pPr>
+              <w:pStyle w:val="ISOComments"/>
+              <w:rPr>
+                <w:lang w:val="en-US"/>
+              </w:rPr>
+            </w:pPr>
+            <w:r>
+              <w:rPr>
+                <w:lang w:val="en-US"/>
+              </w:rPr>
+              <w:t>clause4</w:t>
             </w:r>
             <w:r>
               <w:rPr>
                 <w:lang w:val="en-US"/>
               </w:rPr>
               <w:tab/>
-              <w:t>Future editions of this document might include additional processes if additional ISO 14649 descriptions become available.</w:t>
+              <w:t>The removal may not be specified for a particular Executable.</w:t>
             </w:r>
           </w:p>
           <w:p>
@@ -14697,7 +15246,7 @@
                 <w:lang w:val="en-US"/>
               </w:rPr>
               <w:tab/>
-              <w:t>The its_technology may not be specified for a particular Am_operation.</w:t>
+              <w:t>The to_be may not be specified for a particular Executable.</w:t>
             </w:r>
           </w:p>
           <w:p>
@@ -14718,7 +15267,49 @@
                 <w:lang w:val="en-US"/>
               </w:rPr>
               <w:tab/>
-              <w:t>If compute_downskin is false or unspecified, they may not.</w:t>
+              <w:t>The twin_end may not be specified for a particular Executable.</w:t>
+            </w:r>
+          </w:p>
+          <w:p>
+            <w:pPr>
+              <w:pStyle w:val="ISOComments"/>
+              <w:rPr>
+                <w:lang w:val="en-US"/>
+              </w:rPr>
+            </w:pPr>
+            <w:r>
+              <w:rPr>
+                <w:lang w:val="en-US"/>
+              </w:rPr>
+              <w:t>clause4</w:t>
+            </w:r>
+            <w:r>
+              <w:rPr>
+                <w:lang w:val="en-US"/>
+              </w:rPr>
+              <w:tab/>
+              <w:t>The twin_exception may not be specified for a particular Executable.</w:t>
+            </w:r>
+          </w:p>
+          <w:p>
+            <w:pPr>
+              <w:pStyle w:val="ISOComments"/>
+              <w:rPr>
+                <w:lang w:val="en-US"/>
+              </w:rPr>
+            </w:pPr>
+            <w:r>
+              <w:rPr>
+                <w:lang w:val="en-US"/>
+              </w:rPr>
+              <w:t>clause4</w:t>
+            </w:r>
+            <w:r>
+              <w:rPr>
+                <w:lang w:val="en-US"/>
+              </w:rPr>
+              <w:tab/>
+              <w:t>The twin_plan may not be specified for a particular Executable.</w:t>
             </w:r>
           </w:p>
           <w:p>
@@ -14740,7 +15331,7 @@
                 <w:lang w:val="en-US"/>
               </w:rPr>
               <w:tab/>
-              <w:t>If compute_upskin is false or unspecified, they may not.</w:t>
+              <w:t>The twin_source may not be specified for a particular Executable.</w:t>
             </w:r>
           </w:p>
           <w:p>
@@ -14761,7 +15352,7 @@
                 <w:lang w:val="en-US"/>
               </w:rPr>
               <w:tab/>
-              <w:t>If compute_spike is false or unspecified, they may not.</w:t>
+              <w:t>The twin_start may not be specified for a particular Executable.</w:t>
             </w:r>
           </w:p>
           <w:p>
@@ -14782,7 +15373,7 @@
                 <w:lang w:val="en-US"/>
               </w:rPr>
               <w:tab/>
-              <w:t>If compute_thin_wall is false or unspecified, they may not.</w:t>
+              <w:t>The twin_worktime may not be specified for a particular Executable.</w:t>
             </w:r>
           </w:p>
           <w:p>
@@ -14803,7 +15394,7 @@
                 <w:lang w:val="en-US"/>
               </w:rPr>
               <w:tab/>
-              <w:t>The its_support_geometry may not be specified for a particular Executable.</w:t>
+              <w:t>The its_machine_functions may not be specified for a particular Extended_operation.</w:t>
             </w:r>
           </w:p>
           <w:p>
@@ -14824,7 +15415,7 @@
                 <w:lang w:val="en-US"/>
               </w:rPr>
               <w:tab/>
-              <w:t>PLC measurements may not be portable between machines.</w:t>
+              <w:t>The its_technology may not be specified for a particular Extended_operation.</w:t>
             </w:r>
           </w:p>
           <w:p>
@@ -14845,7 +15436,7 @@
                 <w:lang w:val="en-US"/>
               </w:rPr>
               <w:tab/>
-              <w:t>The clamping shall be performed at high speed if high_speed is true, and may not if high_speed is false or not specified.</w:t>
+              <w:t>The its_tool may not be specified for a particular Extended_operation.</w:t>
             </w:r>
           </w:p>
           <w:p>
@@ -14866,7 +15457,7 @@
                 <w:lang w:val="en-US"/>
               </w:rPr>
               <w:tab/>
-              <w:t>The its_toolref_direction may not be specified for a particular Cutter_contact_trajectory.</w:t>
+              <w:t>The expected_value may not be specified for a particular Feature_complete_probing.</w:t>
             </w:r>
           </w:p>
           <w:p>
@@ -14887,7 +15478,7 @@
                 <w:lang w:val="en-US"/>
               </w:rPr>
               <w:tab/>
-              <w:t>The path_maximum_deviation may not be specified for a particular Cutter_contact_trajectory.</w:t>
+              <w:t>The description may not be specified for a particular Fixture_usage.</w:t>
             </w:r>
           </w:p>
           <w:p>
@@ -14908,7 +15499,7 @@
                 <w:lang w:val="en-US"/>
               </w:rPr>
               <w:tab/>
-              <w:t>The tool_axis_maximum_deviation may not be specified for a particular Cutter_contact_trajectory.</w:t>
+              <w:t>The its_product may not be specified for a particular Fixture_usage.</w:t>
             </w:r>
           </w:p>
           <w:p>
@@ -14929,7 +15520,7 @@
                 <w:lang w:val="en-US"/>
               </w:rPr>
               <w:tab/>
-              <w:t>The its_toolref_direction may not be specified for a particular Cutter_location_trajectory.</w:t>
+              <w:t>The mount_reference may not be specified for a particular Fixture_usage.</w:t>
             </w:r>
           </w:p>
           <w:p>
@@ -14950,7 +15541,266 @@
                 <w:lang w:val="en-US"/>
               </w:rPr>
               <w:tab/>
-              <w:t>The path_maximum_deviation may not be specified for a particular Cutter_location_trajectory.</w:t>
+              <w:t>The workpiece_reference may not be specified for a particular Fixture_usage.</w:t>
+            </w:r>
+          </w:p>
+          <w:p>
+            <w:pPr>
+              <w:pStyle w:val="ISOComments"/>
+              <w:rPr>
+                <w:lang w:val="en-US"/>
+              </w:rPr>
+            </w:pPr>
+            <w:r>
+              <w:rPr>
+                <w:lang w:val="en-US"/>
+              </w:rPr>
+              <w:t>clause4</w:t>
+            </w:r>
+            <w:r>
+              <w:rPr>
+                <w:lang w:val="en-US"/>
+              </w:rPr>
+              <w:tab/>
+              <w:t xml:space="preserve">The axis_travel may not be specified for a particular Machine_parameters and the axis_travel shall not be specified if </w:t>
+            </w:r>
+            <w:r>
+              <w:rPr>
+                <w:lang w:val="en-US"/>
+              </w:rPr>
+              <w:lastRenderedPageBreak/>
+              <w:t>work_volume_length, work_volume_width, or work_volume_height is specified.</w:t>
+            </w:r>
+          </w:p>
+          <w:p>
+            <w:pPr>
+              <w:pStyle w:val="ISOComments"/>
+              <w:rPr>
+                <w:lang w:val="en-US"/>
+              </w:rPr>
+            </w:pPr>
+            <w:r>
+              <w:rPr>
+                <w:lang w:val="en-US"/>
+              </w:rPr>
+              <w:t>clause4</w:t>
+            </w:r>
+            <w:r>
+              <w:rPr>
+                <w:lang w:val="en-US"/>
+              </w:rPr>
+              <w:tab/>
+              <w:t>The feedrate may not be specified for a particular Machine_parameters.</w:t>
+            </w:r>
+          </w:p>
+          <w:p>
+            <w:pPr>
+              <w:pStyle w:val="ISOComments"/>
+              <w:rPr>
+                <w:lang w:val="en-US"/>
+              </w:rPr>
+            </w:pPr>
+            <w:r>
+              <w:rPr>
+                <w:lang w:val="en-US"/>
+              </w:rPr>
+              <w:t>clause4</w:t>
+            </w:r>
+            <w:r>
+              <w:rPr>
+                <w:lang w:val="en-US"/>
+              </w:rPr>
+              <w:tab/>
+              <w:t>The number_of_control_axis may not be specified for a particular Machine_parameters.</w:t>
+            </w:r>
+          </w:p>
+          <w:p>
+            <w:pPr>
+              <w:pStyle w:val="ISOComments"/>
+              <w:rPr>
+                <w:lang w:val="en-US"/>
+              </w:rPr>
+            </w:pPr>
+            <w:r>
+              <w:rPr>
+                <w:lang w:val="en-US"/>
+              </w:rPr>
+              <w:t>clause4</w:t>
+            </w:r>
+            <w:r>
+              <w:rPr>
+                <w:lang w:val="en-US"/>
+              </w:rPr>
+              <w:tab/>
+              <w:t>The number_of_simultaneous_axis may not be specified for a particular Machine_parameters.</w:t>
+            </w:r>
+          </w:p>
+          <w:p>
+            <w:pPr>
+              <w:pStyle w:val="ISOComments"/>
+              <w:rPr>
+                <w:lang w:val="en-US"/>
+              </w:rPr>
+            </w:pPr>
+            <w:r>
+              <w:rPr>
+                <w:lang w:val="en-US"/>
+              </w:rPr>
+              <w:t>clause4</w:t>
+            </w:r>
+            <w:r>
+              <w:rPr>
+                <w:lang w:val="en-US"/>
+              </w:rPr>
+              <w:tab/>
+              <w:t>The positioning_accuracy may not be specified for a particular Machine_parameters.</w:t>
+            </w:r>
+          </w:p>
+          <w:p>
+            <w:pPr>
+              <w:pStyle w:val="ISOComments"/>
+              <w:rPr>
+                <w:lang w:val="en-US"/>
+              </w:rPr>
+            </w:pPr>
+            <w:r>
+              <w:rPr>
+                <w:lang w:val="en-US"/>
+              </w:rPr>
+              <w:t>clause4</w:t>
+            </w:r>
+            <w:r>
+              <w:rPr>
+                <w:lang w:val="en-US"/>
+              </w:rPr>
+              <w:tab/>
+              <w:t>The spindle_power may not be specified for a particular Machine_parameters.</w:t>
+            </w:r>
+          </w:p>
+          <w:p>
+            <w:pPr>
+              <w:pStyle w:val="ISOComments"/>
+              <w:rPr>
+                <w:lang w:val="en-US"/>
+              </w:rPr>
+            </w:pPr>
+            <w:r>
+              <w:rPr>
+                <w:lang w:val="en-US"/>
+              </w:rPr>
+              <w:t>clause4</w:t>
+            </w:r>
+            <w:r>
+              <w:rPr>
+                <w:lang w:val="en-US"/>
+              </w:rPr>
+              <w:tab/>
+              <w:t>The spindle_torque may not be specified for a particular Machine_parameters.</w:t>
+            </w:r>
+          </w:p>
+          <w:p>
+            <w:pPr>
+              <w:pStyle w:val="ISOComments"/>
+              <w:rPr>
+                <w:lang w:val="en-US"/>
+              </w:rPr>
+            </w:pPr>
+            <w:r>
+              <w:rPr>
+                <w:lang w:val="en-US"/>
+              </w:rPr>
+              <w:t>clause4</w:t>
+            </w:r>
+            <w:r>
+              <w:rPr>
+                <w:lang w:val="en-US"/>
+              </w:rPr>
+              <w:tab/>
+              <w:t>The spindle_speed may not be specified for a particular Machine_parameters.</w:t>
+            </w:r>
+          </w:p>
+          <w:p>
+            <w:pPr>
+              <w:pStyle w:val="ISOComments"/>
+              <w:rPr>
+                <w:lang w:val="en-US"/>
+              </w:rPr>
+            </w:pPr>
+            <w:r>
+              <w:rPr>
+                <w:lang w:val="en-US"/>
+              </w:rPr>
+              <w:t>clause4</w:t>
+            </w:r>
+            <w:r>
+              <w:rPr>
+                <w:lang w:val="en-US"/>
+              </w:rPr>
+              <w:tab/>
+              <w:t>The table_indexing may not be specified for a particular Machine_parameters.</w:t>
+            </w:r>
+          </w:p>
+          <w:p>
+            <w:pPr>
+              <w:pStyle w:val="ISOComments"/>
+              <w:rPr>
+                <w:lang w:val="en-US"/>
+              </w:rPr>
+            </w:pPr>
+            <w:r>
+              <w:rPr>
+                <w:lang w:val="en-US"/>
+              </w:rPr>
+              <w:t>clause4</w:t>
+            </w:r>
+            <w:r>
+              <w:rPr>
+                <w:lang w:val="en-US"/>
+              </w:rPr>
+              <w:tab/>
+              <w:t>The table_length may not be specified for a particular Machine_parameters.</w:t>
+            </w:r>
+          </w:p>
+          <w:p>
+            <w:pPr>
+              <w:pStyle w:val="ISOComments"/>
+              <w:rPr>
+                <w:lang w:val="en-US"/>
+              </w:rPr>
+            </w:pPr>
+            <w:r>
+              <w:rPr>
+                <w:lang w:val="en-US"/>
+              </w:rPr>
+              <w:t>clause4</w:t>
+            </w:r>
+            <w:r>
+              <w:rPr>
+                <w:lang w:val="en-US"/>
+              </w:rPr>
+              <w:tab/>
+              <w:t>The table_width may not be specified for a particular Machine_parameters.</w:t>
+            </w:r>
+          </w:p>
+          <w:p>
+            <w:pPr>
+              <w:pStyle w:val="ISOComments"/>
+              <w:rPr>
+                <w:lang w:val="en-US"/>
+              </w:rPr>
+            </w:pPr>
+            <w:r>
+              <w:rPr>
+                <w:lang w:val="en-US"/>
+              </w:rPr>
+              <w:t>clause4</w:t>
+            </w:r>
+            <w:r>
+              <w:rPr>
+                <w:lang w:val="en-US"/>
+              </w:rPr>
+              <w:tab/>
+              <w:t>The work_volume_height may not be specified for a particular Machine_parameters and the work_volume_height shall not be specified if axis_travel is specified.</w:t>
             </w:r>
           </w:p>
           <w:p>
@@ -14972,7 +15822,7 @@
                 <w:lang w:val="en-US"/>
               </w:rPr>
               <w:tab/>
-              <w:t>The tool_axis_maximum_deviation may not be specified for a particular Cutter_location_trajectory.</w:t>
+              <w:t>The work_volume_length may not be specified for a particular Machine_parameters and the work_volume_length shall not be specified if axis_travel is specified.</w:t>
             </w:r>
           </w:p>
           <w:p>
@@ -14993,7 +15843,7 @@
                 <w:lang w:val="en-US"/>
               </w:rPr>
               <w:tab/>
-              <w:t>The as_is may not be specified for a particular Executable.</w:t>
+              <w:t>The work_volume_width may not be specified for a particular Machine_parameters and the work_volume_width shall not be specified if axis_travel is specified.</w:t>
             </w:r>
           </w:p>
           <w:p>
@@ -15014,7 +15864,7 @@
                 <w:lang w:val="en-US"/>
               </w:rPr>
               <w:tab/>
-              <w:t>The enabled may not be specified for a particular Executable.</w:t>
+              <w:t>The description may not be specified for a particular Machine_usage.</w:t>
             </w:r>
           </w:p>
           <w:p>
@@ -15035,7 +15885,7 @@
                 <w:lang w:val="en-US"/>
               </w:rPr>
               <w:tab/>
-              <w:t>The machine_used may not be specified for a particular Executable.</w:t>
+              <w:t>The its_product may not be specified for a particular Machine_usage.</w:t>
             </w:r>
           </w:p>
           <w:p>
@@ -15056,7 +15906,7 @@
                 <w:lang w:val="en-US"/>
               </w:rPr>
               <w:tab/>
-              <w:t>The process_properties describe characteristics of an Executable that may not be conveyed using other capabilities of this document.</w:t>
+              <w:t>The configuration may not be specified for a particular Machine_with_kinematics.</w:t>
             </w:r>
           </w:p>
           <w:p>
@@ -15077,7 +15927,7 @@
                 <w:lang w:val="en-US"/>
               </w:rPr>
               <w:tab/>
-              <w:t>The removal may not be specified for a particular Executable.</w:t>
+              <w:t>The its_usage may not be specified for a particular Machining_tool.</w:t>
             </w:r>
           </w:p>
           <w:p>
@@ -15098,7 +15948,7 @@
                 <w:lang w:val="en-US"/>
               </w:rPr>
               <w:tab/>
-              <w:t>The to_be may not be specified for a particular Executable.</w:t>
+              <w:t>If primary is false or not specified, a referencing Drill_and_fill_group may not be preferred.</w:t>
             </w:r>
           </w:p>
           <w:p>
@@ -15119,7 +15969,7 @@
                 <w:lang w:val="en-US"/>
               </w:rPr>
               <w:tab/>
-              <w:t>The twin_end may not be specified for a particular Executable.</w:t>
+              <w:t>The property_date may not be specified for a particular Process_property.</w:t>
             </w:r>
           </w:p>
           <w:p>
@@ -15140,7 +15990,7 @@
                 <w:lang w:val="en-US"/>
               </w:rPr>
               <w:tab/>
-              <w:t>The twin_exception may not be specified for a particular Executable.</w:t>
+              <w:t>If seal_check is false or unspecified, the sealant may not be checked.</w:t>
             </w:r>
           </w:p>
           <w:p>
@@ -15161,7 +16011,7 @@
                 <w:lang w:val="en-US"/>
               </w:rPr>
               <w:tab/>
-              <w:t>The twin_plan may not be specified for a particular Executable.</w:t>
+              <w:t>The description may not be specified for a particular Tool_usage.</w:t>
             </w:r>
           </w:p>
           <w:p>
@@ -15182,28 +16032,7 @@
                 <w:lang w:val="en-US"/>
               </w:rPr>
               <w:tab/>
-              <w:t>The twin_source may not be specified for a particular Executable.</w:t>
-            </w:r>
-          </w:p>
-          <w:p>
-            <w:pPr>
-              <w:pStyle w:val="ISOComments"/>
-              <w:rPr>
-                <w:lang w:val="en-US"/>
-              </w:rPr>
-            </w:pPr>
-            <w:r>
-              <w:rPr>
-                <w:lang w:val="en-US"/>
-              </w:rPr>
-              <w:t>clause4</w:t>
-            </w:r>
-            <w:r>
-              <w:rPr>
-                <w:lang w:val="en-US"/>
-              </w:rPr>
-              <w:tab/>
-              <w:t>The twin_start may not be specified for a particular Executable.</w:t>
+              <w:t>The gage_placement may not be specified for a particular Tool_usage.</w:t>
             </w:r>
           </w:p>
           <w:p>
@@ -15225,7 +16054,7 @@
                 <w:lang w:val="en-US"/>
               </w:rPr>
               <w:tab/>
-              <w:t>The twin_worktime may not be specified for a particular Executable.</w:t>
+              <w:t>The its_carousel may not be specified for a particular Tool_usage.</w:t>
             </w:r>
           </w:p>
           <w:p>
@@ -15246,7 +16075,7 @@
                 <w:lang w:val="en-US"/>
               </w:rPr>
               <w:tab/>
-              <w:t>The its_machine_functions may not be specified for a particular Extended_operation.</w:t>
+              <w:t>The its_library_reference may not be specified for a particular Tool_usage.</w:t>
             </w:r>
           </w:p>
           <w:p>
@@ -15267,7 +16096,7 @@
                 <w:lang w:val="en-US"/>
               </w:rPr>
               <w:tab/>
-              <w:t>The its_technology may not be specified for a particular Extended_operation.</w:t>
+              <w:t>The its_position may not be specified for a particular Tool_usage.</w:t>
             </w:r>
           </w:p>
           <w:p>
@@ -15288,7 +16117,7 @@
                 <w:lang w:val="en-US"/>
               </w:rPr>
               <w:tab/>
-              <w:t>The its_tool may not be specified for a particular Extended_operation.</w:t>
+              <w:t>The its_product may not be specified for a particular Tool_usage.</w:t>
             </w:r>
           </w:p>
           <w:p>
@@ -15309,7 +16138,7 @@
                 <w:lang w:val="en-US"/>
               </w:rPr>
               <w:tab/>
-              <w:t>The expected_value may not be specified for a particular Feature_complete_probing.</w:t>
+              <w:t>The tool_end_placement may not be specified for a particular Tool_usage.</w:t>
             </w:r>
           </w:p>
           <w:p>
@@ -15330,7 +16159,7 @@
                 <w:lang w:val="en-US"/>
               </w:rPr>
               <w:tab/>
-              <w:t>The description may not be specified for a particular Fixture_usage.</w:t>
+              <w:t>The its_id may not be specified for a particular Toolpath.</w:t>
             </w:r>
           </w:p>
           <w:p>
@@ -15351,7 +16180,7 @@
                 <w:lang w:val="en-US"/>
               </w:rPr>
               <w:tab/>
-              <w:t>The its_product may not be specified for a particular Fixture_usage.</w:t>
+              <w:t>The ball_radius may not be specified for a particular Touch_probe.</w:t>
             </w:r>
           </w:p>
           <w:p>
@@ -15372,7 +16201,7 @@
                 <w:lang w:val="en-US"/>
               </w:rPr>
               <w:tab/>
-              <w:t>The mount_reference may not be specified for a particular Fixture_usage.</w:t>
+              <w:t>The stylus_diameter may not be specified for a particular Touch_probe.</w:t>
             </w:r>
           </w:p>
           <w:p>
@@ -15393,7 +16222,7 @@
                 <w:lang w:val="en-US"/>
               </w:rPr>
               <w:tab/>
-              <w:t>The workpiece_reference may not be specified for a particular Fixture_usage.</w:t>
+              <w:t>The its_material_removal_depth may not be specified for a particular Trajectory.</w:t>
             </w:r>
           </w:p>
           <w:p>
@@ -15414,7 +16243,7 @@
                 <w:lang w:val="en-US"/>
               </w:rPr>
               <w:tab/>
-              <w:t>The axis_travel may not be specified for a particular Machine_parameters and the axis_travel shall not be specified if work_volume_length, work_volume_width, or work_volume_height is specified.</w:t>
+              <w:t>The its_material_removal_overcut may not be specified for a particular Trajectory.</w:t>
             </w:r>
           </w:p>
           <w:p>
@@ -15435,7 +16264,28 @@
                 <w:lang w:val="en-US"/>
               </w:rPr>
               <w:tab/>
-              <w:t>The feedrate may not be specified for a particular Machine_parameters.</w:t>
+              <w:t>The its_material_removal_total_volume may not be specified for a particular Trajectory.</w:t>
+            </w:r>
+          </w:p>
+          <w:p>
+            <w:pPr>
+              <w:pStyle w:val="ISOComments"/>
+              <w:rPr>
+                <w:lang w:val="en-US"/>
+              </w:rPr>
+            </w:pPr>
+            <w:r>
+              <w:rPr>
+                <w:lang w:val="en-US"/>
+              </w:rPr>
+              <w:t>clause4</w:t>
+            </w:r>
+            <w:r>
+              <w:rPr>
+                <w:lang w:val="en-US"/>
+              </w:rPr>
+              <w:tab/>
+              <w:t>The cross_section_area_parameters may not be specified for a particular Trajectory.</w:t>
             </w:r>
           </w:p>
           <w:p>
@@ -15457,7 +16307,7 @@
                 <w:lang w:val="en-US"/>
               </w:rPr>
               <w:tab/>
-              <w:t>The number_of_control_axis may not be specified for a particular Machine_parameters.</w:t>
+              <w:t>The toolpath_orientation may not be specified for a particular Workingstep.</w:t>
             </w:r>
           </w:p>
           <w:p>
@@ -15478,7 +16328,7 @@
                 <w:lang w:val="en-US"/>
               </w:rPr>
               <w:tab/>
-              <w:t>The number_of_simultaneous_axis may not be specified for a particular Machine_parameters.</w:t>
+              <w:t>The its_approvals may not be specified for a particular Workpiece.</w:t>
             </w:r>
           </w:p>
           <w:p>
@@ -15499,7 +16349,7 @@
                 <w:lang w:val="en-US"/>
               </w:rPr>
               <w:tab/>
-              <w:t>The positioning_accuracy may not be specified for a particular Machine_parameters.</w:t>
+              <w:t>The its_categories may not be specified for a particular Workpiece.</w:t>
             </w:r>
           </w:p>
           <w:p>
@@ -15520,7 +16370,7 @@
                 <w:lang w:val="en-US"/>
               </w:rPr>
               <w:tab/>
-              <w:t>The spindle_power may not be specified for a particular Machine_parameters.</w:t>
+              <w:t>The its_datestamps may not be specified for a particular Workpiece.</w:t>
             </w:r>
           </w:p>
           <w:p>
@@ -15541,7 +16391,7 @@
                 <w:lang w:val="en-US"/>
               </w:rPr>
               <w:tab/>
-              <w:t>The spindle_torque may not be specified for a particular Machine_parameters.</w:t>
+              <w:t>The its_orgs may not be specified for a particular Workpiece.</w:t>
             </w:r>
           </w:p>
           <w:p>
@@ -15562,7 +16412,7 @@
                 <w:lang w:val="en-US"/>
               </w:rPr>
               <w:tab/>
-              <w:t>The spindle_speed may not be specified for a particular Machine_parameters.</w:t>
+              <w:t>The its_people may not be specified for a particular Workpiece.</w:t>
             </w:r>
           </w:p>
           <w:p>
@@ -15583,7 +16433,7 @@
                 <w:lang w:val="en-US"/>
               </w:rPr>
               <w:tab/>
-              <w:t>The table_indexing may not be specified for a particular Machine_parameters.</w:t>
+              <w:t>The its_timestamps may not be specified for a particular Workpiece.</w:t>
             </w:r>
           </w:p>
           <w:p>
@@ -15604,7 +16454,7 @@
                 <w:lang w:val="en-US"/>
               </w:rPr>
               <w:tab/>
-              <w:t>The table_length may not be specified for a particular Machine_parameters.</w:t>
+              <w:t>The product_approvals may not be specified for a particular Workpiece.</w:t>
             </w:r>
           </w:p>
           <w:p>
@@ -15625,7 +16475,7 @@
                 <w:lang w:val="en-US"/>
               </w:rPr>
               <w:tab/>
-              <w:t>The table_width may not be specified for a particular Machine_parameters.</w:t>
+              <w:t>The product_datestamps may not be specified for a particular Workpiece.</w:t>
             </w:r>
           </w:p>
           <w:p>
@@ -15646,7 +16496,7 @@
                 <w:lang w:val="en-US"/>
               </w:rPr>
               <w:tab/>
-              <w:t>The work_volume_height may not be specified for a particular Machine_parameters and the work_volume_height shall not be specified if axis_travel is specified.</w:t>
+              <w:t>The product_orgs may not be specified for a particular Workpiece.</w:t>
             </w:r>
           </w:p>
           <w:p>
@@ -15667,7 +16517,49 @@
                 <w:lang w:val="en-US"/>
               </w:rPr>
               <w:tab/>
-              <w:t>The work_volume_length may not be specified for a particular Machine_parameters and the work_volume_length shall not be specified if axis_travel is specified.</w:t>
+              <w:t>The product_people may not be specified for a particular Workpiece.</w:t>
+            </w:r>
+          </w:p>
+          <w:p>
+            <w:pPr>
+              <w:pStyle w:val="ISOComments"/>
+              <w:rPr>
+                <w:lang w:val="en-US"/>
+              </w:rPr>
+            </w:pPr>
+            <w:r>
+              <w:rPr>
+                <w:lang w:val="en-US"/>
+              </w:rPr>
+              <w:t>clause4</w:t>
+            </w:r>
+            <w:r>
+              <w:rPr>
+                <w:lang w:val="en-US"/>
+              </w:rPr>
+              <w:tab/>
+              <w:t>The product_timestamps may not be specified for a particular Workpiece.</w:t>
+            </w:r>
+          </w:p>
+          <w:p>
+            <w:pPr>
+              <w:pStyle w:val="ISOComments"/>
+              <w:rPr>
+                <w:lang w:val="en-US"/>
+              </w:rPr>
+            </w:pPr>
+            <w:r>
+              <w:rPr>
+                <w:lang w:val="en-US"/>
+              </w:rPr>
+              <w:t>clause4</w:t>
+            </w:r>
+            <w:r>
+              <w:rPr>
+                <w:lang w:val="en-US"/>
+              </w:rPr>
+              <w:tab/>
+              <w:t>The revision_approvals may not be specified for a particular Workpiece.</w:t>
             </w:r>
           </w:p>
           <w:p>
@@ -15689,743 +16581,6 @@
                 <w:lang w:val="en-US"/>
               </w:rPr>
               <w:tab/>
-              <w:t>The work_volume_width may not be specified for a particular Machine_parameters and the work_volume_width shall not be specified if axis_travel is specified.</w:t>
-            </w:r>
-          </w:p>
-          <w:p>
-            <w:pPr>
-              <w:pStyle w:val="ISOComments"/>
-              <w:rPr>
-                <w:lang w:val="en-US"/>
-              </w:rPr>
-            </w:pPr>
-            <w:r>
-              <w:rPr>
-                <w:lang w:val="en-US"/>
-              </w:rPr>
-              <w:t>clause4</w:t>
-            </w:r>
-            <w:r>
-              <w:rPr>
-                <w:lang w:val="en-US"/>
-              </w:rPr>
-              <w:tab/>
-              <w:t>The description may not be specified for a particular Machine_usage.</w:t>
-            </w:r>
-          </w:p>
-          <w:p>
-            <w:pPr>
-              <w:pStyle w:val="ISOComments"/>
-              <w:rPr>
-                <w:lang w:val="en-US"/>
-              </w:rPr>
-            </w:pPr>
-            <w:r>
-              <w:rPr>
-                <w:lang w:val="en-US"/>
-              </w:rPr>
-              <w:t>clause4</w:t>
-            </w:r>
-            <w:r>
-              <w:rPr>
-                <w:lang w:val="en-US"/>
-              </w:rPr>
-              <w:tab/>
-              <w:t>The its_product may not be specified for a particular Machine_usage.</w:t>
-            </w:r>
-          </w:p>
-          <w:p>
-            <w:pPr>
-              <w:pStyle w:val="ISOComments"/>
-              <w:rPr>
-                <w:lang w:val="en-US"/>
-              </w:rPr>
-            </w:pPr>
-            <w:r>
-              <w:rPr>
-                <w:lang w:val="en-US"/>
-              </w:rPr>
-              <w:t>clause4</w:t>
-            </w:r>
-            <w:r>
-              <w:rPr>
-                <w:lang w:val="en-US"/>
-              </w:rPr>
-              <w:tab/>
-              <w:t>The configuration may not be specified for a particular Machine_with_kinematics.</w:t>
-            </w:r>
-          </w:p>
-          <w:p>
-            <w:pPr>
-              <w:pStyle w:val="ISOComments"/>
-              <w:rPr>
-                <w:lang w:val="en-US"/>
-              </w:rPr>
-            </w:pPr>
-            <w:r>
-              <w:rPr>
-                <w:lang w:val="en-US"/>
-              </w:rPr>
-              <w:t>clause4</w:t>
-            </w:r>
-            <w:r>
-              <w:rPr>
-                <w:lang w:val="en-US"/>
-              </w:rPr>
-              <w:tab/>
-              <w:t>The its_usage may not be specified for a particular Machining_tool.</w:t>
-            </w:r>
-          </w:p>
-          <w:p>
-            <w:pPr>
-              <w:pStyle w:val="ISOComments"/>
-              <w:rPr>
-                <w:lang w:val="en-US"/>
-              </w:rPr>
-            </w:pPr>
-            <w:r>
-              <w:rPr>
-                <w:lang w:val="en-US"/>
-              </w:rPr>
-              <w:t>clause4</w:t>
-            </w:r>
-            <w:r>
-              <w:rPr>
-                <w:lang w:val="en-US"/>
-              </w:rPr>
-              <w:tab/>
-              <w:t>If primary is false or not specified, a referencing Drill_and_fill_group may not be preferred.</w:t>
-            </w:r>
-          </w:p>
-          <w:p>
-            <w:pPr>
-              <w:pStyle w:val="ISOComments"/>
-              <w:rPr>
-                <w:lang w:val="en-US"/>
-              </w:rPr>
-            </w:pPr>
-            <w:r>
-              <w:rPr>
-                <w:lang w:val="en-US"/>
-              </w:rPr>
-              <w:t>clause4</w:t>
-            </w:r>
-            <w:r>
-              <w:rPr>
-                <w:lang w:val="en-US"/>
-              </w:rPr>
-              <w:tab/>
-              <w:t>The property_date may not be specified for a particular Process_property.</w:t>
-            </w:r>
-          </w:p>
-          <w:p>
-            <w:pPr>
-              <w:pStyle w:val="ISOComments"/>
-              <w:rPr>
-                <w:lang w:val="en-US"/>
-              </w:rPr>
-            </w:pPr>
-            <w:r>
-              <w:rPr>
-                <w:lang w:val="en-US"/>
-              </w:rPr>
-              <w:t>clause4</w:t>
-            </w:r>
-            <w:r>
-              <w:rPr>
-                <w:lang w:val="en-US"/>
-              </w:rPr>
-              <w:tab/>
-              <w:t>If seal_check is false or unspecified, the sealant may not be checked.</w:t>
-            </w:r>
-          </w:p>
-          <w:p>
-            <w:pPr>
-              <w:pStyle w:val="ISOComments"/>
-              <w:rPr>
-                <w:lang w:val="en-US"/>
-              </w:rPr>
-            </w:pPr>
-            <w:r>
-              <w:rPr>
-                <w:lang w:val="en-US"/>
-              </w:rPr>
-              <w:t>clause4</w:t>
-            </w:r>
-            <w:r>
-              <w:rPr>
-                <w:lang w:val="en-US"/>
-              </w:rPr>
-              <w:tab/>
-              <w:t>The description may not be specified for a particular Tool_usage.</w:t>
-            </w:r>
-          </w:p>
-          <w:p>
-            <w:pPr>
-              <w:pStyle w:val="ISOComments"/>
-              <w:rPr>
-                <w:lang w:val="en-US"/>
-              </w:rPr>
-            </w:pPr>
-            <w:r>
-              <w:rPr>
-                <w:lang w:val="en-US"/>
-              </w:rPr>
-              <w:t>clause4</w:t>
-            </w:r>
-            <w:r>
-              <w:rPr>
-                <w:lang w:val="en-US"/>
-              </w:rPr>
-              <w:tab/>
-              <w:t>The gage_placement may not be specified for a particular Tool_usage.</w:t>
-            </w:r>
-          </w:p>
-          <w:p>
-            <w:pPr>
-              <w:pStyle w:val="ISOComments"/>
-              <w:rPr>
-                <w:lang w:val="en-US"/>
-              </w:rPr>
-            </w:pPr>
-            <w:r>
-              <w:rPr>
-                <w:lang w:val="en-US"/>
-              </w:rPr>
-              <w:t>clause4</w:t>
-            </w:r>
-            <w:r>
-              <w:rPr>
-                <w:lang w:val="en-US"/>
-              </w:rPr>
-              <w:tab/>
-              <w:t>The its_carousel may not be specified for a particular Tool_usage.</w:t>
-            </w:r>
-          </w:p>
-          <w:p>
-            <w:pPr>
-              <w:pStyle w:val="ISOComments"/>
-              <w:rPr>
-                <w:lang w:val="en-US"/>
-              </w:rPr>
-            </w:pPr>
-            <w:r>
-              <w:rPr>
-                <w:lang w:val="en-US"/>
-              </w:rPr>
-              <w:t>clause4</w:t>
-            </w:r>
-            <w:r>
-              <w:rPr>
-                <w:lang w:val="en-US"/>
-              </w:rPr>
-              <w:tab/>
-              <w:t>The its_library_reference may not be specified for a particular Tool_usage.</w:t>
-            </w:r>
-          </w:p>
-          <w:p>
-            <w:pPr>
-              <w:pStyle w:val="ISOComments"/>
-              <w:rPr>
-                <w:lang w:val="en-US"/>
-              </w:rPr>
-            </w:pPr>
-            <w:r>
-              <w:rPr>
-                <w:lang w:val="en-US"/>
-              </w:rPr>
-              <w:lastRenderedPageBreak/>
-              <w:t>clause4</w:t>
-            </w:r>
-            <w:r>
-              <w:rPr>
-                <w:lang w:val="en-US"/>
-              </w:rPr>
-              <w:tab/>
-              <w:t>The its_position may not be specified for a particular Tool_usage.</w:t>
-            </w:r>
-          </w:p>
-          <w:p>
-            <w:pPr>
-              <w:pStyle w:val="ISOComments"/>
-              <w:rPr>
-                <w:lang w:val="en-US"/>
-              </w:rPr>
-            </w:pPr>
-            <w:r>
-              <w:rPr>
-                <w:lang w:val="en-US"/>
-              </w:rPr>
-              <w:t>clause4</w:t>
-            </w:r>
-            <w:r>
-              <w:rPr>
-                <w:lang w:val="en-US"/>
-              </w:rPr>
-              <w:tab/>
-              <w:t>The its_product may not be specified for a particular Tool_usage.</w:t>
-            </w:r>
-          </w:p>
-          <w:p>
-            <w:pPr>
-              <w:pStyle w:val="ISOComments"/>
-              <w:rPr>
-                <w:lang w:val="en-US"/>
-              </w:rPr>
-            </w:pPr>
-            <w:r>
-              <w:rPr>
-                <w:lang w:val="en-US"/>
-              </w:rPr>
-              <w:t>clause4</w:t>
-            </w:r>
-            <w:r>
-              <w:rPr>
-                <w:lang w:val="en-US"/>
-              </w:rPr>
-              <w:tab/>
-              <w:t>The tool_end_placement may not be specified for a particular Tool_usage.</w:t>
-            </w:r>
-          </w:p>
-          <w:p>
-            <w:pPr>
-              <w:pStyle w:val="ISOComments"/>
-              <w:rPr>
-                <w:lang w:val="en-US"/>
-              </w:rPr>
-            </w:pPr>
-            <w:r>
-              <w:rPr>
-                <w:lang w:val="en-US"/>
-              </w:rPr>
-              <w:t>clause4</w:t>
-            </w:r>
-            <w:r>
-              <w:rPr>
-                <w:lang w:val="en-US"/>
-              </w:rPr>
-              <w:tab/>
-              <w:t>The its_id may not be specified for a particular Toolpath.</w:t>
-            </w:r>
-          </w:p>
-          <w:p>
-            <w:pPr>
-              <w:pStyle w:val="ISOComments"/>
-              <w:rPr>
-                <w:lang w:val="en-US"/>
-              </w:rPr>
-            </w:pPr>
-            <w:r>
-              <w:rPr>
-                <w:lang w:val="en-US"/>
-              </w:rPr>
-              <w:t>clause4</w:t>
-            </w:r>
-            <w:r>
-              <w:rPr>
-                <w:lang w:val="en-US"/>
-              </w:rPr>
-              <w:tab/>
-              <w:t>The ball_radius may not be specified for a particular Touch_probe.</w:t>
-            </w:r>
-          </w:p>
-          <w:p>
-            <w:pPr>
-              <w:pStyle w:val="ISOComments"/>
-              <w:rPr>
-                <w:lang w:val="en-US"/>
-              </w:rPr>
-            </w:pPr>
-            <w:r>
-              <w:rPr>
-                <w:lang w:val="en-US"/>
-              </w:rPr>
-              <w:t>clause4</w:t>
-            </w:r>
-            <w:r>
-              <w:rPr>
-                <w:lang w:val="en-US"/>
-              </w:rPr>
-              <w:tab/>
-              <w:t>The stylus_diameter may not be specified for a particular Touch_probe.</w:t>
-            </w:r>
-          </w:p>
-          <w:p>
-            <w:pPr>
-              <w:pStyle w:val="ISOComments"/>
-              <w:rPr>
-                <w:lang w:val="en-US"/>
-              </w:rPr>
-            </w:pPr>
-            <w:r>
-              <w:rPr>
-                <w:lang w:val="en-US"/>
-              </w:rPr>
-              <w:t>clause4</w:t>
-            </w:r>
-            <w:r>
-              <w:rPr>
-                <w:lang w:val="en-US"/>
-              </w:rPr>
-              <w:tab/>
-              <w:t>The its_material_removal_depth may not be specified for a particular Trajectory.</w:t>
-            </w:r>
-          </w:p>
-          <w:p>
-            <w:pPr>
-              <w:pStyle w:val="ISOComments"/>
-              <w:rPr>
-                <w:lang w:val="en-US"/>
-              </w:rPr>
-            </w:pPr>
-            <w:r>
-              <w:rPr>
-                <w:lang w:val="en-US"/>
-              </w:rPr>
-              <w:t>clause4</w:t>
-            </w:r>
-            <w:r>
-              <w:rPr>
-                <w:lang w:val="en-US"/>
-              </w:rPr>
-              <w:tab/>
-              <w:t>The its_material_removal_overcut may not be specified for a particular Trajectory.</w:t>
-            </w:r>
-          </w:p>
-          <w:p>
-            <w:pPr>
-              <w:pStyle w:val="ISOComments"/>
-              <w:rPr>
-                <w:lang w:val="en-US"/>
-              </w:rPr>
-            </w:pPr>
-            <w:r>
-              <w:rPr>
-                <w:lang w:val="en-US"/>
-              </w:rPr>
-              <w:t>clause4</w:t>
-            </w:r>
-            <w:r>
-              <w:rPr>
-                <w:lang w:val="en-US"/>
-              </w:rPr>
-              <w:tab/>
-              <w:t>The its_material_removal_total_volume may not be specified for a particular Trajectory.</w:t>
-            </w:r>
-          </w:p>
-          <w:p>
-            <w:pPr>
-              <w:pStyle w:val="ISOComments"/>
-              <w:rPr>
-                <w:lang w:val="en-US"/>
-              </w:rPr>
-            </w:pPr>
-            <w:r>
-              <w:rPr>
-                <w:lang w:val="en-US"/>
-              </w:rPr>
-              <w:t>clause4</w:t>
-            </w:r>
-            <w:r>
-              <w:rPr>
-                <w:lang w:val="en-US"/>
-              </w:rPr>
-              <w:tab/>
-              <w:t>The cross_section_area_parameters may not be specified for a particular Trajectory.</w:t>
-            </w:r>
-          </w:p>
-          <w:p>
-            <w:pPr>
-              <w:pStyle w:val="ISOComments"/>
-              <w:rPr>
-                <w:lang w:val="en-US"/>
-              </w:rPr>
-            </w:pPr>
-            <w:r>
-              <w:rPr>
-                <w:lang w:val="en-US"/>
-              </w:rPr>
-              <w:t>clause4</w:t>
-            </w:r>
-            <w:r>
-              <w:rPr>
-                <w:lang w:val="en-US"/>
-              </w:rPr>
-              <w:tab/>
-              <w:t>The toolpath_orientation may not be specified for a particular Workingstep.</w:t>
-            </w:r>
-          </w:p>
-          <w:p>
-            <w:pPr>
-              <w:pStyle w:val="ISOComments"/>
-              <w:rPr>
-                <w:lang w:val="en-US"/>
-              </w:rPr>
-            </w:pPr>
-            <w:r>
-              <w:rPr>
-                <w:lang w:val="en-US"/>
-              </w:rPr>
-              <w:t>clause4</w:t>
-            </w:r>
-            <w:r>
-              <w:rPr>
-                <w:lang w:val="en-US"/>
-              </w:rPr>
-              <w:tab/>
-              <w:t>The its_approvals may not be specified for a particular Workpiece.</w:t>
-            </w:r>
-          </w:p>
-          <w:p>
-            <w:pPr>
-              <w:pStyle w:val="ISOComments"/>
-              <w:rPr>
-                <w:lang w:val="en-US"/>
-              </w:rPr>
-            </w:pPr>
-            <w:r>
-              <w:rPr>
-                <w:lang w:val="en-US"/>
-              </w:rPr>
-              <w:lastRenderedPageBreak/>
-              <w:t>clause4</w:t>
-            </w:r>
-            <w:r>
-              <w:rPr>
-                <w:lang w:val="en-US"/>
-              </w:rPr>
-              <w:tab/>
-              <w:t>The its_categories may not be specified for a particular Workpiece.</w:t>
-            </w:r>
-          </w:p>
-          <w:p>
-            <w:pPr>
-              <w:pStyle w:val="ISOComments"/>
-              <w:rPr>
-                <w:lang w:val="en-US"/>
-              </w:rPr>
-            </w:pPr>
-            <w:r>
-              <w:rPr>
-                <w:lang w:val="en-US"/>
-              </w:rPr>
-              <w:t>clause4</w:t>
-            </w:r>
-            <w:r>
-              <w:rPr>
-                <w:lang w:val="en-US"/>
-              </w:rPr>
-              <w:tab/>
-              <w:t>The its_datestamps may not be specified for a particular Workpiece.</w:t>
-            </w:r>
-          </w:p>
-          <w:p>
-            <w:pPr>
-              <w:pStyle w:val="ISOComments"/>
-              <w:rPr>
-                <w:lang w:val="en-US"/>
-              </w:rPr>
-            </w:pPr>
-            <w:r>
-              <w:rPr>
-                <w:lang w:val="en-US"/>
-              </w:rPr>
-              <w:t>clause4</w:t>
-            </w:r>
-            <w:r>
-              <w:rPr>
-                <w:lang w:val="en-US"/>
-              </w:rPr>
-              <w:tab/>
-              <w:t>The its_orgs may not be specified for a particular Workpiece.</w:t>
-            </w:r>
-          </w:p>
-          <w:p>
-            <w:pPr>
-              <w:pStyle w:val="ISOComments"/>
-              <w:rPr>
-                <w:lang w:val="en-US"/>
-              </w:rPr>
-            </w:pPr>
-            <w:r>
-              <w:rPr>
-                <w:lang w:val="en-US"/>
-              </w:rPr>
-              <w:t>clause4</w:t>
-            </w:r>
-            <w:r>
-              <w:rPr>
-                <w:lang w:val="en-US"/>
-              </w:rPr>
-              <w:tab/>
-              <w:t>The its_people may not be specified for a particular Workpiece.</w:t>
-            </w:r>
-          </w:p>
-          <w:p>
-            <w:pPr>
-              <w:pStyle w:val="ISOComments"/>
-              <w:rPr>
-                <w:lang w:val="en-US"/>
-              </w:rPr>
-            </w:pPr>
-            <w:r>
-              <w:rPr>
-                <w:lang w:val="en-US"/>
-              </w:rPr>
-              <w:t>clause4</w:t>
-            </w:r>
-            <w:r>
-              <w:rPr>
-                <w:lang w:val="en-US"/>
-              </w:rPr>
-              <w:tab/>
-              <w:t>The its_timestamps may not be specified for a particular Workpiece.</w:t>
-            </w:r>
-          </w:p>
-          <w:p>
-            <w:pPr>
-              <w:pStyle w:val="ISOComments"/>
-              <w:rPr>
-                <w:lang w:val="en-US"/>
-              </w:rPr>
-            </w:pPr>
-            <w:r>
-              <w:rPr>
-                <w:lang w:val="en-US"/>
-              </w:rPr>
-              <w:t>clause4</w:t>
-            </w:r>
-            <w:r>
-              <w:rPr>
-                <w:lang w:val="en-US"/>
-              </w:rPr>
-              <w:tab/>
-              <w:t>The product_approvals may not be specified for a particular Workpiece.</w:t>
-            </w:r>
-          </w:p>
-          <w:p>
-            <w:pPr>
-              <w:pStyle w:val="ISOComments"/>
-              <w:rPr>
-                <w:lang w:val="en-US"/>
-              </w:rPr>
-            </w:pPr>
-            <w:r>
-              <w:rPr>
-                <w:lang w:val="en-US"/>
-              </w:rPr>
-              <w:t>clause4</w:t>
-            </w:r>
-            <w:r>
-              <w:rPr>
-                <w:lang w:val="en-US"/>
-              </w:rPr>
-              <w:tab/>
-              <w:t>The product_datestamps may not be specified for a particular Workpiece.</w:t>
-            </w:r>
-          </w:p>
-          <w:p>
-            <w:pPr>
-              <w:pStyle w:val="ISOComments"/>
-              <w:rPr>
-                <w:lang w:val="en-US"/>
-              </w:rPr>
-            </w:pPr>
-            <w:r>
-              <w:rPr>
-                <w:lang w:val="en-US"/>
-              </w:rPr>
-              <w:t>clause4</w:t>
-            </w:r>
-            <w:r>
-              <w:rPr>
-                <w:lang w:val="en-US"/>
-              </w:rPr>
-              <w:tab/>
-              <w:t>The product_orgs may not be specified for a particular Workpiece.</w:t>
-            </w:r>
-          </w:p>
-          <w:p>
-            <w:pPr>
-              <w:pStyle w:val="ISOComments"/>
-              <w:rPr>
-                <w:lang w:val="en-US"/>
-              </w:rPr>
-            </w:pPr>
-            <w:r>
-              <w:rPr>
-                <w:lang w:val="en-US"/>
-              </w:rPr>
-              <w:t>clause4</w:t>
-            </w:r>
-            <w:r>
-              <w:rPr>
-                <w:lang w:val="en-US"/>
-              </w:rPr>
-              <w:tab/>
-              <w:t>The product_people may not be specified for a particular Workpiece.</w:t>
-            </w:r>
-          </w:p>
-          <w:p>
-            <w:pPr>
-              <w:pStyle w:val="ISOComments"/>
-              <w:rPr>
-                <w:lang w:val="en-US"/>
-              </w:rPr>
-            </w:pPr>
-            <w:r>
-              <w:rPr>
-                <w:lang w:val="en-US"/>
-              </w:rPr>
-              <w:t>clause4</w:t>
-            </w:r>
-            <w:r>
-              <w:rPr>
-                <w:lang w:val="en-US"/>
-              </w:rPr>
-              <w:tab/>
-              <w:t>The product_timestamps may not be specified for a particular Workpiece.</w:t>
-            </w:r>
-          </w:p>
-          <w:p>
-            <w:pPr>
-              <w:pStyle w:val="ISOComments"/>
-              <w:rPr>
-                <w:lang w:val="en-US"/>
-              </w:rPr>
-            </w:pPr>
-            <w:r>
-              <w:rPr>
-                <w:lang w:val="en-US"/>
-              </w:rPr>
-              <w:t>clause4</w:t>
-            </w:r>
-            <w:r>
-              <w:rPr>
-                <w:lang w:val="en-US"/>
-              </w:rPr>
-              <w:tab/>
-              <w:t>The revision_approvals may not be specified for a particular Workpiece.</w:t>
-            </w:r>
-          </w:p>
-          <w:p>
-            <w:pPr>
-              <w:pStyle w:val="ISOComments"/>
-              <w:rPr>
-                <w:lang w:val="en-US"/>
-              </w:rPr>
-            </w:pPr>
-            <w:r>
-              <w:rPr>
-                <w:lang w:val="en-US"/>
-              </w:rPr>
-              <w:t>clause4</w:t>
-            </w:r>
-            <w:r>
-              <w:rPr>
-                <w:lang w:val="en-US"/>
-              </w:rPr>
-              <w:tab/>
               <w:t>The revision_datestamps may not be specified for a particular Workpiece.</w:t>
             </w:r>
           </w:p>
@@ -16461,7 +16616,6 @@
               <w:rPr>
                 <w:lang w:val="en-US"/>
               </w:rPr>
-              <w:lastRenderedPageBreak/>
               <w:t>clause4</w:t>
             </w:r>
             <w:r>
@@ -16651,6 +16805,7 @@
               <w:rPr>
                 <w:lang w:val="en-US"/>
               </w:rPr>
+              <w:lastRenderedPageBreak/>
               <w:t>clause5</w:t>
             </w:r>
             <w:r>
@@ -16689,13 +16844,7 @@
               <w:pStyle w:val="ISOSecretObservations"/>
             </w:pPr>
             <w:r>
-              <w:t xml:space="preserve">Adopted </w:t>
-            </w:r>
-            <w:r>
-              <w:t xml:space="preserve">IDP2 </w:t>
-            </w:r>
-            <w:r>
-              <w:t>clause 7 wording</w:t>
+              <w:t>Adopted IDP2 clause 7 wording</w:t>
             </w:r>
           </w:p>
           <w:p>
@@ -16734,10 +16883,7 @@
             </w:pPr>
             <w:r>
               <w:lastRenderedPageBreak/>
-              <w:t>SC4QC-</w:t>
-            </w:r>
-            <w:r>
-              <w:t>4</w:t>
+              <w:t>SC4QC-4</w:t>
             </w:r>
           </w:p>
         </w:tc>
@@ -17004,6 +17150,7 @@
               <w:rPr>
                 <w:lang w:val="en-US"/>
               </w:rPr>
+              <w:lastRenderedPageBreak/>
               <w:t>clause4</w:t>
             </w:r>
             <w:r>
@@ -17046,7 +17193,6 @@
               <w:rPr>
                 <w:lang w:val="en-US"/>
               </w:rPr>
-              <w:lastRenderedPageBreak/>
               <w:t>clause4</w:t>
             </w:r>
             <w:r>
@@ -17181,6 +17327,7 @@
               <w:rPr>
                 <w:lang w:val="en-US"/>
               </w:rPr>
+              <w:lastRenderedPageBreak/>
               <w:t>clause5</w:t>
             </w:r>
             <w:r>
@@ -17209,14 +17356,7 @@
                 <w:lang w:val="en-US"/>
               </w:rPr>
               <w:tab/>
-              <w:t xml:space="preserve">To determine the depth of the Profile_feature, one must geometrically evaluate </w:t>
-            </w:r>
-            <w:r>
-              <w:rPr>
-                <w:lang w:val="en-US"/>
-              </w:rPr>
-              <w:lastRenderedPageBreak/>
-              <w:t>the distance in the negative Z direction between this placement and the depth surface.</w:t>
+              <w:t>To determine the depth of the Profile_feature, one must geometrically evaluate the distance in the negative Z direction between this placement and the depth surface.</w:t>
             </w:r>
           </w:p>
           <w:p>
@@ -17321,7 +17461,14 @@
                 <w:lang w:val="en-US"/>
               </w:rPr>
               <w:tab/>
-              <w:t>The definitions of Cutter_contact_trajectory, Cutter_location_trajectory, Axis_trajectory, and Toolpath_speed, require that the curves that describe location (basiccurve), tool axis, surface normal, and feed speed must have the same parameterization.</w:t>
+              <w:t xml:space="preserve">The definitions of Cutter_contact_trajectory, Cutter_location_trajectory, Axis_trajectory, and Toolpath_speed, require that the curves that describe location (basiccurve), tool axis, surface </w:t>
+            </w:r>
+            <w:r>
+              <w:rPr>
+                <w:lang w:val="en-US"/>
+              </w:rPr>
+              <w:lastRenderedPageBreak/>
+              <w:t>normal, and feed speed must have the same parameterization.</w:t>
             </w:r>
           </w:p>
           <w:p>
@@ -17356,7 +17503,6 @@
               <w:rPr>
                 <w:lang w:val="en-US"/>
               </w:rPr>
-              <w:lastRenderedPageBreak/>
               <w:t>clause5</w:t>
             </w:r>
             <w:r>
@@ -17731,6 +17877,7 @@
               <w:rPr>
                 <w:lang w:val="en-US"/>
               </w:rPr>
+              <w:lastRenderedPageBreak/>
               <w:t xml:space="preserve">In annexG, please verify 'The application reference model is a graphical representation of the structure and constraints of the application objects specified in clause 4, including the application objects referenced from the ISO 10303-1000-series parts, ISO 14649-10, ISO 14649-11, ISO 14649-12, ISO 14649-17, ISO 14649-111 and ISO 14649-121.' </w:t>
             </w:r>
           </w:p>
@@ -17745,64 +17892,70 @@
               <w:rPr>
                 <w:lang w:val="en-US"/>
               </w:rPr>
+              <w:t xml:space="preserve">In annexK, please verify 'Change the measure UoF to reference application object definitions and mappings from ISO 10303-1054, 10303-1106, 10303-1753, and 10303-1782 rather than define them in clause 4 and 5.' </w:t>
+            </w:r>
+          </w:p>
+          <w:p>
+            <w:pPr>
+              <w:pStyle w:val="ISOComments"/>
+              <w:rPr>
+                <w:lang w:val="en-US"/>
+              </w:rPr>
+            </w:pPr>
+            <w:r>
+              <w:rPr>
+                <w:lang w:val="en-US"/>
+              </w:rPr>
+              <w:t xml:space="preserve">In annexK, please verify 'Move the Manufacturing_feature application object from the workpiece UoF into the manufacturing feature UoF and reference the application object definitions and mappings from ISO 10303-1814 rather than define it in clause 4 and 5.' </w:t>
+            </w:r>
+          </w:p>
+          <w:p>
+            <w:pPr>
+              <w:pStyle w:val="ISOComments"/>
+              <w:rPr>
+                <w:lang w:val="en-US"/>
+              </w:rPr>
+            </w:pPr>
+            <w:r>
+              <w:rPr>
+                <w:lang w:val="en-US"/>
+              </w:rPr>
+              <w:t xml:space="preserve">In annexK, please verify 'Change the manufacturing feature UoF to reference the following feature application object definitions and mappings from ISO 10303-1814 rather than define them in clause 4 and 5.' </w:t>
+            </w:r>
+          </w:p>
+          <w:p>
+            <w:pPr>
+              <w:pStyle w:val="ISOComments"/>
+              <w:rPr>
+                <w:lang w:val="en-US"/>
+              </w:rPr>
+            </w:pPr>
+            <w:r>
+              <w:rPr>
+                <w:lang w:val="en-US"/>
+              </w:rPr>
+              <w:t xml:space="preserve">In annexK, please verify 'Also remove definition in clause 5 for chamfer_requires_faces_or_features, edge_round_requires_faces_or_features, restrict_unneeded_feature_usage.' </w:t>
+            </w:r>
+          </w:p>
+          <w:p>
+            <w:pPr>
+              <w:pStyle w:val="ISOComments"/>
+              <w:rPr>
+                <w:lang w:val="en-US"/>
+              </w:rPr>
+            </w:pPr>
+            <w:r>
+              <w:rPr>
+                <w:lang w:val="en-US"/>
+              </w:rPr>
+              <w:t xml:space="preserve">In annexK, please verify 'Delete the turning feature UoF, moving the following application objects to the manufacturing feature UoF. Reference the definitions and mappings from ISO </w:t>
+            </w:r>
+            <w:r>
+              <w:rPr>
+                <w:lang w:val="en-US"/>
+              </w:rPr>
               <w:lastRenderedPageBreak/>
-              <w:t xml:space="preserve">In annexK, please verify 'Change the measure UoF to reference application object definitions and mappings from ISO 10303-1054, 10303-1106, 10303-1753, and 10303-1782 rather than define them in clause 4 and 5.' </w:t>
-            </w:r>
-          </w:p>
-          <w:p>
-            <w:pPr>
-              <w:pStyle w:val="ISOComments"/>
-              <w:rPr>
-                <w:lang w:val="en-US"/>
-              </w:rPr>
-            </w:pPr>
-            <w:r>
-              <w:rPr>
-                <w:lang w:val="en-US"/>
-              </w:rPr>
-              <w:t xml:space="preserve">In annexK, please verify 'Move the Manufacturing_feature application object from the workpiece UoF into the manufacturing feature UoF and reference the application object definitions and mappings from ISO 10303-1814 rather than define it in clause 4 and 5.' </w:t>
-            </w:r>
-          </w:p>
-          <w:p>
-            <w:pPr>
-              <w:pStyle w:val="ISOComments"/>
-              <w:rPr>
-                <w:lang w:val="en-US"/>
-              </w:rPr>
-            </w:pPr>
-            <w:r>
-              <w:rPr>
-                <w:lang w:val="en-US"/>
-              </w:rPr>
-              <w:t xml:space="preserve">In annexK, please verify 'Change the manufacturing feature UoF to reference the following feature application object definitions and mappings from ISO 10303-1814 rather than define them in clause 4 and 5.' </w:t>
-            </w:r>
-          </w:p>
-          <w:p>
-            <w:pPr>
-              <w:pStyle w:val="ISOComments"/>
-              <w:rPr>
-                <w:lang w:val="en-US"/>
-              </w:rPr>
-            </w:pPr>
-            <w:r>
-              <w:rPr>
-                <w:lang w:val="en-US"/>
-              </w:rPr>
-              <w:t xml:space="preserve">In annexK, please verify 'Also remove definition in clause 5 for chamfer_requires_faces_or_features, edge_round_requires_faces_or_features, restrict_unneeded_feature_usage.' </w:t>
-            </w:r>
-          </w:p>
-          <w:p>
-            <w:pPr>
-              <w:pStyle w:val="ISOComments"/>
-              <w:rPr>
-                <w:lang w:val="en-US"/>
-              </w:rPr>
-            </w:pPr>
-            <w:r>
-              <w:rPr>
-                <w:lang w:val="en-US"/>
-              </w:rPr>
-              <w:t xml:space="preserve">In annexK, please verify 'Delete the turning feature UoF, moving the following application objects to the manufacturing feature UoF. Reference the definitions and mappings from ISO 10303-1814 rather than define them in clause 4 and 5.' </w:t>
+              <w:t xml:space="preserve">10303-1814 rather than define them in clause 4 and 5.' </w:t>
             </w:r>
           </w:p>
           <w:p>
@@ -17830,91 +17983,91 @@
               <w:rPr>
                 <w:lang w:val="en-US"/>
               </w:rPr>
+              <w:t xml:space="preserve">In annexK, please verify 'Added machining_fixture_usage to clause 5 for use in the mapping.' </w:t>
+            </w:r>
+          </w:p>
+          <w:p>
+            <w:pPr>
+              <w:pStyle w:val="ISOComments"/>
+              <w:rPr>
+                <w:lang w:val="en-US"/>
+              </w:rPr>
+            </w:pPr>
+            <w:r>
+              <w:rPr>
+                <w:lang w:val="en-US"/>
+              </w:rPr>
+              <w:t xml:space="preserve">In annexK, please verify 'Add extended_type_operation to clause 5 to support mapping of Extended_operation.' </w:t>
+            </w:r>
+          </w:p>
+          <w:p>
+            <w:pPr>
+              <w:pStyle w:val="ISOComments"/>
+              <w:rPr>
+                <w:lang w:val="en-US"/>
+              </w:rPr>
+            </w:pPr>
+            <w:r>
+              <w:rPr>
+                <w:lang w:val="en-US"/>
+              </w:rPr>
+              <w:t xml:space="preserve">In annexK, please verify 'Add via_arc_point and via_helix_point to clause 5 to support high-speed milling operations.' </w:t>
+            </w:r>
+          </w:p>
+          <w:p>
+            <w:pPr>
+              <w:pStyle w:val="ISOComments"/>
+              <w:rPr>
+                <w:lang w:val="en-US"/>
+              </w:rPr>
+            </w:pPr>
+            <w:r>
+              <w:rPr>
+                <w:lang w:val="en-US"/>
+              </w:rPr>
+              <w:t xml:space="preserve">In annexK, please verify 'Add additive_type_operation to clause 5 to support mapping of Am_operation and subtypes.' </w:t>
+            </w:r>
+          </w:p>
+          <w:p>
+            <w:pPr>
+              <w:pStyle w:val="ISOComments"/>
+              <w:rPr>
+                <w:lang w:val="en-US"/>
+              </w:rPr>
+            </w:pPr>
+            <w:r>
+              <w:rPr>
+                <w:lang w:val="en-US"/>
+              </w:rPr>
+              <w:t xml:space="preserve">In annexK, please verify 'Change the geometric dimensioning and tolerancing UoF to reference the following feature application object definitions and mappings from ISO 10303-1050 and ISO 10303-1051 rather than define them in clause 4 and 5.' </w:t>
+            </w:r>
+          </w:p>
+          <w:p>
+            <w:pPr>
+              <w:pStyle w:val="ISOComments"/>
+              <w:rPr>
+                <w:lang w:val="en-US"/>
+              </w:rPr>
+            </w:pPr>
+            <w:r>
+              <w:rPr>
+                <w:lang w:val="en-US"/>
+              </w:rPr>
+              <w:t xml:space="preserve">In annexK, please verify 'Remove definitions in clause 5 for directed_dimensional_location, externally_defined_dimension_definition, and placed_datum_target_feature.' </w:t>
+            </w:r>
+          </w:p>
+          <w:p>
+            <w:pPr>
+              <w:pStyle w:val="ISOComments"/>
+              <w:rPr>
+                <w:lang w:val="en-US"/>
+              </w:rPr>
+            </w:pPr>
+            <w:r>
+              <w:rPr>
+                <w:lang w:val="en-US"/>
+              </w:rPr>
               <w:lastRenderedPageBreak/>
-              <w:t xml:space="preserve">In annexK, please verify 'Added machining_fixture_usage to clause 5 for use in the mapping.' </w:t>
-            </w:r>
-          </w:p>
-          <w:p>
-            <w:pPr>
-              <w:pStyle w:val="ISOComments"/>
-              <w:rPr>
-                <w:lang w:val="en-US"/>
-              </w:rPr>
-            </w:pPr>
-            <w:r>
-              <w:rPr>
-                <w:lang w:val="en-US"/>
-              </w:rPr>
-              <w:t xml:space="preserve">In annexK, please verify 'Add extended_type_operation to clause 5 to support mapping of Extended_operation.' </w:t>
-            </w:r>
-          </w:p>
-          <w:p>
-            <w:pPr>
-              <w:pStyle w:val="ISOComments"/>
-              <w:rPr>
-                <w:lang w:val="en-US"/>
-              </w:rPr>
-            </w:pPr>
-            <w:r>
-              <w:rPr>
-                <w:lang w:val="en-US"/>
-              </w:rPr>
-              <w:t xml:space="preserve">In annexK, please verify 'Add via_arc_point and via_helix_point to clause 5 to support high-speed milling operations.' </w:t>
-            </w:r>
-          </w:p>
-          <w:p>
-            <w:pPr>
-              <w:pStyle w:val="ISOComments"/>
-              <w:rPr>
-                <w:lang w:val="en-US"/>
-              </w:rPr>
-            </w:pPr>
-            <w:r>
-              <w:rPr>
-                <w:lang w:val="en-US"/>
-              </w:rPr>
-              <w:t xml:space="preserve">In annexK, please verify 'Add additive_type_operation to clause 5 to support mapping of Am_operation and subtypes.' </w:t>
-            </w:r>
-          </w:p>
-          <w:p>
-            <w:pPr>
-              <w:pStyle w:val="ISOComments"/>
-              <w:rPr>
-                <w:lang w:val="en-US"/>
-              </w:rPr>
-            </w:pPr>
-            <w:r>
-              <w:rPr>
-                <w:lang w:val="en-US"/>
-              </w:rPr>
-              <w:t xml:space="preserve">In annexK, please verify 'Change the geometric dimensioning and tolerancing UoF to reference the following feature application object definitions and mappings from ISO 10303-1050 and ISO 10303-1051 rather than define them in clause 4 and 5.' </w:t>
-            </w:r>
-          </w:p>
-          <w:p>
-            <w:pPr>
-              <w:pStyle w:val="ISOComments"/>
-              <w:rPr>
-                <w:lang w:val="en-US"/>
-              </w:rPr>
-            </w:pPr>
-            <w:r>
-              <w:rPr>
-                <w:lang w:val="en-US"/>
-              </w:rPr>
-              <w:t xml:space="preserve">In annexK, please verify 'Remove definitions in clause 5 for directed_dimensional_location, externally_defined_dimension_definition, and placed_datum_target_feature.' </w:t>
-            </w:r>
-          </w:p>
-          <w:p>
-            <w:pPr>
-              <w:pStyle w:val="ISOComments"/>
-              <w:rPr>
-                <w:lang w:val="en-US"/>
-              </w:rPr>
-            </w:pPr>
-            <w:r>
-              <w:rPr>
-                <w:lang w:val="en-US"/>
-              </w:rPr>
               <w:t xml:space="preserve">In annexK, please verify 'The information requirements described in clause 4 have not changed.' </w:t>
             </w:r>
           </w:p>
@@ -17943,97 +18096,91 @@
               <w:rPr>
                 <w:lang w:val="en-US"/>
               </w:rPr>
-              <w:t xml:space="preserve">In clause5, please verify 'This clause specifies how each UoF and application object in clause 4 </w:t>
-            </w:r>
+              <w:t xml:space="preserve">In clause5, please verify 'This clause specifies how each UoF and application object in clause 4 shall be represented by one or more AIM EXPRESS constructs given by Annex A.' </w:t>
+            </w:r>
+          </w:p>
+          <w:p>
+            <w:pPr>
+              <w:pStyle w:val="ISOComments"/>
+              <w:rPr>
+                <w:lang w:val="en-US"/>
+              </w:rPr>
+            </w:pPr>
+            <w:r>
+              <w:rPr>
+                <w:lang w:val="en-US"/>
+              </w:rPr>
+              <w:t xml:space="preserve">In introduction, please verify 'The information requirements of the application are specified in clause 4 using terminology appropriate to the application.' </w:t>
+            </w:r>
+          </w:p>
+          <w:p>
+            <w:pPr>
+              <w:pStyle w:val="ISOComments"/>
+              <w:rPr>
+                <w:lang w:val="en-US"/>
+              </w:rPr>
+            </w:pPr>
+            <w:r>
+              <w:rPr>
+                <w:lang w:val="en-US"/>
+              </w:rPr>
+              <w:t xml:space="preserve">In annexK, please verify 'The Process_property name has been reused for an application object defined by the Executable UoF that extends an Executable with additional information.' </w:t>
+            </w:r>
+          </w:p>
+          <w:p>
+            <w:pPr>
+              <w:pStyle w:val="ISOComments"/>
+              <w:rPr>
+                <w:lang w:val="en-US"/>
+              </w:rPr>
+            </w:pPr>
+            <w:r>
+              <w:rPr>
+                <w:lang w:val="en-US"/>
+              </w:rPr>
+              <w:t xml:space="preserve">In clause4, please verify 'The executable UoF specifies the information necessary to describe control flow of a machining program as well as the non-machining actions that may be performed by a numerical control.' </w:t>
+            </w:r>
+          </w:p>
+          <w:p>
+            <w:pPr>
+              <w:pStyle w:val="ISOComments"/>
+              <w:rPr>
+                <w:lang w:val="en-US"/>
+              </w:rPr>
+            </w:pPr>
+            <w:r>
+              <w:rPr>
+                <w:lang w:val="en-US"/>
+              </w:rPr>
+              <w:t xml:space="preserve">In clause4, please verify 'The following application objects are used by the executable UoF, and shall be as defined by ISO 14649-10.' </w:t>
+            </w:r>
+          </w:p>
+          <w:p>
+            <w:pPr>
+              <w:pStyle w:val="ISOComments"/>
+              <w:rPr>
+                <w:lang w:val="en-US"/>
+              </w:rPr>
+            </w:pPr>
+            <w:r>
+              <w:rPr>
+                <w:lang w:val="en-US"/>
+              </w:rPr>
+              <w:t xml:space="preserve">In clause4, please verify 'In addition, the following application objects are used by the executable UoF, and shall be as defined by this document' </w:t>
+            </w:r>
+          </w:p>
+          <w:p>
+            <w:pPr>
+              <w:pStyle w:val="ISOComments"/>
+              <w:rPr>
+                <w:lang w:val="en-US"/>
+              </w:rPr>
+            </w:pPr>
             <w:r>
               <w:rPr>
                 <w:lang w:val="en-US"/>
               </w:rPr>
               <w:lastRenderedPageBreak/>
-              <w:t xml:space="preserve">shall be represented by one or more AIM EXPRESS constructs given by Annex A.' </w:t>
-            </w:r>
-          </w:p>
-          <w:p>
-            <w:pPr>
-              <w:pStyle w:val="ISOComments"/>
-              <w:rPr>
-                <w:lang w:val="en-US"/>
-              </w:rPr>
-            </w:pPr>
-            <w:r>
-              <w:rPr>
-                <w:lang w:val="en-US"/>
-              </w:rPr>
-              <w:t xml:space="preserve">In introduction, please verify 'The information requirements of the application are specified in clause 4 using terminology appropriate to the application.' </w:t>
-            </w:r>
-          </w:p>
-          <w:p>
-            <w:pPr>
-              <w:pStyle w:val="ISOComments"/>
-              <w:rPr>
-                <w:lang w:val="en-US"/>
-              </w:rPr>
-            </w:pPr>
-            <w:r>
-              <w:rPr>
-                <w:lang w:val="en-US"/>
-              </w:rPr>
-              <w:t xml:space="preserve">In annexK, please verify 'The Process_property name has been reused for an application object defined by the Executable UoF that extends an Executable with additional information.' </w:t>
-            </w:r>
-          </w:p>
-          <w:p>
-            <w:pPr>
-              <w:pStyle w:val="ISOComments"/>
-              <w:rPr>
-                <w:lang w:val="en-US"/>
-              </w:rPr>
-            </w:pPr>
-            <w:r>
-              <w:rPr>
-                <w:lang w:val="en-US"/>
-              </w:rPr>
-              <w:t xml:space="preserve">In clause4, please verify 'The executable UoF specifies the information necessary to describe control flow of a machining program as well as the non-machining actions that may be performed by a numerical control.' </w:t>
-            </w:r>
-          </w:p>
-          <w:p>
-            <w:pPr>
-              <w:pStyle w:val="ISOComments"/>
-              <w:rPr>
-                <w:lang w:val="en-US"/>
-              </w:rPr>
-            </w:pPr>
-            <w:r>
-              <w:rPr>
-                <w:lang w:val="en-US"/>
-              </w:rPr>
-              <w:t xml:space="preserve">In clause4, please verify 'The following application objects are used by the executable UoF, and shall be as defined by ISO 14649-10.' </w:t>
-            </w:r>
-          </w:p>
-          <w:p>
-            <w:pPr>
-              <w:pStyle w:val="ISOComments"/>
-              <w:rPr>
-                <w:lang w:val="en-US"/>
-              </w:rPr>
-            </w:pPr>
-            <w:r>
-              <w:rPr>
-                <w:lang w:val="en-US"/>
-              </w:rPr>
-              <w:t xml:space="preserve">In clause4, please verify 'In addition, the following application objects are used by the executable UoF, and shall be as defined by this document' </w:t>
-            </w:r>
-          </w:p>
-          <w:p>
-            <w:pPr>
-              <w:pStyle w:val="ISOComments"/>
-              <w:rPr>
-                <w:lang w:val="en-US"/>
-              </w:rPr>
-            </w:pPr>
-            <w:r>
-              <w:rPr>
-                <w:lang w:val="en-US"/>
-              </w:rPr>
               <w:t xml:space="preserve">In clause4, please verify 'The following application objects are used by the executable UoF, and shall be as defined by ISO 10303-1526.' </w:t>
             </w:r>
           </w:p>
@@ -18062,14 +18209,7 @@
               <w:rPr>
                 <w:lang w:val="en-US"/>
               </w:rPr>
-              <w:t xml:space="preserve">In clause6, please verify 'This conformance class includes everything specified by CC1, plus all remaining application objects from the toolpath </w:t>
-            </w:r>
-            <w:r>
-              <w:rPr>
-                <w:lang w:val="en-US"/>
-              </w:rPr>
-              <w:lastRenderedPageBreak/>
-              <w:t xml:space="preserve">UoF and the Parallel application object from the executable UOF.' </w:t>
+              <w:t xml:space="preserve">In clause6, please verify 'This conformance class includes everything specified by CC1, plus all remaining application objects from the toolpath UoF and the Parallel application object from the executable UOF.' </w:t>
             </w:r>
           </w:p>
           <w:p>
@@ -18517,6 +18657,7 @@
                     <w:rPr>
                       <w:lang w:val="en-US"/>
                     </w:rPr>
+                    <w:lastRenderedPageBreak/>
                     <w:t>annexJ</w:t>
                   </w:r>
                 </w:p>
@@ -18799,7 +18940,6 @@
                     <w:rPr>
                       <w:lang w:val="en-US"/>
                     </w:rPr>
-                    <w:lastRenderedPageBreak/>
                     <w:t>clause5</w:t>
                   </w:r>
                 </w:p>
@@ -19355,6 +19495,7 @@
               <w:pStyle w:val="ISOMB"/>
             </w:pPr>
             <w:r>
+              <w:lastRenderedPageBreak/>
               <w:t>SC4QC-8</w:t>
             </w:r>
           </w:p>
@@ -19450,14 +19591,7 @@
               <w:rPr>
                 <w:lang w:val="en-US"/>
               </w:rPr>
-              <w:t xml:space="preserve">Please verify if the reference ISO 10303-21:2016, ISO 10303-21 should be added dated or undated in the reference list Please verify if the reference ISO 14649-11:2004, ISO 14649-11 should be added dated or undated in the reference list Please verify if the reference ISO 14649-12:2005, ISO 14649-12 should be added dated or undated in the reference list Please verify if the reference </w:t>
-            </w:r>
-            <w:r>
-              <w:rPr>
-                <w:lang w:val="en-US"/>
-              </w:rPr>
-              <w:lastRenderedPageBreak/>
-              <w:t>ISO 14649-1:2003, ISO 14649-1 should be added dated or undated in the reference list</w:t>
+              <w:t>Please verify if the reference ISO 10303-21:2016, ISO 10303-21 should be added dated or undated in the reference list Please verify if the reference ISO 14649-11:2004, ISO 14649-11 should be added dated or undated in the reference list Please verify if the reference ISO 14649-12:2005, ISO 14649-12 should be added dated or undated in the reference list Please verify if the reference ISO 14649-1:2003, ISO 14649-1 should be added dated or undated in the reference list</w:t>
             </w:r>
           </w:p>
         </w:tc>

</xml_diff>

<commit_message>
Address ISO 1-5, 8, 10, 11
Signed-off-by: David Loffredo <loffredo@steptools.com>
</commit_message>
<xml_diff>
--- a/comments/ISO_DIS_10303-238e4_comment_log.docx
+++ b/comments/ISO_DIS_10303-238e4_comment_log.docx
@@ -11605,6 +11605,9 @@
             <w:pPr>
               <w:pStyle w:val="ISOSecretObservations"/>
             </w:pPr>
+            <w:r>
+              <w:t>Adopted proposed solution</w:t>
+            </w:r>
           </w:p>
         </w:tc>
       </w:tr>
@@ -11759,6 +11762,9 @@
             <w:pPr>
               <w:pStyle w:val="ISOSecretObservations"/>
             </w:pPr>
+            <w:r>
+              <w:t>Moved to introduction</w:t>
+            </w:r>
           </w:p>
         </w:tc>
       </w:tr>
@@ -11913,6 +11919,9 @@
             <w:pPr>
               <w:pStyle w:val="ISOSecretObservations"/>
             </w:pPr>
+            <w:r>
+              <w:t>Moved to introduction</w:t>
+            </w:r>
           </w:p>
         </w:tc>
       </w:tr>
@@ -12072,6 +12081,9 @@
             <w:pPr>
               <w:pStyle w:val="ISOSecretObservations"/>
             </w:pPr>
+            <w:r>
+              <w:t>Adopted proposed solution</w:t>
+            </w:r>
           </w:p>
         </w:tc>
       </w:tr>
@@ -12249,6 +12261,9 @@
             <w:pPr>
               <w:pStyle w:val="ISOSecretObservations"/>
             </w:pPr>
+            <w:r>
+              <w:t>Adopted proposed solution</w:t>
+            </w:r>
           </w:p>
         </w:tc>
       </w:tr>
@@ -12877,6 +12892,12 @@
             <w:pPr>
               <w:pStyle w:val="ISOSecretObservations"/>
             </w:pPr>
+            <w:r>
+              <w:t>Adopted IDP2 clause 7 wording</w:t>
+            </w:r>
+            <w:r>
+              <w:t>, see comment SC4QC-3</w:t>
+            </w:r>
           </w:p>
         </w:tc>
       </w:tr>
@@ -13340,6 +13361,9 @@
             <w:pPr>
               <w:pStyle w:val="ISOSecretObservations"/>
             </w:pPr>
+            <w:r>
+              <w:t>Adopted proposed solution</w:t>
+            </w:r>
           </w:p>
         </w:tc>
       </w:tr>
@@ -13527,6 +13551,9 @@
             <w:pPr>
               <w:pStyle w:val="ISOSecretObservations"/>
             </w:pPr>
+            <w:r>
+              <w:t>Clarified to a single implementation method</w:t>
+            </w:r>
           </w:p>
         </w:tc>
       </w:tr>

</xml_diff>

<commit_message>
Mark resolved comments with RESOLVED
Signed-off-by: David Loffredo <loffredo@steptools.com>
</commit_message>
<xml_diff>
--- a/comments/ISO_DIS_10303-238e4_comment_log.docx
+++ b/comments/ISO_DIS_10303-238e4_comment_log.docx
@@ -163,7 +163,10 @@
           </w:tcPr>
           <w:p>
             <w:r>
-              <w:t>RESOLVED (ed): Abstract page header changed to 'ISO/DIS 10303-238:2026(en)'.</w:t>
+              <w:t xml:space="preserve">RESOLVED - </w:t>
+            </w:r>
+            <w:r>
+              <w:t>Abstract page header changed to 'ISO/DIS 10303-238:2026(en)'.</w:t>
             </w:r>
           </w:p>
         </w:tc>
@@ -301,7 +304,10 @@
           </w:tcPr>
           <w:p>
             <w:r>
-              <w:t>RESOLVED (ed): Foreword changed 'This third edition' to 'This fourth edition'.</w:t>
+              <w:t xml:space="preserve">RESOLVED - </w:t>
+            </w:r>
+            <w:r>
+              <w:t>Foreword changed 'This third edition' to 'This fourth edition'.</w:t>
             </w:r>
           </w:p>
         </w:tc>
@@ -436,7 +442,10 @@
           </w:tcPr>
           <w:p>
             <w:r>
-              <w:t>RESOLVED (ed): added period at end of sentence (Foreword Para 10).</w:t>
+              <w:t xml:space="preserve">RESOLVED - </w:t>
+            </w:r>
+            <w:r>
+              <w:t>added period at end of sentence (Foreword Para 10).</w:t>
             </w:r>
           </w:p>
         </w:tc>
@@ -571,7 +580,10 @@
           </w:tcPr>
           <w:p>
             <w:r>
-              <w:t>RESOLVED (ed): changed to 'manufacturing processes that are based' (Introduction Para 2).</w:t>
+              <w:t xml:space="preserve">RESOLVED - </w:t>
+            </w:r>
+            <w:r>
+              <w:t>changed to 'manufacturing processes that are based' (Introduction Para 2).</w:t>
             </w:r>
           </w:p>
         </w:tc>
@@ -705,11 +717,8 @@
             </w:tcBorders>
           </w:tcPr>
           <w:p>
-            <w:pPr>
-              <w:pStyle w:val="ISOSecretObservations"/>
-            </w:pPr>
-            <w:r>
-              <w:t>Adopted proposed solution</w:t>
+            <w:r>
+              <w:t>RESOLVED - Adopted proposed solution</w:t>
             </w:r>
           </w:p>
         </w:tc>
@@ -843,9 +852,9 @@
             </w:tcBorders>
           </w:tcPr>
           <w:p>
-            <w:pPr>
-              <w:pStyle w:val="ISOSecretObservations"/>
-            </w:pPr>
+            <w:r>
+              <w:t xml:space="preserve">RESOLVED - </w:t>
+            </w:r>
             <w:r>
               <w:t>Added "</w:t>
             </w:r>
@@ -999,9 +1008,9 @@
             </w:tcBorders>
           </w:tcPr>
           <w:p>
-            <w:pPr>
-              <w:pStyle w:val="ISOSecretObservations"/>
-            </w:pPr>
+            <w:r>
+              <w:t xml:space="preserve">RESOLVED - </w:t>
+            </w:r>
             <w:r>
               <w:t>Added Part 17 to abstract</w:t>
             </w:r>
@@ -1025,7 +1034,6 @@
               <w:pStyle w:val="ISOMB"/>
             </w:pPr>
             <w:r>
-              <w:lastRenderedPageBreak/>
               <w:t>US-8</w:t>
             </w:r>
           </w:p>
@@ -1138,11 +1146,11 @@
             </w:tcBorders>
           </w:tcPr>
           <w:p>
-            <w:pPr>
-              <w:pStyle w:val="ISOSecretObservations"/>
-            </w:pPr>
-            <w:r>
-              <w:t>Defer – Adjusting wording of scope statement needs to be coordinated with ISO,   Do at project launch of Ed5.</w:t>
+            <w:r>
+              <w:t>DEFER</w:t>
+            </w:r>
+            <w:r>
+              <w:t xml:space="preserve"> – Adjusting wording of scope statement needs to be coordinated with ISO,   Do at project launch of Ed5.</w:t>
             </w:r>
           </w:p>
         </w:tc>
@@ -1164,6 +1172,7 @@
               <w:pStyle w:val="ISOMB"/>
             </w:pPr>
             <w:r>
+              <w:lastRenderedPageBreak/>
               <w:t>US-9</w:t>
             </w:r>
           </w:p>
@@ -1277,7 +1286,10 @@
           </w:tcPr>
           <w:p>
             <w:r>
-              <w:t>RESOLVED (ed): added 'Application module:' prefix to ISO 10303-1054 title.</w:t>
+              <w:t xml:space="preserve">RESOLVED - </w:t>
+            </w:r>
+            <w:r>
+              <w:t>added 'Application module:' prefix to ISO 10303-1054 title.</w:t>
             </w:r>
           </w:p>
         </w:tc>
@@ -1412,7 +1424,10 @@
           </w:tcPr>
           <w:p>
             <w:r>
-              <w:t>RESOLVED (ed): added 'Application module:' prefix to ISO 10303-1106 title.</w:t>
+              <w:t xml:space="preserve">RESOLVED - </w:t>
+            </w:r>
+            <w:r>
+              <w:t>added 'Application module:' prefix to ISO 10303-1106 title.</w:t>
             </w:r>
           </w:p>
         </w:tc>
@@ -1547,7 +1562,10 @@
           </w:tcPr>
           <w:p>
             <w:r>
-              <w:t>RESOLVED (ed): added 'Application module:' prefix to ISO 10303-1110 title.</w:t>
+              <w:t xml:space="preserve">RESOLVED - </w:t>
+            </w:r>
+            <w:r>
+              <w:t>added 'Application module:' prefix to ISO 10303-1110 title.</w:t>
             </w:r>
           </w:p>
         </w:tc>
@@ -1682,7 +1700,10 @@
           </w:tcPr>
           <w:p>
             <w:r>
-              <w:t>RESOLVED (ed): corrected ISO 23247-1 title to published title.</w:t>
+              <w:t xml:space="preserve">RESOLVED - </w:t>
+            </w:r>
+            <w:r>
+              <w:t>corrected ISO 23247-1 title to published title.</w:t>
             </w:r>
           </w:p>
         </w:tc>
@@ -1817,7 +1838,10 @@
           </w:tcPr>
           <w:p>
             <w:r>
-              <w:t>RESOLVED (ed): changed '3.7 Term defined' to 'Terms defined in ISO 14649-10'.</w:t>
+              <w:t xml:space="preserve">RESOLVED - </w:t>
+            </w:r>
+            <w:r>
+              <w:t>changed '3.7 Term defined' to 'Terms defined in ISO 14649-10'.</w:t>
             </w:r>
           </w:p>
         </w:tc>
@@ -1951,11 +1975,8 @@
             </w:tcBorders>
           </w:tcPr>
           <w:p>
-            <w:pPr>
-              <w:pStyle w:val="ISOSecretObservations"/>
-            </w:pPr>
-            <w:r>
-              <w:t>Adopted proposed solution</w:t>
+            <w:r>
+              <w:t>RESOLVED - Adopted proposed solution</w:t>
             </w:r>
           </w:p>
         </w:tc>
@@ -2089,11 +2110,8 @@
             </w:tcBorders>
           </w:tcPr>
           <w:p>
-            <w:pPr>
-              <w:pStyle w:val="ISOSecretObservations"/>
-            </w:pPr>
-            <w:r>
-              <w:t>Adopted proposed solution</w:t>
+            <w:r>
+              <w:t>RESOLVED - Adopted proposed solution</w:t>
             </w:r>
           </w:p>
         </w:tc>
@@ -2115,7 +2133,6 @@
               <w:pStyle w:val="ISOMB"/>
             </w:pPr>
             <w:r>
-              <w:lastRenderedPageBreak/>
               <w:t>US-16</w:t>
             </w:r>
           </w:p>
@@ -2228,14 +2245,8 @@
             </w:tcBorders>
           </w:tcPr>
           <w:p>
-            <w:pPr>
-              <w:pStyle w:val="ISOSecretObservations"/>
-            </w:pPr>
-            <w:r>
-              <w:t>Adopted</w:t>
-            </w:r>
-            <w:r>
-              <w:t xml:space="preserve"> proposed solution</w:t>
+            <w:r>
+              <w:t>RESOLVED - Adopted proposed solution</w:t>
             </w:r>
             <w:r>
               <w:t xml:space="preserve">, also </w:t>
@@ -2278,6 +2289,7 @@
               <w:rPr>
                 <w:highlight w:val="yellow"/>
               </w:rPr>
+              <w:lastRenderedPageBreak/>
               <w:t>US-17</w:t>
             </w:r>
           </w:p>
@@ -2424,7 +2436,6 @@
           </w:tcPr>
           <w:p>
             <w:pPr>
-              <w:pStyle w:val="ISOSecretObservations"/>
               <w:rPr>
                 <w:highlight w:val="yellow"/>
               </w:rPr>
@@ -2607,7 +2618,6 @@
           </w:tcPr>
           <w:p>
             <w:pPr>
-              <w:pStyle w:val="ISOSecretObservations"/>
               <w:rPr>
                 <w:highlight w:val="yellow"/>
               </w:rPr>
@@ -2750,11 +2760,11 @@
             </w:tcBorders>
           </w:tcPr>
           <w:p>
-            <w:pPr>
-              <w:pStyle w:val="ISOSecretObservations"/>
-            </w:pPr>
-            <w:r>
-              <w:t>RESOLVED (ed): removed erroneous &lt;/H5&gt; tag in 4.3.38.2 heading.</w:t>
+            <w:r>
+              <w:t xml:space="preserve">RESOLVED - </w:t>
+            </w:r>
+            <w:r>
+              <w:t>removed erroneous &lt;/H5&gt; tag in 4.3.38.2 heading.</w:t>
             </w:r>
           </w:p>
         </w:tc>
@@ -2888,11 +2898,8 @@
             </w:tcBorders>
           </w:tcPr>
           <w:p>
-            <w:pPr>
-              <w:pStyle w:val="ISOSecretObservations"/>
-            </w:pPr>
-            <w:r>
-              <w:t>Adopted proposed solution</w:t>
+            <w:r>
+              <w:t>RESOLVED - Adopted proposed solution</w:t>
             </w:r>
           </w:p>
         </w:tc>
@@ -3026,11 +3033,8 @@
             </w:tcBorders>
           </w:tcPr>
           <w:p>
-            <w:pPr>
-              <w:pStyle w:val="ISOSecretObservations"/>
-            </w:pPr>
-            <w:r>
-              <w:t>Adopted proposed solution</w:t>
+            <w:r>
+              <w:t>RESOLVED - Adopted proposed solution</w:t>
             </w:r>
           </w:p>
         </w:tc>
@@ -3164,11 +3168,11 @@
             </w:tcBorders>
           </w:tcPr>
           <w:p>
-            <w:pPr>
-              <w:pStyle w:val="ISOSecretObservations"/>
-            </w:pPr>
-            <w:r>
-              <w:t>RESOLVED (ed): numbered second note as 'NOTE 2' in 4.3.53.</w:t>
+            <w:r>
+              <w:t xml:space="preserve">RESOLVED - </w:t>
+            </w:r>
+            <w:r>
+              <w:t>numbered second note as 'NOTE 2' in 4.3.53.</w:t>
             </w:r>
           </w:p>
         </w:tc>
@@ -3306,14 +3310,7 @@
               <w:rPr>
                 <w:highlight w:val="yellow"/>
               </w:rPr>
-              <w:t xml:space="preserve">Description seems incomplete… What is response to check_dimensions_operation?  What dimensions are in force?  Should there be a flag </w:t>
-            </w:r>
-            <w:r>
-              <w:rPr>
-                <w:highlight w:val="yellow"/>
-              </w:rPr>
-              <w:lastRenderedPageBreak/>
-              <w:t>to check and adjust?  Should measurements be recorded? (djo)</w:t>
+              <w:t>Description seems incomplete… What is response to check_dimensions_operation?  What dimensions are in force?  Should there be a flag to check and adjust?  Should measurements be recorded? (djo)</w:t>
             </w:r>
           </w:p>
         </w:tc>
@@ -3336,7 +3333,6 @@
               <w:rPr>
                 <w:highlight w:val="yellow"/>
               </w:rPr>
-              <w:lastRenderedPageBreak/>
               <w:t>Add descriptions/capabilities</w:t>
             </w:r>
           </w:p>
@@ -3351,7 +3347,6 @@
           </w:tcPr>
           <w:p>
             <w:pPr>
-              <w:pStyle w:val="ISOSecretObservations"/>
               <w:rPr>
                 <w:highlight w:val="yellow"/>
               </w:rPr>
@@ -3497,7 +3492,14 @@
               <w:rPr>
                 <w:highlight w:val="yellow"/>
               </w:rPr>
-              <w:t>One key use of a manufacturing stage, is that it can be used to reference alternative fastener assemblies  (grip length +1 for example) .. But it’s not clear what it is useful for.  Maybe there should be a note in this section on this application or elsewhere</w:t>
+              <w:t xml:space="preserve">One key use of a manufacturing stage, is that it can be used to reference alternative fastener assemblies  (grip length +1 for example) .. But it’s not clear what it is useful for.  Maybe there should </w:t>
+            </w:r>
+            <w:r>
+              <w:rPr>
+                <w:highlight w:val="yellow"/>
+              </w:rPr>
+              <w:lastRenderedPageBreak/>
+              <w:t>be a note in this section on this application or elsewhere</w:t>
             </w:r>
           </w:p>
           <w:p>
@@ -3534,6 +3536,7 @@
               <w:rPr>
                 <w:highlight w:val="yellow"/>
               </w:rPr>
+              <w:lastRenderedPageBreak/>
               <w:t>Add note on how multiple fastener groups could be handled using this Application Object</w:t>
             </w:r>
           </w:p>
@@ -3548,7 +3551,6 @@
           </w:tcPr>
           <w:p>
             <w:pPr>
-              <w:pStyle w:val="ISOSecretObservations"/>
               <w:rPr>
                 <w:highlight w:val="yellow"/>
               </w:rPr>
@@ -3726,7 +3728,6 @@
           </w:tcPr>
           <w:p>
             <w:pPr>
-              <w:pStyle w:val="ISOSecretObservations"/>
               <w:rPr>
                 <w:highlight w:val="yellow"/>
               </w:rPr>
@@ -3740,7 +3741,6 @@
           </w:p>
           <w:p>
             <w:pPr>
-              <w:pStyle w:val="ISOSecretObservations"/>
               <w:rPr>
                 <w:highlight w:val="yellow"/>
               </w:rPr>
@@ -3923,7 +3923,6 @@
           </w:tcPr>
           <w:p>
             <w:pPr>
-              <w:pStyle w:val="ISOSecretObservations"/>
               <w:rPr>
                 <w:highlight w:val="yellow"/>
               </w:rPr>
@@ -4096,7 +4095,6 @@
           </w:tcPr>
           <w:p>
             <w:pPr>
-              <w:pStyle w:val="ISOSecretObservations"/>
               <w:rPr>
                 <w:highlight w:val="yellow"/>
               </w:rPr>
@@ -4275,7 +4273,6 @@
           </w:tcPr>
           <w:p>
             <w:pPr>
-              <w:pStyle w:val="ISOSecretObservations"/>
               <w:rPr>
                 <w:highlight w:val="yellow"/>
               </w:rPr>
@@ -4454,7 +4451,6 @@
           </w:tcPr>
           <w:p>
             <w:pPr>
-              <w:pStyle w:val="ISOSecretObservations"/>
               <w:rPr>
                 <w:highlight w:val="yellow"/>
               </w:rPr>
@@ -4485,7 +4481,6 @@
               <w:pStyle w:val="ISOMB"/>
             </w:pPr>
             <w:r>
-              <w:lastRenderedPageBreak/>
               <w:t>US-30</w:t>
             </w:r>
           </w:p>
@@ -4598,11 +4593,11 @@
             </w:tcBorders>
           </w:tcPr>
           <w:p>
-            <w:pPr>
-              <w:pStyle w:val="ISOSecretObservations"/>
-            </w:pPr>
-            <w:r>
-              <w:t>RESOLVED (ed): removed duplicate 'the' in 5.1.1.</w:t>
+            <w:r>
+              <w:t xml:space="preserve">RESOLVED - </w:t>
+            </w:r>
+            <w:r>
+              <w:t>removed duplicate 'the' in 5.1.1.</w:t>
             </w:r>
           </w:p>
         </w:tc>
@@ -4736,11 +4731,11 @@
             </w:tcBorders>
           </w:tcPr>
           <w:p>
-            <w:pPr>
-              <w:pStyle w:val="ISOSecretObservations"/>
-            </w:pPr>
-            <w:r>
-              <w:t>RESOLVED (ed): changed 'mapping specification' to 'mapping specifications' in 5.1.1 NOTE.</w:t>
+            <w:r>
+              <w:t xml:space="preserve">RESOLVED - </w:t>
+            </w:r>
+            <w:r>
+              <w:t>changed 'mapping specification' to 'mapping specifications' in 5.1.1 NOTE.</w:t>
             </w:r>
           </w:p>
         </w:tc>
@@ -4874,11 +4869,8 @@
             </w:tcBorders>
           </w:tcPr>
           <w:p>
-            <w:pPr>
-              <w:pStyle w:val="ISOSecretObservations"/>
-            </w:pPr>
-            <w:r>
-              <w:t>Adopted proposed solution</w:t>
+            <w:r>
+              <w:t>RESOLVED - Adopted proposed solution</w:t>
             </w:r>
           </w:p>
         </w:tc>
@@ -4900,6 +4892,7 @@
               <w:pStyle w:val="ISOMB"/>
             </w:pPr>
             <w:r>
+              <w:lastRenderedPageBreak/>
               <w:t>US-33</w:t>
             </w:r>
           </w:p>
@@ -5012,11 +5005,11 @@
             </w:tcBorders>
           </w:tcPr>
           <w:p>
-            <w:pPr>
-              <w:pStyle w:val="ISOSecretObservations"/>
-            </w:pPr>
-            <w:r>
-              <w:t>RESOLVED (ed): fixed doubled 'map-map-' prefix to 'map-' in 5.1.6.12.1 and 5.1.6.12.2.</w:t>
+            <w:r>
+              <w:t xml:space="preserve">RESOLVED - </w:t>
+            </w:r>
+            <w:r>
+              <w:t>fixed doubled 'map-map-' prefix to 'map-' in 5.1.6.12.1 and 5.1.6.12.2.</w:t>
             </w:r>
           </w:p>
         </w:tc>
@@ -5150,11 +5143,8 @@
             </w:tcBorders>
           </w:tcPr>
           <w:p>
-            <w:pPr>
-              <w:pStyle w:val="ISOSecretObservations"/>
-            </w:pPr>
-            <w:r>
-              <w:t>Adopted proposed solution</w:t>
+            <w:r>
+              <w:t>RESOLVED - Adopted proposed solution</w:t>
             </w:r>
           </w:p>
         </w:tc>
@@ -5288,11 +5278,8 @@
             </w:tcBorders>
           </w:tcPr>
           <w:p>
-            <w:pPr>
-              <w:pStyle w:val="ISOSecretObservations"/>
-            </w:pPr>
-            <w:r>
-              <w:t>Adopted proposed solution</w:t>
+            <w:r>
+              <w:t>RESOLVED - Adopted proposed solution</w:t>
             </w:r>
           </w:p>
         </w:tc>
@@ -5426,11 +5413,8 @@
             </w:tcBorders>
           </w:tcPr>
           <w:p>
-            <w:pPr>
-              <w:pStyle w:val="ISOSecretObservations"/>
-            </w:pPr>
-            <w:r>
-              <w:t>Adopted proposed solution</w:t>
+            <w:r>
+              <w:t>RESOLVED - Adopted proposed solution</w:t>
             </w:r>
           </w:p>
         </w:tc>
@@ -5564,11 +5548,8 @@
             </w:tcBorders>
           </w:tcPr>
           <w:p>
-            <w:pPr>
-              <w:pStyle w:val="ISOSecretObservations"/>
-            </w:pPr>
-            <w:r>
-              <w:t>Adopted proposed solution</w:t>
+            <w:r>
+              <w:t>RESOLVED - Adopted proposed solution</w:t>
             </w:r>
           </w:p>
         </w:tc>
@@ -5702,11 +5683,8 @@
             </w:tcBorders>
           </w:tcPr>
           <w:p>
-            <w:pPr>
-              <w:pStyle w:val="ISOSecretObservations"/>
-            </w:pPr>
-            <w:r>
-              <w:t>Adopted proposed solution</w:t>
+            <w:r>
+              <w:t>RESOLVED - Adopted proposed solution</w:t>
             </w:r>
           </w:p>
         </w:tc>
@@ -5728,7 +5706,6 @@
               <w:pStyle w:val="ISOMB"/>
             </w:pPr>
             <w:r>
-              <w:lastRenderedPageBreak/>
               <w:t>US-39</w:t>
             </w:r>
           </w:p>
@@ -5841,11 +5818,8 @@
             </w:tcBorders>
           </w:tcPr>
           <w:p>
-            <w:pPr>
-              <w:pStyle w:val="ISOSecretObservations"/>
-            </w:pPr>
-            <w:r>
-              <w:t>Adopted proposed solution</w:t>
+            <w:r>
+              <w:t>RESOLVED - Adopted proposed solution</w:t>
             </w:r>
           </w:p>
         </w:tc>
@@ -5979,11 +5953,11 @@
             </w:tcBorders>
           </w:tcPr>
           <w:p>
-            <w:pPr>
-              <w:pStyle w:val="ISOSecretObservations"/>
-            </w:pPr>
-            <w:r>
-              <w:t>RESOLVED (ed): changed 'preceeding' to 'preceding' in Clause 6.</w:t>
+            <w:r>
+              <w:t xml:space="preserve">RESOLVED - </w:t>
+            </w:r>
+            <w:r>
+              <w:t>changed 'preceeding' to 'preceding' in Clause 6.</w:t>
             </w:r>
           </w:p>
         </w:tc>
@@ -6117,11 +6091,11 @@
             </w:tcBorders>
           </w:tcPr>
           <w:p>
-            <w:pPr>
-              <w:pStyle w:val="ISOSecretObservations"/>
-            </w:pPr>
-            <w:r>
-              <w:t>RESOLVED (ed): changed 'sup-ported' to 'supported' in Clause 6.</w:t>
+            <w:r>
+              <w:t xml:space="preserve">RESOLVED - </w:t>
+            </w:r>
+            <w:r>
+              <w:t>changed 'sup-ported' to 'supported' in Clause 6.</w:t>
             </w:r>
           </w:p>
         </w:tc>
@@ -6255,9 +6229,9 @@
             </w:tcBorders>
           </w:tcPr>
           <w:p>
-            <w:pPr>
-              <w:pStyle w:val="ISOSecretObservations"/>
-            </w:pPr>
+            <w:r>
+              <w:t xml:space="preserve">RESOLVED - </w:t>
+            </w:r>
             <w:r>
               <w:t>Added hot link to all table references so that renum.pl will update them like the figure refs.</w:t>
             </w:r>
@@ -6281,6 +6255,7 @@
               <w:pStyle w:val="ISOMB"/>
             </w:pPr>
             <w:r>
+              <w:lastRenderedPageBreak/>
               <w:t>US-43</w:t>
             </w:r>
           </w:p>
@@ -6393,11 +6368,11 @@
             </w:tcBorders>
           </w:tcPr>
           <w:p>
-            <w:pPr>
-              <w:pStyle w:val="ISOSecretObservations"/>
-            </w:pPr>
-            <w:r>
-              <w:t>RESOLVED (ed): standardized 'UOF'/'UOFs' to 'UoF'/'UoFs' in Clause 6.</w:t>
+            <w:r>
+              <w:t xml:space="preserve">RESOLVED - </w:t>
+            </w:r>
+            <w:r>
+              <w:t>standardized 'UOF'/'UOFs' to 'UoF'/'UoFs' in Clause 6.</w:t>
             </w:r>
           </w:p>
         </w:tc>
@@ -6531,17 +6506,14 @@
             </w:tcBorders>
           </w:tcPr>
           <w:p>
-            <w:pPr>
-              <w:pStyle w:val="ISOSecretObservations"/>
-            </w:pPr>
-            <w:r>
-              <w:t>RESOLVED (ed): changed 'superceeds' to 'supersedes' in Annex A (Nxxx left for separate comment).</w:t>
-            </w:r>
-          </w:p>
-          <w:p>
-            <w:pPr>
-              <w:pStyle w:val="ISOSecretObservations"/>
-            </w:pPr>
+            <w:r>
+              <w:t xml:space="preserve">RESOLVED - </w:t>
+            </w:r>
+            <w:r>
+              <w:t>changed 'superceeds' to 'supersedes' in Annex A (Nxxx left for separate comment).</w:t>
+            </w:r>
+          </w:p>
+          <w:p>
             <w:r>
               <w:t>Also updated in attached AIM/ARM express files</w:t>
             </w:r>
@@ -6677,9 +6649,6 @@
             </w:tcBorders>
           </w:tcPr>
           <w:p>
-            <w:pPr>
-              <w:pStyle w:val="ISOSecretObservations"/>
-            </w:pPr>
             <w:r>
               <w:t xml:space="preserve">Done,. </w:t>
             </w:r>
@@ -6818,11 +6787,11 @@
             </w:tcBorders>
           </w:tcPr>
           <w:p>
-            <w:pPr>
-              <w:pStyle w:val="ISOSecretObservations"/>
-            </w:pPr>
-            <w:r>
-              <w:t>RESOLVED (ed): changed 'preceeding' to 'preceding' in Annex D.</w:t>
+            <w:r>
+              <w:t xml:space="preserve">RESOLVED - </w:t>
+            </w:r>
+            <w:r>
+              <w:t>changed 'preceeding' to 'preceding' in Annex D.</w:t>
             </w:r>
           </w:p>
         </w:tc>
@@ -6844,7 +6813,6 @@
               <w:pStyle w:val="ISOMB"/>
             </w:pPr>
             <w:r>
-              <w:lastRenderedPageBreak/>
               <w:t>US-47</w:t>
             </w:r>
           </w:p>
@@ -6957,11 +6925,11 @@
             </w:tcBorders>
           </w:tcPr>
           <w:p>
-            <w:pPr>
-              <w:pStyle w:val="ISOSecretObservations"/>
-            </w:pPr>
-            <w:r>
-              <w:t>RESOLVED (ed): body changed to 'Protocol Implementation Conformance Statement' to match heading (Annex D).</w:t>
+            <w:r>
+              <w:t xml:space="preserve">RESOLVED - </w:t>
+            </w:r>
+            <w:r>
+              <w:t>body changed to 'Protocol Implementation Conformance Statement' to match heading (Annex D).</w:t>
             </w:r>
           </w:p>
         </w:tc>
@@ -7095,9 +7063,9 @@
             </w:tcBorders>
           </w:tcPr>
           <w:p>
-            <w:pPr>
-              <w:pStyle w:val="ISOSecretObservations"/>
-            </w:pPr>
+            <w:r>
+              <w:t xml:space="preserve">RESOLVED - </w:t>
+            </w:r>
             <w:r>
               <w:t>Removed redundant</w:t>
             </w:r>
@@ -7234,7 +7202,10 @@
           </w:tcPr>
           <w:p>
             <w:r>
-              <w:t>RESOLVED (ed): standardized Annex H EXPRESS-G reference to ISO 10303-11:2004, Annex D.</w:t>
+              <w:t xml:space="preserve">RESOLVED - </w:t>
+            </w:r>
+            <w:r>
+              <w:t>standardized Annex H EXPRESS-G reference to ISO 10303-11:2004, Annex D.</w:t>
             </w:r>
           </w:p>
         </w:tc>
@@ -7368,11 +7339,11 @@
             </w:tcBorders>
           </w:tcPr>
           <w:p>
-            <w:pPr>
-              <w:pStyle w:val="ISOSecretObservations"/>
-            </w:pPr>
-            <w:r>
-              <w:t>RESOLVED (ed): fixed 'is is indeed' to 'is indeed' in Annex J.2.</w:t>
+            <w:r>
+              <w:t xml:space="preserve">RESOLVED - </w:t>
+            </w:r>
+            <w:r>
+              <w:t>fixed 'is is indeed' to 'is indeed' in Annex J.2.</w:t>
             </w:r>
           </w:p>
         </w:tc>
@@ -7394,6 +7365,7 @@
               <w:pStyle w:val="ISOMB"/>
             </w:pPr>
             <w:r>
+              <w:lastRenderedPageBreak/>
               <w:t>US-51</w:t>
             </w:r>
           </w:p>
@@ -7506,11 +7478,11 @@
             </w:tcBorders>
           </w:tcPr>
           <w:p>
-            <w:pPr>
-              <w:pStyle w:val="ISOSecretObservations"/>
-            </w:pPr>
-            <w:r>
-              <w:t>RESOLVED (ed): changed 'worplan' to 'workplan' in Annex J.5.</w:t>
+            <w:r>
+              <w:t xml:space="preserve">RESOLVED - </w:t>
+            </w:r>
+            <w:r>
+              <w:t>changed 'worplan' to 'workplan' in Annex J.5.</w:t>
             </w:r>
           </w:p>
         </w:tc>
@@ -7644,11 +7616,8 @@
             </w:tcBorders>
           </w:tcPr>
           <w:p>
-            <w:pPr>
-              <w:pStyle w:val="ISOSecretObservations"/>
-            </w:pPr>
-            <w:r>
-              <w:t>Adopted proposed solution</w:t>
+            <w:r>
+              <w:t>RESOLVED - Adopted proposed solution</w:t>
             </w:r>
           </w:p>
         </w:tc>
@@ -7783,6 +7752,9 @@
           </w:tcPr>
           <w:p>
             <w:r>
+              <w:t xml:space="preserve">RESOLVED - </w:t>
+            </w:r>
+            <w:r>
               <w:t>Removed entire line.  Cut and paste error.</w:t>
             </w:r>
           </w:p>
@@ -7805,7 +7777,6 @@
               <w:pStyle w:val="ISOMB"/>
             </w:pPr>
             <w:r>
-              <w:lastRenderedPageBreak/>
               <w:t>US-54</w:t>
             </w:r>
           </w:p>
@@ -7919,7 +7890,7 @@
           </w:tcPr>
           <w:p>
             <w:r>
-              <w:t>Adopted proposed solution</w:t>
+              <w:t>RESOLVED - Adopted proposed solution</w:t>
             </w:r>
           </w:p>
         </w:tc>
@@ -8054,6 +8025,9 @@
           </w:tcPr>
           <w:p>
             <w:r>
+              <w:t xml:space="preserve">RESOLVED - </w:t>
+            </w:r>
+            <w:r>
               <w:t xml:space="preserve">Undated reference is correct.  Dated version was not called out in </w:t>
             </w:r>
             <w:r>
@@ -8195,7 +8169,10 @@
           </w:tcPr>
           <w:p>
             <w:r>
-              <w:t>RESOLVED (ed): removed space before colon in ISO 10303-223 bibliography entry.</w:t>
+              <w:t xml:space="preserve">RESOLVED - </w:t>
+            </w:r>
+            <w:r>
+              <w:t>removed space before colon in ISO 10303-223 bibliography entry.</w:t>
             </w:r>
           </w:p>
         </w:tc>
@@ -8825,6 +8802,7 @@
               <w:rPr>
                 <w:highlight w:val="yellow"/>
               </w:rPr>
+              <w:lastRenderedPageBreak/>
               <w:t>US-60</w:t>
             </w:r>
           </w:p>
@@ -9780,7 +9758,6 @@
               <w:rPr>
                 <w:highlight w:val="yellow"/>
               </w:rPr>
-              <w:lastRenderedPageBreak/>
               <w:t>US-65</w:t>
             </w:r>
           </w:p>
@@ -10147,7 +10124,6 @@
           </w:tcPr>
           <w:p>
             <w:pPr>
-              <w:pStyle w:val="ISOSecretObservations"/>
               <w:rPr>
                 <w:highlight w:val="yellow"/>
               </w:rPr>
@@ -10485,7 +10461,10 @@
           </w:tcPr>
           <w:p>
             <w:r>
-              <w:t>RESOLVED (ed): changed all 7 occurrences of 'maximim' to 'maximum' in Clause 4.</w:t>
+              <w:t xml:space="preserve">RESOLVED - </w:t>
+            </w:r>
+            <w:r>
+              <w:t>changed all 7 occurrences of 'maximim' to 'maximum' in Clause 4.</w:t>
             </w:r>
           </w:p>
         </w:tc>
@@ -10620,6 +10599,7 @@
           </w:p>
           <w:p>
             <w:r>
+              <w:lastRenderedPageBreak/>
               <w:t>dias[1]\representation_item\measure_representation_item.value_component/2))</w:t>
             </w:r>
           </w:p>
@@ -11006,7 +10986,6 @@
                 <w:highlight w:val="yellow"/>
                 <w:lang w:val="en-US"/>
               </w:rPr>
-              <w:lastRenderedPageBreak/>
               <w:t>SE-</w:t>
             </w:r>
             <w:r>
@@ -11602,11 +11581,8 @@
             </w:tcBorders>
           </w:tcPr>
           <w:p>
-            <w:pPr>
-              <w:pStyle w:val="ISOSecretObservations"/>
-            </w:pPr>
-            <w:r>
-              <w:t>Adopted proposed solution</w:t>
+            <w:r>
+              <w:t>RESOLVED - Adopted proposed solution</w:t>
             </w:r>
           </w:p>
         </w:tc>
@@ -11759,9 +11735,9 @@
             </w:tcBorders>
           </w:tcPr>
           <w:p>
-            <w:pPr>
-              <w:pStyle w:val="ISOSecretObservations"/>
-            </w:pPr>
+            <w:r>
+              <w:t xml:space="preserve">RESOLVED - </w:t>
+            </w:r>
             <w:r>
               <w:t>Moved to introduction</w:t>
             </w:r>
@@ -11916,9 +11892,9 @@
             </w:tcBorders>
           </w:tcPr>
           <w:p>
-            <w:pPr>
-              <w:pStyle w:val="ISOSecretObservations"/>
-            </w:pPr>
+            <w:r>
+              <w:t xml:space="preserve">RESOLVED - </w:t>
+            </w:r>
             <w:r>
               <w:t>Moved to introduction</w:t>
             </w:r>
@@ -12078,11 +12054,8 @@
             </w:tcBorders>
           </w:tcPr>
           <w:p>
-            <w:pPr>
-              <w:pStyle w:val="ISOSecretObservations"/>
-            </w:pPr>
-            <w:r>
-              <w:t>Adopted proposed solution</w:t>
+            <w:r>
+              <w:t>RESOLVED - Adopted proposed solution</w:t>
             </w:r>
           </w:p>
         </w:tc>
@@ -12104,6 +12077,7 @@
               <w:pStyle w:val="ISOMB"/>
             </w:pPr>
             <w:r>
+              <w:lastRenderedPageBreak/>
               <w:t>ISO-5</w:t>
             </w:r>
           </w:p>
@@ -12258,11 +12232,8 @@
             </w:tcBorders>
           </w:tcPr>
           <w:p>
-            <w:pPr>
-              <w:pStyle w:val="ISOSecretObservations"/>
-            </w:pPr>
-            <w:r>
-              <w:t>Adopted proposed solution</w:t>
+            <w:r>
+              <w:t>RESOLVED - Adopted proposed solution</w:t>
             </w:r>
           </w:p>
         </w:tc>
@@ -12284,7 +12255,6 @@
               <w:pStyle w:val="ISOMB"/>
             </w:pPr>
             <w:r>
-              <w:lastRenderedPageBreak/>
               <w:t>ISO-6</w:t>
             </w:r>
           </w:p>
@@ -12393,11 +12363,7 @@
               <w:bottom w:val="single" w:sz="6" w:space="0" w:color="auto"/>
             </w:tcBorders>
           </w:tcPr>
-          <w:p>
-            <w:pPr>
-              <w:pStyle w:val="ISOSecretObservations"/>
-            </w:pPr>
-          </w:p>
+          <w:p/>
         </w:tc>
       </w:tr>
       <w:tr>
@@ -12702,11 +12668,7 @@
               <w:bottom w:val="single" w:sz="6" w:space="0" w:color="auto"/>
             </w:tcBorders>
           </w:tcPr>
-          <w:p>
-            <w:pPr>
-              <w:pStyle w:val="ISOSecretObservations"/>
-            </w:pPr>
-          </w:p>
+          <w:p/>
         </w:tc>
       </w:tr>
       <w:tr>
@@ -12726,6 +12688,7 @@
               <w:pStyle w:val="ISOMB"/>
             </w:pPr>
             <w:r>
+              <w:lastRenderedPageBreak/>
               <w:t>ISO-8</w:t>
             </w:r>
           </w:p>
@@ -12889,9 +12852,9 @@
             </w:tcBorders>
           </w:tcPr>
           <w:p>
-            <w:pPr>
-              <w:pStyle w:val="ISOSecretObservations"/>
-            </w:pPr>
+            <w:r>
+              <w:t xml:space="preserve">RESOLVED - </w:t>
+            </w:r>
             <w:r>
               <w:t>Adopted IDP2 clause 7 wording</w:t>
             </w:r>
@@ -12918,7 +12881,6 @@
               <w:pStyle w:val="ISOMB"/>
             </w:pPr>
             <w:r>
-              <w:lastRenderedPageBreak/>
               <w:t>ISO-9</w:t>
             </w:r>
           </w:p>
@@ -13225,11 +13187,7 @@
               <w:bottom w:val="single" w:sz="6" w:space="0" w:color="auto"/>
             </w:tcBorders>
           </w:tcPr>
-          <w:p>
-            <w:pPr>
-              <w:pStyle w:val="ISOSecretObservations"/>
-            </w:pPr>
-          </w:p>
+          <w:p/>
         </w:tc>
       </w:tr>
       <w:tr>
@@ -13249,6 +13207,7 @@
               <w:pStyle w:val="ISOMB"/>
             </w:pPr>
             <w:r>
+              <w:lastRenderedPageBreak/>
               <w:t>ISO-10</w:t>
             </w:r>
           </w:p>
@@ -13358,11 +13317,8 @@
             </w:tcBorders>
           </w:tcPr>
           <w:p>
-            <w:pPr>
-              <w:pStyle w:val="ISOSecretObservations"/>
-            </w:pPr>
-            <w:r>
-              <w:t>Adopted proposed solution</w:t>
+            <w:r>
+              <w:t>RESOLVED - Adopted proposed solution</w:t>
             </w:r>
           </w:p>
         </w:tc>
@@ -13548,9 +13504,9 @@
             </w:tcBorders>
           </w:tcPr>
           <w:p>
-            <w:pPr>
-              <w:pStyle w:val="ISOSecretObservations"/>
-            </w:pPr>
+            <w:r>
+              <w:t xml:space="preserve">RESOLVED - </w:t>
+            </w:r>
             <w:r>
               <w:t>Clarified to a single implementation method</w:t>
             </w:r>
@@ -13574,7 +13530,6 @@
               <w:pStyle w:val="ISOMB"/>
             </w:pPr>
             <w:r>
-              <w:lastRenderedPageBreak/>
               <w:t>ISO-12</w:t>
             </w:r>
           </w:p>
@@ -13703,11 +13658,7 @@
               <w:bottom w:val="single" w:sz="6" w:space="0" w:color="auto"/>
             </w:tcBorders>
           </w:tcPr>
-          <w:p>
-            <w:pPr>
-              <w:pStyle w:val="ISOSecretObservations"/>
-            </w:pPr>
-          </w:p>
+          <w:p/>
         </w:tc>
       </w:tr>
       <w:tr>
@@ -13872,6 +13823,7 @@
               <w:rPr>
                 <w:lang w:val="en-US"/>
               </w:rPr>
+              <w:lastRenderedPageBreak/>
               <w:t>ISO 10303-1514 should be moved to the Bibliography</w:t>
             </w:r>
           </w:p>
@@ -13939,6 +13891,7 @@
               <w:pStyle w:val="ISOChange"/>
             </w:pPr>
             <w:r>
+              <w:lastRenderedPageBreak/>
               <w:t>Move to bibliography</w:t>
             </w:r>
           </w:p>
@@ -13952,16 +13905,15 @@
             </w:tcBorders>
           </w:tcPr>
           <w:p>
-            <w:pPr>
-              <w:pStyle w:val="ISOSecretObservations"/>
-            </w:pPr>
-            <w:r>
-              <w:t>Adopted proposed solution where appropriate.</w:t>
-            </w:r>
-          </w:p>
-          <w:p>
-            <w:pPr>
-              <w:pStyle w:val="ISOComments"/>
+            <w:r>
+              <w:t>RESOLVED - Adopted proposed solution</w:t>
+            </w:r>
+            <w:r>
+              <w:t xml:space="preserve"> where appropriate.</w:t>
+            </w:r>
+          </w:p>
+          <w:p>
+            <w:pPr>
               <w:rPr>
                 <w:lang w:val="en-US"/>
               </w:rPr>
@@ -14004,9 +13956,6 @@
             </w:r>
           </w:p>
           <w:p>
-            <w:pPr>
-              <w:pStyle w:val="ISOSecretObservations"/>
-            </w:pPr>
             <w:r>
               <w:t xml:space="preserve">ISO 286-1 not moved, is in normative text for </w:t>
             </w:r>
@@ -14018,9 +13967,6 @@
             </w:r>
           </w:p>
           <w:p>
-            <w:pPr>
-              <w:pStyle w:val="ISOSecretObservations"/>
-            </w:pPr>
             <w:r>
               <w:rPr>
                 <w:lang w:val="en-US"/>
@@ -14152,7 +14098,6 @@
               <w:rPr>
                 <w:lang w:val="en-US"/>
               </w:rPr>
-              <w:lastRenderedPageBreak/>
               <w:t xml:space="preserve">ISO 10303-1131 </w:t>
             </w:r>
           </w:p>
@@ -14282,7 +14227,6 @@
               <w:pStyle w:val="ISOChange"/>
             </w:pPr>
             <w:r>
-              <w:lastRenderedPageBreak/>
               <w:t>Remove</w:t>
             </w:r>
           </w:p>
@@ -14296,19 +14240,15 @@
             </w:tcBorders>
           </w:tcPr>
           <w:p>
-            <w:pPr>
-              <w:pStyle w:val="ISOSecretObservations"/>
-            </w:pPr>
-            <w:r>
-              <w:t>Adopted proposed solution where appropriate.</w:t>
-            </w:r>
-          </w:p>
-          <w:p>
-            <w:pPr>
-              <w:pStyle w:val="ISOSecretObservations"/>
-            </w:pPr>
-            <w:r>
-              <w:lastRenderedPageBreak/>
+            <w:r>
+              <w:t>RESOLVED - Adopted proposed solution</w:t>
+            </w:r>
+            <w:r>
+              <w:t xml:space="preserve"> where appropriate.</w:t>
+            </w:r>
+          </w:p>
+          <w:p>
+            <w:r>
               <w:t>ISO 1101, ISO 23247-1, ISO 2806, ISO 5459 are referenced in clause 3</w:t>
             </w:r>
           </w:p>
@@ -14331,106 +14271,106 @@
               <w:pStyle w:val="ISOMB"/>
             </w:pPr>
             <w:r>
+              <w:t>SC4QC-3</w:t>
+            </w:r>
+          </w:p>
+        </w:tc>
+        <w:tc>
+          <w:tcPr>
+            <w:tcW w:w="908" w:type="dxa"/>
+            <w:tcBorders>
+              <w:top w:val="single" w:sz="6" w:space="0" w:color="auto"/>
+              <w:bottom w:val="single" w:sz="6" w:space="0" w:color="auto"/>
+            </w:tcBorders>
+          </w:tcPr>
+          <w:p>
+            <w:pPr>
+              <w:pStyle w:val="ISOClause"/>
+            </w:pPr>
+          </w:p>
+        </w:tc>
+        <w:tc>
+          <w:tcPr>
+            <w:tcW w:w="1209" w:type="dxa"/>
+            <w:tcBorders>
+              <w:top w:val="single" w:sz="6" w:space="0" w:color="auto"/>
+              <w:bottom w:val="single" w:sz="6" w:space="0" w:color="auto"/>
+            </w:tcBorders>
+          </w:tcPr>
+          <w:p>
+            <w:pPr>
+              <w:pStyle w:val="ISOClause"/>
+            </w:pPr>
+            <w:r>
+              <w:t>4, 5</w:t>
+            </w:r>
+          </w:p>
+        </w:tc>
+        <w:tc>
+          <w:tcPr>
+            <w:tcW w:w="1209" w:type="dxa"/>
+            <w:tcBorders>
+              <w:top w:val="single" w:sz="6" w:space="0" w:color="auto"/>
+              <w:bottom w:val="single" w:sz="6" w:space="0" w:color="auto"/>
+            </w:tcBorders>
+          </w:tcPr>
+          <w:p>
+            <w:pPr>
+              <w:pStyle w:val="ISOParagraph"/>
+            </w:pPr>
+          </w:p>
+        </w:tc>
+        <w:tc>
+          <w:tcPr>
+            <w:tcW w:w="1115" w:type="dxa"/>
+            <w:tcBorders>
+              <w:top w:val="single" w:sz="6" w:space="0" w:color="auto"/>
+              <w:bottom w:val="single" w:sz="6" w:space="0" w:color="auto"/>
+            </w:tcBorders>
+          </w:tcPr>
+          <w:p>
+            <w:pPr>
+              <w:pStyle w:val="ISOCommType"/>
+            </w:pPr>
+            <w:r>
+              <w:t>Ed</w:t>
+            </w:r>
+          </w:p>
+        </w:tc>
+        <w:tc>
+          <w:tcPr>
+            <w:tcW w:w="4177" w:type="dxa"/>
+            <w:tcBorders>
+              <w:top w:val="single" w:sz="6" w:space="0" w:color="auto"/>
+              <w:bottom w:val="single" w:sz="6" w:space="0" w:color="auto"/>
+            </w:tcBorders>
+          </w:tcPr>
+          <w:p>
+            <w:pPr>
+              <w:pStyle w:val="ISOComments"/>
+              <w:rPr>
+                <w:lang w:val="en-US"/>
+              </w:rPr>
+            </w:pPr>
+            <w:r>
+              <w:rPr>
+                <w:lang w:val="en-US"/>
+              </w:rPr>
+              <w:t>Do not use these provisions in the fragments displayed below. Use only the provisions listed in IDP2, Clause 7.</w:t>
+            </w:r>
+          </w:p>
+          <w:p>
+            <w:pPr>
+              <w:pStyle w:val="ISOComments"/>
+              <w:rPr>
+                <w:lang w:val="en-US"/>
+              </w:rPr>
+            </w:pPr>
+            <w:r>
+              <w:rPr>
+                <w:lang w:val="en-US"/>
+              </w:rPr>
               <w:lastRenderedPageBreak/>
-              <w:t>SC4QC-3</w:t>
-            </w:r>
-          </w:p>
-        </w:tc>
-        <w:tc>
-          <w:tcPr>
-            <w:tcW w:w="908" w:type="dxa"/>
-            <w:tcBorders>
-              <w:top w:val="single" w:sz="6" w:space="0" w:color="auto"/>
-              <w:bottom w:val="single" w:sz="6" w:space="0" w:color="auto"/>
-            </w:tcBorders>
-          </w:tcPr>
-          <w:p>
-            <w:pPr>
-              <w:pStyle w:val="ISOClause"/>
-            </w:pPr>
-          </w:p>
-        </w:tc>
-        <w:tc>
-          <w:tcPr>
-            <w:tcW w:w="1209" w:type="dxa"/>
-            <w:tcBorders>
-              <w:top w:val="single" w:sz="6" w:space="0" w:color="auto"/>
-              <w:bottom w:val="single" w:sz="6" w:space="0" w:color="auto"/>
-            </w:tcBorders>
-          </w:tcPr>
-          <w:p>
-            <w:pPr>
-              <w:pStyle w:val="ISOClause"/>
-            </w:pPr>
-            <w:r>
-              <w:t>4, 5</w:t>
-            </w:r>
-          </w:p>
-        </w:tc>
-        <w:tc>
-          <w:tcPr>
-            <w:tcW w:w="1209" w:type="dxa"/>
-            <w:tcBorders>
-              <w:top w:val="single" w:sz="6" w:space="0" w:color="auto"/>
-              <w:bottom w:val="single" w:sz="6" w:space="0" w:color="auto"/>
-            </w:tcBorders>
-          </w:tcPr>
-          <w:p>
-            <w:pPr>
-              <w:pStyle w:val="ISOParagraph"/>
-            </w:pPr>
-          </w:p>
-        </w:tc>
-        <w:tc>
-          <w:tcPr>
-            <w:tcW w:w="1115" w:type="dxa"/>
-            <w:tcBorders>
-              <w:top w:val="single" w:sz="6" w:space="0" w:color="auto"/>
-              <w:bottom w:val="single" w:sz="6" w:space="0" w:color="auto"/>
-            </w:tcBorders>
-          </w:tcPr>
-          <w:p>
-            <w:pPr>
-              <w:pStyle w:val="ISOCommType"/>
-            </w:pPr>
-            <w:r>
-              <w:t>Ed</w:t>
-            </w:r>
-          </w:p>
-        </w:tc>
-        <w:tc>
-          <w:tcPr>
-            <w:tcW w:w="4177" w:type="dxa"/>
-            <w:tcBorders>
-              <w:top w:val="single" w:sz="6" w:space="0" w:color="auto"/>
-              <w:bottom w:val="single" w:sz="6" w:space="0" w:color="auto"/>
-            </w:tcBorders>
-          </w:tcPr>
-          <w:p>
-            <w:pPr>
-              <w:pStyle w:val="ISOComments"/>
-              <w:rPr>
-                <w:lang w:val="en-US"/>
-              </w:rPr>
-            </w:pPr>
-            <w:r>
-              <w:rPr>
-                <w:lang w:val="en-US"/>
-              </w:rPr>
-              <w:t>Do not use these provisions in the fragments displayed below. Use only the provisions listed in IDP2, Clause 7.</w:t>
-            </w:r>
-          </w:p>
-          <w:p>
-            <w:pPr>
-              <w:pStyle w:val="ISOComments"/>
-              <w:rPr>
-                <w:lang w:val="en-US"/>
-              </w:rPr>
-            </w:pPr>
-            <w:r>
-              <w:rPr>
-                <w:lang w:val="en-US"/>
-              </w:rPr>
               <w:t>clause4</w:t>
             </w:r>
             <w:r>
@@ -14501,14 +14441,7 @@
                 <w:lang w:val="en-US"/>
               </w:rPr>
               <w:tab/>
-              <w:t xml:space="preserve">A planning_operation has been added to Program_structure to describe information that </w:t>
-            </w:r>
-            <w:r>
-              <w:rPr>
-                <w:lang w:val="en-US"/>
-              </w:rPr>
-              <w:lastRenderedPageBreak/>
-              <w:t>could be used to generate workingsteps just before or during manufacturing.</w:t>
+              <w:t>A planning_operation has been added to Program_structure to describe information that could be used to generate workingsteps just before or during manufacturing.</w:t>
             </w:r>
           </w:p>
           <w:p>
@@ -14627,6 +14560,7 @@
               <w:rPr>
                 <w:lang w:val="en-US"/>
               </w:rPr>
+              <w:lastRenderedPageBreak/>
               <w:t>clause4</w:t>
             </w:r>
             <w:r>
@@ -14697,14 +14631,7 @@
                 <w:lang w:val="en-US"/>
               </w:rPr>
               <w:tab/>
-              <w:t xml:space="preserve">NOTE The planning operation describes information that could be used to </w:t>
-            </w:r>
-            <w:r>
-              <w:rPr>
-                <w:lang w:val="en-US"/>
-              </w:rPr>
-              <w:lastRenderedPageBreak/>
-              <w:t>generate workingsteps just before or during manufacturing.</w:t>
+              <w:t>NOTE The planning operation describes information that could be used to generate workingsteps just before or during manufacturing.</w:t>
             </w:r>
           </w:p>
           <w:p>
@@ -14802,6 +14729,7 @@
               <w:rPr>
                 <w:lang w:val="en-US"/>
               </w:rPr>
+              <w:lastRenderedPageBreak/>
               <w:t>clause5</w:t>
             </w:r>
             <w:r>
@@ -14886,6 +14814,153 @@
               <w:rPr>
                 <w:lang w:val="en-US"/>
               </w:rPr>
+              <w:t>clause4</w:t>
+            </w:r>
+            <w:r>
+              <w:rPr>
+                <w:lang w:val="en-US"/>
+              </w:rPr>
+              <w:tab/>
+              <w:t>If compute_downskin is false or unspecified, they may not.</w:t>
+            </w:r>
+          </w:p>
+          <w:p>
+            <w:pPr>
+              <w:pStyle w:val="ISOComments"/>
+              <w:rPr>
+                <w:lang w:val="en-US"/>
+              </w:rPr>
+            </w:pPr>
+            <w:r>
+              <w:rPr>
+                <w:lang w:val="en-US"/>
+              </w:rPr>
+              <w:t>clause4</w:t>
+            </w:r>
+            <w:r>
+              <w:rPr>
+                <w:lang w:val="en-US"/>
+              </w:rPr>
+              <w:tab/>
+              <w:t>If compute_upskin is false or unspecified, they may not.</w:t>
+            </w:r>
+          </w:p>
+          <w:p>
+            <w:pPr>
+              <w:pStyle w:val="ISOComments"/>
+              <w:rPr>
+                <w:lang w:val="en-US"/>
+              </w:rPr>
+            </w:pPr>
+            <w:r>
+              <w:rPr>
+                <w:lang w:val="en-US"/>
+              </w:rPr>
+              <w:t>clause4</w:t>
+            </w:r>
+            <w:r>
+              <w:rPr>
+                <w:lang w:val="en-US"/>
+              </w:rPr>
+              <w:tab/>
+              <w:t>If compute_spike is false or unspecified, they may not.</w:t>
+            </w:r>
+          </w:p>
+          <w:p>
+            <w:pPr>
+              <w:pStyle w:val="ISOComments"/>
+              <w:rPr>
+                <w:lang w:val="en-US"/>
+              </w:rPr>
+            </w:pPr>
+            <w:r>
+              <w:rPr>
+                <w:lang w:val="en-US"/>
+              </w:rPr>
+              <w:t>clause4</w:t>
+            </w:r>
+            <w:r>
+              <w:rPr>
+                <w:lang w:val="en-US"/>
+              </w:rPr>
+              <w:tab/>
+              <w:t>If compute_thin_wall is false or unspecified, they may not.</w:t>
+            </w:r>
+          </w:p>
+          <w:p>
+            <w:pPr>
+              <w:pStyle w:val="ISOComments"/>
+              <w:rPr>
+                <w:lang w:val="en-US"/>
+              </w:rPr>
+            </w:pPr>
+            <w:r>
+              <w:rPr>
+                <w:lang w:val="en-US"/>
+              </w:rPr>
+              <w:t>clause4</w:t>
+            </w:r>
+            <w:r>
+              <w:rPr>
+                <w:lang w:val="en-US"/>
+              </w:rPr>
+              <w:tab/>
+              <w:t>The its_support_geometry may not be specified for a particular Executable.</w:t>
+            </w:r>
+          </w:p>
+          <w:p>
+            <w:pPr>
+              <w:pStyle w:val="ISOComments"/>
+              <w:rPr>
+                <w:lang w:val="en-US"/>
+              </w:rPr>
+            </w:pPr>
+            <w:r>
+              <w:rPr>
+                <w:lang w:val="en-US"/>
+              </w:rPr>
+              <w:t>clause4</w:t>
+            </w:r>
+            <w:r>
+              <w:rPr>
+                <w:lang w:val="en-US"/>
+              </w:rPr>
+              <w:tab/>
+              <w:t>PLC measurements may not be portable between machines.</w:t>
+            </w:r>
+          </w:p>
+          <w:p>
+            <w:pPr>
+              <w:pStyle w:val="ISOComments"/>
+              <w:rPr>
+                <w:lang w:val="en-US"/>
+              </w:rPr>
+            </w:pPr>
+            <w:r>
+              <w:rPr>
+                <w:lang w:val="en-US"/>
+              </w:rPr>
+              <w:t>clause4</w:t>
+            </w:r>
+            <w:r>
+              <w:rPr>
+                <w:lang w:val="en-US"/>
+              </w:rPr>
+              <w:tab/>
+              <w:t>The clamping shall be performed at high speed if high_speed is true, and may not if high_speed is false or not specified.</w:t>
+            </w:r>
+          </w:p>
+          <w:p>
+            <w:pPr>
+              <w:pStyle w:val="ISOComments"/>
+              <w:rPr>
+                <w:lang w:val="en-US"/>
+              </w:rPr>
+            </w:pPr>
+            <w:r>
+              <w:rPr>
+                <w:lang w:val="en-US"/>
+              </w:rPr>
               <w:lastRenderedPageBreak/>
               <w:t>clause4</w:t>
             </w:r>
@@ -14894,153 +14969,6 @@
                 <w:lang w:val="en-US"/>
               </w:rPr>
               <w:tab/>
-              <w:t>If compute_downskin is false or unspecified, they may not.</w:t>
-            </w:r>
-          </w:p>
-          <w:p>
-            <w:pPr>
-              <w:pStyle w:val="ISOComments"/>
-              <w:rPr>
-                <w:lang w:val="en-US"/>
-              </w:rPr>
-            </w:pPr>
-            <w:r>
-              <w:rPr>
-                <w:lang w:val="en-US"/>
-              </w:rPr>
-              <w:t>clause4</w:t>
-            </w:r>
-            <w:r>
-              <w:rPr>
-                <w:lang w:val="en-US"/>
-              </w:rPr>
-              <w:tab/>
-              <w:t>If compute_upskin is false or unspecified, they may not.</w:t>
-            </w:r>
-          </w:p>
-          <w:p>
-            <w:pPr>
-              <w:pStyle w:val="ISOComments"/>
-              <w:rPr>
-                <w:lang w:val="en-US"/>
-              </w:rPr>
-            </w:pPr>
-            <w:r>
-              <w:rPr>
-                <w:lang w:val="en-US"/>
-              </w:rPr>
-              <w:t>clause4</w:t>
-            </w:r>
-            <w:r>
-              <w:rPr>
-                <w:lang w:val="en-US"/>
-              </w:rPr>
-              <w:tab/>
-              <w:t>If compute_spike is false or unspecified, they may not.</w:t>
-            </w:r>
-          </w:p>
-          <w:p>
-            <w:pPr>
-              <w:pStyle w:val="ISOComments"/>
-              <w:rPr>
-                <w:lang w:val="en-US"/>
-              </w:rPr>
-            </w:pPr>
-            <w:r>
-              <w:rPr>
-                <w:lang w:val="en-US"/>
-              </w:rPr>
-              <w:t>clause4</w:t>
-            </w:r>
-            <w:r>
-              <w:rPr>
-                <w:lang w:val="en-US"/>
-              </w:rPr>
-              <w:tab/>
-              <w:t>If compute_thin_wall is false or unspecified, they may not.</w:t>
-            </w:r>
-          </w:p>
-          <w:p>
-            <w:pPr>
-              <w:pStyle w:val="ISOComments"/>
-              <w:rPr>
-                <w:lang w:val="en-US"/>
-              </w:rPr>
-            </w:pPr>
-            <w:r>
-              <w:rPr>
-                <w:lang w:val="en-US"/>
-              </w:rPr>
-              <w:t>clause4</w:t>
-            </w:r>
-            <w:r>
-              <w:rPr>
-                <w:lang w:val="en-US"/>
-              </w:rPr>
-              <w:tab/>
-              <w:t>The its_support_geometry may not be specified for a particular Executable.</w:t>
-            </w:r>
-          </w:p>
-          <w:p>
-            <w:pPr>
-              <w:pStyle w:val="ISOComments"/>
-              <w:rPr>
-                <w:lang w:val="en-US"/>
-              </w:rPr>
-            </w:pPr>
-            <w:r>
-              <w:rPr>
-                <w:lang w:val="en-US"/>
-              </w:rPr>
-              <w:t>clause4</w:t>
-            </w:r>
-            <w:r>
-              <w:rPr>
-                <w:lang w:val="en-US"/>
-              </w:rPr>
-              <w:tab/>
-              <w:t>PLC measurements may not be portable between machines.</w:t>
-            </w:r>
-          </w:p>
-          <w:p>
-            <w:pPr>
-              <w:pStyle w:val="ISOComments"/>
-              <w:rPr>
-                <w:lang w:val="en-US"/>
-              </w:rPr>
-            </w:pPr>
-            <w:r>
-              <w:rPr>
-                <w:lang w:val="en-US"/>
-              </w:rPr>
-              <w:t>clause4</w:t>
-            </w:r>
-            <w:r>
-              <w:rPr>
-                <w:lang w:val="en-US"/>
-              </w:rPr>
-              <w:tab/>
-              <w:t>The clamping shall be performed at high speed if high_speed is true, and may not if high_speed is false or not specified.</w:t>
-            </w:r>
-          </w:p>
-          <w:p>
-            <w:pPr>
-              <w:pStyle w:val="ISOComments"/>
-              <w:rPr>
-                <w:lang w:val="en-US"/>
-              </w:rPr>
-            </w:pPr>
-            <w:r>
-              <w:rPr>
-                <w:lang w:val="en-US"/>
-              </w:rPr>
-              <w:t>clause4</w:t>
-            </w:r>
-            <w:r>
-              <w:rPr>
-                <w:lang w:val="en-US"/>
-              </w:rPr>
-              <w:tab/>
               <w:t>The its_toolref_direction may not be specified for a particular Cutter_contact_trajectory.</w:t>
             </w:r>
           </w:p>
@@ -15118,6 +15046,132 @@
               <w:rPr>
                 <w:lang w:val="en-US"/>
               </w:rPr>
+              <w:t>clause4</w:t>
+            </w:r>
+            <w:r>
+              <w:rPr>
+                <w:lang w:val="en-US"/>
+              </w:rPr>
+              <w:tab/>
+              <w:t>The path_maximum_deviation may not be specified for a particular Cutter_location_trajectory.</w:t>
+            </w:r>
+          </w:p>
+          <w:p>
+            <w:pPr>
+              <w:pStyle w:val="ISOComments"/>
+              <w:rPr>
+                <w:lang w:val="en-US"/>
+              </w:rPr>
+            </w:pPr>
+            <w:r>
+              <w:rPr>
+                <w:lang w:val="en-US"/>
+              </w:rPr>
+              <w:t>clause4</w:t>
+            </w:r>
+            <w:r>
+              <w:rPr>
+                <w:lang w:val="en-US"/>
+              </w:rPr>
+              <w:tab/>
+              <w:t>The tool_axis_maximum_deviation may not be specified for a particular Cutter_location_trajectory.</w:t>
+            </w:r>
+          </w:p>
+          <w:p>
+            <w:pPr>
+              <w:pStyle w:val="ISOComments"/>
+              <w:rPr>
+                <w:lang w:val="en-US"/>
+              </w:rPr>
+            </w:pPr>
+            <w:r>
+              <w:rPr>
+                <w:lang w:val="en-US"/>
+              </w:rPr>
+              <w:t>clause4</w:t>
+            </w:r>
+            <w:r>
+              <w:rPr>
+                <w:lang w:val="en-US"/>
+              </w:rPr>
+              <w:tab/>
+              <w:t>The as_is may not be specified for a particular Executable.</w:t>
+            </w:r>
+          </w:p>
+          <w:p>
+            <w:pPr>
+              <w:pStyle w:val="ISOComments"/>
+              <w:rPr>
+                <w:lang w:val="en-US"/>
+              </w:rPr>
+            </w:pPr>
+            <w:r>
+              <w:rPr>
+                <w:lang w:val="en-US"/>
+              </w:rPr>
+              <w:t>clause4</w:t>
+            </w:r>
+            <w:r>
+              <w:rPr>
+                <w:lang w:val="en-US"/>
+              </w:rPr>
+              <w:tab/>
+              <w:t>The enabled may not be specified for a particular Executable.</w:t>
+            </w:r>
+          </w:p>
+          <w:p>
+            <w:pPr>
+              <w:pStyle w:val="ISOComments"/>
+              <w:rPr>
+                <w:lang w:val="en-US"/>
+              </w:rPr>
+            </w:pPr>
+            <w:r>
+              <w:rPr>
+                <w:lang w:val="en-US"/>
+              </w:rPr>
+              <w:t>clause4</w:t>
+            </w:r>
+            <w:r>
+              <w:rPr>
+                <w:lang w:val="en-US"/>
+              </w:rPr>
+              <w:tab/>
+              <w:t>The machine_used may not be specified for a particular Executable.</w:t>
+            </w:r>
+          </w:p>
+          <w:p>
+            <w:pPr>
+              <w:pStyle w:val="ISOComments"/>
+              <w:rPr>
+                <w:lang w:val="en-US"/>
+              </w:rPr>
+            </w:pPr>
+            <w:r>
+              <w:rPr>
+                <w:lang w:val="en-US"/>
+              </w:rPr>
+              <w:t>clause4</w:t>
+            </w:r>
+            <w:r>
+              <w:rPr>
+                <w:lang w:val="en-US"/>
+              </w:rPr>
+              <w:tab/>
+              <w:t>The process_properties describe characteristics of an Executable that may not be conveyed using other capabilities of this document.</w:t>
+            </w:r>
+          </w:p>
+          <w:p>
+            <w:pPr>
+              <w:pStyle w:val="ISOComments"/>
+              <w:rPr>
+                <w:lang w:val="en-US"/>
+              </w:rPr>
+            </w:pPr>
+            <w:r>
+              <w:rPr>
+                <w:lang w:val="en-US"/>
+              </w:rPr>
               <w:lastRenderedPageBreak/>
               <w:t>clause4</w:t>
             </w:r>
@@ -15126,132 +15180,6 @@
                 <w:lang w:val="en-US"/>
               </w:rPr>
               <w:tab/>
-              <w:t>The path_maximum_deviation may not be specified for a particular Cutter_location_trajectory.</w:t>
-            </w:r>
-          </w:p>
-          <w:p>
-            <w:pPr>
-              <w:pStyle w:val="ISOComments"/>
-              <w:rPr>
-                <w:lang w:val="en-US"/>
-              </w:rPr>
-            </w:pPr>
-            <w:r>
-              <w:rPr>
-                <w:lang w:val="en-US"/>
-              </w:rPr>
-              <w:t>clause4</w:t>
-            </w:r>
-            <w:r>
-              <w:rPr>
-                <w:lang w:val="en-US"/>
-              </w:rPr>
-              <w:tab/>
-              <w:t>The tool_axis_maximum_deviation may not be specified for a particular Cutter_location_trajectory.</w:t>
-            </w:r>
-          </w:p>
-          <w:p>
-            <w:pPr>
-              <w:pStyle w:val="ISOComments"/>
-              <w:rPr>
-                <w:lang w:val="en-US"/>
-              </w:rPr>
-            </w:pPr>
-            <w:r>
-              <w:rPr>
-                <w:lang w:val="en-US"/>
-              </w:rPr>
-              <w:t>clause4</w:t>
-            </w:r>
-            <w:r>
-              <w:rPr>
-                <w:lang w:val="en-US"/>
-              </w:rPr>
-              <w:tab/>
-              <w:t>The as_is may not be specified for a particular Executable.</w:t>
-            </w:r>
-          </w:p>
-          <w:p>
-            <w:pPr>
-              <w:pStyle w:val="ISOComments"/>
-              <w:rPr>
-                <w:lang w:val="en-US"/>
-              </w:rPr>
-            </w:pPr>
-            <w:r>
-              <w:rPr>
-                <w:lang w:val="en-US"/>
-              </w:rPr>
-              <w:t>clause4</w:t>
-            </w:r>
-            <w:r>
-              <w:rPr>
-                <w:lang w:val="en-US"/>
-              </w:rPr>
-              <w:tab/>
-              <w:t>The enabled may not be specified for a particular Executable.</w:t>
-            </w:r>
-          </w:p>
-          <w:p>
-            <w:pPr>
-              <w:pStyle w:val="ISOComments"/>
-              <w:rPr>
-                <w:lang w:val="en-US"/>
-              </w:rPr>
-            </w:pPr>
-            <w:r>
-              <w:rPr>
-                <w:lang w:val="en-US"/>
-              </w:rPr>
-              <w:t>clause4</w:t>
-            </w:r>
-            <w:r>
-              <w:rPr>
-                <w:lang w:val="en-US"/>
-              </w:rPr>
-              <w:tab/>
-              <w:t>The machine_used may not be specified for a particular Executable.</w:t>
-            </w:r>
-          </w:p>
-          <w:p>
-            <w:pPr>
-              <w:pStyle w:val="ISOComments"/>
-              <w:rPr>
-                <w:lang w:val="en-US"/>
-              </w:rPr>
-            </w:pPr>
-            <w:r>
-              <w:rPr>
-                <w:lang w:val="en-US"/>
-              </w:rPr>
-              <w:t>clause4</w:t>
-            </w:r>
-            <w:r>
-              <w:rPr>
-                <w:lang w:val="en-US"/>
-              </w:rPr>
-              <w:tab/>
-              <w:t>The process_properties describe characteristics of an Executable that may not be conveyed using other capabilities of this document.</w:t>
-            </w:r>
-          </w:p>
-          <w:p>
-            <w:pPr>
-              <w:pStyle w:val="ISOComments"/>
-              <w:rPr>
-                <w:lang w:val="en-US"/>
-              </w:rPr>
-            </w:pPr>
-            <w:r>
-              <w:rPr>
-                <w:lang w:val="en-US"/>
-              </w:rPr>
-              <w:t>clause4</w:t>
-            </w:r>
-            <w:r>
-              <w:rPr>
-                <w:lang w:val="en-US"/>
-              </w:rPr>
-              <w:tab/>
               <w:t>The removal may not be specified for a particular Executable.</w:t>
             </w:r>
           </w:p>
@@ -15350,6 +15278,153 @@
               <w:rPr>
                 <w:lang w:val="en-US"/>
               </w:rPr>
+              <w:t>clause4</w:t>
+            </w:r>
+            <w:r>
+              <w:rPr>
+                <w:lang w:val="en-US"/>
+              </w:rPr>
+              <w:tab/>
+              <w:t>The twin_source may not be specified for a particular Executable.</w:t>
+            </w:r>
+          </w:p>
+          <w:p>
+            <w:pPr>
+              <w:pStyle w:val="ISOComments"/>
+              <w:rPr>
+                <w:lang w:val="en-US"/>
+              </w:rPr>
+            </w:pPr>
+            <w:r>
+              <w:rPr>
+                <w:lang w:val="en-US"/>
+              </w:rPr>
+              <w:t>clause4</w:t>
+            </w:r>
+            <w:r>
+              <w:rPr>
+                <w:lang w:val="en-US"/>
+              </w:rPr>
+              <w:tab/>
+              <w:t>The twin_start may not be specified for a particular Executable.</w:t>
+            </w:r>
+          </w:p>
+          <w:p>
+            <w:pPr>
+              <w:pStyle w:val="ISOComments"/>
+              <w:rPr>
+                <w:lang w:val="en-US"/>
+              </w:rPr>
+            </w:pPr>
+            <w:r>
+              <w:rPr>
+                <w:lang w:val="en-US"/>
+              </w:rPr>
+              <w:t>clause4</w:t>
+            </w:r>
+            <w:r>
+              <w:rPr>
+                <w:lang w:val="en-US"/>
+              </w:rPr>
+              <w:tab/>
+              <w:t>The twin_worktime may not be specified for a particular Executable.</w:t>
+            </w:r>
+          </w:p>
+          <w:p>
+            <w:pPr>
+              <w:pStyle w:val="ISOComments"/>
+              <w:rPr>
+                <w:lang w:val="en-US"/>
+              </w:rPr>
+            </w:pPr>
+            <w:r>
+              <w:rPr>
+                <w:lang w:val="en-US"/>
+              </w:rPr>
+              <w:t>clause4</w:t>
+            </w:r>
+            <w:r>
+              <w:rPr>
+                <w:lang w:val="en-US"/>
+              </w:rPr>
+              <w:tab/>
+              <w:t>The its_machine_functions may not be specified for a particular Extended_operation.</w:t>
+            </w:r>
+          </w:p>
+          <w:p>
+            <w:pPr>
+              <w:pStyle w:val="ISOComments"/>
+              <w:rPr>
+                <w:lang w:val="en-US"/>
+              </w:rPr>
+            </w:pPr>
+            <w:r>
+              <w:rPr>
+                <w:lang w:val="en-US"/>
+              </w:rPr>
+              <w:t>clause4</w:t>
+            </w:r>
+            <w:r>
+              <w:rPr>
+                <w:lang w:val="en-US"/>
+              </w:rPr>
+              <w:tab/>
+              <w:t>The its_technology may not be specified for a particular Extended_operation.</w:t>
+            </w:r>
+          </w:p>
+          <w:p>
+            <w:pPr>
+              <w:pStyle w:val="ISOComments"/>
+              <w:rPr>
+                <w:lang w:val="en-US"/>
+              </w:rPr>
+            </w:pPr>
+            <w:r>
+              <w:rPr>
+                <w:lang w:val="en-US"/>
+              </w:rPr>
+              <w:t>clause4</w:t>
+            </w:r>
+            <w:r>
+              <w:rPr>
+                <w:lang w:val="en-US"/>
+              </w:rPr>
+              <w:tab/>
+              <w:t>The its_tool may not be specified for a particular Extended_operation.</w:t>
+            </w:r>
+          </w:p>
+          <w:p>
+            <w:pPr>
+              <w:pStyle w:val="ISOComments"/>
+              <w:rPr>
+                <w:lang w:val="en-US"/>
+              </w:rPr>
+            </w:pPr>
+            <w:r>
+              <w:rPr>
+                <w:lang w:val="en-US"/>
+              </w:rPr>
+              <w:t>clause4</w:t>
+            </w:r>
+            <w:r>
+              <w:rPr>
+                <w:lang w:val="en-US"/>
+              </w:rPr>
+              <w:tab/>
+              <w:t>The expected_value may not be specified for a particular Feature_complete_probing.</w:t>
+            </w:r>
+          </w:p>
+          <w:p>
+            <w:pPr>
+              <w:pStyle w:val="ISOComments"/>
+              <w:rPr>
+                <w:lang w:val="en-US"/>
+              </w:rPr>
+            </w:pPr>
+            <w:r>
+              <w:rPr>
+                <w:lang w:val="en-US"/>
+              </w:rPr>
               <w:lastRenderedPageBreak/>
               <w:t>clause4</w:t>
             </w:r>
@@ -15358,153 +15433,6 @@
                 <w:lang w:val="en-US"/>
               </w:rPr>
               <w:tab/>
-              <w:t>The twin_source may not be specified for a particular Executable.</w:t>
-            </w:r>
-          </w:p>
-          <w:p>
-            <w:pPr>
-              <w:pStyle w:val="ISOComments"/>
-              <w:rPr>
-                <w:lang w:val="en-US"/>
-              </w:rPr>
-            </w:pPr>
-            <w:r>
-              <w:rPr>
-                <w:lang w:val="en-US"/>
-              </w:rPr>
-              <w:t>clause4</w:t>
-            </w:r>
-            <w:r>
-              <w:rPr>
-                <w:lang w:val="en-US"/>
-              </w:rPr>
-              <w:tab/>
-              <w:t>The twin_start may not be specified for a particular Executable.</w:t>
-            </w:r>
-          </w:p>
-          <w:p>
-            <w:pPr>
-              <w:pStyle w:val="ISOComments"/>
-              <w:rPr>
-                <w:lang w:val="en-US"/>
-              </w:rPr>
-            </w:pPr>
-            <w:r>
-              <w:rPr>
-                <w:lang w:val="en-US"/>
-              </w:rPr>
-              <w:t>clause4</w:t>
-            </w:r>
-            <w:r>
-              <w:rPr>
-                <w:lang w:val="en-US"/>
-              </w:rPr>
-              <w:tab/>
-              <w:t>The twin_worktime may not be specified for a particular Executable.</w:t>
-            </w:r>
-          </w:p>
-          <w:p>
-            <w:pPr>
-              <w:pStyle w:val="ISOComments"/>
-              <w:rPr>
-                <w:lang w:val="en-US"/>
-              </w:rPr>
-            </w:pPr>
-            <w:r>
-              <w:rPr>
-                <w:lang w:val="en-US"/>
-              </w:rPr>
-              <w:t>clause4</w:t>
-            </w:r>
-            <w:r>
-              <w:rPr>
-                <w:lang w:val="en-US"/>
-              </w:rPr>
-              <w:tab/>
-              <w:t>The its_machine_functions may not be specified for a particular Extended_operation.</w:t>
-            </w:r>
-          </w:p>
-          <w:p>
-            <w:pPr>
-              <w:pStyle w:val="ISOComments"/>
-              <w:rPr>
-                <w:lang w:val="en-US"/>
-              </w:rPr>
-            </w:pPr>
-            <w:r>
-              <w:rPr>
-                <w:lang w:val="en-US"/>
-              </w:rPr>
-              <w:t>clause4</w:t>
-            </w:r>
-            <w:r>
-              <w:rPr>
-                <w:lang w:val="en-US"/>
-              </w:rPr>
-              <w:tab/>
-              <w:t>The its_technology may not be specified for a particular Extended_operation.</w:t>
-            </w:r>
-          </w:p>
-          <w:p>
-            <w:pPr>
-              <w:pStyle w:val="ISOComments"/>
-              <w:rPr>
-                <w:lang w:val="en-US"/>
-              </w:rPr>
-            </w:pPr>
-            <w:r>
-              <w:rPr>
-                <w:lang w:val="en-US"/>
-              </w:rPr>
-              <w:t>clause4</w:t>
-            </w:r>
-            <w:r>
-              <w:rPr>
-                <w:lang w:val="en-US"/>
-              </w:rPr>
-              <w:tab/>
-              <w:t>The its_tool may not be specified for a particular Extended_operation.</w:t>
-            </w:r>
-          </w:p>
-          <w:p>
-            <w:pPr>
-              <w:pStyle w:val="ISOComments"/>
-              <w:rPr>
-                <w:lang w:val="en-US"/>
-              </w:rPr>
-            </w:pPr>
-            <w:r>
-              <w:rPr>
-                <w:lang w:val="en-US"/>
-              </w:rPr>
-              <w:t>clause4</w:t>
-            </w:r>
-            <w:r>
-              <w:rPr>
-                <w:lang w:val="en-US"/>
-              </w:rPr>
-              <w:tab/>
-              <w:t>The expected_value may not be specified for a particular Feature_complete_probing.</w:t>
-            </w:r>
-          </w:p>
-          <w:p>
-            <w:pPr>
-              <w:pStyle w:val="ISOComments"/>
-              <w:rPr>
-                <w:lang w:val="en-US"/>
-              </w:rPr>
-            </w:pPr>
-            <w:r>
-              <w:rPr>
-                <w:lang w:val="en-US"/>
-              </w:rPr>
-              <w:t>clause4</w:t>
-            </w:r>
-            <w:r>
-              <w:rPr>
-                <w:lang w:val="en-US"/>
-              </w:rPr>
-              <w:tab/>
               <w:t>The description may not be specified for a particular Fixture_usage.</w:t>
             </w:r>
           </w:p>
@@ -15589,14 +15517,7 @@
                 <w:lang w:val="en-US"/>
               </w:rPr>
               <w:tab/>
-              <w:t xml:space="preserve">The axis_travel may not be specified for a particular Machine_parameters and the axis_travel shall not be specified if </w:t>
-            </w:r>
-            <w:r>
-              <w:rPr>
-                <w:lang w:val="en-US"/>
-              </w:rPr>
-              <w:lastRenderedPageBreak/>
-              <w:t>work_volume_length, work_volume_width, or work_volume_height is specified.</w:t>
+              <w:t>The axis_travel may not be specified for a particular Machine_parameters and the axis_travel shall not be specified if work_volume_length, work_volume_width, or work_volume_height is specified.</w:t>
             </w:r>
           </w:p>
           <w:p>
@@ -15736,6 +15657,7 @@
               <w:rPr>
                 <w:lang w:val="en-US"/>
               </w:rPr>
+              <w:lastRenderedPageBreak/>
               <w:t>clause4</w:t>
             </w:r>
             <w:r>
@@ -15841,6 +15763,132 @@
               <w:rPr>
                 <w:lang w:val="en-US"/>
               </w:rPr>
+              <w:t>clause4</w:t>
+            </w:r>
+            <w:r>
+              <w:rPr>
+                <w:lang w:val="en-US"/>
+              </w:rPr>
+              <w:tab/>
+              <w:t>The work_volume_length may not be specified for a particular Machine_parameters and the work_volume_length shall not be specified if axis_travel is specified.</w:t>
+            </w:r>
+          </w:p>
+          <w:p>
+            <w:pPr>
+              <w:pStyle w:val="ISOComments"/>
+              <w:rPr>
+                <w:lang w:val="en-US"/>
+              </w:rPr>
+            </w:pPr>
+            <w:r>
+              <w:rPr>
+                <w:lang w:val="en-US"/>
+              </w:rPr>
+              <w:t>clause4</w:t>
+            </w:r>
+            <w:r>
+              <w:rPr>
+                <w:lang w:val="en-US"/>
+              </w:rPr>
+              <w:tab/>
+              <w:t>The work_volume_width may not be specified for a particular Machine_parameters and the work_volume_width shall not be specified if axis_travel is specified.</w:t>
+            </w:r>
+          </w:p>
+          <w:p>
+            <w:pPr>
+              <w:pStyle w:val="ISOComments"/>
+              <w:rPr>
+                <w:lang w:val="en-US"/>
+              </w:rPr>
+            </w:pPr>
+            <w:r>
+              <w:rPr>
+                <w:lang w:val="en-US"/>
+              </w:rPr>
+              <w:t>clause4</w:t>
+            </w:r>
+            <w:r>
+              <w:rPr>
+                <w:lang w:val="en-US"/>
+              </w:rPr>
+              <w:tab/>
+              <w:t>The description may not be specified for a particular Machine_usage.</w:t>
+            </w:r>
+          </w:p>
+          <w:p>
+            <w:pPr>
+              <w:pStyle w:val="ISOComments"/>
+              <w:rPr>
+                <w:lang w:val="en-US"/>
+              </w:rPr>
+            </w:pPr>
+            <w:r>
+              <w:rPr>
+                <w:lang w:val="en-US"/>
+              </w:rPr>
+              <w:t>clause4</w:t>
+            </w:r>
+            <w:r>
+              <w:rPr>
+                <w:lang w:val="en-US"/>
+              </w:rPr>
+              <w:tab/>
+              <w:t>The its_product may not be specified for a particular Machine_usage.</w:t>
+            </w:r>
+          </w:p>
+          <w:p>
+            <w:pPr>
+              <w:pStyle w:val="ISOComments"/>
+              <w:rPr>
+                <w:lang w:val="en-US"/>
+              </w:rPr>
+            </w:pPr>
+            <w:r>
+              <w:rPr>
+                <w:lang w:val="en-US"/>
+              </w:rPr>
+              <w:t>clause4</w:t>
+            </w:r>
+            <w:r>
+              <w:rPr>
+                <w:lang w:val="en-US"/>
+              </w:rPr>
+              <w:tab/>
+              <w:t>The configuration may not be specified for a particular Machine_with_kinematics.</w:t>
+            </w:r>
+          </w:p>
+          <w:p>
+            <w:pPr>
+              <w:pStyle w:val="ISOComments"/>
+              <w:rPr>
+                <w:lang w:val="en-US"/>
+              </w:rPr>
+            </w:pPr>
+            <w:r>
+              <w:rPr>
+                <w:lang w:val="en-US"/>
+              </w:rPr>
+              <w:t>clause4</w:t>
+            </w:r>
+            <w:r>
+              <w:rPr>
+                <w:lang w:val="en-US"/>
+              </w:rPr>
+              <w:tab/>
+              <w:t>The its_usage may not be specified for a particular Machining_tool.</w:t>
+            </w:r>
+          </w:p>
+          <w:p>
+            <w:pPr>
+              <w:pStyle w:val="ISOComments"/>
+              <w:rPr>
+                <w:lang w:val="en-US"/>
+              </w:rPr>
+            </w:pPr>
+            <w:r>
+              <w:rPr>
+                <w:lang w:val="en-US"/>
+              </w:rPr>
               <w:lastRenderedPageBreak/>
               <w:t>clause4</w:t>
             </w:r>
@@ -15849,132 +15897,6 @@
                 <w:lang w:val="en-US"/>
               </w:rPr>
               <w:tab/>
-              <w:t>The work_volume_length may not be specified for a particular Machine_parameters and the work_volume_length shall not be specified if axis_travel is specified.</w:t>
-            </w:r>
-          </w:p>
-          <w:p>
-            <w:pPr>
-              <w:pStyle w:val="ISOComments"/>
-              <w:rPr>
-                <w:lang w:val="en-US"/>
-              </w:rPr>
-            </w:pPr>
-            <w:r>
-              <w:rPr>
-                <w:lang w:val="en-US"/>
-              </w:rPr>
-              <w:t>clause4</w:t>
-            </w:r>
-            <w:r>
-              <w:rPr>
-                <w:lang w:val="en-US"/>
-              </w:rPr>
-              <w:tab/>
-              <w:t>The work_volume_width may not be specified for a particular Machine_parameters and the work_volume_width shall not be specified if axis_travel is specified.</w:t>
-            </w:r>
-          </w:p>
-          <w:p>
-            <w:pPr>
-              <w:pStyle w:val="ISOComments"/>
-              <w:rPr>
-                <w:lang w:val="en-US"/>
-              </w:rPr>
-            </w:pPr>
-            <w:r>
-              <w:rPr>
-                <w:lang w:val="en-US"/>
-              </w:rPr>
-              <w:t>clause4</w:t>
-            </w:r>
-            <w:r>
-              <w:rPr>
-                <w:lang w:val="en-US"/>
-              </w:rPr>
-              <w:tab/>
-              <w:t>The description may not be specified for a particular Machine_usage.</w:t>
-            </w:r>
-          </w:p>
-          <w:p>
-            <w:pPr>
-              <w:pStyle w:val="ISOComments"/>
-              <w:rPr>
-                <w:lang w:val="en-US"/>
-              </w:rPr>
-            </w:pPr>
-            <w:r>
-              <w:rPr>
-                <w:lang w:val="en-US"/>
-              </w:rPr>
-              <w:t>clause4</w:t>
-            </w:r>
-            <w:r>
-              <w:rPr>
-                <w:lang w:val="en-US"/>
-              </w:rPr>
-              <w:tab/>
-              <w:t>The its_product may not be specified for a particular Machine_usage.</w:t>
-            </w:r>
-          </w:p>
-          <w:p>
-            <w:pPr>
-              <w:pStyle w:val="ISOComments"/>
-              <w:rPr>
-                <w:lang w:val="en-US"/>
-              </w:rPr>
-            </w:pPr>
-            <w:r>
-              <w:rPr>
-                <w:lang w:val="en-US"/>
-              </w:rPr>
-              <w:t>clause4</w:t>
-            </w:r>
-            <w:r>
-              <w:rPr>
-                <w:lang w:val="en-US"/>
-              </w:rPr>
-              <w:tab/>
-              <w:t>The configuration may not be specified for a particular Machine_with_kinematics.</w:t>
-            </w:r>
-          </w:p>
-          <w:p>
-            <w:pPr>
-              <w:pStyle w:val="ISOComments"/>
-              <w:rPr>
-                <w:lang w:val="en-US"/>
-              </w:rPr>
-            </w:pPr>
-            <w:r>
-              <w:rPr>
-                <w:lang w:val="en-US"/>
-              </w:rPr>
-              <w:t>clause4</w:t>
-            </w:r>
-            <w:r>
-              <w:rPr>
-                <w:lang w:val="en-US"/>
-              </w:rPr>
-              <w:tab/>
-              <w:t>The its_usage may not be specified for a particular Machining_tool.</w:t>
-            </w:r>
-          </w:p>
-          <w:p>
-            <w:pPr>
-              <w:pStyle w:val="ISOComments"/>
-              <w:rPr>
-                <w:lang w:val="en-US"/>
-              </w:rPr>
-            </w:pPr>
-            <w:r>
-              <w:rPr>
-                <w:lang w:val="en-US"/>
-              </w:rPr>
-              <w:t>clause4</w:t>
-            </w:r>
-            <w:r>
-              <w:rPr>
-                <w:lang w:val="en-US"/>
-              </w:rPr>
-              <w:tab/>
               <w:t>If primary is false or not specified, a referencing Drill_and_fill_group may not be preferred.</w:t>
             </w:r>
           </w:p>
@@ -16073,6 +15995,153 @@
               <w:rPr>
                 <w:lang w:val="en-US"/>
               </w:rPr>
+              <w:t>clause4</w:t>
+            </w:r>
+            <w:r>
+              <w:rPr>
+                <w:lang w:val="en-US"/>
+              </w:rPr>
+              <w:tab/>
+              <w:t>The its_carousel may not be specified for a particular Tool_usage.</w:t>
+            </w:r>
+          </w:p>
+          <w:p>
+            <w:pPr>
+              <w:pStyle w:val="ISOComments"/>
+              <w:rPr>
+                <w:lang w:val="en-US"/>
+              </w:rPr>
+            </w:pPr>
+            <w:r>
+              <w:rPr>
+                <w:lang w:val="en-US"/>
+              </w:rPr>
+              <w:t>clause4</w:t>
+            </w:r>
+            <w:r>
+              <w:rPr>
+                <w:lang w:val="en-US"/>
+              </w:rPr>
+              <w:tab/>
+              <w:t>The its_library_reference may not be specified for a particular Tool_usage.</w:t>
+            </w:r>
+          </w:p>
+          <w:p>
+            <w:pPr>
+              <w:pStyle w:val="ISOComments"/>
+              <w:rPr>
+                <w:lang w:val="en-US"/>
+              </w:rPr>
+            </w:pPr>
+            <w:r>
+              <w:rPr>
+                <w:lang w:val="en-US"/>
+              </w:rPr>
+              <w:t>clause4</w:t>
+            </w:r>
+            <w:r>
+              <w:rPr>
+                <w:lang w:val="en-US"/>
+              </w:rPr>
+              <w:tab/>
+              <w:t>The its_position may not be specified for a particular Tool_usage.</w:t>
+            </w:r>
+          </w:p>
+          <w:p>
+            <w:pPr>
+              <w:pStyle w:val="ISOComments"/>
+              <w:rPr>
+                <w:lang w:val="en-US"/>
+              </w:rPr>
+            </w:pPr>
+            <w:r>
+              <w:rPr>
+                <w:lang w:val="en-US"/>
+              </w:rPr>
+              <w:t>clause4</w:t>
+            </w:r>
+            <w:r>
+              <w:rPr>
+                <w:lang w:val="en-US"/>
+              </w:rPr>
+              <w:tab/>
+              <w:t>The its_product may not be specified for a particular Tool_usage.</w:t>
+            </w:r>
+          </w:p>
+          <w:p>
+            <w:pPr>
+              <w:pStyle w:val="ISOComments"/>
+              <w:rPr>
+                <w:lang w:val="en-US"/>
+              </w:rPr>
+            </w:pPr>
+            <w:r>
+              <w:rPr>
+                <w:lang w:val="en-US"/>
+              </w:rPr>
+              <w:t>clause4</w:t>
+            </w:r>
+            <w:r>
+              <w:rPr>
+                <w:lang w:val="en-US"/>
+              </w:rPr>
+              <w:tab/>
+              <w:t>The tool_end_placement may not be specified for a particular Tool_usage.</w:t>
+            </w:r>
+          </w:p>
+          <w:p>
+            <w:pPr>
+              <w:pStyle w:val="ISOComments"/>
+              <w:rPr>
+                <w:lang w:val="en-US"/>
+              </w:rPr>
+            </w:pPr>
+            <w:r>
+              <w:rPr>
+                <w:lang w:val="en-US"/>
+              </w:rPr>
+              <w:t>clause4</w:t>
+            </w:r>
+            <w:r>
+              <w:rPr>
+                <w:lang w:val="en-US"/>
+              </w:rPr>
+              <w:tab/>
+              <w:t>The its_id may not be specified for a particular Toolpath.</w:t>
+            </w:r>
+          </w:p>
+          <w:p>
+            <w:pPr>
+              <w:pStyle w:val="ISOComments"/>
+              <w:rPr>
+                <w:lang w:val="en-US"/>
+              </w:rPr>
+            </w:pPr>
+            <w:r>
+              <w:rPr>
+                <w:lang w:val="en-US"/>
+              </w:rPr>
+              <w:t>clause4</w:t>
+            </w:r>
+            <w:r>
+              <w:rPr>
+                <w:lang w:val="en-US"/>
+              </w:rPr>
+              <w:tab/>
+              <w:t>The ball_radius may not be specified for a particular Touch_probe.</w:t>
+            </w:r>
+          </w:p>
+          <w:p>
+            <w:pPr>
+              <w:pStyle w:val="ISOComments"/>
+              <w:rPr>
+                <w:lang w:val="en-US"/>
+              </w:rPr>
+            </w:pPr>
+            <w:r>
+              <w:rPr>
+                <w:lang w:val="en-US"/>
+              </w:rPr>
               <w:lastRenderedPageBreak/>
               <w:t>clause4</w:t>
             </w:r>
@@ -16081,153 +16150,6 @@
                 <w:lang w:val="en-US"/>
               </w:rPr>
               <w:tab/>
-              <w:t>The its_carousel may not be specified for a particular Tool_usage.</w:t>
-            </w:r>
-          </w:p>
-          <w:p>
-            <w:pPr>
-              <w:pStyle w:val="ISOComments"/>
-              <w:rPr>
-                <w:lang w:val="en-US"/>
-              </w:rPr>
-            </w:pPr>
-            <w:r>
-              <w:rPr>
-                <w:lang w:val="en-US"/>
-              </w:rPr>
-              <w:t>clause4</w:t>
-            </w:r>
-            <w:r>
-              <w:rPr>
-                <w:lang w:val="en-US"/>
-              </w:rPr>
-              <w:tab/>
-              <w:t>The its_library_reference may not be specified for a particular Tool_usage.</w:t>
-            </w:r>
-          </w:p>
-          <w:p>
-            <w:pPr>
-              <w:pStyle w:val="ISOComments"/>
-              <w:rPr>
-                <w:lang w:val="en-US"/>
-              </w:rPr>
-            </w:pPr>
-            <w:r>
-              <w:rPr>
-                <w:lang w:val="en-US"/>
-              </w:rPr>
-              <w:t>clause4</w:t>
-            </w:r>
-            <w:r>
-              <w:rPr>
-                <w:lang w:val="en-US"/>
-              </w:rPr>
-              <w:tab/>
-              <w:t>The its_position may not be specified for a particular Tool_usage.</w:t>
-            </w:r>
-          </w:p>
-          <w:p>
-            <w:pPr>
-              <w:pStyle w:val="ISOComments"/>
-              <w:rPr>
-                <w:lang w:val="en-US"/>
-              </w:rPr>
-            </w:pPr>
-            <w:r>
-              <w:rPr>
-                <w:lang w:val="en-US"/>
-              </w:rPr>
-              <w:t>clause4</w:t>
-            </w:r>
-            <w:r>
-              <w:rPr>
-                <w:lang w:val="en-US"/>
-              </w:rPr>
-              <w:tab/>
-              <w:t>The its_product may not be specified for a particular Tool_usage.</w:t>
-            </w:r>
-          </w:p>
-          <w:p>
-            <w:pPr>
-              <w:pStyle w:val="ISOComments"/>
-              <w:rPr>
-                <w:lang w:val="en-US"/>
-              </w:rPr>
-            </w:pPr>
-            <w:r>
-              <w:rPr>
-                <w:lang w:val="en-US"/>
-              </w:rPr>
-              <w:t>clause4</w:t>
-            </w:r>
-            <w:r>
-              <w:rPr>
-                <w:lang w:val="en-US"/>
-              </w:rPr>
-              <w:tab/>
-              <w:t>The tool_end_placement may not be specified for a particular Tool_usage.</w:t>
-            </w:r>
-          </w:p>
-          <w:p>
-            <w:pPr>
-              <w:pStyle w:val="ISOComments"/>
-              <w:rPr>
-                <w:lang w:val="en-US"/>
-              </w:rPr>
-            </w:pPr>
-            <w:r>
-              <w:rPr>
-                <w:lang w:val="en-US"/>
-              </w:rPr>
-              <w:t>clause4</w:t>
-            </w:r>
-            <w:r>
-              <w:rPr>
-                <w:lang w:val="en-US"/>
-              </w:rPr>
-              <w:tab/>
-              <w:t>The its_id may not be specified for a particular Toolpath.</w:t>
-            </w:r>
-          </w:p>
-          <w:p>
-            <w:pPr>
-              <w:pStyle w:val="ISOComments"/>
-              <w:rPr>
-                <w:lang w:val="en-US"/>
-              </w:rPr>
-            </w:pPr>
-            <w:r>
-              <w:rPr>
-                <w:lang w:val="en-US"/>
-              </w:rPr>
-              <w:t>clause4</w:t>
-            </w:r>
-            <w:r>
-              <w:rPr>
-                <w:lang w:val="en-US"/>
-              </w:rPr>
-              <w:tab/>
-              <w:t>The ball_radius may not be specified for a particular Touch_probe.</w:t>
-            </w:r>
-          </w:p>
-          <w:p>
-            <w:pPr>
-              <w:pStyle w:val="ISOComments"/>
-              <w:rPr>
-                <w:lang w:val="en-US"/>
-              </w:rPr>
-            </w:pPr>
-            <w:r>
-              <w:rPr>
-                <w:lang w:val="en-US"/>
-              </w:rPr>
-              <w:t>clause4</w:t>
-            </w:r>
-            <w:r>
-              <w:rPr>
-                <w:lang w:val="en-US"/>
-              </w:rPr>
-              <w:tab/>
               <w:t>The stylus_diameter may not be specified for a particular Touch_probe.</w:t>
             </w:r>
           </w:p>
@@ -16326,6 +16248,153 @@
               <w:rPr>
                 <w:lang w:val="en-US"/>
               </w:rPr>
+              <w:t>clause4</w:t>
+            </w:r>
+            <w:r>
+              <w:rPr>
+                <w:lang w:val="en-US"/>
+              </w:rPr>
+              <w:tab/>
+              <w:t>The toolpath_orientation may not be specified for a particular Workingstep.</w:t>
+            </w:r>
+          </w:p>
+          <w:p>
+            <w:pPr>
+              <w:pStyle w:val="ISOComments"/>
+              <w:rPr>
+                <w:lang w:val="en-US"/>
+              </w:rPr>
+            </w:pPr>
+            <w:r>
+              <w:rPr>
+                <w:lang w:val="en-US"/>
+              </w:rPr>
+              <w:t>clause4</w:t>
+            </w:r>
+            <w:r>
+              <w:rPr>
+                <w:lang w:val="en-US"/>
+              </w:rPr>
+              <w:tab/>
+              <w:t>The its_approvals may not be specified for a particular Workpiece.</w:t>
+            </w:r>
+          </w:p>
+          <w:p>
+            <w:pPr>
+              <w:pStyle w:val="ISOComments"/>
+              <w:rPr>
+                <w:lang w:val="en-US"/>
+              </w:rPr>
+            </w:pPr>
+            <w:r>
+              <w:rPr>
+                <w:lang w:val="en-US"/>
+              </w:rPr>
+              <w:t>clause4</w:t>
+            </w:r>
+            <w:r>
+              <w:rPr>
+                <w:lang w:val="en-US"/>
+              </w:rPr>
+              <w:tab/>
+              <w:t>The its_categories may not be specified for a particular Workpiece.</w:t>
+            </w:r>
+          </w:p>
+          <w:p>
+            <w:pPr>
+              <w:pStyle w:val="ISOComments"/>
+              <w:rPr>
+                <w:lang w:val="en-US"/>
+              </w:rPr>
+            </w:pPr>
+            <w:r>
+              <w:rPr>
+                <w:lang w:val="en-US"/>
+              </w:rPr>
+              <w:t>clause4</w:t>
+            </w:r>
+            <w:r>
+              <w:rPr>
+                <w:lang w:val="en-US"/>
+              </w:rPr>
+              <w:tab/>
+              <w:t>The its_datestamps may not be specified for a particular Workpiece.</w:t>
+            </w:r>
+          </w:p>
+          <w:p>
+            <w:pPr>
+              <w:pStyle w:val="ISOComments"/>
+              <w:rPr>
+                <w:lang w:val="en-US"/>
+              </w:rPr>
+            </w:pPr>
+            <w:r>
+              <w:rPr>
+                <w:lang w:val="en-US"/>
+              </w:rPr>
+              <w:t>clause4</w:t>
+            </w:r>
+            <w:r>
+              <w:rPr>
+                <w:lang w:val="en-US"/>
+              </w:rPr>
+              <w:tab/>
+              <w:t>The its_orgs may not be specified for a particular Workpiece.</w:t>
+            </w:r>
+          </w:p>
+          <w:p>
+            <w:pPr>
+              <w:pStyle w:val="ISOComments"/>
+              <w:rPr>
+                <w:lang w:val="en-US"/>
+              </w:rPr>
+            </w:pPr>
+            <w:r>
+              <w:rPr>
+                <w:lang w:val="en-US"/>
+              </w:rPr>
+              <w:t>clause4</w:t>
+            </w:r>
+            <w:r>
+              <w:rPr>
+                <w:lang w:val="en-US"/>
+              </w:rPr>
+              <w:tab/>
+              <w:t>The its_people may not be specified for a particular Workpiece.</w:t>
+            </w:r>
+          </w:p>
+          <w:p>
+            <w:pPr>
+              <w:pStyle w:val="ISOComments"/>
+              <w:rPr>
+                <w:lang w:val="en-US"/>
+              </w:rPr>
+            </w:pPr>
+            <w:r>
+              <w:rPr>
+                <w:lang w:val="en-US"/>
+              </w:rPr>
+              <w:t>clause4</w:t>
+            </w:r>
+            <w:r>
+              <w:rPr>
+                <w:lang w:val="en-US"/>
+              </w:rPr>
+              <w:tab/>
+              <w:t>The its_timestamps may not be specified for a particular Workpiece.</w:t>
+            </w:r>
+          </w:p>
+          <w:p>
+            <w:pPr>
+              <w:pStyle w:val="ISOComments"/>
+              <w:rPr>
+                <w:lang w:val="en-US"/>
+              </w:rPr>
+            </w:pPr>
+            <w:r>
+              <w:rPr>
+                <w:lang w:val="en-US"/>
+              </w:rPr>
               <w:lastRenderedPageBreak/>
               <w:t>clause4</w:t>
             </w:r>
@@ -16334,153 +16403,6 @@
                 <w:lang w:val="en-US"/>
               </w:rPr>
               <w:tab/>
-              <w:t>The toolpath_orientation may not be specified for a particular Workingstep.</w:t>
-            </w:r>
-          </w:p>
-          <w:p>
-            <w:pPr>
-              <w:pStyle w:val="ISOComments"/>
-              <w:rPr>
-                <w:lang w:val="en-US"/>
-              </w:rPr>
-            </w:pPr>
-            <w:r>
-              <w:rPr>
-                <w:lang w:val="en-US"/>
-              </w:rPr>
-              <w:t>clause4</w:t>
-            </w:r>
-            <w:r>
-              <w:rPr>
-                <w:lang w:val="en-US"/>
-              </w:rPr>
-              <w:tab/>
-              <w:t>The its_approvals may not be specified for a particular Workpiece.</w:t>
-            </w:r>
-          </w:p>
-          <w:p>
-            <w:pPr>
-              <w:pStyle w:val="ISOComments"/>
-              <w:rPr>
-                <w:lang w:val="en-US"/>
-              </w:rPr>
-            </w:pPr>
-            <w:r>
-              <w:rPr>
-                <w:lang w:val="en-US"/>
-              </w:rPr>
-              <w:t>clause4</w:t>
-            </w:r>
-            <w:r>
-              <w:rPr>
-                <w:lang w:val="en-US"/>
-              </w:rPr>
-              <w:tab/>
-              <w:t>The its_categories may not be specified for a particular Workpiece.</w:t>
-            </w:r>
-          </w:p>
-          <w:p>
-            <w:pPr>
-              <w:pStyle w:val="ISOComments"/>
-              <w:rPr>
-                <w:lang w:val="en-US"/>
-              </w:rPr>
-            </w:pPr>
-            <w:r>
-              <w:rPr>
-                <w:lang w:val="en-US"/>
-              </w:rPr>
-              <w:t>clause4</w:t>
-            </w:r>
-            <w:r>
-              <w:rPr>
-                <w:lang w:val="en-US"/>
-              </w:rPr>
-              <w:tab/>
-              <w:t>The its_datestamps may not be specified for a particular Workpiece.</w:t>
-            </w:r>
-          </w:p>
-          <w:p>
-            <w:pPr>
-              <w:pStyle w:val="ISOComments"/>
-              <w:rPr>
-                <w:lang w:val="en-US"/>
-              </w:rPr>
-            </w:pPr>
-            <w:r>
-              <w:rPr>
-                <w:lang w:val="en-US"/>
-              </w:rPr>
-              <w:t>clause4</w:t>
-            </w:r>
-            <w:r>
-              <w:rPr>
-                <w:lang w:val="en-US"/>
-              </w:rPr>
-              <w:tab/>
-              <w:t>The its_orgs may not be specified for a particular Workpiece.</w:t>
-            </w:r>
-          </w:p>
-          <w:p>
-            <w:pPr>
-              <w:pStyle w:val="ISOComments"/>
-              <w:rPr>
-                <w:lang w:val="en-US"/>
-              </w:rPr>
-            </w:pPr>
-            <w:r>
-              <w:rPr>
-                <w:lang w:val="en-US"/>
-              </w:rPr>
-              <w:t>clause4</w:t>
-            </w:r>
-            <w:r>
-              <w:rPr>
-                <w:lang w:val="en-US"/>
-              </w:rPr>
-              <w:tab/>
-              <w:t>The its_people may not be specified for a particular Workpiece.</w:t>
-            </w:r>
-          </w:p>
-          <w:p>
-            <w:pPr>
-              <w:pStyle w:val="ISOComments"/>
-              <w:rPr>
-                <w:lang w:val="en-US"/>
-              </w:rPr>
-            </w:pPr>
-            <w:r>
-              <w:rPr>
-                <w:lang w:val="en-US"/>
-              </w:rPr>
-              <w:t>clause4</w:t>
-            </w:r>
-            <w:r>
-              <w:rPr>
-                <w:lang w:val="en-US"/>
-              </w:rPr>
-              <w:tab/>
-              <w:t>The its_timestamps may not be specified for a particular Workpiece.</w:t>
-            </w:r>
-          </w:p>
-          <w:p>
-            <w:pPr>
-              <w:pStyle w:val="ISOComments"/>
-              <w:rPr>
-                <w:lang w:val="en-US"/>
-              </w:rPr>
-            </w:pPr>
-            <w:r>
-              <w:rPr>
-                <w:lang w:val="en-US"/>
-              </w:rPr>
-              <w:t>clause4</w:t>
-            </w:r>
-            <w:r>
-              <w:rPr>
-                <w:lang w:val="en-US"/>
-              </w:rPr>
-              <w:tab/>
               <w:t>The product_approvals may not be specified for a particular Workpiece.</w:t>
             </w:r>
           </w:p>
@@ -16600,7 +16522,6 @@
               <w:rPr>
                 <w:lang w:val="en-US"/>
               </w:rPr>
-              <w:lastRenderedPageBreak/>
               <w:t>clause4</w:t>
             </w:r>
             <w:r>
@@ -16748,6 +16669,7 @@
               <w:rPr>
                 <w:lang w:val="en-US"/>
               </w:rPr>
+              <w:lastRenderedPageBreak/>
               <w:t>clause5</w:t>
             </w:r>
             <w:r>
@@ -16832,7 +16754,6 @@
               <w:rPr>
                 <w:lang w:val="en-US"/>
               </w:rPr>
-              <w:lastRenderedPageBreak/>
               <w:t>clause5</w:t>
             </w:r>
             <w:r>
@@ -16867,25 +16788,19 @@
             </w:tcBorders>
           </w:tcPr>
           <w:p>
-            <w:pPr>
-              <w:pStyle w:val="ISOSecretObservations"/>
-            </w:pPr>
+            <w:r>
+              <w:t xml:space="preserve">RESOLVED - </w:t>
+            </w:r>
             <w:r>
               <w:t>Adopted IDP2 clause 7 wording</w:t>
             </w:r>
           </w:p>
           <w:p>
-            <w:pPr>
-              <w:pStyle w:val="ISOSecretObservations"/>
-            </w:pPr>
             <w:r>
               <w:t>Could -&gt; can</w:t>
             </w:r>
           </w:p>
           <w:p>
-            <w:pPr>
-              <w:pStyle w:val="ISOSecretObservations"/>
-            </w:pPr>
             <w:r>
               <w:t>May not be specified -&gt; may be omitted</w:t>
             </w:r>
@@ -17072,6 +16987,7 @@
               <w:rPr>
                 <w:lang w:val="en-US"/>
               </w:rPr>
+              <w:lastRenderedPageBreak/>
               <w:t>clause4</w:t>
             </w:r>
             <w:r>
@@ -17177,7 +17093,6 @@
               <w:rPr>
                 <w:lang w:val="en-US"/>
               </w:rPr>
-              <w:lastRenderedPageBreak/>
               <w:t>clause4</w:t>
             </w:r>
             <w:r>
@@ -17291,6 +17206,7 @@
               <w:rPr>
                 <w:lang w:val="en-US"/>
               </w:rPr>
+              <w:lastRenderedPageBreak/>
               <w:t>clause5</w:t>
             </w:r>
             <w:r>
@@ -17354,7 +17270,6 @@
               <w:rPr>
                 <w:lang w:val="en-US"/>
               </w:rPr>
-              <w:lastRenderedPageBreak/>
               <w:t>clause5</w:t>
             </w:r>
             <w:r>
@@ -17446,7 +17361,14 @@
                 <w:lang w:val="en-US"/>
               </w:rPr>
               <w:tab/>
-              <w:t>The items set must refer to representation_item instances, so measurements are encoded as a measure_representation_item, which is a subtype of measure_with_unit and representation_item.</w:t>
+              <w:t xml:space="preserve">The items set must refer to representation_item instances, so measurements </w:t>
+            </w:r>
+            <w:r>
+              <w:rPr>
+                <w:lang w:val="en-US"/>
+              </w:rPr>
+              <w:lastRenderedPageBreak/>
+              <w:t>are encoded as a measure_representation_item, which is a subtype of measure_with_unit and representation_item.</w:t>
             </w:r>
           </w:p>
           <w:p>
@@ -17488,14 +17410,7 @@
                 <w:lang w:val="en-US"/>
               </w:rPr>
               <w:tab/>
-              <w:t xml:space="preserve">The definitions of Cutter_contact_trajectory, Cutter_location_trajectory, Axis_trajectory, and Toolpath_speed, require that the curves that describe location (basiccurve), tool axis, surface </w:t>
-            </w:r>
-            <w:r>
-              <w:rPr>
-                <w:lang w:val="en-US"/>
-              </w:rPr>
-              <w:lastRenderedPageBreak/>
-              <w:t>normal, and feed speed must have the same parameterization.</w:t>
+              <w:t>The definitions of Cutter_contact_trajectory, Cutter_location_trajectory, Axis_trajectory, and Toolpath_speed, require that the curves that describe location (basiccurve), tool axis, surface normal, and feed speed must have the same parameterization.</w:t>
             </w:r>
           </w:p>
           <w:p>
@@ -17585,18 +17500,14 @@
             </w:tcBorders>
           </w:tcPr>
           <w:p>
-            <w:pPr>
-              <w:pStyle w:val="ISOSecretObservations"/>
-            </w:pPr>
+            <w:r>
+              <w:t xml:space="preserve">RESOLVED - </w:t>
+            </w:r>
             <w:r>
               <w:t>Adopted IDP2 clause 7 wording</w:t>
             </w:r>
           </w:p>
-          <w:p>
-            <w:pPr>
-              <w:pStyle w:val="ISOSecretObservations"/>
-            </w:pPr>
-          </w:p>
+          <w:p/>
         </w:tc>
       </w:tr>
       <w:tr>
@@ -17736,7 +17647,14 @@
               <w:rPr>
                 <w:lang w:val="en-US"/>
               </w:rPr>
-              <w:t xml:space="preserve">In clause4, please verify 'The mapping specification given in clause 5.1 defines how the integrated resources and application interpreted constructs are used to meet the information requirements of this application protocol.' </w:t>
+              <w:t xml:space="preserve">In clause4, please verify 'The mapping specification given in clause 5.1 defines how the integrated resources and application interpreted </w:t>
+            </w:r>
+            <w:r>
+              <w:rPr>
+                <w:lang w:val="en-US"/>
+              </w:rPr>
+              <w:lastRenderedPageBreak/>
+              <w:t xml:space="preserve">constructs are used to meet the information requirements of this application protocol.' </w:t>
             </w:r>
           </w:p>
           <w:p>
@@ -17777,9 +17695,9 @@
             </w:tcBorders>
           </w:tcPr>
           <w:p>
-            <w:pPr>
-              <w:pStyle w:val="ISOSecretObservations"/>
-            </w:pPr>
+            <w:r>
+              <w:t xml:space="preserve">RESOLVED - </w:t>
+            </w:r>
             <w:r>
               <w:t>Removed "clause"</w:t>
             </w:r>
@@ -17904,50 +17822,56 @@
               <w:rPr>
                 <w:lang w:val="en-US"/>
               </w:rPr>
+              <w:t xml:space="preserve">In annexG, please verify 'The application reference model is a graphical representation of the structure and constraints of the application objects specified in clause 4, including the application objects referenced from the ISO 10303-1000-series parts, ISO 14649-10, ISO 14649-11, ISO 14649-12, ISO 14649-17, ISO 14649-111 and ISO 14649-121.' </w:t>
+            </w:r>
+          </w:p>
+          <w:p>
+            <w:pPr>
+              <w:pStyle w:val="ISOComments"/>
+              <w:rPr>
+                <w:lang w:val="en-US"/>
+              </w:rPr>
+            </w:pPr>
+            <w:r>
+              <w:rPr>
+                <w:lang w:val="en-US"/>
+              </w:rPr>
+              <w:t xml:space="preserve">In annexK, please verify 'Change the measure UoF to reference application object definitions and mappings from ISO 10303-1054, 10303-1106, 10303-1753, and 10303-1782 rather than define them in clause 4 and 5.' </w:t>
+            </w:r>
+          </w:p>
+          <w:p>
+            <w:pPr>
+              <w:pStyle w:val="ISOComments"/>
+              <w:rPr>
+                <w:lang w:val="en-US"/>
+              </w:rPr>
+            </w:pPr>
+            <w:r>
+              <w:rPr>
+                <w:lang w:val="en-US"/>
+              </w:rPr>
+              <w:t xml:space="preserve">In annexK, please verify 'Move the Manufacturing_feature application object from the workpiece UoF into the manufacturing feature UoF and reference the application object definitions and mappings from ISO 10303-1814 rather than define it in clause 4 and 5.' </w:t>
+            </w:r>
+          </w:p>
+          <w:p>
+            <w:pPr>
+              <w:pStyle w:val="ISOComments"/>
+              <w:rPr>
+                <w:lang w:val="en-US"/>
+              </w:rPr>
+            </w:pPr>
+            <w:r>
+              <w:rPr>
+                <w:lang w:val="en-US"/>
+              </w:rPr>
+              <w:t xml:space="preserve">In annexK, please verify 'Change the manufacturing feature UoF to reference the following feature application object definitions and </w:t>
+            </w:r>
+            <w:r>
+              <w:rPr>
+                <w:lang w:val="en-US"/>
+              </w:rPr>
               <w:lastRenderedPageBreak/>
-              <w:t xml:space="preserve">In annexG, please verify 'The application reference model is a graphical representation of the structure and constraints of the application objects specified in clause 4, including the application objects referenced from the ISO 10303-1000-series parts, ISO 14649-10, ISO 14649-11, ISO 14649-12, ISO 14649-17, ISO 14649-111 and ISO 14649-121.' </w:t>
-            </w:r>
-          </w:p>
-          <w:p>
-            <w:pPr>
-              <w:pStyle w:val="ISOComments"/>
-              <w:rPr>
-                <w:lang w:val="en-US"/>
-              </w:rPr>
-            </w:pPr>
-            <w:r>
-              <w:rPr>
-                <w:lang w:val="en-US"/>
-              </w:rPr>
-              <w:t xml:space="preserve">In annexK, please verify 'Change the measure UoF to reference application object definitions and mappings from ISO 10303-1054, 10303-1106, 10303-1753, and 10303-1782 rather than define them in clause 4 and 5.' </w:t>
-            </w:r>
-          </w:p>
-          <w:p>
-            <w:pPr>
-              <w:pStyle w:val="ISOComments"/>
-              <w:rPr>
-                <w:lang w:val="en-US"/>
-              </w:rPr>
-            </w:pPr>
-            <w:r>
-              <w:rPr>
-                <w:lang w:val="en-US"/>
-              </w:rPr>
-              <w:t xml:space="preserve">In annexK, please verify 'Move the Manufacturing_feature application object from the workpiece UoF into the manufacturing feature UoF and reference the application object definitions and mappings from ISO 10303-1814 rather than define it in clause 4 and 5.' </w:t>
-            </w:r>
-          </w:p>
-          <w:p>
-            <w:pPr>
-              <w:pStyle w:val="ISOComments"/>
-              <w:rPr>
-                <w:lang w:val="en-US"/>
-              </w:rPr>
-            </w:pPr>
-            <w:r>
-              <w:rPr>
-                <w:lang w:val="en-US"/>
-              </w:rPr>
-              <w:t xml:space="preserve">In annexK, please verify 'Change the manufacturing feature UoF to reference the following feature application object definitions and mappings from ISO 10303-1814 rather than define them in clause 4 and 5.' </w:t>
+              <w:t xml:space="preserve">mappings from ISO 10303-1814 rather than define them in clause 4 and 5.' </w:t>
             </w:r>
           </w:p>
           <w:p>
@@ -17975,98 +17899,98 @@
               <w:rPr>
                 <w:lang w:val="en-US"/>
               </w:rPr>
-              <w:t xml:space="preserve">In annexK, please verify 'Delete the turning feature UoF, moving the following application objects to the manufacturing feature UoF. Reference the definitions and mappings from ISO </w:t>
+              <w:t xml:space="preserve">In annexK, please verify 'Delete the turning feature UoF, moving the following application objects to the manufacturing feature UoF. Reference the definitions and mappings from ISO 10303-1814 rather than define them in clause 4 and 5.' </w:t>
+            </w:r>
+          </w:p>
+          <w:p>
+            <w:pPr>
+              <w:pStyle w:val="ISOComments"/>
+              <w:rPr>
+                <w:lang w:val="en-US"/>
+              </w:rPr>
+            </w:pPr>
+            <w:r>
+              <w:rPr>
+                <w:lang w:val="en-US"/>
+              </w:rPr>
+              <w:t xml:space="preserve">In annexK, please verify 'Added machining_twin_relationship to clause 5 for use in the mapping and guidance on Digital twin process in the Fundamental concepts and assumptions section.' </w:t>
+            </w:r>
+          </w:p>
+          <w:p>
+            <w:pPr>
+              <w:pStyle w:val="ISOComments"/>
+              <w:rPr>
+                <w:lang w:val="en-US"/>
+              </w:rPr>
+            </w:pPr>
+            <w:r>
+              <w:rPr>
+                <w:lang w:val="en-US"/>
+              </w:rPr>
+              <w:t xml:space="preserve">In annexK, please verify 'Added machining_fixture_usage to clause 5 for use in the mapping.' </w:t>
+            </w:r>
+          </w:p>
+          <w:p>
+            <w:pPr>
+              <w:pStyle w:val="ISOComments"/>
+              <w:rPr>
+                <w:lang w:val="en-US"/>
+              </w:rPr>
+            </w:pPr>
+            <w:r>
+              <w:rPr>
+                <w:lang w:val="en-US"/>
+              </w:rPr>
+              <w:t xml:space="preserve">In annexK, please verify 'Add extended_type_operation to clause 5 to support mapping of Extended_operation.' </w:t>
+            </w:r>
+          </w:p>
+          <w:p>
+            <w:pPr>
+              <w:pStyle w:val="ISOComments"/>
+              <w:rPr>
+                <w:lang w:val="en-US"/>
+              </w:rPr>
+            </w:pPr>
+            <w:r>
+              <w:rPr>
+                <w:lang w:val="en-US"/>
+              </w:rPr>
+              <w:t xml:space="preserve">In annexK, please verify 'Add via_arc_point and via_helix_point to clause 5 to support high-speed milling operations.' </w:t>
+            </w:r>
+          </w:p>
+          <w:p>
+            <w:pPr>
+              <w:pStyle w:val="ISOComments"/>
+              <w:rPr>
+                <w:lang w:val="en-US"/>
+              </w:rPr>
+            </w:pPr>
+            <w:r>
+              <w:rPr>
+                <w:lang w:val="en-US"/>
+              </w:rPr>
+              <w:t xml:space="preserve">In annexK, please verify 'Add additive_type_operation to clause 5 to support mapping of Am_operation and subtypes.' </w:t>
+            </w:r>
+          </w:p>
+          <w:p>
+            <w:pPr>
+              <w:pStyle w:val="ISOComments"/>
+              <w:rPr>
+                <w:lang w:val="en-US"/>
+              </w:rPr>
+            </w:pPr>
+            <w:r>
+              <w:rPr>
+                <w:lang w:val="en-US"/>
+              </w:rPr>
+              <w:t xml:space="preserve">In annexK, please verify 'Change the geometric dimensioning and tolerancing UoF to reference </w:t>
             </w:r>
             <w:r>
               <w:rPr>
                 <w:lang w:val="en-US"/>
               </w:rPr>
               <w:lastRenderedPageBreak/>
-              <w:t xml:space="preserve">10303-1814 rather than define them in clause 4 and 5.' </w:t>
-            </w:r>
-          </w:p>
-          <w:p>
-            <w:pPr>
-              <w:pStyle w:val="ISOComments"/>
-              <w:rPr>
-                <w:lang w:val="en-US"/>
-              </w:rPr>
-            </w:pPr>
-            <w:r>
-              <w:rPr>
-                <w:lang w:val="en-US"/>
-              </w:rPr>
-              <w:t xml:space="preserve">In annexK, please verify 'Added machining_twin_relationship to clause 5 for use in the mapping and guidance on Digital twin process in the Fundamental concepts and assumptions section.' </w:t>
-            </w:r>
-          </w:p>
-          <w:p>
-            <w:pPr>
-              <w:pStyle w:val="ISOComments"/>
-              <w:rPr>
-                <w:lang w:val="en-US"/>
-              </w:rPr>
-            </w:pPr>
-            <w:r>
-              <w:rPr>
-                <w:lang w:val="en-US"/>
-              </w:rPr>
-              <w:t xml:space="preserve">In annexK, please verify 'Added machining_fixture_usage to clause 5 for use in the mapping.' </w:t>
-            </w:r>
-          </w:p>
-          <w:p>
-            <w:pPr>
-              <w:pStyle w:val="ISOComments"/>
-              <w:rPr>
-                <w:lang w:val="en-US"/>
-              </w:rPr>
-            </w:pPr>
-            <w:r>
-              <w:rPr>
-                <w:lang w:val="en-US"/>
-              </w:rPr>
-              <w:t xml:space="preserve">In annexK, please verify 'Add extended_type_operation to clause 5 to support mapping of Extended_operation.' </w:t>
-            </w:r>
-          </w:p>
-          <w:p>
-            <w:pPr>
-              <w:pStyle w:val="ISOComments"/>
-              <w:rPr>
-                <w:lang w:val="en-US"/>
-              </w:rPr>
-            </w:pPr>
-            <w:r>
-              <w:rPr>
-                <w:lang w:val="en-US"/>
-              </w:rPr>
-              <w:t xml:space="preserve">In annexK, please verify 'Add via_arc_point and via_helix_point to clause 5 to support high-speed milling operations.' </w:t>
-            </w:r>
-          </w:p>
-          <w:p>
-            <w:pPr>
-              <w:pStyle w:val="ISOComments"/>
-              <w:rPr>
-                <w:lang w:val="en-US"/>
-              </w:rPr>
-            </w:pPr>
-            <w:r>
-              <w:rPr>
-                <w:lang w:val="en-US"/>
-              </w:rPr>
-              <w:t xml:space="preserve">In annexK, please verify 'Add additive_type_operation to clause 5 to support mapping of Am_operation and subtypes.' </w:t>
-            </w:r>
-          </w:p>
-          <w:p>
-            <w:pPr>
-              <w:pStyle w:val="ISOComments"/>
-              <w:rPr>
-                <w:lang w:val="en-US"/>
-              </w:rPr>
-            </w:pPr>
-            <w:r>
-              <w:rPr>
-                <w:lang w:val="en-US"/>
-              </w:rPr>
-              <w:t xml:space="preserve">In annexK, please verify 'Change the geometric dimensioning and tolerancing UoF to reference the following feature application object definitions and mappings from ISO 10303-1050 and ISO 10303-1051 rather than define them in clause 4 and 5.' </w:t>
+              <w:t xml:space="preserve">the following feature application object definitions and mappings from ISO 10303-1050 and ISO 10303-1051 rather than define them in clause 4 and 5.' </w:t>
             </w:r>
           </w:p>
           <w:p>
@@ -18094,91 +18018,91 @@
               <w:rPr>
                 <w:lang w:val="en-US"/>
               </w:rPr>
+              <w:t xml:space="preserve">In annexK, please verify 'The information requirements described in clause 4 have not changed.' </w:t>
+            </w:r>
+          </w:p>
+          <w:p>
+            <w:pPr>
+              <w:pStyle w:val="ISOComments"/>
+              <w:rPr>
+                <w:lang w:val="en-US"/>
+              </w:rPr>
+            </w:pPr>
+            <w:r>
+              <w:rPr>
+                <w:lang w:val="en-US"/>
+              </w:rPr>
+              <w:t xml:space="preserve">In annexK, please verify 'The application interpreted model described in clause 5 has not changed.' </w:t>
+            </w:r>
+          </w:p>
+          <w:p>
+            <w:pPr>
+              <w:pStyle w:val="ISOComments"/>
+              <w:rPr>
+                <w:lang w:val="en-US"/>
+              </w:rPr>
+            </w:pPr>
+            <w:r>
+              <w:rPr>
+                <w:lang w:val="en-US"/>
+              </w:rPr>
+              <w:t xml:space="preserve">In clause5, please verify 'This clause specifies how each UoF and application object in clause 4 shall be represented by one or more AIM EXPRESS constructs given by Annex A.' </w:t>
+            </w:r>
+          </w:p>
+          <w:p>
+            <w:pPr>
+              <w:pStyle w:val="ISOComments"/>
+              <w:rPr>
+                <w:lang w:val="en-US"/>
+              </w:rPr>
+            </w:pPr>
+            <w:r>
+              <w:rPr>
+                <w:lang w:val="en-US"/>
+              </w:rPr>
+              <w:t xml:space="preserve">In introduction, please verify 'The information requirements of the application are specified in clause 4 using terminology appropriate to the application.' </w:t>
+            </w:r>
+          </w:p>
+          <w:p>
+            <w:pPr>
+              <w:pStyle w:val="ISOComments"/>
+              <w:rPr>
+                <w:lang w:val="en-US"/>
+              </w:rPr>
+            </w:pPr>
+            <w:r>
+              <w:rPr>
+                <w:lang w:val="en-US"/>
+              </w:rPr>
+              <w:t xml:space="preserve">In annexK, please verify 'The Process_property name has been reused for an application object defined by the Executable UoF that extends an Executable with additional information.' </w:t>
+            </w:r>
+          </w:p>
+          <w:p>
+            <w:pPr>
+              <w:pStyle w:val="ISOComments"/>
+              <w:rPr>
+                <w:lang w:val="en-US"/>
+              </w:rPr>
+            </w:pPr>
+            <w:r>
+              <w:rPr>
+                <w:lang w:val="en-US"/>
+              </w:rPr>
+              <w:t xml:space="preserve">In clause4, please verify 'The executable UoF specifies the information necessary to describe control flow of a machining program as well as the non-machining actions that may be performed by a numerical control.' </w:t>
+            </w:r>
+          </w:p>
+          <w:p>
+            <w:pPr>
+              <w:pStyle w:val="ISOComments"/>
+              <w:rPr>
+                <w:lang w:val="en-US"/>
+              </w:rPr>
+            </w:pPr>
+            <w:r>
+              <w:rPr>
+                <w:lang w:val="en-US"/>
+              </w:rPr>
               <w:lastRenderedPageBreak/>
-              <w:t xml:space="preserve">In annexK, please verify 'The information requirements described in clause 4 have not changed.' </w:t>
-            </w:r>
-          </w:p>
-          <w:p>
-            <w:pPr>
-              <w:pStyle w:val="ISOComments"/>
-              <w:rPr>
-                <w:lang w:val="en-US"/>
-              </w:rPr>
-            </w:pPr>
-            <w:r>
-              <w:rPr>
-                <w:lang w:val="en-US"/>
-              </w:rPr>
-              <w:t xml:space="preserve">In annexK, please verify 'The application interpreted model described in clause 5 has not changed.' </w:t>
-            </w:r>
-          </w:p>
-          <w:p>
-            <w:pPr>
-              <w:pStyle w:val="ISOComments"/>
-              <w:rPr>
-                <w:lang w:val="en-US"/>
-              </w:rPr>
-            </w:pPr>
-            <w:r>
-              <w:rPr>
-                <w:lang w:val="en-US"/>
-              </w:rPr>
-              <w:t xml:space="preserve">In clause5, please verify 'This clause specifies how each UoF and application object in clause 4 shall be represented by one or more AIM EXPRESS constructs given by Annex A.' </w:t>
-            </w:r>
-          </w:p>
-          <w:p>
-            <w:pPr>
-              <w:pStyle w:val="ISOComments"/>
-              <w:rPr>
-                <w:lang w:val="en-US"/>
-              </w:rPr>
-            </w:pPr>
-            <w:r>
-              <w:rPr>
-                <w:lang w:val="en-US"/>
-              </w:rPr>
-              <w:t xml:space="preserve">In introduction, please verify 'The information requirements of the application are specified in clause 4 using terminology appropriate to the application.' </w:t>
-            </w:r>
-          </w:p>
-          <w:p>
-            <w:pPr>
-              <w:pStyle w:val="ISOComments"/>
-              <w:rPr>
-                <w:lang w:val="en-US"/>
-              </w:rPr>
-            </w:pPr>
-            <w:r>
-              <w:rPr>
-                <w:lang w:val="en-US"/>
-              </w:rPr>
-              <w:t xml:space="preserve">In annexK, please verify 'The Process_property name has been reused for an application object defined by the Executable UoF that extends an Executable with additional information.' </w:t>
-            </w:r>
-          </w:p>
-          <w:p>
-            <w:pPr>
-              <w:pStyle w:val="ISOComments"/>
-              <w:rPr>
-                <w:lang w:val="en-US"/>
-              </w:rPr>
-            </w:pPr>
-            <w:r>
-              <w:rPr>
-                <w:lang w:val="en-US"/>
-              </w:rPr>
-              <w:t xml:space="preserve">In clause4, please verify 'The executable UoF specifies the information necessary to describe control flow of a machining program as well as the non-machining actions that may be performed by a numerical control.' </w:t>
-            </w:r>
-          </w:p>
-          <w:p>
-            <w:pPr>
-              <w:pStyle w:val="ISOComments"/>
-              <w:rPr>
-                <w:lang w:val="en-US"/>
-              </w:rPr>
-            </w:pPr>
-            <w:r>
-              <w:rPr>
-                <w:lang w:val="en-US"/>
-              </w:rPr>
               <w:t xml:space="preserve">In clause4, please verify 'The following application objects are used by the executable UoF, and shall be as defined by ISO 14649-10.' </w:t>
             </w:r>
           </w:p>
@@ -18207,7 +18131,6 @@
               <w:rPr>
                 <w:lang w:val="en-US"/>
               </w:rPr>
-              <w:lastRenderedPageBreak/>
               <w:t xml:space="preserve">In clause4, please verify 'The following application objects are used by the executable UoF, and shall be as defined by ISO 10303-1526.' </w:t>
             </w:r>
           </w:p>
@@ -18285,9 +18208,9 @@
             </w:tcBorders>
           </w:tcPr>
           <w:p>
-            <w:pPr>
-              <w:pStyle w:val="ISOSecretObservations"/>
-            </w:pPr>
+            <w:r>
+              <w:t xml:space="preserve">RESOLVED - </w:t>
+            </w:r>
             <w:r>
               <w:t>Capitalized usage</w:t>
             </w:r>
@@ -18543,6 +18466,7 @@
                     <w:rPr>
                       <w:lang w:val="en-US"/>
                     </w:rPr>
+                    <w:lastRenderedPageBreak/>
                     <w:t>annexJ</w:t>
                   </w:r>
                 </w:p>
@@ -18684,7 +18608,6 @@
                     <w:rPr>
                       <w:lang w:val="en-US"/>
                     </w:rPr>
-                    <w:lastRenderedPageBreak/>
                     <w:t>annexJ</w:t>
                   </w:r>
                 </w:p>
@@ -19343,6 +19266,7 @@
                     <w:rPr>
                       <w:lang w:val="en-US"/>
                     </w:rPr>
+                    <w:lastRenderedPageBreak/>
                     <w:t>clause5</w:t>
                   </w:r>
                 </w:p>
@@ -19496,9 +19420,9 @@
             </w:tcBorders>
           </w:tcPr>
           <w:p>
-            <w:pPr>
-              <w:pStyle w:val="ISOSecretObservations"/>
-            </w:pPr>
+            <w:r>
+              <w:t xml:space="preserve">RESOLVED - </w:t>
+            </w:r>
             <w:r>
               <w:t>REAM and gage are intended terms, corrected other typos</w:t>
             </w:r>
@@ -19645,9 +19569,6 @@
             </w:tcBorders>
           </w:tcPr>
           <w:p>
-            <w:pPr>
-              <w:pStyle w:val="ISOSecretObservations"/>
-            </w:pPr>
             <w:r>
               <w:t>Dated references are all in notes or examples.  The undated references remain in the reference list.</w:t>
             </w:r>

</xml_diff>

<commit_message>
Resolved US-24 and US 58-60
Signed-off-by: David Loffredo <loffredo@steptools.com>
</commit_message>
<xml_diff>
--- a/comments/ISO_DIS_10303-238e4_comment_log.docx
+++ b/comments/ISO_DIS_10303-238e4_comment_log.docx
@@ -132,7 +132,23 @@
               <w:pStyle w:val="ISOComments"/>
             </w:pPr>
             <w:r>
-              <w:t>Page header says 'ISO 10303-238:2026(E)' — missing 'DIS' prefix and uses uppercase '(E)' instead of lowercase '(en)' as used in all other files. (djo)</w:t>
+              <w:t>Page header says 'ISO 10303-238:2026(E)' — missing 'DIS' prefix and uses uppercase '(E)' instead of lowercase '(</w:t>
+            </w:r>
+            <w:proofErr w:type="spellStart"/>
+            <w:r>
+              <w:t>en</w:t>
+            </w:r>
+            <w:proofErr w:type="spellEnd"/>
+            <w:r>
+              <w:t>)' as used in all other files. (</w:t>
+            </w:r>
+            <w:proofErr w:type="spellStart"/>
+            <w:r>
+              <w:t>djo</w:t>
+            </w:r>
+            <w:proofErr w:type="spellEnd"/>
+            <w:r>
+              <w:t>)</w:t>
             </w:r>
           </w:p>
         </w:tc>
@@ -149,7 +165,15 @@
               <w:pStyle w:val="ISOChange"/>
             </w:pPr>
             <w:r>
-              <w:t>Change to 'ISO/DIS 10303-238:2026(en)' for consistency with other pages.</w:t>
+              <w:t>Change to 'ISO/DIS 10303-238:2026(</w:t>
+            </w:r>
+            <w:proofErr w:type="spellStart"/>
+            <w:r>
+              <w:t>en</w:t>
+            </w:r>
+            <w:proofErr w:type="spellEnd"/>
+            <w:r>
+              <w:t>)' for consistency with other pages.</w:t>
             </w:r>
           </w:p>
         </w:tc>
@@ -169,7 +193,15 @@
               <w:t xml:space="preserve"> - </w:t>
             </w:r>
             <w:r>
-              <w:t>Abstract page header changed to 'ISO/DIS 10303-238:2026(en)'.</w:t>
+              <w:t>Abstract page header changed to 'ISO/DIS 10303-238:2026(</w:t>
+            </w:r>
+            <w:proofErr w:type="spellStart"/>
+            <w:r>
+              <w:t>en</w:t>
+            </w:r>
+            <w:proofErr w:type="spellEnd"/>
+            <w:r>
+              <w:t>)'.</w:t>
             </w:r>
           </w:p>
         </w:tc>
@@ -276,7 +308,15 @@
               <w:pStyle w:val="ISOComments"/>
             </w:pPr>
             <w:r>
-              <w:t>Edition number contradiction. Text says 'This third edition of ISO 10303-238 is based upon version 12...' but earlier states 'This fourth edition cancels and replaces the third edition'. Copy-paste error from Edition 3. (djo)</w:t>
+              <w:t>Edition number contradiction. Text says 'This third edition of ISO 10303-238 is based upon version 12...' but earlier states 'This fourth edition cancels and replaces the third edition'. Copy-paste error from Edition 3. (</w:t>
+            </w:r>
+            <w:proofErr w:type="spellStart"/>
+            <w:r>
+              <w:t>djo</w:t>
+            </w:r>
+            <w:proofErr w:type="spellEnd"/>
+            <w:r>
+              <w:t>)</w:t>
             </w:r>
           </w:p>
         </w:tc>
@@ -417,7 +457,15 @@
               <w:pStyle w:val="ISOComments"/>
             </w:pPr>
             <w:r>
-              <w:t>Missing period at end of sentence: 'A list of all parts in the ISO 10303 series can be found on the ISO website' (djo)</w:t>
+              <w:t>Missing period at end of sentence: 'A list of all parts in the ISO 10303 series can be found on the ISO website' (</w:t>
+            </w:r>
+            <w:proofErr w:type="spellStart"/>
+            <w:r>
+              <w:t>djo</w:t>
+            </w:r>
+            <w:proofErr w:type="spellEnd"/>
+            <w:r>
+              <w:t>)</w:t>
             </w:r>
           </w:p>
         </w:tc>
@@ -558,7 +606,15 @@
               <w:pStyle w:val="ISOComments"/>
             </w:pPr>
             <w:r>
-              <w:t>Subject-verb agreement error: 'representation of manufacturing process that is based on three-dimensional models' — should be plural since multiple processes (milling, turning, additive) are covered. (djo)</w:t>
+              <w:t>Subject-verb agreement error: 'representation of manufacturing process that is based on three-dimensional models' — should be plural since multiple processes (milling, turning, additive) are covered. (</w:t>
+            </w:r>
+            <w:proofErr w:type="spellStart"/>
+            <w:r>
+              <w:t>djo</w:t>
+            </w:r>
+            <w:proofErr w:type="spellEnd"/>
+            <w:r>
+              <w:t>)</w:t>
             </w:r>
           </w:p>
         </w:tc>
@@ -699,7 +755,15 @@
               <w:pStyle w:val="ISOComments"/>
             </w:pPr>
             <w:r>
-              <w:t>Subject-verb agreement error: 'Information object identifiers for the AIM is given in Annex E.' (djo)</w:t>
+              <w:t>Subject-verb agreement error: 'Information object identifiers for the AIM is given in Annex E.' (</w:t>
+            </w:r>
+            <w:proofErr w:type="spellStart"/>
+            <w:r>
+              <w:t>djo</w:t>
+            </w:r>
+            <w:proofErr w:type="spellEnd"/>
+            <w:r>
+              <w:t>)</w:t>
             </w:r>
           </w:p>
         </w:tc>
@@ -837,7 +901,15 @@
               <w:pStyle w:val="ISOComments"/>
             </w:pPr>
             <w:r>
-              <w:t>The reader's guide describes Clauses 1, 3, 4, 5 and all annexes but never mentions Clause 2 (Normative references). (djo)</w:t>
+              <w:t>The reader's guide describes Clauses 1, 3, 4, 5 and all annexes but never mentions Clause 2 (Normative references). (</w:t>
+            </w:r>
+            <w:proofErr w:type="spellStart"/>
+            <w:r>
+              <w:t>djo</w:t>
+            </w:r>
+            <w:proofErr w:type="spellEnd"/>
+            <w:r>
+              <w:t>)</w:t>
             </w:r>
           </w:p>
         </w:tc>
@@ -960,9 +1032,11 @@
             <w:pPr>
               <w:pStyle w:val="ISOCommType"/>
             </w:pPr>
+            <w:proofErr w:type="spellStart"/>
             <w:r>
               <w:t>te</w:t>
             </w:r>
+            <w:proofErr w:type="spellEnd"/>
           </w:p>
         </w:tc>
         <w:tc>
@@ -978,7 +1052,15 @@
               <w:pStyle w:val="ISOComments"/>
             </w:pPr>
             <w:r>
-              <w:t>The abstract references ISO 14649-10, -11, -12, -111, -121 as the basis but does not mention ISO 14649-17 (additive manufacturing). Scope NOTE 3 does reference -17. Since AM is a major Edition 4 addition, the abstract should be consistent. (djo)</w:t>
+              <w:t>The abstract references ISO 14649-10, -11, -12, -111, -121 as the basis but does not mention ISO 14649-17 (additive manufacturing). Scope NOTE 3 does reference -17. Since AM is a major Edition 4 addition, the abstract should be consistent. (</w:t>
+            </w:r>
+            <w:proofErr w:type="spellStart"/>
+            <w:r>
+              <w:t>djo</w:t>
+            </w:r>
+            <w:proofErr w:type="spellEnd"/>
+            <w:r>
+              <w:t>)</w:t>
             </w:r>
           </w:p>
         </w:tc>
@@ -1119,7 +1201,15 @@
               <w:pStyle w:val="ISOComments"/>
             </w:pPr>
             <w:r>
-              <w:t>'Numerical controlled' is used rather than the standard term 'computerized numerical control' as used in ISO 14649 titles. (djo)</w:t>
+              <w:t>'Numerical controlled' is used rather than the standard term 'computerized numerical control' as used in ISO 14649 titles. (</w:t>
+            </w:r>
+            <w:proofErr w:type="spellStart"/>
+            <w:r>
+              <w:t>djo</w:t>
+            </w:r>
+            <w:proofErr w:type="spellEnd"/>
+            <w:r>
+              <w:t>)</w:t>
             </w:r>
           </w:p>
         </w:tc>
@@ -1258,7 +1348,15 @@
               <w:pStyle w:val="ISOComments"/>
             </w:pPr>
             <w:r>
-              <w:t>Title reads 'Part 1054: Value with unit' — missing 'Application module:' prefix that all other 1000-series parts include. (djo)</w:t>
+              <w:t>Title reads 'Part 1054: Value with unit' — missing 'Application module:' prefix that all other 1000-series parts include. (</w:t>
+            </w:r>
+            <w:proofErr w:type="spellStart"/>
+            <w:r>
+              <w:t>djo</w:t>
+            </w:r>
+            <w:proofErr w:type="spellEnd"/>
+            <w:r>
+              <w:t>)</w:t>
             </w:r>
           </w:p>
         </w:tc>
@@ -1399,7 +1497,15 @@
               <w:pStyle w:val="ISOComments"/>
             </w:pPr>
             <w:r>
-              <w:t>Title reads 'Part 1106: Extended measure representation' — missing 'Application module:' prefix. (djo)</w:t>
+              <w:t>Title reads 'Part 1106: Extended measure representation' — missing 'Application module:' prefix. (</w:t>
+            </w:r>
+            <w:proofErr w:type="spellStart"/>
+            <w:r>
+              <w:t>djo</w:t>
+            </w:r>
+            <w:proofErr w:type="spellEnd"/>
+            <w:r>
+              <w:t>)</w:t>
             </w:r>
           </w:p>
         </w:tc>
@@ -1540,7 +1646,15 @@
               <w:pStyle w:val="ISOComments"/>
             </w:pPr>
             <w:r>
-              <w:t>Title reads 'Part 1110: Surface conditions' — missing 'Application module:' prefix. (djo)</w:t>
+              <w:t>Title reads 'Part 1110: Surface conditions' — missing 'Application module:' prefix. (</w:t>
+            </w:r>
+            <w:proofErr w:type="spellStart"/>
+            <w:r>
+              <w:t>djo</w:t>
+            </w:r>
+            <w:proofErr w:type="spellEnd"/>
+            <w:r>
+              <w:t>)</w:t>
             </w:r>
           </w:p>
         </w:tc>
@@ -1681,7 +1795,15 @@
               <w:pStyle w:val="ISOComments"/>
             </w:pPr>
             <w:r>
-              <w:t>Title given as 'Digital Twin manufacturing framework' does not match published title 'Automation systems and integration — Digital twin framework for manufacturing'. (djo)</w:t>
+              <w:t>Title given as 'Digital Twin manufacturing framework' does not match published title 'Automation systems and integration — Digital twin framework for manufacturing'. (</w:t>
+            </w:r>
+            <w:proofErr w:type="spellStart"/>
+            <w:r>
+              <w:t>djo</w:t>
+            </w:r>
+            <w:proofErr w:type="spellEnd"/>
+            <w:r>
+              <w:t>)</w:t>
             </w:r>
           </w:p>
         </w:tc>
@@ -1822,7 +1944,15 @@
               <w:pStyle w:val="ISOComments"/>
             </w:pPr>
             <w:r>
-              <w:t>Section header uses singular 'Term defined in ISO 14649-10' while all other sections use plural 'Terms defined in...'. (djo)</w:t>
+              <w:t>Section header uses singular 'Term defined in ISO 14649-10' while all other sections use plural 'Terms defined in...'. (</w:t>
+            </w:r>
+            <w:proofErr w:type="spellStart"/>
+            <w:r>
+              <w:t>djo</w:t>
+            </w:r>
+            <w:proofErr w:type="spellEnd"/>
+            <w:r>
+              <w:t>)</w:t>
             </w:r>
           </w:p>
         </w:tc>
@@ -1963,7 +2093,15 @@
               <w:pStyle w:val="ISOComments"/>
             </w:pPr>
             <w:r>
-              <w:t>Last list item 'Digital Twin modelling;' ends with semicolon instead of period. All other sections end their final item with a period per ISO convention. (djo)</w:t>
+              <w:t>Last list item 'Digital Twin modelling;' ends with semicolon instead of period. All other sections end their final item with a period per ISO convention. (</w:t>
+            </w:r>
+            <w:proofErr w:type="spellStart"/>
+            <w:r>
+              <w:t>djo</w:t>
+            </w:r>
+            <w:proofErr w:type="spellEnd"/>
+            <w:r>
+              <w:t>)</w:t>
             </w:r>
           </w:p>
         </w:tc>
@@ -2101,7 +2239,31 @@
               <w:pStyle w:val="ISOComments"/>
             </w:pPr>
             <w:r>
-              <w:t>List of Operation UoF objects has period after 'Operation' but list continues with 'Toolpath_list' followed by semicolon. Period should only be on the final item. (djo)</w:t>
+              <w:t xml:space="preserve">List of Operation </w:t>
+            </w:r>
+            <w:proofErr w:type="spellStart"/>
+            <w:r>
+              <w:t>UoF</w:t>
+            </w:r>
+            <w:proofErr w:type="spellEnd"/>
+            <w:r>
+              <w:t xml:space="preserve"> objects has period after 'Operation' but list continues with '</w:t>
+            </w:r>
+            <w:proofErr w:type="spellStart"/>
+            <w:r>
+              <w:t>Toolpath_list</w:t>
+            </w:r>
+            <w:proofErr w:type="spellEnd"/>
+            <w:r>
+              <w:t>' followed by semicolon. Period should only be on the final item. (</w:t>
+            </w:r>
+            <w:proofErr w:type="spellStart"/>
+            <w:r>
+              <w:t>djo</w:t>
+            </w:r>
+            <w:proofErr w:type="spellEnd"/>
+            <w:r>
+              <w:t>)</w:t>
             </w:r>
           </w:p>
         </w:tc>
@@ -2118,7 +2280,15 @@
               <w:pStyle w:val="ISOChange"/>
             </w:pPr>
             <w:r>
-              <w:t>Move the period to the last list item (Toolpath_list) and use semicolons for preceding items.</w:t>
+              <w:t>Move the period to the last list item (</w:t>
+            </w:r>
+            <w:proofErr w:type="spellStart"/>
+            <w:r>
+              <w:t>Toolpath_list</w:t>
+            </w:r>
+            <w:proofErr w:type="spellEnd"/>
+            <w:r>
+              <w:t>) and use semicolons for preceding items.</w:t>
             </w:r>
           </w:p>
         </w:tc>
@@ -2221,9 +2391,11 @@
             <w:pPr>
               <w:pStyle w:val="ISOCommType"/>
             </w:pPr>
+            <w:proofErr w:type="spellStart"/>
             <w:r>
               <w:t>te</w:t>
             </w:r>
+            <w:proofErr w:type="spellEnd"/>
           </w:p>
         </w:tc>
         <w:tc>
@@ -2239,7 +2411,23 @@
               <w:pStyle w:val="ISOComments"/>
             </w:pPr>
             <w:r>
-              <w:t>Multiple HREF attributes contain trailing spaces in ID references (e.g., '#ao-am_application_feature '). These trailing spaces could cause broken cross-reference links. (djo)</w:t>
+              <w:t>Multiple HREF attributes contain trailing spaces in ID references (e.g., '#</w:t>
+            </w:r>
+            <w:proofErr w:type="spellStart"/>
+            <w:r>
+              <w:t>ao-am_application_feature</w:t>
+            </w:r>
+            <w:proofErr w:type="spellEnd"/>
+            <w:r>
+              <w:t xml:space="preserve"> '). These trailing spaces could cause broken cross-reference links. (</w:t>
+            </w:r>
+            <w:proofErr w:type="spellStart"/>
+            <w:r>
+              <w:t>djo</w:t>
+            </w:r>
+            <w:proofErr w:type="spellEnd"/>
+            <w:r>
+              <w:t>)</w:t>
             </w:r>
           </w:p>
         </w:tc>
@@ -2399,12 +2587,14 @@
                 <w:highlight w:val="yellow"/>
               </w:rPr>
             </w:pPr>
+            <w:proofErr w:type="spellStart"/>
             <w:r>
               <w:rPr>
                 <w:highlight w:val="yellow"/>
               </w:rPr>
               <w:t>te</w:t>
             </w:r>
+            <w:proofErr w:type="spellEnd"/>
           </w:p>
         </w:tc>
         <w:tc>
@@ -2426,7 +2616,35 @@
               <w:rPr>
                 <w:highlight w:val="yellow"/>
               </w:rPr>
-              <w:t>No support provided for a Combined_drill_and_countersink (it does not exist in 14646-111) (djo)</w:t>
+              <w:t xml:space="preserve">No support provided for a </w:t>
+            </w:r>
+            <w:proofErr w:type="spellStart"/>
+            <w:r>
+              <w:rPr>
+                <w:highlight w:val="yellow"/>
+              </w:rPr>
+              <w:t>Combined_drill_and_countersink</w:t>
+            </w:r>
+            <w:proofErr w:type="spellEnd"/>
+            <w:r>
+              <w:rPr>
+                <w:highlight w:val="yellow"/>
+              </w:rPr>
+              <w:t xml:space="preserve"> (it does not exist in 14646-111) (</w:t>
+            </w:r>
+            <w:proofErr w:type="spellStart"/>
+            <w:r>
+              <w:rPr>
+                <w:highlight w:val="yellow"/>
+              </w:rPr>
+              <w:t>djo</w:t>
+            </w:r>
+            <w:proofErr w:type="spellEnd"/>
+            <w:r>
+              <w:rPr>
+                <w:highlight w:val="yellow"/>
+              </w:rPr>
+              <w:t>)</w:t>
             </w:r>
           </w:p>
         </w:tc>
@@ -2449,7 +2667,21 @@
               <w:rPr>
                 <w:highlight w:val="yellow"/>
               </w:rPr>
-              <w:t>Add Combined_drill_and_countersink application object</w:t>
+              <w:t xml:space="preserve">Add </w:t>
+            </w:r>
+            <w:proofErr w:type="spellStart"/>
+            <w:r>
+              <w:rPr>
+                <w:highlight w:val="yellow"/>
+              </w:rPr>
+              <w:t>Combined_drill_and_countersink</w:t>
+            </w:r>
+            <w:proofErr w:type="spellEnd"/>
+            <w:r>
+              <w:rPr>
+                <w:highlight w:val="yellow"/>
+              </w:rPr>
+              <w:t xml:space="preserve"> application object</w:t>
             </w:r>
           </w:p>
         </w:tc>
@@ -2474,9 +2706,11 @@
             <w:r>
               <w:t xml:space="preserve">Added </w:t>
             </w:r>
+            <w:proofErr w:type="spellStart"/>
             <w:r>
               <w:t>Combined_drill_and_countersink</w:t>
             </w:r>
+            <w:proofErr w:type="spellEnd"/>
             <w:r>
               <w:t xml:space="preserve"> </w:t>
             </w:r>
@@ -2567,9 +2801,11 @@
             <w:pPr>
               <w:pStyle w:val="ISOCommType"/>
             </w:pPr>
+            <w:proofErr w:type="spellStart"/>
             <w:r>
               <w:t>te</w:t>
             </w:r>
+            <w:proofErr w:type="spellEnd"/>
           </w:p>
         </w:tc>
         <w:tc>
@@ -2585,7 +2821,39 @@
               <w:pStyle w:val="ISOComments"/>
             </w:pPr>
             <w:r>
-              <w:t>The EXPRESS definition block for Am_application_feature shows 'Am_application_region' instead of 'Am_application_feature'. Wrong entity name in the formal definition. (djo)</w:t>
+              <w:t xml:space="preserve">The EXPRESS definition block for </w:t>
+            </w:r>
+            <w:proofErr w:type="spellStart"/>
+            <w:r>
+              <w:t>Am_application_feature</w:t>
+            </w:r>
+            <w:proofErr w:type="spellEnd"/>
+            <w:r>
+              <w:t xml:space="preserve"> shows '</w:t>
+            </w:r>
+            <w:proofErr w:type="spellStart"/>
+            <w:r>
+              <w:t>Am_application_region</w:t>
+            </w:r>
+            <w:proofErr w:type="spellEnd"/>
+            <w:r>
+              <w:t>' instead of '</w:t>
+            </w:r>
+            <w:proofErr w:type="spellStart"/>
+            <w:r>
+              <w:t>Am_application_feature</w:t>
+            </w:r>
+            <w:proofErr w:type="spellEnd"/>
+            <w:r>
+              <w:t>'. Wrong entity name in the formal definition. (</w:t>
+            </w:r>
+            <w:proofErr w:type="spellStart"/>
+            <w:r>
+              <w:t>djo</w:t>
+            </w:r>
+            <w:proofErr w:type="spellEnd"/>
+            <w:r>
+              <w:t>)</w:t>
             </w:r>
           </w:p>
         </w:tc>
@@ -2602,7 +2870,15 @@
               <w:pStyle w:val="ISOChange"/>
             </w:pPr>
             <w:r>
-              <w:t>Correct the entity name in the EXPRESS block to 'Am_application_feature'.</w:t>
+              <w:t>Correct the entity name in the EXPRESS block to '</w:t>
+            </w:r>
+            <w:proofErr w:type="spellStart"/>
+            <w:r>
+              <w:t>Am_application_feature</w:t>
+            </w:r>
+            <w:proofErr w:type="spellEnd"/>
+            <w:r>
+              <w:t>'.</w:t>
             </w:r>
           </w:p>
         </w:tc>
@@ -2720,7 +2996,15 @@
               <w:pStyle w:val="ISOComments"/>
             </w:pPr>
             <w:r>
-              <w:t>Malformed HTML heading: has both &lt;/H5&gt; and &lt;/H4&gt; closing tags (&lt;/H5&gt;&lt;/H4&gt;). (djo)</w:t>
+              <w:t>Malformed HTML heading: has both &lt;/H5&gt; and &lt;/H4&gt; closing tags (&lt;/H5&gt;&lt;/H4&gt;). (</w:t>
+            </w:r>
+            <w:proofErr w:type="spellStart"/>
+            <w:r>
+              <w:t>djo</w:t>
+            </w:r>
+            <w:proofErr w:type="spellEnd"/>
+            <w:r>
+              <w:t>)</w:t>
             </w:r>
           </w:p>
         </w:tc>
@@ -2861,7 +3145,31 @@
               <w:pStyle w:val="ISOComments"/>
             </w:pPr>
             <w:r>
-              <w:t>Malformed paragraph break mid-sentence for Am_pbf_identification small_area_limit. Closing &lt;/p&gt; appears mid-sentence then continues outside the paragraph. (djo)</w:t>
+              <w:t xml:space="preserve">Malformed paragraph break mid-sentence for </w:t>
+            </w:r>
+            <w:proofErr w:type="spellStart"/>
+            <w:r>
+              <w:t>Am_pbf_identification</w:t>
+            </w:r>
+            <w:proofErr w:type="spellEnd"/>
+            <w:r>
+              <w:t xml:space="preserve"> </w:t>
+            </w:r>
+            <w:proofErr w:type="spellStart"/>
+            <w:r>
+              <w:t>small_area_limit</w:t>
+            </w:r>
+            <w:proofErr w:type="spellEnd"/>
+            <w:r>
+              <w:t>. Closing &lt;/p&gt; appears mid-sentence then continues outside the paragraph. (</w:t>
+            </w:r>
+            <w:proofErr w:type="spellStart"/>
+            <w:r>
+              <w:t>djo</w:t>
+            </w:r>
+            <w:proofErr w:type="spellEnd"/>
+            <w:r>
+              <w:t>)</w:t>
             </w:r>
           </w:p>
         </w:tc>
@@ -2999,7 +3307,31 @@
               <w:pStyle w:val="ISOComments"/>
             </w:pPr>
             <w:r>
-              <w:t>Duplicate opening paragraph for reverse_rows (Am_pbf_infill_management_strategy). First &lt;p&gt; contains incomplete sentence fragment that duplicates the second. (djo)</w:t>
+              <w:t xml:space="preserve">Duplicate opening paragraph for </w:t>
+            </w:r>
+            <w:proofErr w:type="spellStart"/>
+            <w:r>
+              <w:t>reverse_rows</w:t>
+            </w:r>
+            <w:proofErr w:type="spellEnd"/>
+            <w:r>
+              <w:t xml:space="preserve"> (</w:t>
+            </w:r>
+            <w:proofErr w:type="spellStart"/>
+            <w:r>
+              <w:t>Am_pbf_infill_management_strategy</w:t>
+            </w:r>
+            <w:proofErr w:type="spellEnd"/>
+            <w:r>
+              <w:t>). First &lt;p&gt; contains incomplete sentence fragment that duplicates the second. (</w:t>
+            </w:r>
+            <w:proofErr w:type="spellStart"/>
+            <w:r>
+              <w:t>djo</w:t>
+            </w:r>
+            <w:proofErr w:type="spellEnd"/>
+            <w:r>
+              <w:t>)</w:t>
             </w:r>
           </w:p>
         </w:tc>
@@ -3137,7 +3469,15 @@
               <w:pStyle w:val="ISOComments"/>
             </w:pPr>
             <w:r>
-              <w:t>NOTE numbering inconsistent: 'NOTE 1' is followed by 'NOTE' (not 'NOTE 2'). (djo)</w:t>
+              <w:t>NOTE numbering inconsistent: 'NOTE 1' is followed by 'NOTE' (not 'NOTE 2'). (</w:t>
+            </w:r>
+            <w:proofErr w:type="spellStart"/>
+            <w:r>
+              <w:t>djo</w:t>
+            </w:r>
+            <w:proofErr w:type="spellEnd"/>
+            <w:r>
+              <w:t>)</w:t>
             </w:r>
           </w:p>
         </w:tc>
@@ -3261,12 +3601,14 @@
                 <w:highlight w:val="yellow"/>
               </w:rPr>
             </w:pPr>
+            <w:proofErr w:type="spellStart"/>
             <w:r>
               <w:rPr>
                 <w:highlight w:val="yellow"/>
               </w:rPr>
               <w:t>Check_dimensions_operation</w:t>
             </w:r>
+            <w:proofErr w:type="spellEnd"/>
           </w:p>
         </w:tc>
         <w:tc>
@@ -3284,12 +3626,14 @@
                 <w:highlight w:val="yellow"/>
               </w:rPr>
             </w:pPr>
+            <w:proofErr w:type="spellStart"/>
             <w:r>
               <w:rPr>
                 <w:highlight w:val="yellow"/>
               </w:rPr>
               <w:t>te</w:t>
             </w:r>
+            <w:proofErr w:type="spellEnd"/>
           </w:p>
         </w:tc>
         <w:tc>
@@ -3312,7 +3656,35 @@
               <w:rPr>
                 <w:highlight w:val="yellow"/>
               </w:rPr>
-              <w:t>Description seems incomplete… What is response to check_dimensions_operation?  What dimensions are in force?  Should there be a flag to check and adjust?  Should measurements be recorded? (djo)</w:t>
+              <w:t xml:space="preserve">Description seems incomplete… What is response to </w:t>
+            </w:r>
+            <w:proofErr w:type="spellStart"/>
+            <w:r>
+              <w:rPr>
+                <w:highlight w:val="yellow"/>
+              </w:rPr>
+              <w:t>check_dimensions_operation</w:t>
+            </w:r>
+            <w:proofErr w:type="spellEnd"/>
+            <w:r>
+              <w:rPr>
+                <w:highlight w:val="yellow"/>
+              </w:rPr>
+              <w:t>?  What dimensions are in force?  Should there be a flag to check and adjust?  Should measurements be recorded? (</w:t>
+            </w:r>
+            <w:proofErr w:type="spellStart"/>
+            <w:r>
+              <w:rPr>
+                <w:highlight w:val="yellow"/>
+              </w:rPr>
+              <w:t>djo</w:t>
+            </w:r>
+            <w:proofErr w:type="spellEnd"/>
+            <w:r>
+              <w:rPr>
+                <w:highlight w:val="yellow"/>
+              </w:rPr>
+              <w:t>)</w:t>
             </w:r>
           </w:p>
         </w:tc>
@@ -3363,12 +3735,14 @@
             <w:r>
               <w:t xml:space="preserve">he results are recorded in a </w:t>
             </w:r>
+            <w:proofErr w:type="spellStart"/>
             <w:r>
               <w:t>Measured</w:t>
             </w:r>
             <w:r>
               <w:t>_property</w:t>
             </w:r>
+            <w:proofErr w:type="spellEnd"/>
             <w:r>
               <w:t xml:space="preserve"> and t</w:t>
             </w:r>
@@ -3381,12 +3755,14 @@
             <w:r>
               <w:t xml:space="preserve">a new </w:t>
             </w:r>
+            <w:proofErr w:type="spellStart"/>
             <w:r>
               <w:t>Response_g</w:t>
             </w:r>
             <w:r>
               <w:t>roup</w:t>
             </w:r>
+            <w:proofErr w:type="spellEnd"/>
             <w:r>
               <w:t xml:space="preserve"> AO</w:t>
             </w:r>
@@ -3476,12 +3852,14 @@
                 <w:highlight w:val="yellow"/>
               </w:rPr>
             </w:pPr>
+            <w:proofErr w:type="spellStart"/>
             <w:r>
               <w:rPr>
                 <w:highlight w:val="yellow"/>
               </w:rPr>
               <w:t>Manufacturing_stage</w:t>
             </w:r>
+            <w:proofErr w:type="spellEnd"/>
           </w:p>
         </w:tc>
         <w:tc>
@@ -3547,7 +3925,21 @@
               <w:rPr>
                 <w:highlight w:val="yellow"/>
               </w:rPr>
-              <w:t xml:space="preserve"> (djo)</w:t>
+              <w:t xml:space="preserve"> (</w:t>
+            </w:r>
+            <w:proofErr w:type="spellStart"/>
+            <w:r>
+              <w:rPr>
+                <w:highlight w:val="yellow"/>
+              </w:rPr>
+              <w:t>djo</w:t>
+            </w:r>
+            <w:proofErr w:type="spellEnd"/>
+            <w:r>
+              <w:rPr>
+                <w:highlight w:val="yellow"/>
+              </w:rPr>
+              <w:t>)</w:t>
             </w:r>
           </w:p>
         </w:tc>
@@ -3584,11 +3976,43 @@
             </w:tcBorders>
           </w:tcPr>
           <w:p>
-            <w:pPr>
-              <w:rPr>
-                <w:highlight w:val="yellow"/>
-              </w:rPr>
-            </w:pPr>
+            <w:r>
+              <w:t xml:space="preserve">RESOLVED (ED) – </w:t>
+            </w:r>
+            <w:r>
+              <w:t xml:space="preserve">Added a note to </w:t>
+            </w:r>
+            <w:proofErr w:type="spellStart"/>
+            <w:r>
+              <w:t>Feature_history.phase</w:t>
+            </w:r>
+            <w:proofErr w:type="spellEnd"/>
+            <w:r>
+              <w:t xml:space="preserve"> indicating how this should be used.</w:t>
+            </w:r>
+            <w:r>
+              <w:t xml:space="preserve"> "</w:t>
+            </w:r>
+            <w:r>
+              <w:t xml:space="preserve">The phase of a project determines the manufacturing rules, such as the one-up </w:t>
+            </w:r>
+            <w:r>
+              <w:lastRenderedPageBreak/>
+              <w:t>assembly rules and fastener groups, that apply to a twin.</w:t>
+            </w:r>
+            <w:commentRangeStart w:id="0"/>
+            <w:commentRangeEnd w:id="0"/>
+            <w:r>
+              <w:rPr>
+                <w:rStyle w:val="CommentReference"/>
+                <w:sz w:val="24"/>
+                <w:szCs w:val="22"/>
+              </w:rPr>
+              <w:commentReference w:id="0"/>
+            </w:r>
+            <w:r>
+              <w:t>"</w:t>
+            </w:r>
           </w:p>
         </w:tc>
       </w:tr>
@@ -3616,6 +4040,7 @@
               <w:rPr>
                 <w:highlight w:val="yellow"/>
               </w:rPr>
+              <w:lastRenderedPageBreak/>
               <w:t>US-25</w:t>
             </w:r>
           </w:p>
@@ -3675,12 +4100,14 @@
                 <w:highlight w:val="yellow"/>
               </w:rPr>
             </w:pPr>
+            <w:proofErr w:type="spellStart"/>
             <w:r>
               <w:rPr>
                 <w:highlight w:val="yellow"/>
               </w:rPr>
               <w:t>Measured_property</w:t>
             </w:r>
+            <w:proofErr w:type="spellEnd"/>
           </w:p>
         </w:tc>
         <w:tc>
@@ -3698,12 +4125,14 @@
                 <w:highlight w:val="yellow"/>
               </w:rPr>
             </w:pPr>
+            <w:proofErr w:type="spellStart"/>
             <w:r>
               <w:rPr>
                 <w:highlight w:val="yellow"/>
               </w:rPr>
               <w:t>te</w:t>
             </w:r>
+            <w:proofErr w:type="spellEnd"/>
           </w:p>
         </w:tc>
         <w:tc>
@@ -3725,7 +4154,35 @@
               <w:rPr>
                 <w:highlight w:val="yellow"/>
               </w:rPr>
-              <w:t>This Application Object isn’t specific to drill and fill.. should it be on a more general UoF? (djo)</w:t>
+              <w:t xml:space="preserve">This Application Object isn’t specific to drill and fill.. should it be on a more general </w:t>
+            </w:r>
+            <w:proofErr w:type="spellStart"/>
+            <w:r>
+              <w:rPr>
+                <w:highlight w:val="yellow"/>
+              </w:rPr>
+              <w:t>UoF</w:t>
+            </w:r>
+            <w:proofErr w:type="spellEnd"/>
+            <w:r>
+              <w:rPr>
+                <w:highlight w:val="yellow"/>
+              </w:rPr>
+              <w:t>? (</w:t>
+            </w:r>
+            <w:proofErr w:type="spellStart"/>
+            <w:r>
+              <w:rPr>
+                <w:highlight w:val="yellow"/>
+              </w:rPr>
+              <w:t>djo</w:t>
+            </w:r>
+            <w:proofErr w:type="spellEnd"/>
+            <w:r>
+              <w:rPr>
+                <w:highlight w:val="yellow"/>
+              </w:rPr>
+              <w:t>)</w:t>
             </w:r>
           </w:p>
         </w:tc>
@@ -3748,8 +4205,16 @@
               <w:rPr>
                 <w:highlight w:val="yellow"/>
               </w:rPr>
-              <w:t>Move to a more general UoF</w:t>
-            </w:r>
+              <w:t xml:space="preserve">Move to a more general </w:t>
+            </w:r>
+            <w:proofErr w:type="spellStart"/>
+            <w:r>
+              <w:rPr>
+                <w:highlight w:val="yellow"/>
+              </w:rPr>
+              <w:t>UoF</w:t>
+            </w:r>
+            <w:proofErr w:type="spellEnd"/>
           </w:p>
         </w:tc>
         <w:tc>
@@ -3776,7 +4241,15 @@
               <w:t xml:space="preserve"> </w:t>
             </w:r>
             <w:r>
-              <w:t>moved to new Digital twin UoF.</w:t>
+              <w:t xml:space="preserve">moved to new Digital twin </w:t>
+            </w:r>
+            <w:proofErr w:type="spellStart"/>
+            <w:r>
+              <w:t>UoF</w:t>
+            </w:r>
+            <w:proofErr w:type="spellEnd"/>
+            <w:r>
+              <w:t>.</w:t>
             </w:r>
             <w:r>
               <w:t>.</w:t>
@@ -3866,12 +4339,14 @@
                 <w:highlight w:val="yellow"/>
               </w:rPr>
             </w:pPr>
+            <w:proofErr w:type="spellStart"/>
             <w:r>
               <w:rPr>
                 <w:highlight w:val="yellow"/>
               </w:rPr>
               <w:t>Oneup_assembly_group</w:t>
             </w:r>
+            <w:proofErr w:type="spellEnd"/>
           </w:p>
         </w:tc>
         <w:tc>
@@ -3916,7 +4391,21 @@
               <w:rPr>
                 <w:highlight w:val="yellow"/>
               </w:rPr>
-              <w:t>Not clear if this is an “and” or an “or” (djo)</w:t>
+              <w:t>Not clear if this is an “and” or an “or” (</w:t>
+            </w:r>
+            <w:proofErr w:type="spellStart"/>
+            <w:r>
+              <w:rPr>
+                <w:highlight w:val="yellow"/>
+              </w:rPr>
+              <w:t>djo</w:t>
+            </w:r>
+            <w:proofErr w:type="spellEnd"/>
+            <w:r>
+              <w:rPr>
+                <w:highlight w:val="yellow"/>
+              </w:rPr>
+              <w:t>)</w:t>
             </w:r>
           </w:p>
         </w:tc>
@@ -4043,12 +4532,14 @@
                 <w:highlight w:val="yellow"/>
               </w:rPr>
             </w:pPr>
+            <w:proofErr w:type="spellStart"/>
             <w:r>
               <w:rPr>
                 <w:highlight w:val="yellow"/>
               </w:rPr>
               <w:t>Product_view_prototype</w:t>
             </w:r>
+            <w:proofErr w:type="spellEnd"/>
           </w:p>
         </w:tc>
         <w:tc>
@@ -4088,7 +4579,35 @@
               <w:rPr>
                 <w:highlight w:val="yellow"/>
               </w:rPr>
-              <w:t>This Application Object isn’t specific to drill and fill.. should it be on a more general UoF? (djo)</w:t>
+              <w:t xml:space="preserve">This Application Object isn’t specific to drill and fill.. should it be on a more general </w:t>
+            </w:r>
+            <w:proofErr w:type="spellStart"/>
+            <w:r>
+              <w:rPr>
+                <w:highlight w:val="yellow"/>
+              </w:rPr>
+              <w:t>UoF</w:t>
+            </w:r>
+            <w:proofErr w:type="spellEnd"/>
+            <w:r>
+              <w:rPr>
+                <w:highlight w:val="yellow"/>
+              </w:rPr>
+              <w:t>? (</w:t>
+            </w:r>
+            <w:proofErr w:type="spellStart"/>
+            <w:r>
+              <w:rPr>
+                <w:highlight w:val="yellow"/>
+              </w:rPr>
+              <w:t>djo</w:t>
+            </w:r>
+            <w:proofErr w:type="spellEnd"/>
+            <w:r>
+              <w:rPr>
+                <w:highlight w:val="yellow"/>
+              </w:rPr>
+              <w:t>)</w:t>
             </w:r>
           </w:p>
         </w:tc>
@@ -4111,8 +4630,16 @@
               <w:rPr>
                 <w:highlight w:val="yellow"/>
               </w:rPr>
-              <w:t>Move to a more general UoF</w:t>
-            </w:r>
+              <w:t xml:space="preserve">Move to a more general </w:t>
+            </w:r>
+            <w:proofErr w:type="spellStart"/>
+            <w:r>
+              <w:rPr>
+                <w:highlight w:val="yellow"/>
+              </w:rPr>
+              <w:t>UoF</w:t>
+            </w:r>
+            <w:proofErr w:type="spellEnd"/>
           </w:p>
         </w:tc>
         <w:tc>
@@ -4130,7 +4657,15 @@
               </w:rPr>
             </w:pPr>
             <w:r>
-              <w:t>RESOLVED (ED) – moved to new Digital twin UoF.</w:t>
+              <w:t xml:space="preserve">RESOLVED (ED) – moved to new Digital twin </w:t>
+            </w:r>
+            <w:proofErr w:type="spellStart"/>
+            <w:r>
+              <w:t>UoF</w:t>
+            </w:r>
+            <w:proofErr w:type="spellEnd"/>
+            <w:r>
+              <w:t>.</w:t>
             </w:r>
             <w:r>
               <w:t>.</w:t>
@@ -4221,12 +4756,14 @@
                 <w:highlight w:val="yellow"/>
               </w:rPr>
             </w:pPr>
+            <w:proofErr w:type="spellStart"/>
             <w:r>
               <w:rPr>
                 <w:highlight w:val="yellow"/>
               </w:rPr>
               <w:t>Product_view_twin</w:t>
             </w:r>
+            <w:proofErr w:type="spellEnd"/>
           </w:p>
         </w:tc>
         <w:tc>
@@ -4266,7 +4803,35 @@
               <w:rPr>
                 <w:highlight w:val="yellow"/>
               </w:rPr>
-              <w:t>This Application Object isn’t specific to drill and fill.. should it be on a more general UoF? (djo)</w:t>
+              <w:t xml:space="preserve">This Application Object isn’t specific to drill and fill.. should it be on a more general </w:t>
+            </w:r>
+            <w:proofErr w:type="spellStart"/>
+            <w:r>
+              <w:rPr>
+                <w:highlight w:val="yellow"/>
+              </w:rPr>
+              <w:t>UoF</w:t>
+            </w:r>
+            <w:proofErr w:type="spellEnd"/>
+            <w:r>
+              <w:rPr>
+                <w:highlight w:val="yellow"/>
+              </w:rPr>
+              <w:t>? (</w:t>
+            </w:r>
+            <w:proofErr w:type="spellStart"/>
+            <w:r>
+              <w:rPr>
+                <w:highlight w:val="yellow"/>
+              </w:rPr>
+              <w:t>djo</w:t>
+            </w:r>
+            <w:proofErr w:type="spellEnd"/>
+            <w:r>
+              <w:rPr>
+                <w:highlight w:val="yellow"/>
+              </w:rPr>
+              <w:t>)</w:t>
             </w:r>
           </w:p>
         </w:tc>
@@ -4289,8 +4854,16 @@
               <w:rPr>
                 <w:highlight w:val="yellow"/>
               </w:rPr>
-              <w:t>Move to a more general UoF</w:t>
-            </w:r>
+              <w:t xml:space="preserve">Move to a more general </w:t>
+            </w:r>
+            <w:proofErr w:type="spellStart"/>
+            <w:r>
+              <w:rPr>
+                <w:highlight w:val="yellow"/>
+              </w:rPr>
+              <w:t>UoF</w:t>
+            </w:r>
+            <w:proofErr w:type="spellEnd"/>
           </w:p>
         </w:tc>
         <w:tc>
@@ -4308,7 +4881,15 @@
               </w:rPr>
             </w:pPr>
             <w:r>
-              <w:t>RESOLVED (ED) – moved to new Digital twin UoF.</w:t>
+              <w:t xml:space="preserve">RESOLVED (ED) – moved to new Digital twin </w:t>
+            </w:r>
+            <w:proofErr w:type="spellStart"/>
+            <w:r>
+              <w:t>UoF</w:t>
+            </w:r>
+            <w:proofErr w:type="spellEnd"/>
+            <w:r>
+              <w:t>.</w:t>
             </w:r>
             <w:r>
               <w:t>.</w:t>
@@ -4399,12 +4980,14 @@
                 <w:highlight w:val="yellow"/>
               </w:rPr>
             </w:pPr>
+            <w:proofErr w:type="spellStart"/>
             <w:r>
               <w:rPr>
                 <w:highlight w:val="yellow"/>
               </w:rPr>
               <w:t>State_condition</w:t>
             </w:r>
+            <w:proofErr w:type="spellEnd"/>
           </w:p>
         </w:tc>
         <w:tc>
@@ -4444,7 +5027,35 @@
               <w:rPr>
                 <w:highlight w:val="yellow"/>
               </w:rPr>
-              <w:t>This Application Object isn’t specific to drill and fill.. should it be on a more general UoF? (djo)</w:t>
+              <w:t xml:space="preserve">This Application Object isn’t specific to drill and fill.. should it be on a more general </w:t>
+            </w:r>
+            <w:proofErr w:type="spellStart"/>
+            <w:r>
+              <w:rPr>
+                <w:highlight w:val="yellow"/>
+              </w:rPr>
+              <w:t>UoF</w:t>
+            </w:r>
+            <w:proofErr w:type="spellEnd"/>
+            <w:r>
+              <w:rPr>
+                <w:highlight w:val="yellow"/>
+              </w:rPr>
+              <w:t>? (</w:t>
+            </w:r>
+            <w:proofErr w:type="spellStart"/>
+            <w:r>
+              <w:rPr>
+                <w:highlight w:val="yellow"/>
+              </w:rPr>
+              <w:t>djo</w:t>
+            </w:r>
+            <w:proofErr w:type="spellEnd"/>
+            <w:r>
+              <w:rPr>
+                <w:highlight w:val="yellow"/>
+              </w:rPr>
+              <w:t>)</w:t>
             </w:r>
           </w:p>
         </w:tc>
@@ -4467,8 +5078,16 @@
               <w:rPr>
                 <w:highlight w:val="yellow"/>
               </w:rPr>
-              <w:t>Move to a more general UoF</w:t>
-            </w:r>
+              <w:t xml:space="preserve">Move to a more general </w:t>
+            </w:r>
+            <w:proofErr w:type="spellStart"/>
+            <w:r>
+              <w:rPr>
+                <w:highlight w:val="yellow"/>
+              </w:rPr>
+              <w:t>UoF</w:t>
+            </w:r>
+            <w:proofErr w:type="spellEnd"/>
           </w:p>
         </w:tc>
         <w:tc>
@@ -4486,7 +5105,15 @@
               </w:rPr>
             </w:pPr>
             <w:r>
-              <w:t>RESOLVED (ED) – moved to new Digital twin UoF.</w:t>
+              <w:t xml:space="preserve">RESOLVED (ED) – moved to new Digital twin </w:t>
+            </w:r>
+            <w:proofErr w:type="spellStart"/>
+            <w:r>
+              <w:t>UoF</w:t>
+            </w:r>
+            <w:proofErr w:type="spellEnd"/>
+            <w:r>
+              <w:t>.</w:t>
             </w:r>
             <w:r>
               <w:t>.</w:t>
@@ -4593,7 +5220,23 @@
               <w:pStyle w:val="ISOComments"/>
             </w:pPr>
             <w:r>
-              <w:t>Duplicated word: 'are listed after the the application object to which they belong'. (djo)</w:t>
+              <w:t xml:space="preserve">Duplicated word: 'are listed after the </w:t>
+            </w:r>
+            <w:proofErr w:type="spellStart"/>
+            <w:r>
+              <w:t>the</w:t>
+            </w:r>
+            <w:proofErr w:type="spellEnd"/>
+            <w:r>
+              <w:t xml:space="preserve"> application object to which they belong'. (</w:t>
+            </w:r>
+            <w:proofErr w:type="spellStart"/>
+            <w:r>
+              <w:t>djo</w:t>
+            </w:r>
+            <w:proofErr w:type="spellEnd"/>
+            <w:r>
+              <w:t>)</w:t>
             </w:r>
           </w:p>
         </w:tc>
@@ -4734,7 +5377,15 @@
               <w:pStyle w:val="ISOComments"/>
             </w:pPr>
             <w:r>
-              <w:t>Subject-verb disagreement: 'this document presents the mapping specification in the same order as they appear'. (djo)</w:t>
+              <w:t>Subject-verb disagreement: 'this document presents the mapping specification in the same order as they appear'. (</w:t>
+            </w:r>
+            <w:proofErr w:type="spellStart"/>
+            <w:r>
+              <w:t>djo</w:t>
+            </w:r>
+            <w:proofErr w:type="spellEnd"/>
+            <w:r>
+              <w:t>)</w:t>
             </w:r>
           </w:p>
         </w:tc>
@@ -4857,9 +5508,11 @@
             <w:pPr>
               <w:pStyle w:val="ISOCommType"/>
             </w:pPr>
+            <w:proofErr w:type="spellStart"/>
             <w:r>
               <w:t>te</w:t>
             </w:r>
+            <w:proofErr w:type="spellEnd"/>
           </w:p>
         </w:tc>
         <w:tc>
@@ -4875,7 +5528,31 @@
               <w:pStyle w:val="ISOComments"/>
             </w:pPr>
             <w:r>
-              <w:t>Mapping table for table_indexing (machine_parameters) is malformed: 'AIM element:' row is missing; content appears under 'Reference path:' header. (djo)</w:t>
+              <w:t xml:space="preserve">Mapping table for </w:t>
+            </w:r>
+            <w:proofErr w:type="spellStart"/>
+            <w:r>
+              <w:t>table_indexing</w:t>
+            </w:r>
+            <w:proofErr w:type="spellEnd"/>
+            <w:r>
+              <w:t xml:space="preserve"> (</w:t>
+            </w:r>
+            <w:proofErr w:type="spellStart"/>
+            <w:r>
+              <w:t>machine_parameters</w:t>
+            </w:r>
+            <w:proofErr w:type="spellEnd"/>
+            <w:r>
+              <w:t>) is malformed: 'AIM element:' row is missing; content appears under 'Reference path:' header. (</w:t>
+            </w:r>
+            <w:proofErr w:type="spellStart"/>
+            <w:r>
+              <w:t>djo</w:t>
+            </w:r>
+            <w:proofErr w:type="spellEnd"/>
+            <w:r>
+              <w:t>)</w:t>
             </w:r>
           </w:p>
         </w:tc>
@@ -4979,8 +5656,13 @@
               <w:pStyle w:val="ISOParagraph"/>
             </w:pPr>
             <w:r>
-              <w:t>ID attr</w:t>
-            </w:r>
+              <w:t xml:space="preserve">ID </w:t>
+            </w:r>
+            <w:proofErr w:type="spellStart"/>
+            <w:r>
+              <w:t>attr</w:t>
+            </w:r>
+            <w:proofErr w:type="spellEnd"/>
           </w:p>
         </w:tc>
         <w:tc>
@@ -5013,7 +5695,23 @@
               <w:pStyle w:val="ISOComments"/>
             </w:pPr>
             <w:r>
-              <w:t>ID attribute has doubled prefix: 'map-map-machine_with_kinematics-configuration'. Same for 5.1.6.12.2. (djo)</w:t>
+              <w:t>ID attribute has doubled prefix: 'map-map-</w:t>
+            </w:r>
+            <w:proofErr w:type="spellStart"/>
+            <w:r>
+              <w:t>machine_with_kinematics</w:t>
+            </w:r>
+            <w:proofErr w:type="spellEnd"/>
+            <w:r>
+              <w:t>-configuration'. Same for 5.1.6.12.2. (</w:t>
+            </w:r>
+            <w:proofErr w:type="spellStart"/>
+            <w:r>
+              <w:t>djo</w:t>
+            </w:r>
+            <w:proofErr w:type="spellEnd"/>
+            <w:r>
+              <w:t>)</w:t>
             </w:r>
           </w:p>
         </w:tc>
@@ -5030,7 +5728,23 @@
               <w:pStyle w:val="ISOChange"/>
             </w:pPr>
             <w:r>
-              <w:t>Change to 'map-machine_with_kinematics-configuration' and 'map-machine_with_kinematics-mechanism'.</w:t>
+              <w:t>Change to 'map-</w:t>
+            </w:r>
+            <w:proofErr w:type="spellStart"/>
+            <w:r>
+              <w:t>machine_with_kinematics</w:t>
+            </w:r>
+            <w:proofErr w:type="spellEnd"/>
+            <w:r>
+              <w:t>-configuration' and 'map-</w:t>
+            </w:r>
+            <w:proofErr w:type="spellStart"/>
+            <w:r>
+              <w:t>machine_with_kinematics</w:t>
+            </w:r>
+            <w:proofErr w:type="spellEnd"/>
+            <w:r>
+              <w:t>-mechanism'.</w:t>
             </w:r>
           </w:p>
         </w:tc>
@@ -5137,9 +5851,11 @@
             <w:pPr>
               <w:pStyle w:val="ISOCommType"/>
             </w:pPr>
+            <w:proofErr w:type="spellStart"/>
             <w:r>
               <w:t>te</w:t>
             </w:r>
+            <w:proofErr w:type="spellEnd"/>
           </w:p>
         </w:tc>
         <w:tc>
@@ -5155,7 +5871,31 @@
               <w:pStyle w:val="ISOComments"/>
             </w:pPr>
             <w:r>
-              <w:t>Reference path for Setup fixture_usage begins with 'product_definition_formation &lt;-' repeated twice consecutively. Likely copy/paste error. (djo)</w:t>
+              <w:t xml:space="preserve">Reference path for Setup </w:t>
+            </w:r>
+            <w:proofErr w:type="spellStart"/>
+            <w:r>
+              <w:t>fixture_usage</w:t>
+            </w:r>
+            <w:proofErr w:type="spellEnd"/>
+            <w:r>
+              <w:t xml:space="preserve"> begins with '</w:t>
+            </w:r>
+            <w:proofErr w:type="spellStart"/>
+            <w:r>
+              <w:t>product_definition_formation</w:t>
+            </w:r>
+            <w:proofErr w:type="spellEnd"/>
+            <w:r>
+              <w:t xml:space="preserve"> &lt;-' repeated twice consecutively. Likely copy/paste error. (</w:t>
+            </w:r>
+            <w:proofErr w:type="spellStart"/>
+            <w:r>
+              <w:t>djo</w:t>
+            </w:r>
+            <w:proofErr w:type="spellEnd"/>
+            <w:r>
+              <w:t>)</w:t>
             </w:r>
           </w:p>
         </w:tc>
@@ -5293,7 +6033,31 @@
               <w:pStyle w:val="ISOComments"/>
             </w:pPr>
             <w:r>
-              <w:t>Section 5.1.7 (Operation UoF mapping) has no introductory paragraph describing which external standards define parts of the mapping, unlike all other UoF sections. (djo)</w:t>
+              <w:t xml:space="preserve">Section 5.1.7 (Operation </w:t>
+            </w:r>
+            <w:proofErr w:type="spellStart"/>
+            <w:r>
+              <w:t>UoF</w:t>
+            </w:r>
+            <w:proofErr w:type="spellEnd"/>
+            <w:r>
+              <w:t xml:space="preserve"> mapping) has no introductory paragraph describing which external standards define parts of the mapping, unlike all other </w:t>
+            </w:r>
+            <w:proofErr w:type="spellStart"/>
+            <w:r>
+              <w:t>UoF</w:t>
+            </w:r>
+            <w:proofErr w:type="spellEnd"/>
+            <w:r>
+              <w:t xml:space="preserve"> sections. (</w:t>
+            </w:r>
+            <w:proofErr w:type="spellStart"/>
+            <w:r>
+              <w:t>djo</w:t>
+            </w:r>
+            <w:proofErr w:type="spellEnd"/>
+            <w:r>
+              <w:t>)</w:t>
             </w:r>
           </w:p>
         </w:tc>
@@ -5431,7 +6195,23 @@
               <w:pStyle w:val="ISOComments"/>
             </w:pPr>
             <w:r>
-              <w:t>Navigation DIV block for air_strategy is duplicated. (djo)</w:t>
+              <w:t xml:space="preserve">Navigation DIV block for </w:t>
+            </w:r>
+            <w:proofErr w:type="spellStart"/>
+            <w:r>
+              <w:t>air_strategy</w:t>
+            </w:r>
+            <w:proofErr w:type="spellEnd"/>
+            <w:r>
+              <w:t xml:space="preserve"> is duplicated. (</w:t>
+            </w:r>
+            <w:proofErr w:type="spellStart"/>
+            <w:r>
+              <w:t>djo</w:t>
+            </w:r>
+            <w:proofErr w:type="spellEnd"/>
+            <w:r>
+              <w:t>)</w:t>
             </w:r>
           </w:p>
         </w:tc>
@@ -5551,9 +6331,11 @@
             <w:pPr>
               <w:pStyle w:val="ISOCommType"/>
             </w:pPr>
+            <w:proofErr w:type="spellStart"/>
             <w:r>
               <w:t>te</w:t>
             </w:r>
+            <w:proofErr w:type="spellEnd"/>
           </w:p>
         </w:tc>
         <w:tc>
@@ -5569,7 +6351,31 @@
               <w:pStyle w:val="ISOComments"/>
             </w:pPr>
             <w:r>
-              <w:t>Mapping table for boring_operation spindle_stop_at_bottom has same malformed structure — 'AIM element:' row missing. (djo)</w:t>
+              <w:t xml:space="preserve">Mapping table for </w:t>
+            </w:r>
+            <w:proofErr w:type="spellStart"/>
+            <w:r>
+              <w:t>boring_operation</w:t>
+            </w:r>
+            <w:proofErr w:type="spellEnd"/>
+            <w:r>
+              <w:t xml:space="preserve"> </w:t>
+            </w:r>
+            <w:proofErr w:type="spellStart"/>
+            <w:r>
+              <w:t>spindle_stop_at_bottom</w:t>
+            </w:r>
+            <w:proofErr w:type="spellEnd"/>
+            <w:r>
+              <w:t xml:space="preserve"> has same malformed structure — 'AIM element:' row missing. (</w:t>
+            </w:r>
+            <w:proofErr w:type="spellStart"/>
+            <w:r>
+              <w:t>djo</w:t>
+            </w:r>
+            <w:proofErr w:type="spellEnd"/>
+            <w:r>
+              <w:t>)</w:t>
             </w:r>
           </w:p>
         </w:tc>
@@ -5689,9 +6495,11 @@
             <w:pPr>
               <w:pStyle w:val="ISOCommType"/>
             </w:pPr>
+            <w:proofErr w:type="spellStart"/>
             <w:r>
               <w:t>te</w:t>
             </w:r>
+            <w:proofErr w:type="spellEnd"/>
           </w:p>
         </w:tc>
         <w:tc>
@@ -5707,7 +6515,23 @@
               <w:pStyle w:val="ISOComments"/>
             </w:pPr>
             <w:r>
-              <w:t>Mapping table for milling_machine_functions coolant — 'AIM element:' row missing. (djo)</w:t>
+              <w:t xml:space="preserve">Mapping table for </w:t>
+            </w:r>
+            <w:proofErr w:type="spellStart"/>
+            <w:r>
+              <w:t>milling_machine_functions</w:t>
+            </w:r>
+            <w:proofErr w:type="spellEnd"/>
+            <w:r>
+              <w:t xml:space="preserve"> coolant — 'AIM element:' row missing. (</w:t>
+            </w:r>
+            <w:proofErr w:type="spellStart"/>
+            <w:r>
+              <w:t>djo</w:t>
+            </w:r>
+            <w:proofErr w:type="spellEnd"/>
+            <w:r>
+              <w:t>)</w:t>
             </w:r>
           </w:p>
         </w:tc>
@@ -5827,9 +6651,11 @@
             <w:pPr>
               <w:pStyle w:val="ISOCommType"/>
             </w:pPr>
+            <w:proofErr w:type="spellStart"/>
             <w:r>
               <w:t>te</w:t>
             </w:r>
+            <w:proofErr w:type="spellEnd"/>
           </w:p>
         </w:tc>
         <w:tc>
@@ -5845,7 +6671,23 @@
               <w:pStyle w:val="ISOComments"/>
             </w:pPr>
             <w:r>
-              <w:t>Mapping table for milling_machine_functions mist — 'AIM element:' row missing. (djo)</w:t>
+              <w:t xml:space="preserve">Mapping table for </w:t>
+            </w:r>
+            <w:proofErr w:type="spellStart"/>
+            <w:r>
+              <w:t>milling_machine_functions</w:t>
+            </w:r>
+            <w:proofErr w:type="spellEnd"/>
+            <w:r>
+              <w:t xml:space="preserve"> mist — 'AIM element:' row missing. (</w:t>
+            </w:r>
+            <w:proofErr w:type="spellStart"/>
+            <w:r>
+              <w:t>djo</w:t>
+            </w:r>
+            <w:proofErr w:type="spellEnd"/>
+            <w:r>
+              <w:t>)</w:t>
             </w:r>
           </w:p>
         </w:tc>
@@ -5983,7 +6825,23 @@
               <w:pStyle w:val="ISOComments"/>
             </w:pPr>
             <w:r>
-              <w:t>Spelling error: 'preceeding' should be 'preceding'. (djo)</w:t>
+              <w:t>Spelling error: '</w:t>
+            </w:r>
+            <w:proofErr w:type="spellStart"/>
+            <w:r>
+              <w:t>preceeding</w:t>
+            </w:r>
+            <w:proofErr w:type="spellEnd"/>
+            <w:r>
+              <w:t>' should be 'preceding'. (</w:t>
+            </w:r>
+            <w:proofErr w:type="spellStart"/>
+            <w:r>
+              <w:t>djo</w:t>
+            </w:r>
+            <w:proofErr w:type="spellEnd"/>
+            <w:r>
+              <w:t>)</w:t>
             </w:r>
           </w:p>
         </w:tc>
@@ -6000,7 +6858,15 @@
               <w:pStyle w:val="ISOChange"/>
             </w:pPr>
             <w:r>
-              <w:t>Change 'preceeding' to 'preceding'.</w:t>
+              <w:t>Change '</w:t>
+            </w:r>
+            <w:proofErr w:type="spellStart"/>
+            <w:r>
+              <w:t>preceeding</w:t>
+            </w:r>
+            <w:proofErr w:type="spellEnd"/>
+            <w:r>
+              <w:t>' to 'preceding'.</w:t>
             </w:r>
           </w:p>
         </w:tc>
@@ -6020,7 +6886,15 @@
               <w:t xml:space="preserve"> - </w:t>
             </w:r>
             <w:r>
-              <w:t>changed 'preceeding' to 'preceding' in Clause 6.</w:t>
+              <w:t>changed '</w:t>
+            </w:r>
+            <w:proofErr w:type="spellStart"/>
+            <w:r>
+              <w:t>preceeding</w:t>
+            </w:r>
+            <w:proofErr w:type="spellEnd"/>
+            <w:r>
+              <w:t>' to 'preceding' in Clause 6.</w:t>
             </w:r>
           </w:p>
         </w:tc>
@@ -6124,7 +6998,23 @@
               <w:pStyle w:val="ISOComments"/>
             </w:pPr>
             <w:r>
-              <w:t>Broken word from typesetting: 'sup-ported' — erroneous hyphenation artifact. (djo)</w:t>
+              <w:t xml:space="preserve">Broken word from typesetting: </w:t>
+            </w:r>
+            <w:proofErr w:type="spellStart"/>
+            <w:r>
+              <w:t>'sup</w:t>
+            </w:r>
+            <w:proofErr w:type="spellEnd"/>
+            <w:r>
+              <w:t>-ported' — erroneous hyphenation artifact. (</w:t>
+            </w:r>
+            <w:proofErr w:type="spellStart"/>
+            <w:r>
+              <w:t>djo</w:t>
+            </w:r>
+            <w:proofErr w:type="spellEnd"/>
+            <w:r>
+              <w:t>)</w:t>
             </w:r>
           </w:p>
         </w:tc>
@@ -6141,7 +7031,15 @@
               <w:pStyle w:val="ISOChange"/>
             </w:pPr>
             <w:r>
-              <w:t>Change 'sup-ported' to 'supported'.</w:t>
+              <w:t xml:space="preserve">Change </w:t>
+            </w:r>
+            <w:proofErr w:type="spellStart"/>
+            <w:r>
+              <w:t>'sup</w:t>
+            </w:r>
+            <w:proofErr w:type="spellEnd"/>
+            <w:r>
+              <w:t>-ported' to 'supported'.</w:t>
             </w:r>
           </w:p>
         </w:tc>
@@ -6161,7 +7059,15 @@
               <w:t xml:space="preserve"> - </w:t>
             </w:r>
             <w:r>
-              <w:t>changed 'sup-ported' to 'supported' in Clause 6.</w:t>
+              <w:t xml:space="preserve">changed </w:t>
+            </w:r>
+            <w:proofErr w:type="spellStart"/>
+            <w:r>
+              <w:t>'sup</w:t>
+            </w:r>
+            <w:proofErr w:type="spellEnd"/>
+            <w:r>
+              <w:t>-ported' to 'supported' in Clause 6.</w:t>
             </w:r>
           </w:p>
         </w:tc>
@@ -6247,9 +7153,11 @@
             <w:pPr>
               <w:pStyle w:val="ISOCommType"/>
             </w:pPr>
+            <w:proofErr w:type="spellStart"/>
             <w:r>
               <w:t>te</w:t>
             </w:r>
+            <w:proofErr w:type="spellEnd"/>
           </w:p>
         </w:tc>
         <w:tc>
@@ -6265,7 +7173,15 @@
               <w:pStyle w:val="ISOComments"/>
             </w:pPr>
             <w:r>
-              <w:t>Text references 'Table 15' but the table in the HTML is captioned 'Table 1 — Conformance class elements'. Numbering must be reconciled. (djo)</w:t>
+              <w:t>Text references 'Table 15' but the table in the HTML is captioned 'Table 1 — Conformance class elements'. Numbering must be reconciled. (</w:t>
+            </w:r>
+            <w:proofErr w:type="spellStart"/>
+            <w:r>
+              <w:t>djo</w:t>
+            </w:r>
+            <w:proofErr w:type="spellEnd"/>
+            <w:r>
+              <w:t>)</w:t>
             </w:r>
           </w:p>
         </w:tc>
@@ -6406,7 +7322,23 @@
               <w:pStyle w:val="ISOComments"/>
             </w:pPr>
             <w:r>
-              <w:t>Inconsistent abbreviation: 'UoF' (lowercase o) mixed with 'UOF' (all uppercase) throughout the clause. (djo)</w:t>
+              <w:t>Inconsistent abbreviation: '</w:t>
+            </w:r>
+            <w:proofErr w:type="spellStart"/>
+            <w:r>
+              <w:t>UoF</w:t>
+            </w:r>
+            <w:proofErr w:type="spellEnd"/>
+            <w:r>
+              <w:t>' (lowercase o) mixed with 'UOF' (all uppercase) throughout the clause. (</w:t>
+            </w:r>
+            <w:proofErr w:type="spellStart"/>
+            <w:r>
+              <w:t>djo</w:t>
+            </w:r>
+            <w:proofErr w:type="spellEnd"/>
+            <w:r>
+              <w:t>)</w:t>
             </w:r>
           </w:p>
         </w:tc>
@@ -6423,7 +7355,15 @@
               <w:pStyle w:val="ISOChange"/>
             </w:pPr>
             <w:r>
-              <w:t>Standardize to 'UoF' (Unit of Functionality) throughout.</w:t>
+              <w:t>Standardize to '</w:t>
+            </w:r>
+            <w:proofErr w:type="spellStart"/>
+            <w:r>
+              <w:t>UoF</w:t>
+            </w:r>
+            <w:proofErr w:type="spellEnd"/>
+            <w:r>
+              <w:t>' (Unit of Functionality) throughout.</w:t>
             </w:r>
           </w:p>
         </w:tc>
@@ -6443,7 +7383,23 @@
               <w:t xml:space="preserve"> - </w:t>
             </w:r>
             <w:r>
-              <w:t>standardized 'UOF'/'UOFs' to 'UoF'/'UoFs' in Clause 6.</w:t>
+              <w:t>standardized 'UOF'/'UOFs' to '</w:t>
+            </w:r>
+            <w:proofErr w:type="spellStart"/>
+            <w:r>
+              <w:t>UoF</w:t>
+            </w:r>
+            <w:proofErr w:type="spellEnd"/>
+            <w:r>
+              <w:t>'/'</w:t>
+            </w:r>
+            <w:proofErr w:type="spellStart"/>
+            <w:r>
+              <w:t>UoFs</w:t>
+            </w:r>
+            <w:proofErr w:type="spellEnd"/>
+            <w:r>
+              <w:t>' in Clause 6.</w:t>
             </w:r>
           </w:p>
         </w:tc>
@@ -6548,7 +7504,23 @@
               <w:pStyle w:val="ISOComments"/>
             </w:pPr>
             <w:r>
-              <w:t>Spelling error in EXPRESS comment: 'superceeds' should be 'supersedes'. (djo)</w:t>
+              <w:t>Spelling error in EXPRESS comment: '</w:t>
+            </w:r>
+            <w:proofErr w:type="spellStart"/>
+            <w:r>
+              <w:t>superceeds</w:t>
+            </w:r>
+            <w:proofErr w:type="spellEnd"/>
+            <w:r>
+              <w:t>' should be 'supersedes'. (</w:t>
+            </w:r>
+            <w:proofErr w:type="spellStart"/>
+            <w:r>
+              <w:t>djo</w:t>
+            </w:r>
+            <w:proofErr w:type="spellEnd"/>
+            <w:r>
+              <w:t>)</w:t>
             </w:r>
           </w:p>
         </w:tc>
@@ -6565,7 +7537,15 @@
               <w:pStyle w:val="ISOChange"/>
             </w:pPr>
             <w:r>
-              <w:t>Change 'superceeds' to 'supersedes'.</w:t>
+              <w:t>Change '</w:t>
+            </w:r>
+            <w:proofErr w:type="spellStart"/>
+            <w:r>
+              <w:t>superceeds</w:t>
+            </w:r>
+            <w:proofErr w:type="spellEnd"/>
+            <w:r>
+              <w:t>' to 'supersedes'.</w:t>
             </w:r>
           </w:p>
         </w:tc>
@@ -6585,7 +7565,23 @@
               <w:t xml:space="preserve"> - </w:t>
             </w:r>
             <w:r>
-              <w:t>changed 'superceeds' to 'supersedes' in Annex A (Nxxx left for separate comment).</w:t>
+              <w:t>changed '</w:t>
+            </w:r>
+            <w:proofErr w:type="spellStart"/>
+            <w:r>
+              <w:t>superceeds</w:t>
+            </w:r>
+            <w:proofErr w:type="spellEnd"/>
+            <w:r>
+              <w:t>' to 'supersedes' in Annex A (</w:t>
+            </w:r>
+            <w:proofErr w:type="spellStart"/>
+            <w:r>
+              <w:t>Nxxx</w:t>
+            </w:r>
+            <w:proofErr w:type="spellEnd"/>
+            <w:r>
+              <w:t xml:space="preserve"> left for separate comment).</w:t>
             </w:r>
           </w:p>
           <w:p>
@@ -6693,14 +7689,27 @@
             <w:pPr>
               <w:pStyle w:val="ISOComments"/>
             </w:pPr>
+            <w:proofErr w:type="spellStart"/>
             <w:r>
               <w:t>Un</w:t>
             </w:r>
             <w:r>
-              <w:t>RESOLVED (ed)</w:t>
-            </w:r>
-            <w:r>
-              <w:t xml:space="preserve"> document number placeholder: 'WG15Nxxx' — should contain actual N-number. (djo)</w:t>
+              <w:t>RESOLVED</w:t>
+            </w:r>
+            <w:proofErr w:type="spellEnd"/>
+            <w:r>
+              <w:t xml:space="preserve"> (ed)</w:t>
+            </w:r>
+            <w:r>
+              <w:t xml:space="preserve"> document number placeholder: 'WG15Nxxx' — should contain actual N-number. (</w:t>
+            </w:r>
+            <w:proofErr w:type="spellStart"/>
+            <w:r>
+              <w:t>djo</w:t>
+            </w:r>
+            <w:proofErr w:type="spellEnd"/>
+            <w:r>
+              <w:t>)</w:t>
             </w:r>
           </w:p>
         </w:tc>
@@ -6717,7 +7726,15 @@
               <w:pStyle w:val="ISOChange"/>
             </w:pPr>
             <w:r>
-              <w:t>Replace 'Nxxx' with the actual WG15 document number.</w:t>
+              <w:t>Replace '</w:t>
+            </w:r>
+            <w:proofErr w:type="spellStart"/>
+            <w:r>
+              <w:t>Nxxx</w:t>
+            </w:r>
+            <w:proofErr w:type="spellEnd"/>
+            <w:r>
+              <w:t>' with the actual WG15 document number.</w:t>
             </w:r>
           </w:p>
         </w:tc>
@@ -6847,7 +7864,23 @@
               <w:pStyle w:val="ISOComments"/>
             </w:pPr>
             <w:r>
-              <w:t>Spelling error: 'preceeding' should be 'preceding'. (djo)</w:t>
+              <w:t>Spelling error: '</w:t>
+            </w:r>
+            <w:proofErr w:type="spellStart"/>
+            <w:r>
+              <w:t>preceeding</w:t>
+            </w:r>
+            <w:proofErr w:type="spellEnd"/>
+            <w:r>
+              <w:t>' should be 'preceding'. (</w:t>
+            </w:r>
+            <w:proofErr w:type="spellStart"/>
+            <w:r>
+              <w:t>djo</w:t>
+            </w:r>
+            <w:proofErr w:type="spellEnd"/>
+            <w:r>
+              <w:t>)</w:t>
             </w:r>
           </w:p>
         </w:tc>
@@ -6864,7 +7897,15 @@
               <w:pStyle w:val="ISOChange"/>
             </w:pPr>
             <w:r>
-              <w:t>Change 'preceeding' to 'preceding'.</w:t>
+              <w:t>Change '</w:t>
+            </w:r>
+            <w:proofErr w:type="spellStart"/>
+            <w:r>
+              <w:t>preceeding</w:t>
+            </w:r>
+            <w:proofErr w:type="spellEnd"/>
+            <w:r>
+              <w:t>' to 'preceding'.</w:t>
             </w:r>
           </w:p>
         </w:tc>
@@ -6884,7 +7925,15 @@
               <w:t xml:space="preserve"> - </w:t>
             </w:r>
             <w:r>
-              <w:t>changed 'preceeding' to 'preceding' in Annex D.</w:t>
+              <w:t>changed '</w:t>
+            </w:r>
+            <w:proofErr w:type="spellStart"/>
+            <w:r>
+              <w:t>preceeding</w:t>
+            </w:r>
+            <w:proofErr w:type="spellEnd"/>
+            <w:r>
+              <w:t>' to 'preceding' in Annex D.</w:t>
             </w:r>
           </w:p>
         </w:tc>
@@ -6988,7 +8037,15 @@
               <w:pStyle w:val="ISOComments"/>
             </w:pPr>
             <w:r>
-              <w:t>Heading says 'Protocol Implementation Conformance Statement (PICS)' but body text says 'Protocol Information and Conformance Statement (PICS)'. These must match. (djo)</w:t>
+              <w:t>Heading says 'Protocol Implementation Conformance Statement (PICS)' but body text says 'Protocol Information and Conformance Statement (PICS)'. These must match. (</w:t>
+            </w:r>
+            <w:proofErr w:type="spellStart"/>
+            <w:r>
+              <w:t>djo</w:t>
+            </w:r>
+            <w:proofErr w:type="spellEnd"/>
+            <w:r>
+              <w:t>)</w:t>
             </w:r>
           </w:p>
         </w:tc>
@@ -7129,7 +8186,15 @@
               <w:pStyle w:val="ISOComments"/>
             </w:pPr>
             <w:r>
-              <w:t>Text reads 'assigned to the model-based-integrated-manufacturing-schema schema' — redundant 'schema'. Also inconsistency between hyphenated OID form and underscored EXPRESS name not clarified. (djo)</w:t>
+              <w:t>Text reads 'assigned to the model-based-integrated-manufacturing-schema schema' — redundant 'schema'. Also inconsistency between hyphenated OID form and underscored EXPRESS name not clarified. (</w:t>
+            </w:r>
+            <w:proofErr w:type="spellStart"/>
+            <w:r>
+              <w:t>djo</w:t>
+            </w:r>
+            <w:proofErr w:type="spellEnd"/>
+            <w:r>
+              <w:t>)</w:t>
             </w:r>
           </w:p>
         </w:tc>
@@ -7270,7 +8335,15 @@
               <w:pStyle w:val="ISOComments"/>
             </w:pPr>
             <w:r>
-              <w:t>Annex G references 'ISO 10303-11:2004, Annex D' for EXPRESS-G definition but Annex H references 'ISO 10303-11:1994, Annex D'. Inconsistent edition years. (djo)</w:t>
+              <w:t>Annex G references 'ISO 10303-11:2004, Annex D' for EXPRESS-G definition but Annex H references 'ISO 10303-11:1994, Annex D'. Inconsistent edition years. (</w:t>
+            </w:r>
+            <w:proofErr w:type="spellStart"/>
+            <w:r>
+              <w:t>djo</w:t>
+            </w:r>
+            <w:proofErr w:type="spellEnd"/>
+            <w:r>
+              <w:t>)</w:t>
             </w:r>
           </w:p>
         </w:tc>
@@ -7411,7 +8484,31 @@
               <w:pStyle w:val="ISOComments"/>
             </w:pPr>
             <w:r>
-              <w:t>Duplicate word and malformed sentence: 'which the description attribute in ISO 10303-21 syntax) is is indeed' — contains 'is is' and missing word 'is' in parenthetical. (djo)</w:t>
+              <w:t xml:space="preserve">Duplicate word and malformed sentence: 'which the description attribute in ISO 10303-21 syntax) is </w:t>
+            </w:r>
+            <w:proofErr w:type="spellStart"/>
+            <w:r>
+              <w:t>is</w:t>
+            </w:r>
+            <w:proofErr w:type="spellEnd"/>
+            <w:r>
+              <w:t xml:space="preserve"> indeed' — contains 'is </w:t>
+            </w:r>
+            <w:proofErr w:type="spellStart"/>
+            <w:r>
+              <w:t>is</w:t>
+            </w:r>
+            <w:proofErr w:type="spellEnd"/>
+            <w:r>
+              <w:t>' and missing word 'is' in parenthetical. (</w:t>
+            </w:r>
+            <w:proofErr w:type="spellStart"/>
+            <w:r>
+              <w:t>djo</w:t>
+            </w:r>
+            <w:proofErr w:type="spellEnd"/>
+            <w:r>
+              <w:t>)</w:t>
             </w:r>
           </w:p>
         </w:tc>
@@ -7448,7 +8545,15 @@
               <w:t xml:space="preserve"> - </w:t>
             </w:r>
             <w:r>
-              <w:t>fixed 'is is indeed' to 'is indeed' in Annex J.2.</w:t>
+              <w:t xml:space="preserve">fixed 'is </w:t>
+            </w:r>
+            <w:proofErr w:type="spellStart"/>
+            <w:r>
+              <w:t>is</w:t>
+            </w:r>
+            <w:proofErr w:type="spellEnd"/>
+            <w:r>
+              <w:t xml:space="preserve"> indeed' to 'is indeed' in Annex J.2.</w:t>
             </w:r>
           </w:p>
         </w:tc>
@@ -7552,7 +8657,23 @@
               <w:pStyle w:val="ISOComments"/>
             </w:pPr>
             <w:r>
-              <w:t>Typo: 'worplan' should be 'workplan'. (djo)</w:t>
+              <w:t>Typo: '</w:t>
+            </w:r>
+            <w:proofErr w:type="spellStart"/>
+            <w:r>
+              <w:t>worplan</w:t>
+            </w:r>
+            <w:proofErr w:type="spellEnd"/>
+            <w:r>
+              <w:t>' should be 'workplan'. (</w:t>
+            </w:r>
+            <w:proofErr w:type="spellStart"/>
+            <w:r>
+              <w:t>djo</w:t>
+            </w:r>
+            <w:proofErr w:type="spellEnd"/>
+            <w:r>
+              <w:t>)</w:t>
             </w:r>
           </w:p>
         </w:tc>
@@ -7569,7 +8690,15 @@
               <w:pStyle w:val="ISOChange"/>
             </w:pPr>
             <w:r>
-              <w:t>Change 'worplan' to 'workplan'.</w:t>
+              <w:t>Change '</w:t>
+            </w:r>
+            <w:proofErr w:type="spellStart"/>
+            <w:r>
+              <w:t>worplan</w:t>
+            </w:r>
+            <w:proofErr w:type="spellEnd"/>
+            <w:r>
+              <w:t>' to 'workplan'.</w:t>
             </w:r>
           </w:p>
         </w:tc>
@@ -7589,7 +8718,15 @@
               <w:t xml:space="preserve"> - </w:t>
             </w:r>
             <w:r>
-              <w:t>changed 'worplan' to 'workplan' in Annex J.5.</w:t>
+              <w:t>changed '</w:t>
+            </w:r>
+            <w:proofErr w:type="spellStart"/>
+            <w:r>
+              <w:t>worplan</w:t>
+            </w:r>
+            <w:proofErr w:type="spellEnd"/>
+            <w:r>
+              <w:t>' to 'workplan' in Annex J.5.</w:t>
             </w:r>
           </w:p>
         </w:tc>
@@ -7676,9 +8813,11 @@
             <w:pPr>
               <w:pStyle w:val="ISOCommType"/>
             </w:pPr>
+            <w:proofErr w:type="spellStart"/>
             <w:r>
               <w:t>te</w:t>
             </w:r>
+            <w:proofErr w:type="spellEnd"/>
           </w:p>
         </w:tc>
         <w:tc>
@@ -7694,7 +8833,15 @@
               <w:pStyle w:val="ISOComments"/>
             </w:pPr>
             <w:r>
-              <w:t>APPLICATION_PROTOCOL_DEFINITION in example data sets uses year 2018. This is inconsistent with the 2026 document date. (djo)</w:t>
+              <w:t>APPLICATION_PROTOCOL_DEFINITION in example data sets uses year 2018. This is inconsistent with the 2026 document date. (</w:t>
+            </w:r>
+            <w:proofErr w:type="spellStart"/>
+            <w:r>
+              <w:t>djo</w:t>
+            </w:r>
+            <w:proofErr w:type="spellEnd"/>
+            <w:r>
+              <w:t>)</w:t>
             </w:r>
           </w:p>
         </w:tc>
@@ -7814,9 +8961,11 @@
             <w:pPr>
               <w:pStyle w:val="ISOCommType"/>
             </w:pPr>
+            <w:proofErr w:type="spellStart"/>
             <w:r>
               <w:t>te</w:t>
             </w:r>
+            <w:proofErr w:type="spellEnd"/>
           </w:p>
         </w:tc>
         <w:tc>
@@ -7832,7 +8981,47 @@
               <w:pStyle w:val="ISOComments"/>
             </w:pPr>
             <w:r>
-              <w:t>Cross-reference error: '&lt;A HREF="clause4.htm#ao-workpiece"&gt;Feedstop&lt;/a&gt;' — link text says 'Feedstop' but href points to '#ao-workpiece'. Copy-paste error. (djo)</w:t>
+              <w:t>Cross-reference error: '&lt;A HREF="clause4.htm#ao-workpiece"&gt;</w:t>
+            </w:r>
+            <w:proofErr w:type="spellStart"/>
+            <w:r>
+              <w:t>Feedstop</w:t>
+            </w:r>
+            <w:proofErr w:type="spellEnd"/>
+            <w:r>
+              <w:t>&lt;/a&gt;' — link text says '</w:t>
+            </w:r>
+            <w:proofErr w:type="spellStart"/>
+            <w:r>
+              <w:t>Feedstop</w:t>
+            </w:r>
+            <w:proofErr w:type="spellEnd"/>
+            <w:r>
+              <w:t xml:space="preserve">' but </w:t>
+            </w:r>
+            <w:proofErr w:type="spellStart"/>
+            <w:r>
+              <w:t>href</w:t>
+            </w:r>
+            <w:proofErr w:type="spellEnd"/>
+            <w:r>
+              <w:t xml:space="preserve"> points to '#</w:t>
+            </w:r>
+            <w:proofErr w:type="spellStart"/>
+            <w:r>
+              <w:t>ao</w:t>
+            </w:r>
+            <w:proofErr w:type="spellEnd"/>
+            <w:r>
+              <w:t>-workpiece'. Copy-paste error. (</w:t>
+            </w:r>
+            <w:proofErr w:type="spellStart"/>
+            <w:r>
+              <w:t>djo</w:t>
+            </w:r>
+            <w:proofErr w:type="spellEnd"/>
+            <w:r>
+              <w:t>)</w:t>
             </w:r>
           </w:p>
         </w:tc>
@@ -7849,7 +9038,15 @@
               <w:pStyle w:val="ISOChange"/>
             </w:pPr>
             <w:r>
-              <w:t>Change href to 'clause4.htm#ao-feedstop'.</w:t>
+              <w:t xml:space="preserve">Change </w:t>
+            </w:r>
+            <w:proofErr w:type="spellStart"/>
+            <w:r>
+              <w:t>href</w:t>
+            </w:r>
+            <w:proofErr w:type="spellEnd"/>
+            <w:r>
+              <w:t xml:space="preserve"> to 'clause4.htm#ao-feedstop'.</w:t>
             </w:r>
           </w:p>
         </w:tc>
@@ -7973,7 +9170,15 @@
               <w:pStyle w:val="ISOComments"/>
             </w:pPr>
             <w:r>
-              <w:t>Grammar error: 'this have since been removed' — 'this' should be 'these' (referring to plural WR1 and WR2 rules). (djo)</w:t>
+              <w:t>Grammar error: 'this have since been removed' — 'this' should be 'these' (referring to plural WR1 and WR2 rules). (</w:t>
+            </w:r>
+            <w:proofErr w:type="spellStart"/>
+            <w:r>
+              <w:t>djo</w:t>
+            </w:r>
+            <w:proofErr w:type="spellEnd"/>
+            <w:r>
+              <w:t>)</w:t>
             </w:r>
           </w:p>
         </w:tc>
@@ -8111,7 +9316,15 @@
               <w:pStyle w:val="ISOComments"/>
             </w:pPr>
             <w:r>
-              <w:t>Entry missing colon and date after standard number. All other entries follow pattern 'ISO XXXXX:YYYY, Title'. (djo)</w:t>
+              <w:t>Entry missing colon and date after standard number. All other entries follow pattern 'ISO XXXXX:YYYY, Title'. (</w:t>
+            </w:r>
+            <w:proofErr w:type="spellStart"/>
+            <w:r>
+              <w:t>djo</w:t>
+            </w:r>
+            <w:proofErr w:type="spellEnd"/>
+            <w:r>
+              <w:t>)</w:t>
             </w:r>
           </w:p>
         </w:tc>
@@ -8258,7 +9471,15 @@
               <w:pStyle w:val="ISOComments"/>
             </w:pPr>
             <w:r>
-              <w:t>Extra space before colon in subtitle: 'Application protocol : Exchange of design...' — inconsistent with all other entries. (djo)</w:t>
+              <w:t>Extra space before colon in subtitle: 'Application protocol : Exchange of design...' — inconsistent with all other entries. (</w:t>
+            </w:r>
+            <w:proofErr w:type="spellStart"/>
+            <w:r>
+              <w:t>djo</w:t>
+            </w:r>
+            <w:proofErr w:type="spellEnd"/>
+            <w:r>
+              <w:t>)</w:t>
             </w:r>
           </w:p>
         </w:tc>
@@ -8410,12 +9631,14 @@
                 <w:highlight w:val="yellow"/>
               </w:rPr>
             </w:pPr>
+            <w:proofErr w:type="spellStart"/>
             <w:r>
               <w:rPr>
                 <w:highlight w:val="yellow"/>
               </w:rPr>
               <w:t>te</w:t>
             </w:r>
+            <w:proofErr w:type="spellEnd"/>
           </w:p>
         </w:tc>
         <w:tc>
@@ -8438,7 +9661,21 @@
               <w:rPr>
                 <w:highlight w:val="yellow"/>
               </w:rPr>
-              <w:t>The product_view twin should include a property describing the phase of the twin</w:t>
+              <w:t xml:space="preserve">The </w:t>
+            </w:r>
+            <w:proofErr w:type="spellStart"/>
+            <w:r>
+              <w:rPr>
+                <w:highlight w:val="yellow"/>
+              </w:rPr>
+              <w:t>product_view</w:t>
+            </w:r>
+            <w:proofErr w:type="spellEnd"/>
+            <w:r>
+              <w:rPr>
+                <w:highlight w:val="yellow"/>
+              </w:rPr>
+              <w:t xml:space="preserve"> twin should include a property describing the phase of the twin</w:t>
             </w:r>
           </w:p>
         </w:tc>
@@ -8476,8 +9713,16 @@
               <w:rPr>
                 <w:highlight w:val="yellow"/>
               </w:rPr>
-              <w:t>Phase          :       Manufacturing_stage</w:t>
-            </w:r>
+              <w:t xml:space="preserve">Phase          :       </w:t>
+            </w:r>
+            <w:proofErr w:type="spellStart"/>
+            <w:r>
+              <w:rPr>
+                <w:highlight w:val="yellow"/>
+              </w:rPr>
+              <w:t>Manufacturing_stage</w:t>
+            </w:r>
+            <w:proofErr w:type="spellEnd"/>
           </w:p>
         </w:tc>
         <w:tc>
@@ -8615,12 +9860,14 @@
                 <w:highlight w:val="yellow"/>
               </w:rPr>
             </w:pPr>
+            <w:proofErr w:type="spellStart"/>
             <w:r>
               <w:rPr>
                 <w:highlight w:val="yellow"/>
               </w:rPr>
               <w:t>te</w:t>
             </w:r>
+            <w:proofErr w:type="spellEnd"/>
           </w:p>
         </w:tc>
         <w:tc>
@@ -8643,7 +9890,21 @@
               <w:rPr>
                 <w:highlight w:val="yellow"/>
               </w:rPr>
-              <w:t xml:space="preserve">The manufacturing_feature_twin should include a property describing the phase of the twin. </w:t>
+              <w:t xml:space="preserve">The </w:t>
+            </w:r>
+            <w:proofErr w:type="spellStart"/>
+            <w:r>
+              <w:rPr>
+                <w:highlight w:val="yellow"/>
+              </w:rPr>
+              <w:t>manufacturing_feature_twin</w:t>
+            </w:r>
+            <w:proofErr w:type="spellEnd"/>
+            <w:r>
+              <w:rPr>
+                <w:highlight w:val="yellow"/>
+              </w:rPr>
+              <w:t xml:space="preserve"> should include a property describing the phase of the twin. </w:t>
             </w:r>
           </w:p>
         </w:tc>
@@ -8681,8 +9942,16 @@
               <w:rPr>
                 <w:highlight w:val="yellow"/>
               </w:rPr>
-              <w:t>Phase          :       Manufacturing_stage</w:t>
-            </w:r>
+              <w:t xml:space="preserve">Phase          :       </w:t>
+            </w:r>
+            <w:proofErr w:type="spellStart"/>
+            <w:r>
+              <w:rPr>
+                <w:highlight w:val="yellow"/>
+              </w:rPr>
+              <w:t>Manufacturing_stage</w:t>
+            </w:r>
+            <w:proofErr w:type="spellEnd"/>
           </w:p>
         </w:tc>
         <w:tc>
@@ -8702,11 +9971,36 @@
               </w:rPr>
             </w:pPr>
             <w:r>
-              <w:rPr>
-                <w:highlight w:val="yellow"/>
-              </w:rPr>
-              <w:t>DJO/MH sort out understanding</w:t>
-            </w:r>
+              <w:t xml:space="preserve">RESOLVED (ED) </w:t>
+            </w:r>
+            <w:r>
+              <w:t>–</w:t>
+            </w:r>
+            <w:r>
+              <w:t xml:space="preserve"> </w:t>
+            </w:r>
+            <w:r>
+              <w:t xml:space="preserve">The phase is described by the feature history and </w:t>
+            </w:r>
+            <w:r>
+              <w:t>renamed</w:t>
+            </w:r>
+            <w:r>
+              <w:t xml:space="preserve"> </w:t>
+            </w:r>
+            <w:proofErr w:type="spellStart"/>
+            <w:r>
+              <w:t>Manufacturing_stage</w:t>
+            </w:r>
+            <w:proofErr w:type="spellEnd"/>
+            <w:r>
+              <w:t xml:space="preserve"> to </w:t>
+            </w:r>
+            <w:proofErr w:type="spellStart"/>
+            <w:r>
+              <w:t>Manufacturing_phase</w:t>
+            </w:r>
+            <w:proofErr w:type="spellEnd"/>
           </w:p>
         </w:tc>
       </w:tr>
@@ -8820,12 +10114,14 @@
                 <w:highlight w:val="yellow"/>
               </w:rPr>
             </w:pPr>
+            <w:proofErr w:type="spellStart"/>
             <w:r>
               <w:rPr>
                 <w:highlight w:val="yellow"/>
               </w:rPr>
               <w:t>te</w:t>
             </w:r>
+            <w:proofErr w:type="spellEnd"/>
           </w:p>
         </w:tc>
         <w:tc>
@@ -8844,11 +10140,19 @@
                 <w:highlight w:val="yellow"/>
               </w:rPr>
             </w:pPr>
-            <w:r>
-              <w:rPr>
-                <w:highlight w:val="yellow"/>
-              </w:rPr>
-              <w:t>Phase_history should be feature history..</w:t>
+            <w:proofErr w:type="spellStart"/>
+            <w:r>
+              <w:rPr>
+                <w:highlight w:val="yellow"/>
+              </w:rPr>
+              <w:t>Phase_history</w:t>
+            </w:r>
+            <w:proofErr w:type="spellEnd"/>
+            <w:r>
+              <w:rPr>
+                <w:highlight w:val="yellow"/>
+              </w:rPr>
+              <w:t xml:space="preserve"> should be feature history..</w:t>
             </w:r>
           </w:p>
         </w:tc>
@@ -8872,7 +10176,35 @@
               <w:rPr>
                 <w:highlight w:val="yellow"/>
               </w:rPr>
-              <w:t>Rename Phase_history to Feature_history and remove the phase property</w:t>
+              <w:t xml:space="preserve">Rename </w:t>
+            </w:r>
+            <w:proofErr w:type="spellStart"/>
+            <w:r>
+              <w:rPr>
+                <w:highlight w:val="yellow"/>
+              </w:rPr>
+              <w:t>Phase_history</w:t>
+            </w:r>
+            <w:proofErr w:type="spellEnd"/>
+            <w:r>
+              <w:rPr>
+                <w:highlight w:val="yellow"/>
+              </w:rPr>
+              <w:t xml:space="preserve"> to </w:t>
+            </w:r>
+            <w:proofErr w:type="spellStart"/>
+            <w:r>
+              <w:rPr>
+                <w:highlight w:val="yellow"/>
+              </w:rPr>
+              <w:t>Feature_history</w:t>
+            </w:r>
+            <w:proofErr w:type="spellEnd"/>
+            <w:r>
+              <w:rPr>
+                <w:highlight w:val="yellow"/>
+              </w:rPr>
+              <w:t xml:space="preserve"> and remove the phase property</w:t>
             </w:r>
           </w:p>
         </w:tc>
@@ -8887,18 +10219,39 @@
             </w:tcBorders>
           </w:tcPr>
           <w:p>
-            <w:pPr>
-              <w:rPr>
-                <w:highlight w:val="yellow"/>
-              </w:rPr>
-            </w:pPr>
-            <w:r>
-              <w:rPr>
-                <w:highlight w:val="yellow"/>
-              </w:rPr>
-              <w:t>DJO/MH sort out understanding</w:t>
-            </w:r>
-          </w:p>
+            <w:r>
+              <w:t>RESOLVED (ED) -</w:t>
+            </w:r>
+            <w:r>
+              <w:t xml:space="preserve"> </w:t>
+            </w:r>
+            <w:r>
+              <w:t>renamed</w:t>
+            </w:r>
+            <w:r>
+              <w:t xml:space="preserve"> </w:t>
+            </w:r>
+            <w:proofErr w:type="spellStart"/>
+            <w:r>
+              <w:t>Phase_history</w:t>
+            </w:r>
+            <w:proofErr w:type="spellEnd"/>
+            <w:r>
+              <w:t xml:space="preserve"> </w:t>
+            </w:r>
+            <w:r>
+              <w:t xml:space="preserve">to </w:t>
+            </w:r>
+            <w:proofErr w:type="spellStart"/>
+            <w:r>
+              <w:t>Feature_history</w:t>
+            </w:r>
+            <w:proofErr w:type="spellEnd"/>
+            <w:r>
+              <w:t>.</w:t>
+            </w:r>
+          </w:p>
+          <w:p/>
         </w:tc>
       </w:tr>
       <w:tr>
@@ -9011,12 +10364,14 @@
                 <w:highlight w:val="yellow"/>
               </w:rPr>
             </w:pPr>
+            <w:proofErr w:type="spellStart"/>
             <w:r>
               <w:rPr>
                 <w:highlight w:val="yellow"/>
               </w:rPr>
               <w:t>te</w:t>
             </w:r>
+            <w:proofErr w:type="spellEnd"/>
           </w:p>
         </w:tc>
         <w:tc>
@@ -9084,10 +10439,7 @@
               </w:rPr>
             </w:pPr>
             <w:r>
-              <w:rPr>
-                <w:highlight w:val="yellow"/>
-              </w:rPr>
-              <w:t>DJO/MH sort out understanding</w:t>
+              <w:t>RESOLVED (ED) - Adopted proposed solution</w:t>
             </w:r>
           </w:p>
         </w:tc>
@@ -9203,12 +10555,14 @@
                 <w:highlight w:val="yellow"/>
               </w:rPr>
             </w:pPr>
+            <w:proofErr w:type="spellStart"/>
             <w:r>
               <w:rPr>
                 <w:highlight w:val="yellow"/>
               </w:rPr>
               <w:t>ge</w:t>
             </w:r>
+            <w:proofErr w:type="spellEnd"/>
           </w:p>
         </w:tc>
         <w:tc>
@@ -9255,7 +10609,21 @@
               <w:rPr>
                 <w:highlight w:val="yellow"/>
               </w:rPr>
-              <w:t>Change name to “used_prototype” to indicate this is the item used as the product.</w:t>
+              <w:t>Change name to “</w:t>
+            </w:r>
+            <w:proofErr w:type="spellStart"/>
+            <w:r>
+              <w:rPr>
+                <w:highlight w:val="yellow"/>
+              </w:rPr>
+              <w:t>used_prototype</w:t>
+            </w:r>
+            <w:proofErr w:type="spellEnd"/>
+            <w:r>
+              <w:rPr>
+                <w:highlight w:val="yellow"/>
+              </w:rPr>
+              <w:t>” to indicate this is the item used as the product.</w:t>
             </w:r>
           </w:p>
         </w:tc>
@@ -9446,7 +10814,21 @@
               <w:rPr>
                 <w:highlight w:val="yellow"/>
               </w:rPr>
-              <w:t>Change name to “planned_prototype” to indicate this is the planned item for the product.</w:t>
+              <w:t>Change name to “</w:t>
+            </w:r>
+            <w:proofErr w:type="spellStart"/>
+            <w:r>
+              <w:rPr>
+                <w:highlight w:val="yellow"/>
+              </w:rPr>
+              <w:t>planned_prototype</w:t>
+            </w:r>
+            <w:proofErr w:type="spellEnd"/>
+            <w:r>
+              <w:rPr>
+                <w:highlight w:val="yellow"/>
+              </w:rPr>
+              <w:t>” to indicate this is the planned item for the product.</w:t>
             </w:r>
           </w:p>
         </w:tc>
@@ -9585,12 +10967,14 @@
                 <w:highlight w:val="yellow"/>
               </w:rPr>
             </w:pPr>
+            <w:proofErr w:type="spellStart"/>
             <w:r>
               <w:rPr>
                 <w:highlight w:val="yellow"/>
               </w:rPr>
               <w:t>Te</w:t>
             </w:r>
+            <w:proofErr w:type="spellEnd"/>
           </w:p>
         </w:tc>
         <w:tc>
@@ -9637,7 +11021,21 @@
               <w:rPr>
                 <w:highlight w:val="yellow"/>
               </w:rPr>
-              <w:t>Add property for the “designed_prototype” to show the as-designed item</w:t>
+              <w:t>Add property for the “</w:t>
+            </w:r>
+            <w:proofErr w:type="spellStart"/>
+            <w:r>
+              <w:rPr>
+                <w:highlight w:val="yellow"/>
+              </w:rPr>
+              <w:t>designed_prototype</w:t>
+            </w:r>
+            <w:proofErr w:type="spellEnd"/>
+            <w:r>
+              <w:rPr>
+                <w:highlight w:val="yellow"/>
+              </w:rPr>
+              <w:t>” to show the as-designed item</w:t>
             </w:r>
           </w:p>
         </w:tc>
@@ -9804,7 +11202,21 @@
               <w:rPr>
                 <w:highlight w:val="yellow"/>
               </w:rPr>
-              <w:t>The description Added_cost is too general</w:t>
+              <w:t xml:space="preserve">The description </w:t>
+            </w:r>
+            <w:proofErr w:type="spellStart"/>
+            <w:r>
+              <w:rPr>
+                <w:highlight w:val="yellow"/>
+              </w:rPr>
+              <w:t>Added_cost</w:t>
+            </w:r>
+            <w:proofErr w:type="spellEnd"/>
+            <w:r>
+              <w:rPr>
+                <w:highlight w:val="yellow"/>
+              </w:rPr>
+              <w:t xml:space="preserve"> is too general</w:t>
             </w:r>
           </w:p>
         </w:tc>
@@ -9828,8 +11240,30 @@
               <w:rPr>
                 <w:highlight w:val="yellow"/>
               </w:rPr>
-              <w:t>Change added_cost to added_wear</w:t>
-            </w:r>
+              <w:t xml:space="preserve">Change </w:t>
+            </w:r>
+            <w:proofErr w:type="spellStart"/>
+            <w:r>
+              <w:rPr>
+                <w:highlight w:val="yellow"/>
+              </w:rPr>
+              <w:t>added_cost</w:t>
+            </w:r>
+            <w:proofErr w:type="spellEnd"/>
+            <w:r>
+              <w:rPr>
+                <w:highlight w:val="yellow"/>
+              </w:rPr>
+              <w:t xml:space="preserve"> to </w:t>
+            </w:r>
+            <w:proofErr w:type="spellStart"/>
+            <w:r>
+              <w:rPr>
+                <w:highlight w:val="yellow"/>
+              </w:rPr>
+              <w:t>added_wear</w:t>
+            </w:r>
+            <w:proofErr w:type="spellEnd"/>
           </w:p>
         </w:tc>
         <w:tc>
@@ -9967,12 +11401,14 @@
                 <w:highlight w:val="yellow"/>
               </w:rPr>
             </w:pPr>
+            <w:proofErr w:type="spellStart"/>
             <w:r>
               <w:rPr>
                 <w:highlight w:val="yellow"/>
               </w:rPr>
               <w:t>Te</w:t>
             </w:r>
+            <w:proofErr w:type="spellEnd"/>
           </w:p>
         </w:tc>
         <w:tc>
@@ -10179,12 +11615,14 @@
                 <w:highlight w:val="yellow"/>
               </w:rPr>
             </w:pPr>
+            <w:proofErr w:type="spellStart"/>
             <w:r>
               <w:rPr>
                 <w:highlight w:val="yellow"/>
               </w:rPr>
               <w:t>Te</w:t>
             </w:r>
+            <w:proofErr w:type="spellEnd"/>
           </w:p>
         </w:tc>
         <w:tc>
@@ -10207,7 +11645,21 @@
               <w:rPr>
                 <w:highlight w:val="yellow"/>
               </w:rPr>
-              <w:t>Restrict processing of the identrification to an area within a closed curve</w:t>
+              <w:t xml:space="preserve">Restrict processing of the </w:t>
+            </w:r>
+            <w:proofErr w:type="spellStart"/>
+            <w:r>
+              <w:rPr>
+                <w:highlight w:val="yellow"/>
+              </w:rPr>
+              <w:t>identrification</w:t>
+            </w:r>
+            <w:proofErr w:type="spellEnd"/>
+            <w:r>
+              <w:rPr>
+                <w:highlight w:val="yellow"/>
+              </w:rPr>
+              <w:t xml:space="preserve"> to an area within a closed curve</w:t>
             </w:r>
           </w:p>
         </w:tc>
@@ -10227,12 +11679,28 @@
                 <w:highlight w:val="yellow"/>
               </w:rPr>
             </w:pPr>
-            <w:r>
-              <w:rPr>
-                <w:highlight w:val="yellow"/>
-              </w:rPr>
-              <w:t>restricted_to  : closed_composite_curve</w:t>
-            </w:r>
+            <w:proofErr w:type="spellStart"/>
+            <w:r>
+              <w:rPr>
+                <w:highlight w:val="yellow"/>
+              </w:rPr>
+              <w:t>restricted_to</w:t>
+            </w:r>
+            <w:proofErr w:type="spellEnd"/>
+            <w:r>
+              <w:rPr>
+                <w:highlight w:val="yellow"/>
+              </w:rPr>
+              <w:t xml:space="preserve">  : </w:t>
+            </w:r>
+            <w:proofErr w:type="spellStart"/>
+            <w:r>
+              <w:rPr>
+                <w:highlight w:val="yellow"/>
+              </w:rPr>
+              <w:t>closed_composite_curve</w:t>
+            </w:r>
+            <w:proofErr w:type="spellEnd"/>
           </w:p>
         </w:tc>
         <w:tc>
@@ -10365,12 +11833,14 @@
                 <w:highlight w:val="yellow"/>
               </w:rPr>
             </w:pPr>
+            <w:proofErr w:type="spellStart"/>
             <w:r>
               <w:rPr>
                 <w:highlight w:val="yellow"/>
               </w:rPr>
               <w:t>te</w:t>
             </w:r>
+            <w:proofErr w:type="spellEnd"/>
           </w:p>
           <w:p>
             <w:pPr>
@@ -10394,11 +11864,19 @@
                 <w:highlight w:val="yellow"/>
               </w:rPr>
             </w:pPr>
-            <w:r>
-              <w:rPr>
-                <w:highlight w:val="yellow"/>
-              </w:rPr>
-              <w:t>cross_section_area_parameters is mapped to be represented as seven-dimensional curve which is not supported by ISO 10303-42</w:t>
+            <w:proofErr w:type="spellStart"/>
+            <w:r>
+              <w:rPr>
+                <w:highlight w:val="yellow"/>
+              </w:rPr>
+              <w:t>cross_section_area_parameters</w:t>
+            </w:r>
+            <w:proofErr w:type="spellEnd"/>
+            <w:r>
+              <w:rPr>
+                <w:highlight w:val="yellow"/>
+              </w:rPr>
+              <w:t xml:space="preserve"> is mapped to be represented as seven-dimensional curve which is not supported by ISO 10303-42</w:t>
             </w:r>
           </w:p>
         </w:tc>
@@ -10538,8 +12016,13 @@
             </w:tcBorders>
           </w:tcPr>
           <w:p>
-            <w:r>
-              <w:t>te/ed</w:t>
+            <w:proofErr w:type="spellStart"/>
+            <w:r>
+              <w:t>te</w:t>
+            </w:r>
+            <w:proofErr w:type="spellEnd"/>
+            <w:r>
+              <w:t>/ed</w:t>
             </w:r>
           </w:p>
           <w:p/>
@@ -10554,7 +12037,15 @@
           </w:tcPr>
           <w:p>
             <w:r>
-              <w:t>There are 7 occurrences of the word "maximim”.</w:t>
+              <w:t>There are 7 occurrences of the word "</w:t>
+            </w:r>
+            <w:proofErr w:type="spellStart"/>
+            <w:r>
+              <w:t>maximim</w:t>
+            </w:r>
+            <w:proofErr w:type="spellEnd"/>
+            <w:r>
+              <w:t>”.</w:t>
             </w:r>
           </w:p>
           <w:p/>
@@ -10584,13 +12075,18 @@
           </w:tcPr>
           <w:p>
             <w:r>
-              <w:t>RESOLVED (ED)</w:t>
-            </w:r>
-            <w:r>
-              <w:t xml:space="preserve"> - </w:t>
-            </w:r>
-            <w:r>
-              <w:t>changed all 7 occurrences of 'maximim' to 'maximum' in Clause 4.</w:t>
+              <w:t xml:space="preserve">RESOLVED (ED) - </w:t>
+            </w:r>
+            <w:r>
+              <w:t>changed all 7 occurrences of '</w:t>
+            </w:r>
+            <w:proofErr w:type="spellStart"/>
+            <w:r>
+              <w:t>maximim</w:t>
+            </w:r>
+            <w:proofErr w:type="spellEnd"/>
+            <w:r>
+              <w:t>' to 'maximum' in Clause 4.</w:t>
             </w:r>
           </w:p>
         </w:tc>
@@ -10674,9 +12170,11 @@
             </w:tcBorders>
           </w:tcPr>
           <w:p>
+            <w:proofErr w:type="spellStart"/>
             <w:r>
               <w:t>te</w:t>
             </w:r>
+            <w:proofErr w:type="spellEnd"/>
           </w:p>
           <w:p/>
         </w:tc>
@@ -10690,7 +12188,15 @@
           </w:tcPr>
           <w:p>
             <w:r>
-              <w:t>Group qualifier needed in return statement in FUNCTION verify_ballnose_endmill_dimensions.</w:t>
+              <w:t xml:space="preserve">Group qualifier needed in return statement in FUNCTION </w:t>
+            </w:r>
+            <w:proofErr w:type="spellStart"/>
+            <w:r>
+              <w:t>verify_ballnose_endmill_dimensions</w:t>
+            </w:r>
+            <w:proofErr w:type="spellEnd"/>
+            <w:r>
+              <w:t>.</w:t>
             </w:r>
           </w:p>
           <w:p/>
@@ -10710,7 +12216,31 @@
           </w:p>
           <w:p>
             <w:r>
-              <w:t xml:space="preserve">(rads[1].value_component = dias[1].value_component/2)) </w:t>
+              <w:t>(rads[1].</w:t>
+            </w:r>
+            <w:proofErr w:type="spellStart"/>
+            <w:r>
+              <w:t>value_component</w:t>
+            </w:r>
+            <w:proofErr w:type="spellEnd"/>
+            <w:r>
+              <w:t xml:space="preserve"> = </w:t>
+            </w:r>
+            <w:proofErr w:type="spellStart"/>
+            <w:r>
+              <w:t>dias</w:t>
+            </w:r>
+            <w:proofErr w:type="spellEnd"/>
+            <w:r>
+              <w:t>[1].</w:t>
+            </w:r>
+            <w:proofErr w:type="spellStart"/>
+            <w:r>
+              <w:t>value_component</w:t>
+            </w:r>
+            <w:proofErr w:type="spellEnd"/>
+            <w:r>
+              <w:t xml:space="preserve">/2)) </w:t>
             </w:r>
           </w:p>
           <w:p>
@@ -10740,10 +12270,7 @@
           </w:tcPr>
           <w:p>
             <w:r>
-              <w:t xml:space="preserve">RESOLVED (ED) – If you add the group qualifier, it needs to go all the way down to measure with unit to be </w:t>
-            </w:r>
-            <w:r>
-              <w:t xml:space="preserve">correct.  Added qualifier </w:t>
+              <w:t xml:space="preserve">RESOLVED (ED) – If you add the group qualifier, it needs to go all the way down to measure with unit to be correct.  Added qualifier </w:t>
             </w:r>
             <w:r>
               <w:t>\representation_item\measure_representation_item\measure_with_unit</w:t>
@@ -10831,9 +12358,11 @@
             </w:tcBorders>
           </w:tcPr>
           <w:p>
+            <w:proofErr w:type="spellStart"/>
             <w:r>
               <w:t>te</w:t>
             </w:r>
+            <w:proofErr w:type="spellEnd"/>
           </w:p>
           <w:p/>
         </w:tc>
@@ -10847,7 +12376,15 @@
           </w:tcPr>
           <w:p>
             <w:r>
-              <w:t>Group qualifier needed in return statement in FUNCTION verify_bullnose_endmill_dimensions.</w:t>
+              <w:t xml:space="preserve">Group qualifier needed in return statement in FUNCTION </w:t>
+            </w:r>
+            <w:proofErr w:type="spellStart"/>
+            <w:r>
+              <w:t>verify_bullnose_endmill_dimensions</w:t>
+            </w:r>
+            <w:proofErr w:type="spellEnd"/>
+            <w:r>
+              <w:t>.</w:t>
             </w:r>
           </w:p>
           <w:p/>
@@ -10867,7 +12404,31 @@
           </w:p>
           <w:p>
             <w:r>
-              <w:t>(rads[1].value_component = dias[1].value_component/2))</w:t>
+              <w:t>(rads[1].</w:t>
+            </w:r>
+            <w:proofErr w:type="spellStart"/>
+            <w:r>
+              <w:t>value_component</w:t>
+            </w:r>
+            <w:proofErr w:type="spellEnd"/>
+            <w:r>
+              <w:t xml:space="preserve"> = </w:t>
+            </w:r>
+            <w:proofErr w:type="spellStart"/>
+            <w:r>
+              <w:t>dias</w:t>
+            </w:r>
+            <w:proofErr w:type="spellEnd"/>
+            <w:r>
+              <w:t>[1].</w:t>
+            </w:r>
+            <w:proofErr w:type="spellStart"/>
+            <w:r>
+              <w:t>value_component</w:t>
+            </w:r>
+            <w:proofErr w:type="spellEnd"/>
+            <w:r>
+              <w:t>/2))</w:t>
             </w:r>
           </w:p>
           <w:p>
@@ -10980,9 +12541,11 @@
             </w:tcBorders>
           </w:tcPr>
           <w:p>
+            <w:proofErr w:type="spellStart"/>
             <w:r>
               <w:t>te</w:t>
             </w:r>
+            <w:proofErr w:type="spellEnd"/>
           </w:p>
           <w:p/>
         </w:tc>
@@ -10996,7 +12559,31 @@
           </w:tcPr>
           <w:p>
             <w:r>
-              <w:t>Why is Product_view_twin identifier attribute user_serial_number mapped to be represented as a property? It seem to be inconsistent with the mapping of attribute system_serial_number.</w:t>
+              <w:t xml:space="preserve">Why is </w:t>
+            </w:r>
+            <w:proofErr w:type="spellStart"/>
+            <w:r>
+              <w:t>Product_view_twin</w:t>
+            </w:r>
+            <w:proofErr w:type="spellEnd"/>
+            <w:r>
+              <w:t xml:space="preserve"> identifier attribute </w:t>
+            </w:r>
+            <w:proofErr w:type="spellStart"/>
+            <w:r>
+              <w:t>user_serial_number</w:t>
+            </w:r>
+            <w:proofErr w:type="spellEnd"/>
+            <w:r>
+              <w:t xml:space="preserve"> mapped to be represented as a property? It seem to be inconsistent with the mapping of attribute </w:t>
+            </w:r>
+            <w:proofErr w:type="spellStart"/>
+            <w:r>
+              <w:t>system_serial_number</w:t>
+            </w:r>
+            <w:proofErr w:type="spellEnd"/>
+            <w:r>
+              <w:t>.</w:t>
             </w:r>
           </w:p>
           <w:p/>
@@ -11011,7 +12598,23 @@
           </w:tcPr>
           <w:p>
             <w:r>
-              <w:t>No need to change but expected mapping was the use of ISO 10303-41 identification_assignment and identification_role, as documented in earlier AP238 ed4 version (WG15 N265).</w:t>
+              <w:t xml:space="preserve">No need to change but expected mapping was the use of ISO 10303-41 </w:t>
+            </w:r>
+            <w:proofErr w:type="spellStart"/>
+            <w:r>
+              <w:t>identification_assignment</w:t>
+            </w:r>
+            <w:proofErr w:type="spellEnd"/>
+            <w:r>
+              <w:t xml:space="preserve"> and </w:t>
+            </w:r>
+            <w:proofErr w:type="spellStart"/>
+            <w:r>
+              <w:t>identification_role</w:t>
+            </w:r>
+            <w:proofErr w:type="spellEnd"/>
+            <w:r>
+              <w:t>, as documented in earlier AP238 ed4 version (WG15 N265).</w:t>
             </w:r>
           </w:p>
           <w:p/>
@@ -11107,9 +12710,11 @@
             </w:tcBorders>
           </w:tcPr>
           <w:p>
+            <w:proofErr w:type="spellStart"/>
             <w:r>
               <w:t>te</w:t>
             </w:r>
+            <w:proofErr w:type="spellEnd"/>
           </w:p>
           <w:p/>
         </w:tc>
@@ -11125,7 +12730,7 @@
             <w:r>
               <w:t xml:space="preserve">constructive_geometry_representation.wr2 issue, also documented in </w:t>
             </w:r>
-            <w:hyperlink r:id="rId7" w:tgtFrame="_blank" w:history="1">
+            <w:hyperlink r:id="rId11" w:tgtFrame="_blank" w:history="1">
               <w:r>
                 <w:rPr>
                   <w:rStyle w:val="Hyperlink"/>
@@ -11151,7 +12756,31 @@
           </w:p>
           <w:p>
             <w:r>
-              <w:t>"TYPEOF(cgr_i)) &amp;lt;&amp;gt; 1))) = 0;"</w:t>
+              <w:t>"TYPEOF(</w:t>
+            </w:r>
+            <w:proofErr w:type="spellStart"/>
+            <w:r>
+              <w:t>cgr_i</w:t>
+            </w:r>
+            <w:proofErr w:type="spellEnd"/>
+            <w:r>
+              <w:t>)) &amp;</w:t>
+            </w:r>
+            <w:proofErr w:type="spellStart"/>
+            <w:r>
+              <w:t>lt</w:t>
+            </w:r>
+            <w:proofErr w:type="spellEnd"/>
+            <w:r>
+              <w:t>;&amp;</w:t>
+            </w:r>
+            <w:proofErr w:type="spellStart"/>
+            <w:r>
+              <w:t>gt</w:t>
+            </w:r>
+            <w:proofErr w:type="spellEnd"/>
+            <w:r>
+              <w:t>; 1))) = 0;"</w:t>
             </w:r>
           </w:p>
           <w:p>
@@ -11161,7 +12790,15 @@
           </w:p>
           <w:p>
             <w:r>
-              <w:t>"TYPEOF(cgr_i)) = 1))) = 0;"</w:t>
+              <w:t>"TYPEOF(</w:t>
+            </w:r>
+            <w:proofErr w:type="spellStart"/>
+            <w:r>
+              <w:t>cgr_i</w:t>
+            </w:r>
+            <w:proofErr w:type="spellEnd"/>
+            <w:r>
+              <w:t>)) = 1))) = 0;"</w:t>
             </w:r>
           </w:p>
           <w:p/>
@@ -11290,12 +12927,14 @@
                 <w:highlight w:val="yellow"/>
               </w:rPr>
             </w:pPr>
+            <w:proofErr w:type="spellStart"/>
             <w:r>
               <w:rPr>
                 <w:highlight w:val="yellow"/>
               </w:rPr>
               <w:t>te</w:t>
             </w:r>
+            <w:proofErr w:type="spellEnd"/>
           </w:p>
           <w:p>
             <w:pPr>
@@ -11323,7 +12962,21 @@
               <w:rPr>
                 <w:highlight w:val="yellow"/>
               </w:rPr>
-              <w:t>The Tool_life_estimate entity differ from our recent discussion of Tool Paths as a Service.</w:t>
+              <w:t xml:space="preserve">The </w:t>
+            </w:r>
+            <w:proofErr w:type="spellStart"/>
+            <w:r>
+              <w:rPr>
+                <w:highlight w:val="yellow"/>
+              </w:rPr>
+              <w:t>Tool_life_estimate</w:t>
+            </w:r>
+            <w:proofErr w:type="spellEnd"/>
+            <w:r>
+              <w:rPr>
+                <w:highlight w:val="yellow"/>
+              </w:rPr>
+              <w:t xml:space="preserve"> entity differ from our recent discussion of Tool Paths as a Service.</w:t>
             </w:r>
           </w:p>
           <w:p>
@@ -11535,10 +13188,7 @@
           </w:tcPr>
           <w:p>
             <w:r>
-              <w:t>RESOLVED (ED)</w:t>
-            </w:r>
-            <w:r>
-              <w:t xml:space="preserve"> - Adopted proposed solution</w:t>
+              <w:t>RESOLVED (ED) - Adopted proposed solution</w:t>
             </w:r>
           </w:p>
         </w:tc>
@@ -11692,13 +13342,7 @@
           </w:tcPr>
           <w:p>
             <w:r>
-              <w:t>RESOLVED (ED)</w:t>
-            </w:r>
-            <w:r>
-              <w:t xml:space="preserve"> - </w:t>
-            </w:r>
-            <w:r>
-              <w:t>Moved to introduction</w:t>
+              <w:t>RESOLVED (ED) - Moved to introduction</w:t>
             </w:r>
           </w:p>
         </w:tc>
@@ -11852,13 +13496,7 @@
           </w:tcPr>
           <w:p>
             <w:r>
-              <w:t>RESOLVED (ED)</w:t>
-            </w:r>
-            <w:r>
-              <w:t xml:space="preserve"> - </w:t>
-            </w:r>
-            <w:r>
-              <w:t>Moved to introduction</w:t>
+              <w:t>RESOLVED (ED) - Moved to introduction</w:t>
             </w:r>
           </w:p>
         </w:tc>
@@ -12017,10 +13655,7 @@
           </w:tcPr>
           <w:p>
             <w:r>
-              <w:t>RESOLVED (ED)</w:t>
-            </w:r>
-            <w:r>
-              <w:t xml:space="preserve"> - Adopted proposed solution</w:t>
+              <w:t>RESOLVED (ED) - Adopted proposed solution</w:t>
             </w:r>
           </w:p>
         </w:tc>
@@ -12176,8 +13811,13 @@
               <w:pStyle w:val="ISOChange"/>
             </w:pPr>
             <w:r>
-              <w:t>The exclusions above include: xxxx</w:t>
-            </w:r>
+              <w:t xml:space="preserve">The exclusions above include: </w:t>
+            </w:r>
+            <w:proofErr w:type="spellStart"/>
+            <w:r>
+              <w:t>xxxx</w:t>
+            </w:r>
+            <w:proofErr w:type="spellEnd"/>
           </w:p>
         </w:tc>
         <w:tc>
@@ -12191,10 +13831,7 @@
           <w:p>
             <w:r>
               <w:lastRenderedPageBreak/>
-              <w:t>RESOLVED (ED)</w:t>
-            </w:r>
-            <w:r>
-              <w:t xml:space="preserve"> - Adopted proposed solution</w:t>
+              <w:t>RESOLVED (ED) - Adopted proposed solution</w:t>
             </w:r>
           </w:p>
         </w:tc>
@@ -12486,7 +14123,7 @@
             <w:r>
               <w:t xml:space="preserve">Clause 3 is not formatted (does not contain the correct content) correctly per ISO/IEC Directives, Part 2, </w:t>
             </w:r>
-            <w:hyperlink r:id="rId8" w:history="1">
+            <w:hyperlink r:id="rId12" w:history="1">
               <w:r>
                 <w:rPr>
                   <w:rStyle w:val="Hyperlink"/>
@@ -12795,7 +14432,7 @@
             <w:r>
               <w:t xml:space="preserve">Use correct ISO verbal forms shown in the tables in ISO/IEC Directives, Part 2, </w:t>
             </w:r>
-            <w:hyperlink r:id="rId9" w:history="1">
+            <w:hyperlink r:id="rId13" w:history="1">
               <w:r>
                 <w:rPr>
                   <w:rStyle w:val="Hyperlink"/>
@@ -12877,13 +14514,7 @@
           </w:tcPr>
           <w:p>
             <w:r>
-              <w:t>RESOLVED (ED)</w:t>
-            </w:r>
-            <w:r>
-              <w:t xml:space="preserve"> - </w:t>
-            </w:r>
-            <w:r>
-              <w:t>Adopted IDP2 clause 7 wording</w:t>
+              <w:t>RESOLVED (ED) - Adopted IDP2 clause 7 wording</w:t>
             </w:r>
           </w:p>
         </w:tc>
@@ -13006,8 +14637,16 @@
               <w:rPr>
                 <w:lang w:val="en-US"/>
               </w:rPr>
-              <w:t>5.1.4 Mapping specification for workpiece UoF</w:t>
-            </w:r>
+              <w:t xml:space="preserve">5.1.4 Mapping specification for workpiece </w:t>
+            </w:r>
+            <w:proofErr w:type="spellStart"/>
+            <w:r>
+              <w:rPr>
+                <w:lang w:val="en-US"/>
+              </w:rPr>
+              <w:t>UoF</w:t>
+            </w:r>
+            <w:proofErr w:type="spellEnd"/>
           </w:p>
           <w:p>
             <w:pPr>
@@ -13020,7 +14659,21 @@
               <w:rPr>
                 <w:lang w:val="en-US"/>
               </w:rPr>
-              <w:t>The mapping specification for the application objects in this UoF shall be as defined by ISO 10303-1006, ISO 10303-1026, ISO 10303-1030, ISO 10303-1110, ISO 10303-1118, ISO 10303-1681, and the specification below.</w:t>
+              <w:t xml:space="preserve">The mapping specification for the application objects in this </w:t>
+            </w:r>
+            <w:proofErr w:type="spellStart"/>
+            <w:r>
+              <w:rPr>
+                <w:lang w:val="en-US"/>
+              </w:rPr>
+              <w:t>UoF</w:t>
+            </w:r>
+            <w:proofErr w:type="spellEnd"/>
+            <w:r>
+              <w:rPr>
+                <w:lang w:val="en-US"/>
+              </w:rPr>
+              <w:t xml:space="preserve"> shall be as defined by ISO 10303-1006, ISO 10303-1026, ISO 10303-1030, ISO 10303-1110, ISO 10303-1118, ISO 10303-1681, and the specification below.</w:t>
             </w:r>
           </w:p>
           <w:p>
@@ -13030,7 +14683,7 @@
                 <w:lang w:val="en-US"/>
               </w:rPr>
             </w:pPr>
-            <w:hyperlink r:id="rId10" w:anchor="ao-workpiece" w:history="1">
+            <w:hyperlink r:id="rId14" w:anchor="ao-workpiece" w:history="1">
               <w:r>
                 <w:rPr>
                   <w:rStyle w:val="Hyperlink"/>
@@ -13045,7 +14698,7 @@
               </w:rPr>
               <w:t> </w:t>
             </w:r>
-            <w:hyperlink r:id="rId11" w:anchor="workpiece" w:history="1">
+            <w:hyperlink r:id="rId15" w:anchor="workpiece" w:history="1">
               <w:r>
                 <w:rPr>
                   <w:rStyle w:val="Hyperlink"/>
@@ -13123,12 +14776,14 @@
                       <w:lang w:val="en-US"/>
                     </w:rPr>
                   </w:pPr>
+                  <w:proofErr w:type="spellStart"/>
                   <w:r>
                     <w:rPr>
                       <w:lang w:val="en-US"/>
                     </w:rPr>
                     <w:t>product_definition</w:t>
                   </w:r>
+                  <w:proofErr w:type="spellEnd"/>
                 </w:p>
               </w:tc>
             </w:tr>
@@ -13213,7 +14868,15 @@
           </w:tcPr>
           <w:p>
             <w:r>
-              <w:t>RESOLVED (ED) – Added subclause headings for UoFs and in Annex K</w:t>
+              <w:t xml:space="preserve">RESOLVED (ED) – Added subclause headings for </w:t>
+            </w:r>
+            <w:proofErr w:type="spellStart"/>
+            <w:r>
+              <w:t>UoFs</w:t>
+            </w:r>
+            <w:proofErr w:type="spellEnd"/>
+            <w:r>
+              <w:t xml:space="preserve"> and in Annex K</w:t>
             </w:r>
           </w:p>
         </w:tc>
@@ -13345,10 +15008,7 @@
           </w:tcPr>
           <w:p>
             <w:r>
-              <w:t>RESOLVED (ED)</w:t>
-            </w:r>
-            <w:r>
-              <w:t xml:space="preserve"> - Adopted proposed solution</w:t>
+              <w:t>RESOLVED (ED) - Adopted proposed solution</w:t>
             </w:r>
           </w:p>
         </w:tc>
@@ -13536,13 +15196,7 @@
           </w:tcPr>
           <w:p>
             <w:r>
-              <w:t>RESOLVED (ED)</w:t>
-            </w:r>
-            <w:r>
-              <w:t xml:space="preserve"> - </w:t>
-            </w:r>
-            <w:r>
-              <w:t>Clarified to a single implementation method</w:t>
+              <w:t>RESOLVED (ED) - Clarified to a single implementation method</w:t>
             </w:r>
           </w:p>
         </w:tc>
@@ -13694,10 +15348,7 @@
           </w:tcPr>
           <w:p>
             <w:r>
-              <w:t>RESOLVED (ED) – All annexes are clearly marked as normative or informative</w:t>
-            </w:r>
-            <w:r>
-              <w:t>.  Verified all annexes are referenced.</w:t>
+              <w:t>RESOLVED (ED) – All annexes are clearly marked as normative or informative.  Verified all annexes are referenced.</w:t>
             </w:r>
           </w:p>
         </w:tc>
@@ -13705,10 +15356,10 @@
     </w:tbl>
     <w:p/>
     <w:sectPr>
-      <w:headerReference w:type="default" r:id="rId12"/>
-      <w:footerReference w:type="default" r:id="rId13"/>
-      <w:headerReference w:type="first" r:id="rId14"/>
-      <w:footerReference w:type="first" r:id="rId15"/>
+      <w:headerReference w:type="default" r:id="rId16"/>
+      <w:footerReference w:type="default" r:id="rId17"/>
+      <w:headerReference w:type="first" r:id="rId18"/>
+      <w:footerReference w:type="first" r:id="rId19"/>
       <w:type w:val="continuous"/>
       <w:pgSz w:w="16840" w:h="11907" w:orient="landscape" w:code="9"/>
       <w:pgMar w:top="851" w:right="851" w:bottom="851" w:left="851" w:header="567" w:footer="567" w:gutter="0"/>
@@ -13718,6 +15369,50 @@
     </w:sectPr>
   </w:body>
 </w:document>
+</file>
+
+<file path=word/comments.xml><?xml version="1.0" encoding="utf-8"?>
+<w:comments xmlns:wpc="http://schemas.microsoft.com/office/word/2010/wordprocessingCanvas" xmlns:cx="http://schemas.microsoft.com/office/drawing/2014/chartex" xmlns:cx1="http://schemas.microsoft.com/office/drawing/2015/9/8/chartex" xmlns:cx2="http://schemas.microsoft.com/office/drawing/2015/10/21/chartex" xmlns:cx3="http://schemas.microsoft.com/office/drawing/2016/5/9/chartex" xmlns:cx4="http://schemas.microsoft.com/office/drawing/2016/5/10/chartex" xmlns:cx5="http://schemas.microsoft.com/office/drawing/2016/5/11/chartex" xmlns:cx6="http://schemas.microsoft.com/office/drawing/2016/5/12/chartex" xmlns:cx7="http://schemas.microsoft.com/office/drawing/2016/5/13/chartex" xmlns:cx8="http://schemas.microsoft.com/office/drawing/2016/5/14/chartex" xmlns:mc="http://schemas.openxmlformats.org/markup-compatibility/2006" xmlns:aink="http://schemas.microsoft.com/office/drawing/2016/ink" xmlns:am3d="http://schemas.microsoft.com/office/drawing/2017/model3d" xmlns:o="urn:schemas-microsoft-com:office:office" xmlns:oel="http://schemas.microsoft.com/office/2019/extlst" xmlns:r="http://schemas.openxmlformats.org/officeDocument/2006/relationships" xmlns:m="http://schemas.openxmlformats.org/officeDocument/2006/math" xmlns:v="urn:schemas-microsoft-com:vml" xmlns:wp14="http://schemas.microsoft.com/office/word/2010/wordprocessingDrawing" xmlns:wp="http://schemas.openxmlformats.org/drawingml/2006/wordprocessingDrawing" xmlns:w10="urn:schemas-microsoft-com:office:word" xmlns:w="http://schemas.openxmlformats.org/wordprocessingml/2006/main" xmlns:w14="http://schemas.microsoft.com/office/word/2010/wordml" xmlns:w15="http://schemas.microsoft.com/office/word/2012/wordml" xmlns:w16cex="http://schemas.microsoft.com/office/word/2018/wordml/cex" xmlns:w16cid="http://schemas.microsoft.com/office/word/2016/wordml/cid" xmlns:w16="http://schemas.microsoft.com/office/word/2018/wordml" xmlns:w16du="http://schemas.microsoft.com/office/word/2023/wordml/word16du" xmlns:w16sdtdh="http://schemas.microsoft.com/office/word/2020/wordml/sdtdatahash" xmlns:w16sdtfl="http://schemas.microsoft.com/office/word/2024/wordml/sdtformatlock" xmlns:w16se="http://schemas.microsoft.com/office/word/2015/wordml/symex" xmlns:wpg="http://schemas.microsoft.com/office/word/2010/wordprocessingGroup" xmlns:wpi="http://schemas.microsoft.com/office/word/2010/wordprocessingInk" xmlns:wne="http://schemas.microsoft.com/office/word/2006/wordml" xmlns:wps="http://schemas.microsoft.com/office/word/2010/wordprocessingShape" mc:Ignorable="w14 w15 w16se w16cid w16 w16cex w16sdtdh w16sdtfl w16du wp14">
+  <w:comment w:id="0" w:author="hardwick" w:date="2026-09-27T11:28:00Z" w:initials="h">
+    <w:p>
+      <w:pPr>
+        <w:pStyle w:val="CommentText"/>
+      </w:pPr>
+      <w:r>
+        <w:rPr>
+          <w:rStyle w:val="CommentReference"/>
+        </w:rPr>
+        <w:annotationRef/>
+      </w:r>
+      <w:r>
+        <w:t>US24</w:t>
+      </w:r>
+    </w:p>
+    <w:p>
+      <w:pPr>
+        <w:pStyle w:val="CommentText"/>
+      </w:pPr>
+    </w:p>
+  </w:comment>
+</w:comments>
+</file>
+
+<file path=word/commentsExtended.xml><?xml version="1.0" encoding="utf-8"?>
+<w15:commentsEx xmlns:wpc="http://schemas.microsoft.com/office/word/2010/wordprocessingCanvas" xmlns:cx="http://schemas.microsoft.com/office/drawing/2014/chartex" xmlns:cx1="http://schemas.microsoft.com/office/drawing/2015/9/8/chartex" xmlns:cx2="http://schemas.microsoft.com/office/drawing/2015/10/21/chartex" xmlns:cx3="http://schemas.microsoft.com/office/drawing/2016/5/9/chartex" xmlns:cx4="http://schemas.microsoft.com/office/drawing/2016/5/10/chartex" xmlns:cx5="http://schemas.microsoft.com/office/drawing/2016/5/11/chartex" xmlns:cx6="http://schemas.microsoft.com/office/drawing/2016/5/12/chartex" xmlns:cx7="http://schemas.microsoft.com/office/drawing/2016/5/13/chartex" xmlns:cx8="http://schemas.microsoft.com/office/drawing/2016/5/14/chartex" xmlns:mc="http://schemas.openxmlformats.org/markup-compatibility/2006" xmlns:aink="http://schemas.microsoft.com/office/drawing/2016/ink" xmlns:am3d="http://schemas.microsoft.com/office/drawing/2017/model3d" xmlns:o="urn:schemas-microsoft-com:office:office" xmlns:oel="http://schemas.microsoft.com/office/2019/extlst" xmlns:r="http://schemas.openxmlformats.org/officeDocument/2006/relationships" xmlns:m="http://schemas.openxmlformats.org/officeDocument/2006/math" xmlns:v="urn:schemas-microsoft-com:vml" xmlns:wp14="http://schemas.microsoft.com/office/word/2010/wordprocessingDrawing" xmlns:wp="http://schemas.openxmlformats.org/drawingml/2006/wordprocessingDrawing" xmlns:w10="urn:schemas-microsoft-com:office:word" xmlns:w="http://schemas.openxmlformats.org/wordprocessingml/2006/main" xmlns:w14="http://schemas.microsoft.com/office/word/2010/wordml" xmlns:w15="http://schemas.microsoft.com/office/word/2012/wordml" xmlns:w16cex="http://schemas.microsoft.com/office/word/2018/wordml/cex" xmlns:w16cid="http://schemas.microsoft.com/office/word/2016/wordml/cid" xmlns:w16="http://schemas.microsoft.com/office/word/2018/wordml" xmlns:w16du="http://schemas.microsoft.com/office/word/2023/wordml/word16du" xmlns:w16sdtdh="http://schemas.microsoft.com/office/word/2020/wordml/sdtdatahash" xmlns:w16sdtfl="http://schemas.microsoft.com/office/word/2024/wordml/sdtformatlock" xmlns:w16se="http://schemas.microsoft.com/office/word/2015/wordml/symex" xmlns:wpg="http://schemas.microsoft.com/office/word/2010/wordprocessingGroup" xmlns:wpi="http://schemas.microsoft.com/office/word/2010/wordprocessingInk" xmlns:wne="http://schemas.microsoft.com/office/word/2006/wordml" xmlns:wps="http://schemas.microsoft.com/office/word/2010/wordprocessingShape" mc:Ignorable="w14 w15 w16se w16cid w16 w16cex w16sdtdh w16sdtfl w16du wp14">
+  <w15:commentEx w15:paraId="552CC790" w15:done="0"/>
+</w15:commentsEx>
+</file>
+
+<file path=word/commentsExtensible.xml><?xml version="1.0" encoding="utf-8"?>
+<w16cex:commentsExtensible xmlns:wpc="http://schemas.microsoft.com/office/word/2010/wordprocessingCanvas" xmlns:cx="http://schemas.microsoft.com/office/drawing/2014/chartex" xmlns:cx1="http://schemas.microsoft.com/office/drawing/2015/9/8/chartex" xmlns:cx2="http://schemas.microsoft.com/office/drawing/2015/10/21/chartex" xmlns:cx3="http://schemas.microsoft.com/office/drawing/2016/5/9/chartex" xmlns:cx4="http://schemas.microsoft.com/office/drawing/2016/5/10/chartex" xmlns:cx5="http://schemas.microsoft.com/office/drawing/2016/5/11/chartex" xmlns:cx6="http://schemas.microsoft.com/office/drawing/2016/5/12/chartex" xmlns:cx7="http://schemas.microsoft.com/office/drawing/2016/5/13/chartex" xmlns:cx8="http://schemas.microsoft.com/office/drawing/2016/5/14/chartex" xmlns:cr="http://schemas.microsoft.com/office/comments/2020/reactions" xmlns:mc="http://schemas.openxmlformats.org/markup-compatibility/2006" xmlns:aink="http://schemas.microsoft.com/office/drawing/2016/ink" xmlns:am3d="http://schemas.microsoft.com/office/drawing/2017/model3d" xmlns:o="urn:schemas-microsoft-com:office:office" xmlns:oel="http://schemas.microsoft.com/office/2019/extlst" xmlns:r="http://schemas.openxmlformats.org/officeDocument/2006/relationships" xmlns:m="http://schemas.openxmlformats.org/officeDocument/2006/math" xmlns:v="urn:schemas-microsoft-com:vml" xmlns:wp14="http://schemas.microsoft.com/office/word/2010/wordprocessingDrawing" xmlns:wp="http://schemas.openxmlformats.org/drawingml/2006/wordprocessingDrawing" xmlns:w10="urn:schemas-microsoft-com:office:word" xmlns:w="http://schemas.openxmlformats.org/wordprocessingml/2006/main" xmlns:w14="http://schemas.microsoft.com/office/word/2010/wordml" xmlns:w15="http://schemas.microsoft.com/office/word/2012/wordml" xmlns:w16cex="http://schemas.microsoft.com/office/word/2018/wordml/cex" xmlns:w16cid="http://schemas.microsoft.com/office/word/2016/wordml/cid" xmlns:w16="http://schemas.microsoft.com/office/word/2018/wordml" xmlns:w16du="http://schemas.microsoft.com/office/word/2023/wordml/word16du" xmlns:w16sdtdh="http://schemas.microsoft.com/office/word/2020/wordml/sdtdatahash" xmlns:w16sdtfl="http://schemas.microsoft.com/office/word/2024/wordml/sdtformatlock" xmlns:w16se="http://schemas.microsoft.com/office/word/2015/wordml/symex" xmlns:wpg="http://schemas.microsoft.com/office/word/2010/wordprocessingGroup" xmlns:wpi="http://schemas.microsoft.com/office/word/2010/wordprocessingInk" xmlns:wne="http://schemas.microsoft.com/office/word/2006/wordml" xmlns:wps="http://schemas.microsoft.com/office/word/2010/wordprocessingShape" mc:Ignorable="w14 w15 w16se w16cid w16 w16cex w16sdtdh w16sdtfl cr w16du wp14">
+  <w16cex:commentExtensible w16cex:durableId="1019C92C" w16cex:dateUtc="2026-09-27T15:28:00Z"/>
+</w16cex:commentsExtensible>
+</file>
+
+<file path=word/commentsIds.xml><?xml version="1.0" encoding="utf-8"?>
+<w16cid:commentsIds xmlns:wpc="http://schemas.microsoft.com/office/word/2010/wordprocessingCanvas" xmlns:cx="http://schemas.microsoft.com/office/drawing/2014/chartex" xmlns:cx1="http://schemas.microsoft.com/office/drawing/2015/9/8/chartex" xmlns:cx2="http://schemas.microsoft.com/office/drawing/2015/10/21/chartex" xmlns:cx3="http://schemas.microsoft.com/office/drawing/2016/5/9/chartex" xmlns:cx4="http://schemas.microsoft.com/office/drawing/2016/5/10/chartex" xmlns:cx5="http://schemas.microsoft.com/office/drawing/2016/5/11/chartex" xmlns:cx6="http://schemas.microsoft.com/office/drawing/2016/5/12/chartex" xmlns:cx7="http://schemas.microsoft.com/office/drawing/2016/5/13/chartex" xmlns:cx8="http://schemas.microsoft.com/office/drawing/2016/5/14/chartex" xmlns:mc="http://schemas.openxmlformats.org/markup-compatibility/2006" xmlns:aink="http://schemas.microsoft.com/office/drawing/2016/ink" xmlns:am3d="http://schemas.microsoft.com/office/drawing/2017/model3d" xmlns:o="urn:schemas-microsoft-com:office:office" xmlns:oel="http://schemas.microsoft.com/office/2019/extlst" xmlns:r="http://schemas.openxmlformats.org/officeDocument/2006/relationships" xmlns:m="http://schemas.openxmlformats.org/officeDocument/2006/math" xmlns:v="urn:schemas-microsoft-com:vml" xmlns:wp14="http://schemas.microsoft.com/office/word/2010/wordprocessingDrawing" xmlns:wp="http://schemas.openxmlformats.org/drawingml/2006/wordprocessingDrawing" xmlns:w10="urn:schemas-microsoft-com:office:word" xmlns:w="http://schemas.openxmlformats.org/wordprocessingml/2006/main" xmlns:w14="http://schemas.microsoft.com/office/word/2010/wordml" xmlns:w15="http://schemas.microsoft.com/office/word/2012/wordml" xmlns:w16cex="http://schemas.microsoft.com/office/word/2018/wordml/cex" xmlns:w16cid="http://schemas.microsoft.com/office/word/2016/wordml/cid" xmlns:w16="http://schemas.microsoft.com/office/word/2018/wordml" xmlns:w16du="http://schemas.microsoft.com/office/word/2023/wordml/word16du" xmlns:w16sdtdh="http://schemas.microsoft.com/office/word/2020/wordml/sdtdatahash" xmlns:w16sdtfl="http://schemas.microsoft.com/office/word/2024/wordml/sdtformatlock" xmlns:w16se="http://schemas.microsoft.com/office/word/2015/wordml/symex" xmlns:wpg="http://schemas.microsoft.com/office/word/2010/wordprocessingGroup" xmlns:wpi="http://schemas.microsoft.com/office/word/2010/wordprocessingInk" xmlns:wne="http://schemas.microsoft.com/office/word/2006/wordml" xmlns:wps="http://schemas.microsoft.com/office/word/2010/wordprocessingShape" mc:Ignorable="w14 w15 w16se w16cid w16 w16cex w16sdtdh w16sdtfl w16du wp14">
+  <w16cid:commentId w16cid:paraId="552CC790" w16cid:durableId="1019C92C"/>
+</w16cid:commentsIds>
 </file>
 
 <file path=word/endnotes.xml><?xml version="1.0" encoding="utf-8"?>
@@ -13865,6 +15560,7 @@
       </w:rPr>
       <w:tab/>
     </w:r>
+    <w:proofErr w:type="spellStart"/>
     <w:r>
       <w:rPr>
         <w:rStyle w:val="PageNumber"/>
@@ -13873,6 +15569,7 @@
       </w:rPr>
       <w:t>ge</w:t>
     </w:r>
+    <w:proofErr w:type="spellEnd"/>
     <w:r>
       <w:rPr>
         <w:rStyle w:val="PageNumber"/>
@@ -13889,6 +15586,7 @@
       </w:rPr>
       <w:tab/>
     </w:r>
+    <w:proofErr w:type="spellStart"/>
     <w:r>
       <w:rPr>
         <w:rStyle w:val="PageNumber"/>
@@ -13897,6 +15595,7 @@
       </w:rPr>
       <w:t>te</w:t>
     </w:r>
+    <w:proofErr w:type="spellEnd"/>
     <w:r>
       <w:rPr>
         <w:rStyle w:val="PageNumber"/>
@@ -14249,7 +15948,24 @@
         <w:sz w:val="16"/>
       </w:rPr>
       <w:tab/>
-      <w:t>ge = general</w:t>
+    </w:r>
+    <w:proofErr w:type="spellStart"/>
+    <w:r>
+      <w:rPr>
+        <w:rStyle w:val="PageNumber"/>
+        <w:bCs/>
+        <w:sz w:val="16"/>
+      </w:rPr>
+      <w:t>ge</w:t>
+    </w:r>
+    <w:proofErr w:type="spellEnd"/>
+    <w:r>
+      <w:rPr>
+        <w:rStyle w:val="PageNumber"/>
+        <w:bCs/>
+        <w:sz w:val="16"/>
+      </w:rPr>
+      <w:t xml:space="preserve"> = general</w:t>
     </w:r>
     <w:r>
       <w:rPr>
@@ -14258,7 +15974,24 @@
         <w:sz w:val="16"/>
       </w:rPr>
       <w:tab/>
-      <w:t xml:space="preserve">te = technical </w:t>
+    </w:r>
+    <w:proofErr w:type="spellStart"/>
+    <w:r>
+      <w:rPr>
+        <w:rStyle w:val="PageNumber"/>
+        <w:bCs/>
+        <w:sz w:val="16"/>
+      </w:rPr>
+      <w:t>te</w:t>
+    </w:r>
+    <w:proofErr w:type="spellEnd"/>
+    <w:r>
+      <w:rPr>
+        <w:rStyle w:val="PageNumber"/>
+        <w:bCs/>
+        <w:sz w:val="16"/>
+      </w:rPr>
+      <w:t xml:space="preserve"> = technical </w:t>
     </w:r>
     <w:r>
       <w:rPr>
@@ -15115,8 +16848,13 @@
         </w:tcPr>
         <w:p>
           <w:r>
-            <w:t>Type of com-ment</w:t>
+            <w:t>Type of com-</w:t>
           </w:r>
+          <w:proofErr w:type="spellStart"/>
+          <w:r>
+            <w:t>ment</w:t>
+          </w:r>
+          <w:proofErr w:type="spellEnd"/>
           <w:r>
             <w:rPr>
               <w:bCs/>
@@ -15640,6 +17378,14 @@
     <w:abstractNumId w:val="0"/>
   </w:num>
 </w:numbering>
+</file>
+
+<file path=word/people.xml><?xml version="1.0" encoding="utf-8"?>
+<w15:people xmlns:wpc="http://schemas.microsoft.com/office/word/2010/wordprocessingCanvas" xmlns:cx="http://schemas.microsoft.com/office/drawing/2014/chartex" xmlns:cx1="http://schemas.microsoft.com/office/drawing/2015/9/8/chartex" xmlns:cx2="http://schemas.microsoft.com/office/drawing/2015/10/21/chartex" xmlns:cx3="http://schemas.microsoft.com/office/drawing/2016/5/9/chartex" xmlns:cx4="http://schemas.microsoft.com/office/drawing/2016/5/10/chartex" xmlns:cx5="http://schemas.microsoft.com/office/drawing/2016/5/11/chartex" xmlns:cx6="http://schemas.microsoft.com/office/drawing/2016/5/12/chartex" xmlns:cx7="http://schemas.microsoft.com/office/drawing/2016/5/13/chartex" xmlns:cx8="http://schemas.microsoft.com/office/drawing/2016/5/14/chartex" xmlns:mc="http://schemas.openxmlformats.org/markup-compatibility/2006" xmlns:aink="http://schemas.microsoft.com/office/drawing/2016/ink" xmlns:am3d="http://schemas.microsoft.com/office/drawing/2017/model3d" xmlns:o="urn:schemas-microsoft-com:office:office" xmlns:oel="http://schemas.microsoft.com/office/2019/extlst" xmlns:r="http://schemas.openxmlformats.org/officeDocument/2006/relationships" xmlns:m="http://schemas.openxmlformats.org/officeDocument/2006/math" xmlns:v="urn:schemas-microsoft-com:vml" xmlns:wp14="http://schemas.microsoft.com/office/word/2010/wordprocessingDrawing" xmlns:wp="http://schemas.openxmlformats.org/drawingml/2006/wordprocessingDrawing" xmlns:w10="urn:schemas-microsoft-com:office:word" xmlns:w="http://schemas.openxmlformats.org/wordprocessingml/2006/main" xmlns:w14="http://schemas.microsoft.com/office/word/2010/wordml" xmlns:w15="http://schemas.microsoft.com/office/word/2012/wordml" xmlns:w16cex="http://schemas.microsoft.com/office/word/2018/wordml/cex" xmlns:w16cid="http://schemas.microsoft.com/office/word/2016/wordml/cid" xmlns:w16="http://schemas.microsoft.com/office/word/2018/wordml" xmlns:w16du="http://schemas.microsoft.com/office/word/2023/wordml/word16du" xmlns:w16sdtdh="http://schemas.microsoft.com/office/word/2020/wordml/sdtdatahash" xmlns:w16sdtfl="http://schemas.microsoft.com/office/word/2024/wordml/sdtformatlock" xmlns:w16se="http://schemas.microsoft.com/office/word/2015/wordml/symex" xmlns:wpg="http://schemas.microsoft.com/office/word/2010/wordprocessingGroup" xmlns:wpi="http://schemas.microsoft.com/office/word/2010/wordprocessingInk" xmlns:wne="http://schemas.microsoft.com/office/word/2006/wordml" xmlns:wps="http://schemas.microsoft.com/office/word/2010/wordprocessingShape" mc:Ignorable="w14 w15 w16se w16cid w16 w16cex w16sdtdh w16sdtfl w16du wp14">
+  <w15:person w15:author="hardwick">
+    <w15:presenceInfo w15:providerId="None" w15:userId="hardwick"/>
+  </w15:person>
+</w15:people>
 </file>
 
 <file path=word/styles.xml><?xml version="1.0" encoding="utf-8"?>
@@ -16259,6 +18005,49 @@
       <w:u w:val="single"/>
     </w:rPr>
   </w:style>
+  <w:style w:type="character" w:styleId="CommentReference">
+    <w:name w:val="annotation reference"/>
+    <w:basedOn w:val="DefaultParagraphFont"/>
+    <w:uiPriority w:val="99"/>
+    <w:semiHidden/>
+    <w:unhideWhenUsed/>
+    <w:rsid w:val="00CF6716"/>
+    <w:rPr>
+      <w:sz w:val="16"/>
+      <w:szCs w:val="16"/>
+    </w:rPr>
+  </w:style>
+  <w:style w:type="paragraph" w:styleId="CommentText">
+    <w:name w:val="annotation text"/>
+    <w:basedOn w:val="Normal"/>
+    <w:link w:val="CommentTextChar"/>
+    <w:uiPriority w:val="99"/>
+    <w:semiHidden/>
+    <w:unhideWhenUsed/>
+    <w:rsid w:val="00CF6716"/>
+    <w:pPr>
+      <w:spacing w:before="100" w:beforeAutospacing="1" w:after="100" w:afterAutospacing="1"/>
+      <w:jc w:val="left"/>
+    </w:pPr>
+    <w:rPr>
+      <w:rFonts w:ascii="Times New Roman" w:eastAsiaTheme="minorHAnsi" w:hAnsi="Times New Roman" w:cstheme="minorBidi"/>
+      <w:sz w:val="20"/>
+      <w:szCs w:val="20"/>
+      <w:lang w:val="en-US"/>
+    </w:rPr>
+  </w:style>
+  <w:style w:type="character" w:customStyle="1" w:styleId="CommentTextChar">
+    <w:name w:val="Comment Text Char"/>
+    <w:basedOn w:val="DefaultParagraphFont"/>
+    <w:link w:val="CommentText"/>
+    <w:uiPriority w:val="99"/>
+    <w:semiHidden/>
+    <w:rsid w:val="00CF6716"/>
+    <w:rPr>
+      <w:rFonts w:eastAsiaTheme="minorHAnsi" w:cstheme="minorBidi"/>
+      <w:lang w:val="en-US" w:eastAsia="en-US"/>
+    </w:rPr>
+  </w:style>
 </w:styles>
 </file>
 

</xml_diff>